<commit_message>
style: convert plain text reference urls to clickable source links
</commit_message>
<xml_diff>
--- a/output/draft/iyare-draft.docx
+++ b/output/draft/iyare-draft.docx
@@ -2631,8 +2631,17 @@
           <w:color w:val="000000"/>
           <w:sz w:val="24"/>
         </w:rPr>
-        <w:t>, 6(3), 241–254. https://doi.org/10.4314/ajtcam.v6i3.57162</w:t>
-      </w:r>
+        <w:t xml:space="preserve">, 6(3), 241–254. </w:t>
+      </w:r>
+      <w:hyperlink r:id="rId10">
+        <w:r>
+          <w:rPr>
+            <w:color w:val="0000FF"/>
+            <w:u w:val="single"/>
+          </w:rPr>
+          <w:t>source</w:t>
+        </w:r>
+      </w:hyperlink>
     </w:p>
     <w:p>
       <w:pPr>
@@ -2662,8 +2671,17 @@
           <w:color w:val="000000"/>
           <w:sz w:val="24"/>
         </w:rPr>
-        <w:t>, 58(S87), 27–32. https://doi.org/10.3109/00016347909157790</w:t>
-      </w:r>
+        <w:t xml:space="preserve">, 58(S87), 27–32. </w:t>
+      </w:r>
+      <w:hyperlink r:id="rId11">
+        <w:r>
+          <w:rPr>
+            <w:color w:val="0000FF"/>
+            <w:u w:val="single"/>
+          </w:rPr>
+          <w:t>source</w:t>
+        </w:r>
+      </w:hyperlink>
     </w:p>
     <w:p>
       <w:pPr>
@@ -2693,7 +2711,24 @@
           <w:color w:val="000000"/>
           <w:sz w:val="24"/>
         </w:rPr>
-        <w:t xml:space="preserve">, 87, 27–32. https://doi.org/10.3109/00016347909157790 </w:t>
+        <w:t xml:space="preserve">, 87, 27–32. </w:t>
+      </w:r>
+      <w:hyperlink r:id="rId11">
+        <w:r>
+          <w:rPr>
+            <w:color w:val="0000FF"/>
+            <w:u w:val="single"/>
+          </w:rPr>
+          <w:t>source</w:t>
+        </w:r>
+      </w:hyperlink>
+      <w:r>
+        <w:rPr>
+          <w:rFonts w:ascii="Times New Roman" w:hAnsi="Times New Roman" w:eastAsia="Times New Roman"/>
+          <w:color w:val="000000"/>
+          <w:sz w:val="24"/>
+        </w:rPr>
+        <w:t xml:space="preserve"> </w:t>
       </w:r>
     </w:p>
     <w:p>
@@ -2724,8 +2759,17 @@
           <w:color w:val="000000"/>
           <w:sz w:val="24"/>
         </w:rPr>
-        <w:t>, 78(3–4), 105–112. https://doi.org/10.1515/znc-2022-0120</w:t>
-      </w:r>
+        <w:t xml:space="preserve">, 78(3–4), 105–112. </w:t>
+      </w:r>
+      <w:hyperlink r:id="rId12">
+        <w:r>
+          <w:rPr>
+            <w:color w:val="0000FF"/>
+            <w:u w:val="single"/>
+          </w:rPr>
+          <w:t>source</w:t>
+        </w:r>
+      </w:hyperlink>
     </w:p>
     <w:p>
       <w:pPr>
@@ -2755,8 +2799,17 @@
           <w:color w:val="000000"/>
           <w:sz w:val="24"/>
         </w:rPr>
-        <w:t>, 2(2), 265–269. https://doi.org/10.15376/biores.2.2.265-269</w:t>
-      </w:r>
+        <w:t xml:space="preserve">, 2(2), 265–269. </w:t>
+      </w:r>
+      <w:hyperlink r:id="rId13">
+        <w:r>
+          <w:rPr>
+            <w:color w:val="0000FF"/>
+            <w:u w:val="single"/>
+          </w:rPr>
+          <w:t>source</w:t>
+        </w:r>
+      </w:hyperlink>
     </w:p>
     <w:p>
       <w:pPr>
@@ -2817,8 +2870,17 @@
           <w:color w:val="000000"/>
           <w:sz w:val="24"/>
         </w:rPr>
-        <w:t>, 18, 39. https://doi.org/10.1186/s12905-018-0532-1</w:t>
-      </w:r>
+        <w:t xml:space="preserve">, 18, 39. </w:t>
+      </w:r>
+      <w:hyperlink r:id="rId14">
+        <w:r>
+          <w:rPr>
+            <w:color w:val="0000FF"/>
+            <w:u w:val="single"/>
+          </w:rPr>
+          <w:t>source</w:t>
+        </w:r>
+      </w:hyperlink>
     </w:p>
     <w:p>
       <w:pPr>
@@ -2848,8 +2910,17 @@
           <w:color w:val="000000"/>
           <w:sz w:val="24"/>
         </w:rPr>
-        <w:t>, 132(6), e249–e258. https://doi.org/10.1097/AOG.0000000000002978</w:t>
-      </w:r>
+        <w:t xml:space="preserve">, 132(6), e249–e258. </w:t>
+      </w:r>
+      <w:hyperlink r:id="rId15">
+        <w:r>
+          <w:rPr>
+            <w:color w:val="0000FF"/>
+            <w:u w:val="single"/>
+          </w:rPr>
+          <w:t>source</w:t>
+        </w:r>
+      </w:hyperlink>
     </w:p>
     <w:p>
       <w:pPr>
@@ -2879,8 +2950,17 @@
           <w:color w:val="000000"/>
           <w:sz w:val="24"/>
         </w:rPr>
-        <w:t>, 6(2), 16–20. https://doi.org/10.36858/jkds.v6i2.120</w:t>
-      </w:r>
+        <w:t xml:space="preserve">, 6(2), 16–20. </w:t>
+      </w:r>
+      <w:hyperlink r:id="rId16">
+        <w:r>
+          <w:rPr>
+            <w:color w:val="0000FF"/>
+            <w:u w:val="single"/>
+          </w:rPr>
+          <w:t>source</w:t>
+        </w:r>
+      </w:hyperlink>
     </w:p>
     <w:p>
       <w:pPr>
@@ -2910,8 +2990,17 @@
           <w:color w:val="000000"/>
           <w:sz w:val="24"/>
         </w:rPr>
-        <w:t>, 2(3), 129–133. https://doi.org/10.1002/ptr.2650020305</w:t>
-      </w:r>
+        <w:t xml:space="preserve">, 2(3), 129–133. </w:t>
+      </w:r>
+      <w:hyperlink r:id="rId17">
+        <w:r>
+          <w:rPr>
+            <w:color w:val="0000FF"/>
+            <w:u w:val="single"/>
+          </w:rPr>
+          <w:t>source</w:t>
+        </w:r>
+      </w:hyperlink>
     </w:p>
     <w:p>
       <w:pPr>
@@ -2941,8 +3030,17 @@
           <w:color w:val="000000"/>
           <w:sz w:val="24"/>
         </w:rPr>
-        <w:t>, 28(3), 365–373. https://doi.org/10.1016/j.bjp.2018.03.010</w:t>
-      </w:r>
+        <w:t xml:space="preserve">, 28(3), 365–373. </w:t>
+      </w:r>
+      <w:hyperlink r:id="rId18">
+        <w:r>
+          <w:rPr>
+            <w:color w:val="0000FF"/>
+            <w:u w:val="single"/>
+          </w:rPr>
+          <w:t>source</w:t>
+        </w:r>
+      </w:hyperlink>
     </w:p>
     <w:p>
       <w:pPr>
@@ -2972,8 +3070,17 @@
           <w:color w:val="000000"/>
           <w:sz w:val="24"/>
         </w:rPr>
-        <w:t>, 64(4), 610–616. https://doi.org/10.1111/j.2042-7158.2011.01440.x</w:t>
-      </w:r>
+        <w:t xml:space="preserve">, 64(4), 610–616. </w:t>
+      </w:r>
+      <w:hyperlink r:id="rId19">
+        <w:r>
+          <w:rPr>
+            <w:color w:val="0000FF"/>
+            <w:u w:val="single"/>
+          </w:rPr>
+          <w:t>source</w:t>
+        </w:r>
+      </w:hyperlink>
     </w:p>
     <w:p>
       <w:pPr>
@@ -3003,8 +3110,17 @@
           <w:color w:val="000000"/>
           <w:sz w:val="24"/>
         </w:rPr>
-        <w:t>, 9(5), 1454. https://doi.org/10.3390/jcm9051454</w:t>
-      </w:r>
+        <w:t xml:space="preserve">, 9(5), 1454. </w:t>
+      </w:r>
+      <w:hyperlink r:id="rId20">
+        <w:r>
+          <w:rPr>
+            <w:color w:val="0000FF"/>
+            <w:u w:val="single"/>
+          </w:rPr>
+          <w:t>source</w:t>
+        </w:r>
+      </w:hyperlink>
     </w:p>
     <w:p>
       <w:pPr>
@@ -3034,8 +3150,17 @@
           <w:color w:val="000000"/>
           <w:sz w:val="24"/>
         </w:rPr>
-        <w:t>, 10(2), 202. https://doi.org/10.3390/biom10020202</w:t>
-      </w:r>
+        <w:t xml:space="preserve">, 10(2), 202. </w:t>
+      </w:r>
+      <w:hyperlink r:id="rId21">
+        <w:r>
+          <w:rPr>
+            <w:color w:val="0000FF"/>
+            <w:u w:val="single"/>
+          </w:rPr>
+          <w:t>source</w:t>
+        </w:r>
+      </w:hyperlink>
     </w:p>
     <w:p>
       <w:pPr>
@@ -3065,8 +3190,17 @@
           <w:color w:val="000000"/>
           <w:sz w:val="24"/>
         </w:rPr>
-        <w:t>, 31(1), 97–99. https://doi.org/10.25081/josac.2022.v31.i1.7508</w:t>
-      </w:r>
+        <w:t xml:space="preserve">, 31(1), 97–99. </w:t>
+      </w:r>
+      <w:hyperlink r:id="rId22">
+        <w:r>
+          <w:rPr>
+            <w:color w:val="0000FF"/>
+            <w:u w:val="single"/>
+          </w:rPr>
+          <w:t>source</w:t>
+        </w:r>
+      </w:hyperlink>
     </w:p>
     <w:p>
       <w:pPr>
@@ -3096,8 +3230,17 @@
           <w:color w:val="000000"/>
           <w:sz w:val="24"/>
         </w:rPr>
-        <w:t>, 39(7), 585–595. https://doi.org/10.1016/j.jogc.2016.12.023</w:t>
-      </w:r>
+        <w:t xml:space="preserve">, 39(7), 585–595. </w:t>
+      </w:r>
+      <w:hyperlink r:id="rId23">
+        <w:r>
+          <w:rPr>
+            <w:color w:val="0000FF"/>
+            <w:u w:val="single"/>
+          </w:rPr>
+          <w:t>source</w:t>
+        </w:r>
+      </w:hyperlink>
     </w:p>
     <w:p>
       <w:pPr>
@@ -3127,8 +3270,17 @@
           <w:color w:val="000000"/>
           <w:sz w:val="24"/>
         </w:rPr>
-        <w:t>, 39(7), 585–595. https://doi.org/10.1016/j.jogc.2016.12.023</w:t>
-      </w:r>
+        <w:t xml:space="preserve">, 39(7), 585–595. </w:t>
+      </w:r>
+      <w:hyperlink r:id="rId23">
+        <w:r>
+          <w:rPr>
+            <w:color w:val="0000FF"/>
+            <w:u w:val="single"/>
+          </w:rPr>
+          <w:t>source</w:t>
+        </w:r>
+      </w:hyperlink>
     </w:p>
     <w:p>
       <w:pPr>
@@ -3158,8 +3310,17 @@
           <w:color w:val="000000"/>
           <w:sz w:val="24"/>
         </w:rPr>
-        <w:t>, 59(10), 987–990. https://doi.org/10.1021/np960451q</w:t>
-      </w:r>
+        <w:t xml:space="preserve">, 59(10), 987–990. </w:t>
+      </w:r>
+      <w:hyperlink r:id="rId24">
+        <w:r>
+          <w:rPr>
+            <w:color w:val="0000FF"/>
+            <w:u w:val="single"/>
+          </w:rPr>
+          <w:t>source</w:t>
+        </w:r>
+      </w:hyperlink>
     </w:p>
     <w:p>
       <w:pPr>
@@ -3189,8 +3350,17 @@
           <w:color w:val="000000"/>
           <w:sz w:val="24"/>
         </w:rPr>
-        <w:t>, 21(6), 501–506. https://doi.org/10.1002/ptr.2124</w:t>
-      </w:r>
+        <w:t xml:space="preserve">, 21(6), 501–506. </w:t>
+      </w:r>
+      <w:hyperlink r:id="rId25">
+        <w:r>
+          <w:rPr>
+            <w:color w:val="0000FF"/>
+            <w:u w:val="single"/>
+          </w:rPr>
+          <w:t>source</w:t>
+        </w:r>
+      </w:hyperlink>
     </w:p>
     <w:p>
       <w:pPr>
@@ -3220,7 +3390,24 @@
           <w:color w:val="000000"/>
           <w:sz w:val="24"/>
         </w:rPr>
-        <w:t>, 135(1), 102–108. https://doi.org/10.1016/0002-9378(79)90176-7</w:t>
+        <w:t xml:space="preserve">, 135(1), 102–108. </w:t>
+      </w:r>
+      <w:hyperlink r:id="rId26">
+        <w:r>
+          <w:rPr>
+            <w:color w:val="0000FF"/>
+            <w:u w:val="single"/>
+          </w:rPr>
+          <w:t>source</w:t>
+        </w:r>
+      </w:hyperlink>
+      <w:r>
+        <w:rPr>
+          <w:rFonts w:ascii="Times New Roman" w:hAnsi="Times New Roman" w:eastAsia="Times New Roman"/>
+          <w:color w:val="000000"/>
+          <w:sz w:val="24"/>
+        </w:rPr>
+        <w:t>90176-7)</w:t>
       </w:r>
     </w:p>
     <w:p>
@@ -3251,7 +3438,24 @@
           <w:color w:val="000000"/>
           <w:sz w:val="24"/>
         </w:rPr>
-        <w:t>, 40(1), 59–66. https://doi.org/10.1016/S1537-1891(02)00311-7</w:t>
+        <w:t xml:space="preserve">, 40(1), 59–66. </w:t>
+      </w:r>
+      <w:hyperlink r:id="rId27">
+        <w:r>
+          <w:rPr>
+            <w:color w:val="0000FF"/>
+            <w:u w:val="single"/>
+          </w:rPr>
+          <w:t>source</w:t>
+        </w:r>
+      </w:hyperlink>
+      <w:r>
+        <w:rPr>
+          <w:rFonts w:ascii="Times New Roman" w:hAnsi="Times New Roman" w:eastAsia="Times New Roman"/>
+          <w:color w:val="000000"/>
+          <w:sz w:val="24"/>
+        </w:rPr>
+        <w:t>00311-7)</w:t>
       </w:r>
     </w:p>
     <w:p>
@@ -3282,8 +3486,17 @@
           <w:color w:val="000000"/>
           <w:sz w:val="24"/>
         </w:rPr>
-        <w:t>, 19(1B), 212–217. https://doi.org/10.1590/S0102-695X2009000200006</w:t>
-      </w:r>
+        <w:t xml:space="preserve">, 19(1B), 212–217. </w:t>
+      </w:r>
+      <w:hyperlink r:id="rId28">
+        <w:r>
+          <w:rPr>
+            <w:color w:val="0000FF"/>
+            <w:u w:val="single"/>
+          </w:rPr>
+          <w:t>source</w:t>
+        </w:r>
+      </w:hyperlink>
     </w:p>
     <w:p>
       <w:pPr>
@@ -3313,7 +3526,24 @@
           <w:color w:val="000000"/>
           <w:sz w:val="24"/>
         </w:rPr>
-        <w:t>, 77(1), 87–94. https://doi.org/10.1016/S0002-9343(84)80025-X</w:t>
+        <w:t xml:space="preserve">, 77(1), 87–94. </w:t>
+      </w:r>
+      <w:hyperlink r:id="rId29">
+        <w:r>
+          <w:rPr>
+            <w:color w:val="0000FF"/>
+            <w:u w:val="single"/>
+          </w:rPr>
+          <w:t>source</w:t>
+        </w:r>
+      </w:hyperlink>
+      <w:r>
+        <w:rPr>
+          <w:rFonts w:ascii="Times New Roman" w:hAnsi="Times New Roman" w:eastAsia="Times New Roman"/>
+          <w:color w:val="000000"/>
+          <w:sz w:val="24"/>
+        </w:rPr>
+        <w:t>80025-X)</w:t>
       </w:r>
     </w:p>
     <w:p>
@@ -3375,8 +3605,17 @@
           <w:color w:val="000000"/>
           <w:sz w:val="24"/>
         </w:rPr>
-        <w:t>, 108(2), 428–441. https://doi.org/10.1097/01.AOG.0000230214.26638.0c</w:t>
-      </w:r>
+        <w:t xml:space="preserve">, 108(2), 428–441. </w:t>
+      </w:r>
+      <w:hyperlink r:id="rId30">
+        <w:r>
+          <w:rPr>
+            <w:color w:val="0000FF"/>
+            <w:u w:val="single"/>
+          </w:rPr>
+          <w:t>source</w:t>
+        </w:r>
+      </w:hyperlink>
     </w:p>
     <w:p>
       <w:pPr>
@@ -3406,8 +3645,17 @@
           <w:color w:val="000000"/>
           <w:sz w:val="24"/>
         </w:rPr>
-        <w:t>, 108(2), 428–441. https://doi.org/10.1097/01.AOG.0000230214.26638.0c</w:t>
-      </w:r>
+        <w:t xml:space="preserve">, 108(2), 428–441. </w:t>
+      </w:r>
+      <w:hyperlink r:id="rId30">
+        <w:r>
+          <w:rPr>
+            <w:color w:val="0000FF"/>
+            <w:u w:val="single"/>
+          </w:rPr>
+          <w:t>source</w:t>
+        </w:r>
+      </w:hyperlink>
     </w:p>
     <w:p>
       <w:pPr>
@@ -3437,8 +3685,17 @@
           <w:color w:val="000000"/>
           <w:sz w:val="24"/>
         </w:rPr>
-        <w:t>, 13(2), 512–520. https://pubmed.ncbi.nlm.nih.gov/26841639/</w:t>
-      </w:r>
+        <w:t xml:space="preserve">, 13(2), 512–520. </w:t>
+      </w:r>
+      <w:hyperlink r:id="rId31">
+        <w:r>
+          <w:rPr>
+            <w:color w:val="0000FF"/>
+            <w:u w:val="single"/>
+          </w:rPr>
+          <w:t>source</w:t>
+        </w:r>
+      </w:hyperlink>
     </w:p>
     <w:p>
       <w:pPr>
@@ -3468,8 +3725,17 @@
           <w:color w:val="000000"/>
           <w:sz w:val="24"/>
         </w:rPr>
-        <w:t>, 12, 793200. https://doi.org/10.3389/fphar.2021.793200</w:t>
-      </w:r>
+        <w:t xml:space="preserve">, 12, 793200. </w:t>
+      </w:r>
+      <w:hyperlink r:id="rId32">
+        <w:r>
+          <w:rPr>
+            <w:color w:val="0000FF"/>
+            <w:u w:val="single"/>
+          </w:rPr>
+          <w:t>source</w:t>
+        </w:r>
+      </w:hyperlink>
     </w:p>
     <w:p>
       <w:pPr>
@@ -3499,8 +3765,17 @@
           <w:color w:val="000000"/>
           <w:sz w:val="24"/>
         </w:rPr>
-        <w:t>, 9(6), 264–274. https://doi.org/10.3923/rjmp.2015.264.274</w:t>
-      </w:r>
+        <w:t xml:space="preserve">, 9(6), 264–274. </w:t>
+      </w:r>
+      <w:hyperlink r:id="rId33">
+        <w:r>
+          <w:rPr>
+            <w:color w:val="0000FF"/>
+            <w:u w:val="single"/>
+          </w:rPr>
+          <w:t>source</w:t>
+        </w:r>
+      </w:hyperlink>
     </w:p>
     <w:p>
       <w:pPr>
@@ -3530,8 +3805,17 @@
           <w:color w:val="000000"/>
           <w:sz w:val="24"/>
         </w:rPr>
-        <w:t>, 100(28), e26633. https://doi.org/10.1097/MD.0000000000026633</w:t>
-      </w:r>
+        <w:t xml:space="preserve">, 100(28), e26633. </w:t>
+      </w:r>
+      <w:hyperlink r:id="rId34">
+        <w:r>
+          <w:rPr>
+            <w:color w:val="0000FF"/>
+            <w:u w:val="single"/>
+          </w:rPr>
+          <w:t>source</w:t>
+        </w:r>
+      </w:hyperlink>
     </w:p>
     <w:p>
       <w:pPr>
@@ -3592,8 +3876,17 @@
           <w:color w:val="000000"/>
           <w:sz w:val="24"/>
         </w:rPr>
-        <w:t>, 88(2), 308–316. https://doi.org/10.1046/j.1365-2672.2000.00969.x</w:t>
-      </w:r>
+        <w:t xml:space="preserve">, 88(2), 308–316. </w:t>
+      </w:r>
+      <w:hyperlink r:id="rId35">
+        <w:r>
+          <w:rPr>
+            <w:color w:val="0000FF"/>
+            <w:u w:val="single"/>
+          </w:rPr>
+          <w:t>source</w:t>
+        </w:r>
+      </w:hyperlink>
     </w:p>
     <w:p>
       <w:pPr>
@@ -3623,8 +3916,17 @@
           <w:color w:val="000000"/>
           <w:sz w:val="24"/>
         </w:rPr>
-        <w:t>, 17(1), 45. https://doi.org/10.3390/ph17010045</w:t>
-      </w:r>
+        <w:t xml:space="preserve">, 17(1), 45. </w:t>
+      </w:r>
+      <w:hyperlink r:id="rId36">
+        <w:r>
+          <w:rPr>
+            <w:color w:val="0000FF"/>
+            <w:u w:val="single"/>
+          </w:rPr>
+          <w:t>source</w:t>
+        </w:r>
+      </w:hyperlink>
     </w:p>
     <w:p>
       <w:pPr>
@@ -3654,8 +3956,17 @@
           <w:color w:val="000000"/>
           <w:sz w:val="24"/>
         </w:rPr>
-        <w:t>, 42(5), 1033–1044. https://doi.org/10.1080/01443615.2021.2004104</w:t>
-      </w:r>
+        <w:t xml:space="preserve">, 42(5), 1033–1044. </w:t>
+      </w:r>
+      <w:hyperlink r:id="rId37">
+        <w:r>
+          <w:rPr>
+            <w:color w:val="0000FF"/>
+            <w:u w:val="single"/>
+          </w:rPr>
+          <w:t>source</w:t>
+        </w:r>
+      </w:hyperlink>
     </w:p>
     <w:p>
       <w:pPr>
@@ -3685,8 +3996,17 @@
           <w:color w:val="000000"/>
           <w:sz w:val="24"/>
         </w:rPr>
-        <w:t>, 23(3), 589–596. https://doi.org/10.1080/0972060X.2020.1794994</w:t>
-      </w:r>
+        <w:t xml:space="preserve">, 23(3), 589–596. </w:t>
+      </w:r>
+      <w:hyperlink r:id="rId38">
+        <w:r>
+          <w:rPr>
+            <w:color w:val="0000FF"/>
+            <w:u w:val="single"/>
+          </w:rPr>
+          <w:t>source</w:t>
+        </w:r>
+      </w:hyperlink>
     </w:p>
     <w:p>
       <w:pPr>
@@ -3716,8 +4036,17 @@
           <w:color w:val="000000"/>
           <w:sz w:val="24"/>
         </w:rPr>
-        <w:t>, 9(6), 549–552. https://doi.org/10.1111/j.1463-1318.2006.01185.x</w:t>
-      </w:r>
+        <w:t xml:space="preserve">, 9(6), 549–552. </w:t>
+      </w:r>
+      <w:hyperlink r:id="rId39">
+        <w:r>
+          <w:rPr>
+            <w:color w:val="0000FF"/>
+            <w:u w:val="single"/>
+          </w:rPr>
+          <w:t>source</w:t>
+        </w:r>
+      </w:hyperlink>
     </w:p>
     <w:p>
       <w:pPr>
@@ -3747,8 +4076,17 @@
           <w:color w:val="000000"/>
           <w:sz w:val="24"/>
         </w:rPr>
-        <w:t>, 22, 143. https://doi.org/10.1186/s12906-022-03619-9</w:t>
-      </w:r>
+        <w:t xml:space="preserve">, 22, 143. </w:t>
+      </w:r>
+      <w:hyperlink r:id="rId40">
+        <w:r>
+          <w:rPr>
+            <w:color w:val="0000FF"/>
+            <w:u w:val="single"/>
+          </w:rPr>
+          <w:t>source</w:t>
+        </w:r>
+      </w:hyperlink>
     </w:p>
     <w:p>
       <w:pPr>
@@ -3778,8 +4116,17 @@
           <w:color w:val="000000"/>
           <w:sz w:val="24"/>
         </w:rPr>
-        <w:t>. https://www.ema.europa.eu/en/documents/herbal-report/final-assessment-report-syzygium-aromaticum-l-merill-et-lm-perry-flos-and-syzygium-aromaticum-l-merill-et-lm-perry-floris-aetheroleum_en.pdf</w:t>
-      </w:r>
+        <w:t xml:space="preserve">. </w:t>
+      </w:r>
+      <w:hyperlink r:id="rId41">
+        <w:r>
+          <w:rPr>
+            <w:color w:val="0000FF"/>
+            <w:u w:val="single"/>
+          </w:rPr>
+          <w:t>source</w:t>
+        </w:r>
+      </w:hyperlink>
     </w:p>
     <w:p>
       <w:pPr>
@@ -3809,8 +4156,17 @@
           <w:color w:val="000000"/>
           <w:sz w:val="24"/>
         </w:rPr>
-        <w:t>, 7(1), 59–66. https://doi.org/10.30442/ahr.0701-07-116</w:t>
-      </w:r>
+        <w:t xml:space="preserve">, 7(1), 59–66. </w:t>
+      </w:r>
+      <w:hyperlink r:id="rId42">
+        <w:r>
+          <w:rPr>
+            <w:color w:val="0000FF"/>
+            <w:u w:val="single"/>
+          </w:rPr>
+          <w:t>source</w:t>
+        </w:r>
+      </w:hyperlink>
     </w:p>
     <w:p>
       <w:pPr>
@@ -3840,8 +4196,17 @@
           <w:color w:val="000000"/>
           <w:sz w:val="24"/>
         </w:rPr>
-        <w:t>, 14, 1185412. https://doi.org/10.3389/fphar.2023.1185412</w:t>
-      </w:r>
+        <w:t xml:space="preserve">, 14, 1185412. </w:t>
+      </w:r>
+      <w:hyperlink r:id="rId43">
+        <w:r>
+          <w:rPr>
+            <w:color w:val="0000FF"/>
+            <w:u w:val="single"/>
+          </w:rPr>
+          <w:t>source</w:t>
+        </w:r>
+      </w:hyperlink>
     </w:p>
     <w:p>
       <w:pPr>
@@ -3871,8 +4236,17 @@
           <w:color w:val="000000"/>
           <w:sz w:val="24"/>
         </w:rPr>
-        <w:t>, 14, 1744806918770320. https://doi.org/10.1177/1744806918770320</w:t>
-      </w:r>
+        <w:t xml:space="preserve">, 14, 1744806918770320. </w:t>
+      </w:r>
+      <w:hyperlink r:id="rId44">
+        <w:r>
+          <w:rPr>
+            <w:color w:val="0000FF"/>
+            <w:u w:val="single"/>
+          </w:rPr>
+          <w:t>source</w:t>
+        </w:r>
+      </w:hyperlink>
     </w:p>
     <w:p>
       <w:pPr>
@@ -3902,8 +4276,17 @@
           <w:color w:val="000000"/>
           <w:sz w:val="24"/>
         </w:rPr>
-        <w:t>, 136(5), 1047–1058. https://doi.org/10.1097/AOG.0000000000004096</w:t>
-      </w:r>
+        <w:t xml:space="preserve">, 136(5), 1047–1058. </w:t>
+      </w:r>
+      <w:hyperlink r:id="rId45">
+        <w:r>
+          <w:rPr>
+            <w:color w:val="0000FF"/>
+            <w:u w:val="single"/>
+          </w:rPr>
+          <w:t>source</w:t>
+        </w:r>
+      </w:hyperlink>
     </w:p>
     <w:p>
       <w:pPr>
@@ -3933,8 +4316,17 @@
           <w:color w:val="000000"/>
           <w:sz w:val="24"/>
         </w:rPr>
-        <w:t>, 136(5), 1047–1058. https://doi.org/10.1097/AOG.0000000000004096</w:t>
-      </w:r>
+        <w:t xml:space="preserve">, 136(5), 1047–1058. </w:t>
+      </w:r>
+      <w:hyperlink r:id="rId45">
+        <w:r>
+          <w:rPr>
+            <w:color w:val="0000FF"/>
+            <w:u w:val="single"/>
+          </w:rPr>
+          <w:t>source</w:t>
+        </w:r>
+      </w:hyperlink>
     </w:p>
     <w:p>
       <w:pPr>
@@ -3964,8 +4356,17 @@
           <w:color w:val="000000"/>
           <w:sz w:val="24"/>
         </w:rPr>
-        <w:t>, 20(2), 209–222. https://doi.org/10.3109/00498259009046865</w:t>
-      </w:r>
+        <w:t xml:space="preserve">, 20(2), 209–222. </w:t>
+      </w:r>
+      <w:hyperlink r:id="rId46">
+        <w:r>
+          <w:rPr>
+            <w:color w:val="0000FF"/>
+            <w:u w:val="single"/>
+          </w:rPr>
+          <w:t>source</w:t>
+        </w:r>
+      </w:hyperlink>
     </w:p>
     <w:p>
       <w:pPr>
@@ -3995,8 +4396,17 @@
           <w:color w:val="000000"/>
           <w:sz w:val="24"/>
         </w:rPr>
-        <w:t>, 2(3), 179–191. https://doi.org/10.1038/nrd1034</w:t>
-      </w:r>
+        <w:t xml:space="preserve">, 2(3), 179–191. </w:t>
+      </w:r>
+      <w:hyperlink r:id="rId47">
+        <w:r>
+          <w:rPr>
+            <w:color w:val="0000FF"/>
+            <w:u w:val="single"/>
+          </w:rPr>
+          <w:t>source</w:t>
+        </w:r>
+      </w:hyperlink>
     </w:p>
     <w:p>
       <w:pPr>
@@ -4026,8 +4436,17 @@
           <w:color w:val="000000"/>
           <w:sz w:val="24"/>
         </w:rPr>
-        <w:t>, 81(12), 1109–1117. https://doi.org/10.1034/j.1600-0412.2002.811202.x</w:t>
-      </w:r>
+        <w:t xml:space="preserve">, 81(12), 1109–1117. </w:t>
+      </w:r>
+      <w:hyperlink r:id="rId48">
+        <w:r>
+          <w:rPr>
+            <w:color w:val="0000FF"/>
+            <w:u w:val="single"/>
+          </w:rPr>
+          <w:t>source</w:t>
+        </w:r>
+      </w:hyperlink>
     </w:p>
     <w:p>
       <w:pPr>
@@ -4057,8 +4476,17 @@
           <w:color w:val="000000"/>
           <w:sz w:val="24"/>
         </w:rPr>
-        <w:t>, 19(6), 471–481. https://doi.org/10.2174/1389557518666181022120248</w:t>
-      </w:r>
+        <w:t xml:space="preserve">, 19(6), 471–481. </w:t>
+      </w:r>
+      <w:hyperlink r:id="rId49">
+        <w:r>
+          <w:rPr>
+            <w:color w:val="0000FF"/>
+            <w:u w:val="single"/>
+          </w:rPr>
+          <w:t>source</w:t>
+        </w:r>
+      </w:hyperlink>
     </w:p>
     <w:p>
       <w:pPr>
@@ -4119,8 +4547,17 @@
           <w:color w:val="000000"/>
           <w:sz w:val="24"/>
         </w:rPr>
-        <w:t>, 76(2), 163–185. https://doi.org/10.1093/jhmas/jrab001</w:t>
-      </w:r>
+        <w:t xml:space="preserve">, 76(2), 163–185. </w:t>
+      </w:r>
+      <w:hyperlink r:id="rId50">
+        <w:r>
+          <w:rPr>
+            <w:color w:val="0000FF"/>
+            <w:u w:val="single"/>
+          </w:rPr>
+          <w:t>source</w:t>
+        </w:r>
+      </w:hyperlink>
     </w:p>
     <w:p>
       <w:pPr>
@@ -4150,8 +4587,17 @@
           <w:color w:val="000000"/>
           <w:sz w:val="24"/>
         </w:rPr>
-        <w:t>, 36(10), 2570–2583. https://doi.org/10.1080/14786419.2021.1903019</w:t>
-      </w:r>
+        <w:t xml:space="preserve">, 36(10), 2570–2583. </w:t>
+      </w:r>
+      <w:hyperlink r:id="rId51">
+        <w:r>
+          <w:rPr>
+            <w:color w:val="0000FF"/>
+            <w:u w:val="single"/>
+          </w:rPr>
+          <w:t>source</w:t>
+        </w:r>
+      </w:hyperlink>
     </w:p>
     <w:p>
       <w:pPr>
@@ -4181,8 +4627,17 @@
           <w:color w:val="000000"/>
           <w:sz w:val="24"/>
         </w:rPr>
-        <w:t>, 108, 104456. https://doi.org/10.1016/j.yrtph.2019.104456</w:t>
-      </w:r>
+        <w:t xml:space="preserve">, 108, 104456. </w:t>
+      </w:r>
+      <w:hyperlink r:id="rId52">
+        <w:r>
+          <w:rPr>
+            <w:color w:val="0000FF"/>
+            <w:u w:val="single"/>
+          </w:rPr>
+          <w:t>source</w:t>
+        </w:r>
+      </w:hyperlink>
     </w:p>
     <w:p>
       <w:pPr>
@@ -4212,8 +4667,17 @@
           <w:color w:val="000000"/>
           <w:sz w:val="24"/>
         </w:rPr>
-        <w:t>, 29(4), 265–270. https://doi.org/10.1111/j.1365-2885.2006.00740.x</w:t>
-      </w:r>
+        <w:t xml:space="preserve">, 29(4), 265–270. </w:t>
+      </w:r>
+      <w:hyperlink r:id="rId53">
+        <w:r>
+          <w:rPr>
+            <w:color w:val="0000FF"/>
+            <w:u w:val="single"/>
+          </w:rPr>
+          <w:t>source</w:t>
+        </w:r>
+      </w:hyperlink>
     </w:p>
     <w:p>
       <w:pPr>
@@ -4243,8 +4707,17 @@
           <w:color w:val="000000"/>
           <w:sz w:val="24"/>
         </w:rPr>
-        <w:t>, 27(1), 1–15. https://doi.org/10.1002/ptr.4686</w:t>
-      </w:r>
+        <w:t xml:space="preserve">, 27(1), 1–15. </w:t>
+      </w:r>
+      <w:hyperlink r:id="rId54">
+        <w:r>
+          <w:rPr>
+            <w:color w:val="0000FF"/>
+            <w:u w:val="single"/>
+          </w:rPr>
+          <w:t>source</w:t>
+        </w:r>
+      </w:hyperlink>
     </w:p>
     <w:p>
       <w:pPr>
@@ -4274,8 +4747,17 @@
           <w:color w:val="000000"/>
           <w:sz w:val="24"/>
         </w:rPr>
-        <w:t>, 14(9), 975–985. https://doi.org/10.1089/jmf.2010.0197</w:t>
-      </w:r>
+        <w:t xml:space="preserve">, 14(9), 975–985. </w:t>
+      </w:r>
+      <w:hyperlink r:id="rId55">
+        <w:r>
+          <w:rPr>
+            <w:color w:val="0000FF"/>
+            <w:u w:val="single"/>
+          </w:rPr>
+          <w:t>source</w:t>
+        </w:r>
+      </w:hyperlink>
     </w:p>
     <w:p>
       <w:pPr>
@@ -4305,8 +4787,17 @@
           <w:color w:val="000000"/>
           <w:sz w:val="24"/>
         </w:rPr>
-        <w:t>, 384(3), 243–251. https://doi.org/10.1007/s00210-012-0742-2</w:t>
-      </w:r>
+        <w:t xml:space="preserve">, 384(3), 243–251. </w:t>
+      </w:r>
+      <w:hyperlink r:id="rId56">
+        <w:r>
+          <w:rPr>
+            <w:color w:val="0000FF"/>
+            <w:u w:val="single"/>
+          </w:rPr>
+          <w:t>source</w:t>
+        </w:r>
+      </w:hyperlink>
     </w:p>
     <w:p>
       <w:pPr>
@@ -4336,8 +4827,17 @@
           <w:color w:val="000000"/>
           <w:sz w:val="24"/>
         </w:rPr>
-        <w:t>, 19(6), 363–371. https://doi.org/10.1016/j.jpag.2006.09.001</w:t>
-      </w:r>
+        <w:t xml:space="preserve">, 19(6), 363–371. </w:t>
+      </w:r>
+      <w:hyperlink r:id="rId57">
+        <w:r>
+          <w:rPr>
+            <w:color w:val="0000FF"/>
+            <w:u w:val="single"/>
+          </w:rPr>
+          <w:t>source</w:t>
+        </w:r>
+      </w:hyperlink>
     </w:p>
     <w:p>
       <w:pPr>
@@ -4367,8 +4867,17 @@
           <w:color w:val="000000"/>
           <w:sz w:val="24"/>
         </w:rPr>
-        <w:t>, 1135, 185–195. https://doi.org/10.1196/annals.1429.007</w:t>
-      </w:r>
+        <w:t xml:space="preserve">, 1135, 185–195. </w:t>
+      </w:r>
+      <w:hyperlink r:id="rId58">
+        <w:r>
+          <w:rPr>
+            <w:color w:val="0000FF"/>
+            <w:u w:val="single"/>
+          </w:rPr>
+          <w:t>source</w:t>
+        </w:r>
+      </w:hyperlink>
     </w:p>
     <w:p>
       <w:pPr>
@@ -4398,8 +4907,17 @@
           <w:color w:val="000000"/>
           <w:sz w:val="24"/>
         </w:rPr>
-        <w:t>, 26(21), 6387. https://doi.org/10.3390/molecules26216387</w:t>
-      </w:r>
+        <w:t xml:space="preserve">, 26(21), 6387. </w:t>
+      </w:r>
+      <w:hyperlink r:id="rId59">
+        <w:r>
+          <w:rPr>
+            <w:color w:val="0000FF"/>
+            <w:u w:val="single"/>
+          </w:rPr>
+          <w:t>source</w:t>
+        </w:r>
+      </w:hyperlink>
     </w:p>
     <w:p>
       <w:pPr>
@@ -4429,8 +4947,17 @@
           <w:color w:val="000000"/>
           <w:sz w:val="24"/>
         </w:rPr>
-        <w:t>, 285, 119955. https://doi.org/10.1016/j.lfs.2021.119955</w:t>
-      </w:r>
+        <w:t xml:space="preserve">, 285, 119955. </w:t>
+      </w:r>
+      <w:hyperlink r:id="rId60">
+        <w:r>
+          <w:rPr>
+            <w:color w:val="0000FF"/>
+            <w:u w:val="single"/>
+          </w:rPr>
+          <w:t>source</w:t>
+        </w:r>
+      </w:hyperlink>
     </w:p>
     <w:p>
       <w:pPr>
@@ -4460,8 +4987,17 @@
           <w:color w:val="000000"/>
           <w:sz w:val="24"/>
         </w:rPr>
-        <w:t>, 160, 106635. https://doi.org/10.1016/j.prostaglandins.2022.106635</w:t>
-      </w:r>
+        <w:t xml:space="preserve">, 160, 106635. </w:t>
+      </w:r>
+      <w:hyperlink r:id="rId61">
+        <w:r>
+          <w:rPr>
+            <w:color w:val="0000FF"/>
+            <w:u w:val="single"/>
+          </w:rPr>
+          <w:t>source</w:t>
+        </w:r>
+      </w:hyperlink>
     </w:p>
     <w:p>
       <w:pPr>
@@ -4491,8 +5027,17 @@
           <w:color w:val="000000"/>
           <w:sz w:val="24"/>
         </w:rPr>
-        <w:t>, 23(11), 6128. https://doi.org/10.3390/ijms23116128</w:t>
-      </w:r>
+        <w:t xml:space="preserve">, 23(11), 6128. </w:t>
+      </w:r>
+      <w:hyperlink r:id="rId62">
+        <w:r>
+          <w:rPr>
+            <w:color w:val="0000FF"/>
+            <w:u w:val="single"/>
+          </w:rPr>
+          <w:t>source</w:t>
+        </w:r>
+      </w:hyperlink>
     </w:p>
     <w:p>
       <w:pPr>
@@ -4522,8 +5067,17 @@
           <w:color w:val="000000"/>
           <w:sz w:val="24"/>
         </w:rPr>
-        <w:t>, 1(1), 1–6. https://doi.org/10.22038/ajp.2011.114</w:t>
-      </w:r>
+        <w:t xml:space="preserve">, 1(1), 1–6. </w:t>
+      </w:r>
+      <w:hyperlink r:id="rId63">
+        <w:r>
+          <w:rPr>
+            <w:color w:val="0000FF"/>
+            <w:u w:val="single"/>
+          </w:rPr>
+          <w:t>source</w:t>
+        </w:r>
+      </w:hyperlink>
     </w:p>
     <w:p>
       <w:pPr>
@@ -4553,8 +5107,17 @@
           <w:color w:val="000000"/>
           <w:sz w:val="24"/>
         </w:rPr>
-        <w:t>, 21(6), 762–778. https://doi.org/10.1093/humupd/dmv039</w:t>
-      </w:r>
+        <w:t xml:space="preserve">, 21(6), 762–778. </w:t>
+      </w:r>
+      <w:hyperlink r:id="rId64">
+        <w:r>
+          <w:rPr>
+            <w:color w:val="0000FF"/>
+            <w:u w:val="single"/>
+          </w:rPr>
+          <w:t>source</w:t>
+        </w:r>
+      </w:hyperlink>
     </w:p>
     <w:p>
       <w:pPr>
@@ -4584,8 +5147,17 @@
           <w:color w:val="000000"/>
           <w:sz w:val="24"/>
         </w:rPr>
-        <w:t>, 34(4), 321–334. https://doi.org/10.1080/10412905.2022.2072968</w:t>
-      </w:r>
+        <w:t xml:space="preserve">, 34(4), 321–334. </w:t>
+      </w:r>
+      <w:hyperlink r:id="rId65">
+        <w:r>
+          <w:rPr>
+            <w:color w:val="0000FF"/>
+            <w:u w:val="single"/>
+          </w:rPr>
+          <w:t>source</w:t>
+        </w:r>
+      </w:hyperlink>
     </w:p>
     <w:p>
       <w:pPr>
@@ -4615,8 +5187,17 @@
           <w:color w:val="000000"/>
           <w:sz w:val="24"/>
         </w:rPr>
-        <w:t>, 30(8), 243–249. https://doi.org/10.1016/j.ogrm.2020.05.004</w:t>
-      </w:r>
+        <w:t xml:space="preserve">, 30(8), 243–249. </w:t>
+      </w:r>
+      <w:hyperlink r:id="rId66">
+        <w:r>
+          <w:rPr>
+            <w:color w:val="0000FF"/>
+            <w:u w:val="single"/>
+          </w:rPr>
+          <w:t>source</w:t>
+        </w:r>
+      </w:hyperlink>
     </w:p>
     <w:p>
       <w:pPr>
@@ -4646,7 +5227,24 @@
           <w:color w:val="000000"/>
           <w:sz w:val="24"/>
         </w:rPr>
-        <w:t xml:space="preserve">, 52(5), 101183. https://doi.org/10.1016/j.cppeds.2022.101183 </w:t>
+        <w:t xml:space="preserve">, 52(5), 101183. </w:t>
+      </w:r>
+      <w:hyperlink r:id="rId67">
+        <w:r>
+          <w:rPr>
+            <w:color w:val="0000FF"/>
+            <w:u w:val="single"/>
+          </w:rPr>
+          <w:t>source</w:t>
+        </w:r>
+      </w:hyperlink>
+      <w:r>
+        <w:rPr>
+          <w:rFonts w:ascii="Times New Roman" w:hAnsi="Times New Roman" w:eastAsia="Times New Roman"/>
+          <w:color w:val="000000"/>
+          <w:sz w:val="24"/>
+        </w:rPr>
+        <w:t xml:space="preserve"> </w:t>
       </w:r>
     </w:p>
     <w:p>
@@ -4677,8 +5275,17 @@
           <w:color w:val="000000"/>
           <w:sz w:val="24"/>
         </w:rPr>
-        <w:t>, 28, 100440. https://doi.org/10.1016/j.hermed.2021.100440</w:t>
-      </w:r>
+        <w:t xml:space="preserve">, 28, 100440. </w:t>
+      </w:r>
+      <w:hyperlink r:id="rId68">
+        <w:r>
+          <w:rPr>
+            <w:color w:val="0000FF"/>
+            <w:u w:val="single"/>
+          </w:rPr>
+          <w:t>source</w:t>
+        </w:r>
+      </w:hyperlink>
     </w:p>
     <w:p>
       <w:pPr>
@@ -4708,8 +5315,17 @@
           <w:color w:val="000000"/>
           <w:sz w:val="24"/>
         </w:rPr>
-        <w:t>, 54(17), 6303–6307. https://doi.org/10.1021/jf060608c</w:t>
-      </w:r>
+        <w:t xml:space="preserve">, 54(17), 6303–6307. </w:t>
+      </w:r>
+      <w:hyperlink r:id="rId69">
+        <w:r>
+          <w:rPr>
+            <w:color w:val="0000FF"/>
+            <w:u w:val="single"/>
+          </w:rPr>
+          <w:t>source</w:t>
+        </w:r>
+      </w:hyperlink>
     </w:p>
     <w:p>
       <w:pPr>
@@ -4739,8 +5355,17 @@
           <w:color w:val="000000"/>
           <w:sz w:val="24"/>
         </w:rPr>
-        <w:t>, 3, 439–449. https://doi.org/10.1016/j.toxrep.2016.04.001</w:t>
-      </w:r>
+        <w:t xml:space="preserve">, 3, 439–449. </w:t>
+      </w:r>
+      <w:hyperlink r:id="rId70">
+        <w:r>
+          <w:rPr>
+            <w:color w:val="0000FF"/>
+            <w:u w:val="single"/>
+          </w:rPr>
+          <w:t>source</w:t>
+        </w:r>
+      </w:hyperlink>
     </w:p>
     <w:p>
       <w:pPr>
@@ -4770,8 +5395,17 @@
           <w:color w:val="000000"/>
           <w:sz w:val="24"/>
         </w:rPr>
-        <w:t>, 36(1), 104–113. https://doi.org/10.1093/epirev/mxt009</w:t>
-      </w:r>
+        <w:t xml:space="preserve">, 36(1), 104–113. </w:t>
+      </w:r>
+      <w:hyperlink r:id="rId71">
+        <w:r>
+          <w:rPr>
+            <w:color w:val="0000FF"/>
+            <w:u w:val="single"/>
+          </w:rPr>
+          <w:t>source</w:t>
+        </w:r>
+      </w:hyperlink>
     </w:p>
     <w:p>
       <w:pPr>
@@ -4801,8 +5435,17 @@
           <w:color w:val="000000"/>
           <w:sz w:val="24"/>
         </w:rPr>
-        <w:t>, 501, 153442. https://doi.org/10.1016/j.tox.2024.153442</w:t>
-      </w:r>
+        <w:t xml:space="preserve">, 501, 153442. </w:t>
+      </w:r>
+      <w:hyperlink r:id="rId72">
+        <w:r>
+          <w:rPr>
+            <w:color w:val="0000FF"/>
+            <w:u w:val="single"/>
+          </w:rPr>
+          <w:t>source</w:t>
+        </w:r>
+      </w:hyperlink>
     </w:p>
     <w:p>
       <w:pPr>
@@ -4832,8 +5475,17 @@
           <w:color w:val="000000"/>
           <w:sz w:val="24"/>
         </w:rPr>
-        <w:t>, 17(6), 6953–6981. https://doi.org/10.3390/molecules17066953</w:t>
-      </w:r>
+        <w:t xml:space="preserve">, 17(6), 6953–6981. </w:t>
+      </w:r>
+      <w:hyperlink r:id="rId73">
+        <w:r>
+          <w:rPr>
+            <w:color w:val="0000FF"/>
+            <w:u w:val="single"/>
+          </w:rPr>
+          <w:t>source</w:t>
+        </w:r>
+      </w:hyperlink>
     </w:p>
     <w:p>
       <w:pPr>
@@ -4863,8 +5515,17 @@
           <w:color w:val="000000"/>
           <w:sz w:val="24"/>
         </w:rPr>
-        <w:t>, 3(2), 186–192. https://pubmed.ncbi.nlm.nih.gov/25050273/</w:t>
-      </w:r>
+        <w:t xml:space="preserve">, 3(2), 186–192. </w:t>
+      </w:r>
+      <w:hyperlink r:id="rId74">
+        <w:r>
+          <w:rPr>
+            <w:color w:val="0000FF"/>
+            <w:u w:val="single"/>
+          </w:rPr>
+          <w:t>source</w:t>
+        </w:r>
+      </w:hyperlink>
     </w:p>
     <w:p>
       <w:pPr>
@@ -4894,8 +5555,17 @@
           <w:color w:val="000000"/>
           <w:sz w:val="24"/>
         </w:rPr>
-        <w:t>, 32(4), 243–256. https://doi.org/10.1080/15376516.2021.2005389</w:t>
-      </w:r>
+        <w:t xml:space="preserve">, 32(4), 243–256. </w:t>
+      </w:r>
+      <w:hyperlink r:id="rId75">
+        <w:r>
+          <w:rPr>
+            <w:color w:val="0000FF"/>
+            <w:u w:val="single"/>
+          </w:rPr>
+          <w:t>source</w:t>
+        </w:r>
+      </w:hyperlink>
     </w:p>
     <w:p>
       <w:pPr>
@@ -4925,8 +5595,17 @@
           <w:color w:val="000000"/>
           <w:sz w:val="24"/>
         </w:rPr>
-        <w:t>, 272, 113939. https://doi.org/10.1016/j.jep.2021.113939</w:t>
-      </w:r>
+        <w:t xml:space="preserve">, 272, 113939. </w:t>
+      </w:r>
+      <w:hyperlink r:id="rId76">
+        <w:r>
+          <w:rPr>
+            <w:color w:val="0000FF"/>
+            <w:u w:val="single"/>
+          </w:rPr>
+          <w:t>source</w:t>
+        </w:r>
+      </w:hyperlink>
     </w:p>
     <w:p>
       <w:pPr>
@@ -4956,8 +5635,17 @@
           <w:color w:val="000000"/>
           <w:sz w:val="24"/>
         </w:rPr>
-        <w:t>, 8(1), 398–406. https://www.phytojournal.com/archives/2019/vol8issue1/PartG/7-6-164-236.pdf</w:t>
-      </w:r>
+        <w:t xml:space="preserve">, 8(1), 398–406. </w:t>
+      </w:r>
+      <w:hyperlink r:id="rId77">
+        <w:r>
+          <w:rPr>
+            <w:color w:val="0000FF"/>
+            <w:u w:val="single"/>
+          </w:rPr>
+          <w:t>source</w:t>
+        </w:r>
+      </w:hyperlink>
     </w:p>
     <w:p>
       <w:pPr>
@@ -4987,8 +5675,17 @@
           <w:color w:val="000000"/>
           <w:sz w:val="24"/>
         </w:rPr>
-        <w:t>, 28, 100438. https://doi.org/10.1016/j.hermed.2021.100438</w:t>
-      </w:r>
+        <w:t xml:space="preserve">, 28, 100438. </w:t>
+      </w:r>
+      <w:hyperlink r:id="rId78">
+        <w:r>
+          <w:rPr>
+            <w:color w:val="0000FF"/>
+            <w:u w:val="single"/>
+          </w:rPr>
+          <w:t>source</w:t>
+        </w:r>
+      </w:hyperlink>
     </w:p>
     <w:p>
       <w:pPr>
@@ -5018,7 +5715,24 @@
           <w:color w:val="000000"/>
           <w:sz w:val="24"/>
         </w:rPr>
-        <w:t>, 73(3), 337–348. https://doi.org/10.1016/S0024-3205(03)00288-1</w:t>
+        <w:t xml:space="preserve">, 73(3), 337–348. </w:t>
+      </w:r>
+      <w:hyperlink r:id="rId79">
+        <w:r>
+          <w:rPr>
+            <w:color w:val="0000FF"/>
+            <w:u w:val="single"/>
+          </w:rPr>
+          <w:t>source</w:t>
+        </w:r>
+      </w:hyperlink>
+      <w:r>
+        <w:rPr>
+          <w:rFonts w:ascii="Times New Roman" w:hAnsi="Times New Roman" w:eastAsia="Times New Roman"/>
+          <w:color w:val="000000"/>
+          <w:sz w:val="24"/>
+        </w:rPr>
+        <w:t>00288-1)</w:t>
       </w:r>
     </w:p>
     <w:p>
@@ -5049,8 +5763,17 @@
           <w:color w:val="000000"/>
           <w:sz w:val="24"/>
         </w:rPr>
-        <w:t>, 22(16), 8765. https://doi.org/10.3390/ijms22168765</w:t>
-      </w:r>
+        <w:t xml:space="preserve">, 22(16), 8765. </w:t>
+      </w:r>
+      <w:hyperlink r:id="rId80">
+        <w:r>
+          <w:rPr>
+            <w:color w:val="0000FF"/>
+            <w:u w:val="single"/>
+          </w:rPr>
+          <w:t>source</w:t>
+        </w:r>
+      </w:hyperlink>
     </w:p>
     <w:p>
       <w:pPr>
@@ -5080,8 +5803,17 @@
           <w:color w:val="000000"/>
           <w:sz w:val="24"/>
         </w:rPr>
-        <w:t>, 30(8), 1131–1142. https://doi.org/10.1089/jwh.2020.8796</w:t>
-      </w:r>
+        <w:t xml:space="preserve">, 30(8), 1131–1142. </w:t>
+      </w:r>
+      <w:hyperlink r:id="rId81">
+        <w:r>
+          <w:rPr>
+            <w:color w:val="0000FF"/>
+            <w:u w:val="single"/>
+          </w:rPr>
+          <w:t>source</w:t>
+        </w:r>
+      </w:hyperlink>
     </w:p>
     <w:p>
       <w:pPr>
@@ -5111,8 +5843,17 @@
           <w:color w:val="000000"/>
           <w:sz w:val="24"/>
         </w:rPr>
-        <w:t>, 101(3), 259–266. https://doi.org/10.1177/00220345211044388</w:t>
-      </w:r>
+        <w:t xml:space="preserve">, 101(3), 259–266. </w:t>
+      </w:r>
+      <w:hyperlink r:id="rId82">
+        <w:r>
+          <w:rPr>
+            <w:color w:val="0000FF"/>
+            <w:u w:val="single"/>
+          </w:rPr>
+          <w:t>source</w:t>
+        </w:r>
+      </w:hyperlink>
     </w:p>
     <w:p>
       <w:pPr>
@@ -5142,8 +5883,17 @@
           <w:color w:val="000000"/>
           <w:sz w:val="24"/>
         </w:rPr>
-        <w:t>. IntechOpen. https://doi.org/10.5772/intechopen.99199</w:t>
-      </w:r>
+        <w:t xml:space="preserve">. IntechOpen. </w:t>
+      </w:r>
+      <w:hyperlink r:id="rId83">
+        <w:r>
+          <w:rPr>
+            <w:color w:val="0000FF"/>
+            <w:u w:val="single"/>
+          </w:rPr>
+          <w:t>source</w:t>
+        </w:r>
+      </w:hyperlink>
     </w:p>
     <w:p>
       <w:pPr>
@@ -5173,8 +5923,17 @@
           <w:color w:val="000000"/>
           <w:sz w:val="24"/>
         </w:rPr>
-        <w:t>, 38(5), 341–345. https://doi.org/10.4103/0253-7613.27702</w:t>
-      </w:r>
+        <w:t xml:space="preserve">, 38(5), 341–345. </w:t>
+      </w:r>
+      <w:hyperlink r:id="rId84">
+        <w:r>
+          <w:rPr>
+            <w:color w:val="0000FF"/>
+            <w:u w:val="single"/>
+          </w:rPr>
+          <w:t>source</w:t>
+        </w:r>
+      </w:hyperlink>
     </w:p>
     <w:p>
       <w:pPr>
@@ -5204,8 +5963,17 @@
           <w:color w:val="000000"/>
           <w:sz w:val="24"/>
         </w:rPr>
-        <w:t>, 15(1), 15–18. https://www.czytelniamedyczna.pl/4799,przeciwgrzybicze-dzialanie-olejku-gozdzikowego.html</w:t>
-      </w:r>
+        <w:t xml:space="preserve">, 15(1), 15–18. </w:t>
+      </w:r>
+      <w:hyperlink r:id="rId85">
+        <w:r>
+          <w:rPr>
+            <w:color w:val="0000FF"/>
+            <w:u w:val="single"/>
+          </w:rPr>
+          <w:t>source</w:t>
+        </w:r>
+      </w:hyperlink>
     </w:p>
     <w:p>
       <w:pPr>
@@ -5235,8 +6003,17 @@
           <w:color w:val="000000"/>
           <w:sz w:val="24"/>
         </w:rPr>
-        <w:t>, 24, 112–125. https://doi.org/10.18433/jpps31456</w:t>
-      </w:r>
+        <w:t xml:space="preserve">, 24, 112–125. </w:t>
+      </w:r>
+      <w:hyperlink r:id="rId86">
+        <w:r>
+          <w:rPr>
+            <w:color w:val="0000FF"/>
+            <w:u w:val="single"/>
+          </w:rPr>
+          <w:t>source</w:t>
+        </w:r>
+      </w:hyperlink>
     </w:p>
     <w:p>
       <w:pPr>
@@ -5266,8 +6043,17 @@
           <w:color w:val="000000"/>
           <w:sz w:val="24"/>
         </w:rPr>
-        <w:t>, 79(2), 245–254. https://doi.org/10.1590/S0001-37652007000200004</w:t>
-      </w:r>
+        <w:t xml:space="preserve">, 79(2), 245–254. </w:t>
+      </w:r>
+      <w:hyperlink r:id="rId87">
+        <w:r>
+          <w:rPr>
+            <w:color w:val="0000FF"/>
+            <w:u w:val="single"/>
+          </w:rPr>
+          <w:t>source</w:t>
+        </w:r>
+      </w:hyperlink>
     </w:p>
     <w:p>
       <w:pPr>
@@ -5297,8 +6083,17 @@
           <w:color w:val="000000"/>
           <w:sz w:val="24"/>
         </w:rPr>
-        <w:t>, 12(11), 3438. https://doi.org/10.3390/nu12113438</w:t>
-      </w:r>
+        <w:t xml:space="preserve">, 12(11), 3438. </w:t>
+      </w:r>
+      <w:hyperlink r:id="rId88">
+        <w:r>
+          <w:rPr>
+            <w:color w:val="0000FF"/>
+            <w:u w:val="single"/>
+          </w:rPr>
+          <w:t>source</w:t>
+        </w:r>
+      </w:hyperlink>
     </w:p>
     <w:p>
       <w:pPr>
@@ -5328,8 +6123,17 @@
           <w:color w:val="000000"/>
           <w:sz w:val="24"/>
         </w:rPr>
-        <w:t>, 85, 19–26. https://doi.org/10.1016/j.maturitas.2015.11.013</w:t>
-      </w:r>
+        <w:t xml:space="preserve">, 85, 19–26. </w:t>
+      </w:r>
+      <w:hyperlink r:id="rId89">
+        <w:r>
+          <w:rPr>
+            <w:color w:val="0000FF"/>
+            <w:u w:val="single"/>
+          </w:rPr>
+          <w:t>source</w:t>
+        </w:r>
+      </w:hyperlink>
     </w:p>
     <w:p>
       <w:pPr>
@@ -5359,8 +6163,17 @@
           <w:color w:val="000000"/>
           <w:sz w:val="24"/>
         </w:rPr>
-        <w:t>, 99(41), e22592. https://doi.org/10.1097/MD.0000000000022592</w:t>
-      </w:r>
+        <w:t xml:space="preserve">, 99(41), e22592. </w:t>
+      </w:r>
+      <w:hyperlink r:id="rId90">
+        <w:r>
+          <w:rPr>
+            <w:color w:val="0000FF"/>
+            <w:u w:val="single"/>
+          </w:rPr>
+          <w:t>source</w:t>
+        </w:r>
+      </w:hyperlink>
     </w:p>
     <w:p>
       <w:pPr>
@@ -5390,8 +6203,17 @@
           <w:color w:val="000000"/>
           <w:sz w:val="24"/>
         </w:rPr>
-        <w:t>, 182, 51–78. https://doi.org/10.1007/112_2021_65</w:t>
-      </w:r>
+        <w:t xml:space="preserve">, 182, 51–78. </w:t>
+      </w:r>
+      <w:hyperlink r:id="rId91">
+        <w:r>
+          <w:rPr>
+            <w:color w:val="0000FF"/>
+            <w:u w:val="single"/>
+          </w:rPr>
+          <w:t>source</w:t>
+        </w:r>
+      </w:hyperlink>
     </w:p>
     <w:p>
       <w:pPr>
@@ -5421,8 +6243,17 @@
           <w:color w:val="000000"/>
           <w:sz w:val="24"/>
         </w:rPr>
-        <w:t>, 87(2), 137–141. https://doi.org/10.1177/154405910808700204</w:t>
-      </w:r>
+        <w:t xml:space="preserve">, 87(2), 137–141. </w:t>
+      </w:r>
+      <w:hyperlink r:id="rId92">
+        <w:r>
+          <w:rPr>
+            <w:color w:val="0000FF"/>
+            <w:u w:val="single"/>
+          </w:rPr>
+          <w:t>source</w:t>
+        </w:r>
+      </w:hyperlink>
     </w:p>
     <w:p>
       <w:pPr>
@@ -5452,8 +6283,17 @@
           <w:color w:val="000000"/>
           <w:sz w:val="24"/>
         </w:rPr>
-        <w:t>, 47(4), e1139. https://doi.org/10.12771/emj.2024.e39</w:t>
-      </w:r>
+        <w:t xml:space="preserve">, 47(4), e1139. </w:t>
+      </w:r>
+      <w:hyperlink r:id="rId93">
+        <w:r>
+          <w:rPr>
+            <w:color w:val="0000FF"/>
+            <w:u w:val="single"/>
+          </w:rPr>
+          <w:t>source</w:t>
+        </w:r>
+      </w:hyperlink>
     </w:p>
     <w:p>
       <w:pPr>
@@ -5483,8 +6323,17 @@
           <w:color w:val="000000"/>
           <w:sz w:val="24"/>
         </w:rPr>
-        <w:t>, 49(1), 176–180. https://doi.org/10.5455/rmj.20230803092427</w:t>
-      </w:r>
+        <w:t xml:space="preserve">, 49(1), 176–180. </w:t>
+      </w:r>
+      <w:hyperlink r:id="rId94">
+        <w:r>
+          <w:rPr>
+            <w:color w:val="0000FF"/>
+            <w:u w:val="single"/>
+          </w:rPr>
+          <w:t>source</w:t>
+        </w:r>
+      </w:hyperlink>
     </w:p>
     <w:p>
       <w:pPr>
@@ -5514,8 +6363,17 @@
           <w:color w:val="000000"/>
           <w:sz w:val="24"/>
         </w:rPr>
-        <w:t>, 138, 26–35. https://doi.org/10.1016/j.maturitas.2020.03.009</w:t>
-      </w:r>
+        <w:t xml:space="preserve">, 138, 26–35. </w:t>
+      </w:r>
+      <w:hyperlink r:id="rId95">
+        <w:r>
+          <w:rPr>
+            <w:color w:val="0000FF"/>
+            <w:u w:val="single"/>
+          </w:rPr>
+          <w:t>source</w:t>
+        </w:r>
+      </w:hyperlink>
     </w:p>
     <w:p>
       <w:pPr>
@@ -5545,8 +6403,17 @@
           <w:color w:val="000000"/>
           <w:sz w:val="24"/>
         </w:rPr>
-        <w:t>, 16, 1223–1236. https://doi.org/10.2147/JPR.S401229</w:t>
-      </w:r>
+        <w:t xml:space="preserve">, 16, 1223–1236. </w:t>
+      </w:r>
+      <w:hyperlink r:id="rId96">
+        <w:r>
+          <w:rPr>
+            <w:color w:val="0000FF"/>
+            <w:u w:val="single"/>
+          </w:rPr>
+          <w:t>source</w:t>
+        </w:r>
+      </w:hyperlink>
     </w:p>
     <w:p>
       <w:pPr>
@@ -5576,8 +6443,17 @@
           <w:color w:val="000000"/>
           <w:sz w:val="24"/>
         </w:rPr>
-        <w:t>, 35(6), 661–668. https://doi.org/10.1016/j.jpag.2022.04.008</w:t>
-      </w:r>
+        <w:t xml:space="preserve">, 35(6), 661–668. </w:t>
+      </w:r>
+      <w:hyperlink r:id="rId97">
+        <w:r>
+          <w:rPr>
+            <w:color w:val="0000FF"/>
+            <w:u w:val="single"/>
+          </w:rPr>
+          <w:t>source</w:t>
+        </w:r>
+      </w:hyperlink>
     </w:p>
     <w:p>
       <w:pPr>
@@ -5607,8 +6483,17 @@
           <w:color w:val="000000"/>
           <w:sz w:val="24"/>
         </w:rPr>
-        <w:t>, 27(2), 69–74. https://doi.org/10.2220/biomedres.27.69</w:t>
-      </w:r>
+        <w:t xml:space="preserve">, 27(2), 69–74. </w:t>
+      </w:r>
+      <w:hyperlink r:id="rId98">
+        <w:r>
+          <w:rPr>
+            <w:color w:val="0000FF"/>
+            <w:u w:val="single"/>
+          </w:rPr>
+          <w:t>source</w:t>
+        </w:r>
+      </w:hyperlink>
     </w:p>
     <w:p>
       <w:pPr>
@@ -5638,8 +6523,17 @@
           <w:color w:val="000000"/>
           <w:sz w:val="24"/>
         </w:rPr>
-        <w:t>, 70(45), 14403–14413. https://doi.org/10.1021/acs.jafc.2c06300</w:t>
-      </w:r>
+        <w:t xml:space="preserve">, 70(45), 14403–14413. </w:t>
+      </w:r>
+      <w:hyperlink r:id="rId99">
+        <w:r>
+          <w:rPr>
+            <w:color w:val="0000FF"/>
+            <w:u w:val="single"/>
+          </w:rPr>
+          <w:t>source</w:t>
+        </w:r>
+      </w:hyperlink>
     </w:p>
     <w:p>
       <w:pPr>
@@ -5669,8 +6563,17 @@
           <w:color w:val="000000"/>
           <w:sz w:val="24"/>
         </w:rPr>
-        <w:t>, 137(2), 189–192. https://doi.org/10.1016/j.ejogrb.2007.10.015</w:t>
-      </w:r>
+        <w:t xml:space="preserve">, 137(2), 189–192. </w:t>
+      </w:r>
+      <w:hyperlink r:id="rId100">
+        <w:r>
+          <w:rPr>
+            <w:color w:val="0000FF"/>
+            <w:u w:val="single"/>
+          </w:rPr>
+          <w:t>source</w:t>
+        </w:r>
+      </w:hyperlink>
     </w:p>
     <w:p>
       <w:pPr>
@@ -5700,8 +6603,17 @@
           <w:color w:val="000000"/>
           <w:sz w:val="24"/>
         </w:rPr>
-        <w:t>, 105, 106810. https://doi.org/10.1016/j.vascn.2020.106810</w:t>
-      </w:r>
+        <w:t xml:space="preserve">, 105, 106810. </w:t>
+      </w:r>
+      <w:hyperlink r:id="rId101">
+        <w:r>
+          <w:rPr>
+            <w:color w:val="0000FF"/>
+            <w:u w:val="single"/>
+          </w:rPr>
+          <w:t>source</w:t>
+        </w:r>
+      </w:hyperlink>
     </w:p>
     <w:p>
       <w:pPr>
@@ -5731,8 +6643,17 @@
           <w:color w:val="000000"/>
           <w:sz w:val="24"/>
         </w:rPr>
-        <w:t>, 17, 2025–2038. https://doi.org/10.2147/IJWH.S521349</w:t>
-      </w:r>
+        <w:t xml:space="preserve">, 17, 2025–2038. </w:t>
+      </w:r>
+      <w:hyperlink r:id="rId102">
+        <w:r>
+          <w:rPr>
+            <w:color w:val="0000FF"/>
+            <w:u w:val="single"/>
+          </w:rPr>
+          <w:t>source</w:t>
+        </w:r>
+      </w:hyperlink>
     </w:p>
     <w:p>
       <w:pPr>
@@ -5762,8 +6683,17 @@
           <w:color w:val="000000"/>
           <w:sz w:val="24"/>
         </w:rPr>
-        <w:t>, 5(11), 60–72. https://doi.org/10.4236/jbm.2017.511007</w:t>
-      </w:r>
+        <w:t xml:space="preserve">, 5(11), 60–72. </w:t>
+      </w:r>
+      <w:hyperlink r:id="rId103">
+        <w:r>
+          <w:rPr>
+            <w:color w:val="0000FF"/>
+            <w:u w:val="single"/>
+          </w:rPr>
+          <w:t>source</w:t>
+        </w:r>
+      </w:hyperlink>
     </w:p>
     <w:p>
       <w:pPr>
@@ -5793,8 +6723,17 @@
           <w:color w:val="000000"/>
           <w:sz w:val="24"/>
         </w:rPr>
-        <w:t>, 180, e63511. https://doi.org/10.3791/63511</w:t>
-      </w:r>
+        <w:t xml:space="preserve">, 180, e63511. </w:t>
+      </w:r>
+      <w:hyperlink r:id="rId104">
+        <w:r>
+          <w:rPr>
+            <w:color w:val="0000FF"/>
+            <w:u w:val="single"/>
+          </w:rPr>
+          <w:t>source</w:t>
+        </w:r>
+      </w:hyperlink>
     </w:p>
     <w:p>
       <w:pPr>
@@ -5824,8 +6763,17 @@
           <w:color w:val="000000"/>
           <w:sz w:val="24"/>
         </w:rPr>
-        <w:t>, 42(3), 378–390. https://doi.org/10.1002/jat.4234</w:t>
-      </w:r>
+        <w:t xml:space="preserve">, 42(3), 378–390. </w:t>
+      </w:r>
+      <w:hyperlink r:id="rId105">
+        <w:r>
+          <w:rPr>
+            <w:color w:val="0000FF"/>
+            <w:u w:val="single"/>
+          </w:rPr>
+          <w:t>source</w:t>
+        </w:r>
+      </w:hyperlink>
     </w:p>
     <w:p>
       <w:pPr>
@@ -5855,8 +6803,17 @@
           <w:color w:val="000000"/>
           <w:sz w:val="24"/>
         </w:rPr>
-        <w:t>, 648(1–3), 110–117. https://doi.org/10.1016/j.ejphar.2010.08.021</w:t>
-      </w:r>
+        <w:t xml:space="preserve">, 648(1–3), 110–117. </w:t>
+      </w:r>
+      <w:hyperlink r:id="rId106">
+        <w:r>
+          <w:rPr>
+            <w:color w:val="0000FF"/>
+            <w:u w:val="single"/>
+          </w:rPr>
+          <w:t>source</w:t>
+        </w:r>
+      </w:hyperlink>
     </w:p>
     <w:p>
       <w:pPr>
@@ -5886,8 +6843,17 @@
           <w:color w:val="000000"/>
           <w:sz w:val="24"/>
         </w:rPr>
-        <w:t>, 128, 108190. https://doi.org/10.1016/j.foodcont.2021.108190</w:t>
-      </w:r>
+        <w:t xml:space="preserve">, 128, 108190. </w:t>
+      </w:r>
+      <w:hyperlink r:id="rId107">
+        <w:r>
+          <w:rPr>
+            <w:color w:val="0000FF"/>
+            <w:u w:val="single"/>
+          </w:rPr>
+          <w:t>source</w:t>
+        </w:r>
+      </w:hyperlink>
     </w:p>
     <w:p>
       <w:pPr>
@@ -5917,8 +6883,17 @@
           <w:color w:val="000000"/>
           <w:sz w:val="24"/>
         </w:rPr>
-        <w:t>, (7), CD001751. https://doi.org/10.1002/14651858.CD001751.pub3</w:t>
-      </w:r>
+        <w:t xml:space="preserve">, (7), CD001751. </w:t>
+      </w:r>
+      <w:hyperlink r:id="rId108">
+        <w:r>
+          <w:rPr>
+            <w:color w:val="0000FF"/>
+            <w:u w:val="single"/>
+          </w:rPr>
+          <w:t>source</w:t>
+        </w:r>
+      </w:hyperlink>
     </w:p>
     <w:p>
       <w:pPr>
@@ -5948,8 +6923,17 @@
           <w:color w:val="000000"/>
           <w:sz w:val="24"/>
         </w:rPr>
-        <w:t>, 23(5), 1039–1051. https://doi.org/10.1080/0972060X.2020.1835772</w:t>
-      </w:r>
+        <w:t xml:space="preserve">, 23(5), 1039–1051. </w:t>
+      </w:r>
+      <w:hyperlink r:id="rId109">
+        <w:r>
+          <w:rPr>
+            <w:color w:val="0000FF"/>
+            <w:u w:val="single"/>
+          </w:rPr>
+          <w:t>source</w:t>
+        </w:r>
+      </w:hyperlink>
     </w:p>
     <w:p>
       <w:pPr>
@@ -5979,8 +6963,17 @@
           <w:color w:val="000000"/>
           <w:sz w:val="24"/>
         </w:rPr>
-        <w:t>, 46(10), 3333–3338. https://doi.org/10.1016/j.fct.2008.06.006</w:t>
-      </w:r>
+        <w:t xml:space="preserve">, 46(10), 3333–3338. </w:t>
+      </w:r>
+      <w:hyperlink r:id="rId110">
+        <w:r>
+          <w:rPr>
+            <w:color w:val="0000FF"/>
+            <w:u w:val="single"/>
+          </w:rPr>
+          <w:t>source</w:t>
+        </w:r>
+      </w:hyperlink>
     </w:p>
     <w:p>
       <w:pPr>
@@ -6010,8 +7003,17 @@
           <w:color w:val="000000"/>
           <w:sz w:val="24"/>
         </w:rPr>
-        <w:t>, 6(8), 67–72. https://journals.innovareacademics.in/index.php/ijpps/article/view/2055</w:t>
-      </w:r>
+        <w:t xml:space="preserve">, 6(8), 67–72. </w:t>
+      </w:r>
+      <w:hyperlink r:id="rId111">
+        <w:r>
+          <w:rPr>
+            <w:color w:val="0000FF"/>
+            <w:u w:val="single"/>
+          </w:rPr>
+          <w:t>source</w:t>
+        </w:r>
+      </w:hyperlink>
     </w:p>
     <w:p>
       <w:pPr>
@@ -6041,8 +7043,17 @@
           <w:color w:val="000000"/>
           <w:sz w:val="24"/>
         </w:rPr>
-        <w:t>, 136(4), 581–586. https://doi.org/10.1038/sj.bjp.0704767</w:t>
-      </w:r>
+        <w:t xml:space="preserve">, 136(4), 581–586. </w:t>
+      </w:r>
+      <w:hyperlink r:id="rId112">
+        <w:r>
+          <w:rPr>
+            <w:color w:val="0000FF"/>
+            <w:u w:val="single"/>
+          </w:rPr>
+          <w:t>source</w:t>
+        </w:r>
+      </w:hyperlink>
     </w:p>
     <w:p>
       <w:pPr>
@@ -6072,8 +7083,17 @@
           <w:color w:val="000000"/>
           <w:sz w:val="24"/>
         </w:rPr>
-        <w:t>, 62(18), 4907–4929. https://doi.org/10.1080/10408398.2021.1895062</w:t>
-      </w:r>
+        <w:t xml:space="preserve">, 62(18), 4907–4929. </w:t>
+      </w:r>
+      <w:hyperlink r:id="rId113">
+        <w:r>
+          <w:rPr>
+            <w:color w:val="0000FF"/>
+            <w:u w:val="single"/>
+          </w:rPr>
+          <w:t>source</w:t>
+        </w:r>
+      </w:hyperlink>
     </w:p>
     <w:p>
       <w:pPr>
@@ -6103,8 +7123,17 @@
           <w:color w:val="000000"/>
           <w:sz w:val="24"/>
         </w:rPr>
-        <w:t>, 123, 104930. https://doi.org/10.1016/j.yrtph.2021.104930</w:t>
-      </w:r>
+        <w:t xml:space="preserve">, 123, 104930. </w:t>
+      </w:r>
+      <w:hyperlink r:id="rId114">
+        <w:r>
+          <w:rPr>
+            <w:color w:val="0000FF"/>
+            <w:u w:val="single"/>
+          </w:rPr>
+          <w:t>source</w:t>
+        </w:r>
+      </w:hyperlink>
     </w:p>
     <w:p>
       <w:pPr>
@@ -6134,8 +7163,17 @@
           <w:color w:val="000000"/>
           <w:sz w:val="24"/>
         </w:rPr>
-        <w:t>, 35(3), 47–57. https://www.researchgate.net/publication/228357516</w:t>
-      </w:r>
+        <w:t xml:space="preserve">, 35(3), 47–57. </w:t>
+      </w:r>
+      <w:hyperlink r:id="rId115">
+        <w:r>
+          <w:rPr>
+            <w:color w:val="0000FF"/>
+            <w:u w:val="single"/>
+          </w:rPr>
+          <w:t>source</w:t>
+        </w:r>
+      </w:hyperlink>
     </w:p>
     <w:p>
       <w:pPr>
@@ -6165,8 +7203,17 @@
           <w:color w:val="000000"/>
           <w:sz w:val="24"/>
         </w:rPr>
-        <w:t>, 45(4), 349–362. https://doi.org/10.1007/s40264-022-01169-0</w:t>
-      </w:r>
+        <w:t xml:space="preserve">, 45(4), 349–362. </w:t>
+      </w:r>
+      <w:hyperlink r:id="rId116">
+        <w:r>
+          <w:rPr>
+            <w:color w:val="0000FF"/>
+            <w:u w:val="single"/>
+          </w:rPr>
+          <w:t>source</w:t>
+        </w:r>
+      </w:hyperlink>
     </w:p>
     <w:p>
       <w:pPr>
@@ -6196,8 +7243,17 @@
           <w:color w:val="000000"/>
           <w:sz w:val="24"/>
         </w:rPr>
-        <w:t>, 6(1), 21–39. https://doi.org/10.1080/J157v06n01_03</w:t>
-      </w:r>
+        <w:t xml:space="preserve">, 6(1), 21–39. </w:t>
+      </w:r>
+      <w:hyperlink r:id="rId117">
+        <w:r>
+          <w:rPr>
+            <w:color w:val="0000FF"/>
+            <w:u w:val="single"/>
+          </w:rPr>
+          <w:t>source</w:t>
+        </w:r>
+      </w:hyperlink>
     </w:p>
     <w:p>
       <w:pPr>
@@ -6227,8 +7283,17 @@
           <w:color w:val="000000"/>
           <w:sz w:val="24"/>
         </w:rPr>
-        <w:t>, 17(11), 1505. https://doi.org/10.3390/ph17211505</w:t>
-      </w:r>
+        <w:t xml:space="preserve">, 17(11), 1505. </w:t>
+      </w:r>
+      <w:hyperlink r:id="rId118">
+        <w:r>
+          <w:rPr>
+            <w:color w:val="0000FF"/>
+            <w:u w:val="single"/>
+          </w:rPr>
+          <w:t>source</w:t>
+        </w:r>
+      </w:hyperlink>
     </w:p>
     <w:p>
       <w:pPr>
@@ -6258,8 +7323,17 @@
           <w:color w:val="000000"/>
           <w:sz w:val="24"/>
         </w:rPr>
-        <w:t>, 79(3), 327–334. https://doi.org/10.1254/jjp.79.327</w:t>
-      </w:r>
+        <w:t xml:space="preserve">, 79(3), 327–334. </w:t>
+      </w:r>
+      <w:hyperlink r:id="rId119">
+        <w:r>
+          <w:rPr>
+            <w:color w:val="0000FF"/>
+            <w:u w:val="single"/>
+          </w:rPr>
+          <w:t>source</w:t>
+        </w:r>
+      </w:hyperlink>
     </w:p>
     <w:p>
       <w:pPr>
@@ -6289,8 +7363,17 @@
           <w:color w:val="000000"/>
           <w:sz w:val="24"/>
         </w:rPr>
-        <w:t>, 84(4), 621–629. https://doi.org/10.4315/JFP-20-365</w:t>
-      </w:r>
+        <w:t xml:space="preserve">, 84(4), 621–629. </w:t>
+      </w:r>
+      <w:hyperlink r:id="rId120">
+        <w:r>
+          <w:rPr>
+            <w:color w:val="0000FF"/>
+            <w:u w:val="single"/>
+          </w:rPr>
+          <w:t>source</w:t>
+        </w:r>
+      </w:hyperlink>
     </w:p>
     <w:p>
       <w:pPr>
@@ -6320,8 +7403,17 @@
           <w:color w:val="000000"/>
           <w:sz w:val="24"/>
         </w:rPr>
-        <w:t>, 23(6), 358–363. https://doi.org/10.1016/j.jpag.2010.05.004</w:t>
-      </w:r>
+        <w:t xml:space="preserve">, 23(6), 358–363. </w:t>
+      </w:r>
+      <w:hyperlink r:id="rId121">
+        <w:r>
+          <w:rPr>
+            <w:color w:val="0000FF"/>
+            <w:u w:val="single"/>
+          </w:rPr>
+          <w:t>source</w:t>
+        </w:r>
+      </w:hyperlink>
     </w:p>
     <w:p>
       <w:pPr>
@@ -6351,8 +7443,17 @@
           <w:color w:val="000000"/>
           <w:sz w:val="24"/>
         </w:rPr>
-        <w:t>, 24(2), 215–221. https://doi.org/10.4103/njcp.njcp_117_20</w:t>
-      </w:r>
+        <w:t xml:space="preserve">, 24(2), 215–221. </w:t>
+      </w:r>
+      <w:hyperlink r:id="rId122">
+        <w:r>
+          <w:rPr>
+            <w:color w:val="0000FF"/>
+            <w:u w:val="single"/>
+          </w:rPr>
+          <w:t>source</w:t>
+        </w:r>
+      </w:hyperlink>
     </w:p>
     <w:p>
       <w:pPr>
@@ -6382,8 +7483,17 @@
           <w:color w:val="000000"/>
           <w:sz w:val="24"/>
         </w:rPr>
-        <w:t>. OECD Publishing. https://doi.org/10.1787/9789264071001-en</w:t>
-      </w:r>
+        <w:t xml:space="preserve">. OECD Publishing. </w:t>
+      </w:r>
+      <w:hyperlink r:id="rId123">
+        <w:r>
+          <w:rPr>
+            <w:color w:val="0000FF"/>
+            <w:u w:val="single"/>
+          </w:rPr>
+          <w:t>source</w:t>
+        </w:r>
+      </w:hyperlink>
     </w:p>
     <w:p>
       <w:pPr>
@@ -6413,8 +7523,17 @@
           <w:color w:val="000000"/>
           <w:sz w:val="24"/>
         </w:rPr>
-        <w:t>. OECD Publishing. https://doi.org/10.1787/9789264071049-en</w:t>
-      </w:r>
+        <w:t xml:space="preserve">. OECD Publishing. </w:t>
+      </w:r>
+      <w:hyperlink r:id="rId124">
+        <w:r>
+          <w:rPr>
+            <w:color w:val="0000FF"/>
+            <w:u w:val="single"/>
+          </w:rPr>
+          <w:t>source</w:t>
+        </w:r>
+      </w:hyperlink>
     </w:p>
     <w:p>
       <w:pPr>
@@ -6444,8 +7563,17 @@
           <w:color w:val="000000"/>
           <w:sz w:val="24"/>
         </w:rPr>
-        <w:t>, 218(4), 390–400. https://doi.org/10.1016/j.ajog.2017.08.108</w:t>
-      </w:r>
+        <w:t xml:space="preserve">, 218(4), 390–400. </w:t>
+      </w:r>
+      <w:hyperlink r:id="rId125">
+        <w:r>
+          <w:rPr>
+            <w:color w:val="0000FF"/>
+            <w:u w:val="single"/>
+          </w:rPr>
+          <w:t>source</w:t>
+        </w:r>
+      </w:hyperlink>
     </w:p>
     <w:p>
       <w:pPr>
@@ -6506,8 +7634,17 @@
           <w:color w:val="000000"/>
           <w:sz w:val="24"/>
         </w:rPr>
-        <w:t>, 29, 100487. https://doi.org/10.1016/j.hermed.2021.100487</w:t>
-      </w:r>
+        <w:t xml:space="preserve">, 29, 100487. </w:t>
+      </w:r>
+      <w:hyperlink r:id="rId126">
+        <w:r>
+          <w:rPr>
+            <w:color w:val="0000FF"/>
+            <w:u w:val="single"/>
+          </w:rPr>
+          <w:t>source</w:t>
+        </w:r>
+      </w:hyperlink>
     </w:p>
     <w:p>
       <w:pPr>
@@ -6537,8 +7674,17 @@
           <w:color w:val="000000"/>
           <w:sz w:val="24"/>
         </w:rPr>
-        <w:t>, 924, 174984. https://doi.org/10.1016/j.ejphar.2022.174984</w:t>
-      </w:r>
+        <w:t xml:space="preserve">, 924, 174984. </w:t>
+      </w:r>
+      <w:hyperlink r:id="rId127">
+        <w:r>
+          <w:rPr>
+            <w:color w:val="0000FF"/>
+            <w:u w:val="single"/>
+          </w:rPr>
+          <w:t>source</w:t>
+        </w:r>
+      </w:hyperlink>
     </w:p>
     <w:p>
       <w:pPr>
@@ -6568,8 +7714,17 @@
           <w:color w:val="000000"/>
           <w:sz w:val="24"/>
         </w:rPr>
-        <w:t>, 890, 173645. https://doi.org/10.1016/j.ejphar.2020.173645</w:t>
-      </w:r>
+        <w:t xml:space="preserve">, 890, 173645. </w:t>
+      </w:r>
+      <w:hyperlink r:id="rId128">
+        <w:r>
+          <w:rPr>
+            <w:color w:val="0000FF"/>
+            <w:u w:val="single"/>
+          </w:rPr>
+          <w:t>source</w:t>
+        </w:r>
+      </w:hyperlink>
     </w:p>
     <w:p>
       <w:pPr>
@@ -6599,7 +7754,24 @@
           <w:color w:val="000000"/>
           <w:sz w:val="24"/>
         </w:rPr>
-        <w:t>, 76(3), 299–302. https://doi.org/10.1016/S0378-8741(01)00249-5</w:t>
+        <w:t xml:space="preserve">, 76(3), 299–302. </w:t>
+      </w:r>
+      <w:hyperlink r:id="rId129">
+        <w:r>
+          <w:rPr>
+            <w:color w:val="0000FF"/>
+            <w:u w:val="single"/>
+          </w:rPr>
+          <w:t>source</w:t>
+        </w:r>
+      </w:hyperlink>
+      <w:r>
+        <w:rPr>
+          <w:rFonts w:ascii="Times New Roman" w:hAnsi="Times New Roman" w:eastAsia="Times New Roman"/>
+          <w:color w:val="000000"/>
+          <w:sz w:val="24"/>
+        </w:rPr>
+        <w:t>00249-5)</w:t>
       </w:r>
     </w:p>
     <w:p>
@@ -6630,8 +7802,17 @@
           <w:color w:val="000000"/>
           <w:sz w:val="24"/>
         </w:rPr>
-        <w:t>. https://www.ncbi.nlm.nih.gov/books/NBK553201/</w:t>
-      </w:r>
+        <w:t xml:space="preserve">. </w:t>
+      </w:r>
+      <w:hyperlink r:id="rId130">
+        <w:r>
+          <w:rPr>
+            <w:color w:val="0000FF"/>
+            <w:u w:val="single"/>
+          </w:rPr>
+          <w:t>source</w:t>
+        </w:r>
+      </w:hyperlink>
     </w:p>
     <w:p>
       <w:pPr>
@@ -6661,8 +7842,17 @@
           <w:color w:val="000000"/>
           <w:sz w:val="24"/>
         </w:rPr>
-        <w:t>, 92(1), 15–25. https://doi.org/10.1007/s40011-021-01287-8</w:t>
-      </w:r>
+        <w:t xml:space="preserve">, 92(1), 15–25. </w:t>
+      </w:r>
+      <w:hyperlink r:id="rId131">
+        <w:r>
+          <w:rPr>
+            <w:color w:val="0000FF"/>
+            <w:u w:val="single"/>
+          </w:rPr>
+          <w:t>source</w:t>
+        </w:r>
+      </w:hyperlink>
     </w:p>
     <w:p>
       <w:pPr>
@@ -6692,8 +7882,17 @@
           <w:color w:val="000000"/>
           <w:sz w:val="24"/>
         </w:rPr>
-        <w:t>, 30(4), 567–576. https://doi.org/10.1007/s10068-021-00900-y</w:t>
-      </w:r>
+        <w:t xml:space="preserve">, 30(4), 567–576. </w:t>
+      </w:r>
+      <w:hyperlink r:id="rId132">
+        <w:r>
+          <w:rPr>
+            <w:color w:val="0000FF"/>
+            <w:u w:val="single"/>
+          </w:rPr>
+          <w:t>source</w:t>
+        </w:r>
+      </w:hyperlink>
     </w:p>
     <w:p>
       <w:pPr>
@@ -6723,8 +7922,17 @@
           <w:color w:val="000000"/>
           <w:sz w:val="24"/>
         </w:rPr>
-        <w:t>, 124(3), 286–294. https://doi.org/10.1016/j.pain.2006.04.024</w:t>
-      </w:r>
+        <w:t xml:space="preserve">, 124(3), 286–294. </w:t>
+      </w:r>
+      <w:hyperlink r:id="rId133">
+        <w:r>
+          <w:rPr>
+            <w:color w:val="0000FF"/>
+            <w:u w:val="single"/>
+          </w:rPr>
+          <w:t>source</w:t>
+        </w:r>
+      </w:hyperlink>
     </w:p>
     <w:p>
       <w:pPr>
@@ -6754,8 +7962,17 @@
           <w:color w:val="000000"/>
           <w:sz w:val="24"/>
         </w:rPr>
-        <w:t>, (3), CD002124. https://doi.org/10.1002/14651858.CD002124.pub2</w:t>
-      </w:r>
+        <w:t xml:space="preserve">, (3), CD002124. </w:t>
+      </w:r>
+      <w:hyperlink r:id="rId134">
+        <w:r>
+          <w:rPr>
+            <w:color w:val="0000FF"/>
+            <w:u w:val="single"/>
+          </w:rPr>
+          <w:t>source</w:t>
+        </w:r>
+      </w:hyperlink>
     </w:p>
     <w:p>
       <w:pPr>
@@ -6785,8 +8002,17 @@
           <w:color w:val="000000"/>
           <w:sz w:val="24"/>
         </w:rPr>
-        <w:t>, 39(1), 148–174. https://doi.org/10.1039/D1NP00044A</w:t>
-      </w:r>
+        <w:t xml:space="preserve">, 39(1), 148–174. </w:t>
+      </w:r>
+      <w:hyperlink r:id="rId135">
+        <w:r>
+          <w:rPr>
+            <w:color w:val="0000FF"/>
+            <w:u w:val="single"/>
+          </w:rPr>
+          <w:t>source</w:t>
+        </w:r>
+      </w:hyperlink>
     </w:p>
     <w:p>
       <w:pPr>
@@ -6816,8 +8042,17 @@
           <w:color w:val="000000"/>
           <w:sz w:val="24"/>
         </w:rPr>
-        <w:t>, 171(22), 5040–5054. https://doi.org/10.1111/bph.12820</w:t>
-      </w:r>
+        <w:t xml:space="preserve">, 171(22), 5040–5054. </w:t>
+      </w:r>
+      <w:hyperlink r:id="rId136">
+        <w:r>
+          <w:rPr>
+            <w:color w:val="0000FF"/>
+            <w:u w:val="single"/>
+          </w:rPr>
+          <w:t>source</w:t>
+        </w:r>
+      </w:hyperlink>
     </w:p>
     <w:p>
       <w:pPr>
@@ -6847,8 +8082,17 @@
           <w:color w:val="000000"/>
           <w:sz w:val="24"/>
         </w:rPr>
-        <w:t>, 761, 136117. https://doi.org/10.1016/j.neulet.2021.136117</w:t>
-      </w:r>
+        <w:t xml:space="preserve">, 761, 136117. </w:t>
+      </w:r>
+      <w:hyperlink r:id="rId137">
+        <w:r>
+          <w:rPr>
+            <w:color w:val="0000FF"/>
+            <w:u w:val="single"/>
+          </w:rPr>
+          <w:t>source</w:t>
+        </w:r>
+      </w:hyperlink>
     </w:p>
     <w:p>
       <w:pPr>
@@ -6878,8 +8122,17 @@
           <w:color w:val="000000"/>
           <w:sz w:val="24"/>
         </w:rPr>
-        <w:t>, 6(11). https://doi.org/10.29057/icsa.v6i11.2723</w:t>
-      </w:r>
+        <w:t xml:space="preserve">, 6(11). </w:t>
+      </w:r>
+      <w:hyperlink r:id="rId138">
+        <w:r>
+          <w:rPr>
+            <w:color w:val="0000FF"/>
+            <w:u w:val="single"/>
+          </w:rPr>
+          <w:t>source</w:t>
+        </w:r>
+      </w:hyperlink>
     </w:p>
     <w:p>
       <w:pPr>
@@ -6909,8 +8162,17 @@
           <w:color w:val="000000"/>
           <w:sz w:val="24"/>
         </w:rPr>
-        <w:t>, 41(11), 7043–7051. https://doi.org/10.1007/s11033-014-3657-9</w:t>
-      </w:r>
+        <w:t xml:space="preserve">, 41(11), 7043–7051. </w:t>
+      </w:r>
+      <w:hyperlink r:id="rId139">
+        <w:r>
+          <w:rPr>
+            <w:color w:val="0000FF"/>
+            <w:u w:val="single"/>
+          </w:rPr>
+          <w:t>source</w:t>
+        </w:r>
+      </w:hyperlink>
     </w:p>
     <w:p>
       <w:pPr>
@@ -6940,8 +8202,17 @@
           <w:color w:val="000000"/>
           <w:sz w:val="24"/>
         </w:rPr>
-        <w:t>, 47(2), 35. https://doi.org/10.1007/s12038-022-00266-z</w:t>
-      </w:r>
+        <w:t xml:space="preserve">, 47(2), 35. </w:t>
+      </w:r>
+      <w:hyperlink r:id="rId140">
+        <w:r>
+          <w:rPr>
+            <w:color w:val="0000FF"/>
+            <w:u w:val="single"/>
+          </w:rPr>
+          <w:t>source</w:t>
+        </w:r>
+      </w:hyperlink>
     </w:p>
     <w:p>
       <w:pPr>
@@ -6971,8 +8242,17 @@
           <w:color w:val="000000"/>
           <w:sz w:val="24"/>
         </w:rPr>
-        <w:t>, 10(28), 28716–28729. https://doi.org/10.1021/acsomega.5c04146</w:t>
-      </w:r>
+        <w:t xml:space="preserve">, 10(28), 28716–28729. </w:t>
+      </w:r>
+      <w:hyperlink r:id="rId141">
+        <w:r>
+          <w:rPr>
+            <w:color w:val="0000FF"/>
+            <w:u w:val="single"/>
+          </w:rPr>
+          <w:t>source</w:t>
+        </w:r>
+      </w:hyperlink>
     </w:p>
     <w:p>
       <w:pPr>
@@ -7002,8 +8282,17 @@
           <w:color w:val="000000"/>
           <w:sz w:val="24"/>
         </w:rPr>
-        <w:t>, 4(2), 226–230. https://doi.org/10.20473/jmv.vol4.iss2.2021.226-230</w:t>
-      </w:r>
+        <w:t xml:space="preserve">, 4(2), 226–230. </w:t>
+      </w:r>
+      <w:hyperlink r:id="rId142">
+        <w:r>
+          <w:rPr>
+            <w:color w:val="0000FF"/>
+            <w:u w:val="single"/>
+          </w:rPr>
+          <w:t>source</w:t>
+        </w:r>
+      </w:hyperlink>
     </w:p>
     <w:p>
       <w:pPr>
@@ -7033,8 +8322,17 @@
           <w:color w:val="000000"/>
           <w:sz w:val="24"/>
         </w:rPr>
-        <w:t>, 74(1), 23–27. https://doi.org/10.1016/j.plefa.2005.10.002</w:t>
-      </w:r>
+        <w:t xml:space="preserve">, 74(1), 23–27. </w:t>
+      </w:r>
+      <w:hyperlink r:id="rId143">
+        <w:r>
+          <w:rPr>
+            <w:color w:val="0000FF"/>
+            <w:u w:val="single"/>
+          </w:rPr>
+          <w:t>source</w:t>
+        </w:r>
+      </w:hyperlink>
     </w:p>
     <w:p>
       <w:pPr>
@@ -7064,8 +8362,17 @@
           <w:color w:val="000000"/>
           <w:sz w:val="24"/>
         </w:rPr>
-        <w:t>, 27(5), 387–399. https://doi.org/10.1089/acm.2020.0436</w:t>
-      </w:r>
+        <w:t xml:space="preserve">, 27(5), 387–399. </w:t>
+      </w:r>
+      <w:hyperlink r:id="rId144">
+        <w:r>
+          <w:rPr>
+            <w:color w:val="0000FF"/>
+            <w:u w:val="single"/>
+          </w:rPr>
+          <w:t>source</w:t>
+        </w:r>
+      </w:hyperlink>
     </w:p>
     <w:p>
       <w:pPr>
@@ -7095,8 +8402,17 @@
           <w:color w:val="000000"/>
           <w:sz w:val="24"/>
         </w:rPr>
-        <w:t>, 58, 1–12. https://doi.org/10.1540/jsmr.58.1</w:t>
-      </w:r>
+        <w:t xml:space="preserve">, 58, 1–12. </w:t>
+      </w:r>
+      <w:hyperlink r:id="rId145">
+        <w:r>
+          <w:rPr>
+            <w:color w:val="0000FF"/>
+            <w:u w:val="single"/>
+          </w:rPr>
+          <w:t>source</w:t>
+        </w:r>
+      </w:hyperlink>
     </w:p>
     <w:p>
       <w:pPr>
@@ -7126,8 +8442,17 @@
           <w:color w:val="000000"/>
           <w:sz w:val="24"/>
         </w:rPr>
-        <w:t>, 85, 153558. https://doi.org/10.1016/j.phymed.2021.153558</w:t>
-      </w:r>
+        <w:t xml:space="preserve">, 85, 153558. </w:t>
+      </w:r>
+      <w:hyperlink r:id="rId146">
+        <w:r>
+          <w:rPr>
+            <w:color w:val="0000FF"/>
+            <w:u w:val="single"/>
+          </w:rPr>
+          <w:t>source</w:t>
+        </w:r>
+      </w:hyperlink>
     </w:p>
     <w:p>
       <w:pPr>
@@ -7157,8 +8482,17 @@
           <w:color w:val="000000"/>
           <w:sz w:val="24"/>
         </w:rPr>
-        <w:t>, 310, 50–51. https://doi.org/10.1056/nejm198401053100115</w:t>
-      </w:r>
+        <w:t xml:space="preserve">, 310, 50–51. </w:t>
+      </w:r>
+      <w:hyperlink r:id="rId147">
+        <w:r>
+          <w:rPr>
+            <w:color w:val="0000FF"/>
+            <w:u w:val="single"/>
+          </w:rPr>
+          <w:t>source</w:t>
+        </w:r>
+      </w:hyperlink>
     </w:p>
     <w:p>
       <w:pPr>
@@ -7188,8 +8522,17 @@
           <w:color w:val="000000"/>
           <w:sz w:val="24"/>
         </w:rPr>
-        <w:t>, 22, 45. https://doi.org/10.1186/s12905-022-01614-3</w:t>
-      </w:r>
+        <w:t xml:space="preserve">, 22, 45. </w:t>
+      </w:r>
+      <w:hyperlink r:id="rId148">
+        <w:r>
+          <w:rPr>
+            <w:color w:val="0000FF"/>
+            <w:u w:val="single"/>
+          </w:rPr>
+          <w:t>source</w:t>
+        </w:r>
+      </w:hyperlink>
     </w:p>
     <w:p>
       <w:pPr>
@@ -7219,8 +8562,17 @@
           <w:color w:val="000000"/>
           <w:sz w:val="24"/>
         </w:rPr>
-        <w:t>, 12(2), 3457–3498. https://doi.org/10.1002/cphy.c210027</w:t>
-      </w:r>
+        <w:t xml:space="preserve">, 12(2), 3457–3498. </w:t>
+      </w:r>
+      <w:hyperlink r:id="rId149">
+        <w:r>
+          <w:rPr>
+            <w:color w:val="0000FF"/>
+            <w:u w:val="single"/>
+          </w:rPr>
+          <w:t>source</w:t>
+        </w:r>
+      </w:hyperlink>
     </w:p>
     <w:p>
       <w:pPr>
@@ -7250,8 +8602,17 @@
           <w:color w:val="000000"/>
           <w:sz w:val="24"/>
         </w:rPr>
-        <w:t>, 169, 102294. https://doi.org/10.1016/j.plefa.2021.102294</w:t>
-      </w:r>
+        <w:t xml:space="preserve">, 169, 102294. </w:t>
+      </w:r>
+      <w:hyperlink r:id="rId150">
+        <w:r>
+          <w:rPr>
+            <w:color w:val="0000FF"/>
+            <w:u w:val="single"/>
+          </w:rPr>
+          <w:t>source</w:t>
+        </w:r>
+      </w:hyperlink>
     </w:p>
     <w:p>
       <w:pPr>
@@ -7281,8 +8642,17 @@
           <w:color w:val="000000"/>
           <w:sz w:val="24"/>
         </w:rPr>
-        <w:t>, 23(4), 319–326. https://doi.org/10.1080/14786410802242679</w:t>
-      </w:r>
+        <w:t xml:space="preserve">, 23(4), 319–326. </w:t>
+      </w:r>
+      <w:hyperlink r:id="rId151">
+        <w:r>
+          <w:rPr>
+            <w:color w:val="0000FF"/>
+            <w:u w:val="single"/>
+          </w:rPr>
+          <w:t>source</w:t>
+        </w:r>
+      </w:hyperlink>
     </w:p>
     <w:p>
       <w:pPr>
@@ -7312,8 +8682,17 @@
           <w:color w:val="000000"/>
           <w:sz w:val="24"/>
         </w:rPr>
-        <w:t>, 50(Suppl), S29–S34. https://doi.org/10.1194/jlr.R800042-JLR200</w:t>
-      </w:r>
+        <w:t xml:space="preserve">, 50(Suppl), S29–S34. </w:t>
+      </w:r>
+      <w:hyperlink r:id="rId152">
+        <w:r>
+          <w:rPr>
+            <w:color w:val="0000FF"/>
+            <w:u w:val="single"/>
+          </w:rPr>
+          <w:t>source</w:t>
+        </w:r>
+      </w:hyperlink>
     </w:p>
     <w:p>
       <w:pPr>
@@ -7343,8 +8722,17 @@
           <w:color w:val="000000"/>
           <w:sz w:val="24"/>
         </w:rPr>
-        <w:t>, 64(15), 3048–3053. https://doi.org/10.1021/acs.jafc.6b00337</w:t>
-      </w:r>
+        <w:t xml:space="preserve">, 64(15), 3048–3053. </w:t>
+      </w:r>
+      <w:hyperlink r:id="rId153">
+        <w:r>
+          <w:rPr>
+            <w:color w:val="0000FF"/>
+            <w:u w:val="single"/>
+          </w:rPr>
+          <w:t>source</w:t>
+        </w:r>
+      </w:hyperlink>
     </w:p>
     <w:p>
       <w:pPr>
@@ -7374,8 +8762,17 @@
           <w:color w:val="000000"/>
           <w:sz w:val="24"/>
         </w:rPr>
-        <w:t>, 11(12), 5432. https://doi.org/10.3390/app11125432</w:t>
-      </w:r>
+        <w:t xml:space="preserve">, 11(12), 5432. </w:t>
+      </w:r>
+      <w:hyperlink r:id="rId154">
+        <w:r>
+          <w:rPr>
+            <w:color w:val="0000FF"/>
+            <w:u w:val="single"/>
+          </w:rPr>
+          <w:t>source</w:t>
+        </w:r>
+      </w:hyperlink>
     </w:p>
     <w:p>
       <w:pPr>
@@ -7405,8 +8802,17 @@
           <w:color w:val="000000"/>
           <w:sz w:val="24"/>
         </w:rPr>
-        <w:t>, (5), CD001751. https://doi.org/10.1002/14651858.CD001751.pub4</w:t>
-      </w:r>
+        <w:t xml:space="preserve">, (5), CD001751. </w:t>
+      </w:r>
+      <w:hyperlink r:id="rId155">
+        <w:r>
+          <w:rPr>
+            <w:color w:val="0000FF"/>
+            <w:u w:val="single"/>
+          </w:rPr>
+          <w:t>source</w:t>
+        </w:r>
+      </w:hyperlink>
     </w:p>
     <w:p>
       <w:pPr>
@@ -7436,8 +8842,17 @@
           <w:color w:val="000000"/>
           <w:sz w:val="24"/>
         </w:rPr>
-        <w:t>, 383(2), 149–158. https://doi.org/10.1007/s00210-010-0582-x</w:t>
-      </w:r>
+        <w:t xml:space="preserve">, 383(2), 149–158. </w:t>
+      </w:r>
+      <w:hyperlink r:id="rId156">
+        <w:r>
+          <w:rPr>
+            <w:color w:val="0000FF"/>
+            <w:u w:val="single"/>
+          </w:rPr>
+          <w:t>source</w:t>
+        </w:r>
+      </w:hyperlink>
     </w:p>
     <w:p>
       <w:pPr>
@@ -7467,8 +8882,17 @@
           <w:color w:val="000000"/>
           <w:sz w:val="24"/>
         </w:rPr>
-        <w:t>, 12, 751207. https://doi.org/10.3389/fphar.2021.751207</w:t>
-      </w:r>
+        <w:t xml:space="preserve">, 12, 751207. </w:t>
+      </w:r>
+      <w:hyperlink r:id="rId157">
+        <w:r>
+          <w:rPr>
+            <w:color w:val="0000FF"/>
+            <w:u w:val="single"/>
+          </w:rPr>
+          <w:t>source</w:t>
+        </w:r>
+      </w:hyperlink>
     </w:p>
     <w:p>
       <w:pPr>
@@ -7498,8 +8922,17 @@
           <w:color w:val="000000"/>
           <w:sz w:val="24"/>
         </w:rPr>
-        <w:t>, 15(3), 684–692. https://doi.org/10.14202/vetworld.2022.684-692</w:t>
-      </w:r>
+        <w:t xml:space="preserve">, 15(3), 684–692. </w:t>
+      </w:r>
+      <w:hyperlink r:id="rId158">
+        <w:r>
+          <w:rPr>
+            <w:color w:val="0000FF"/>
+            <w:u w:val="single"/>
+          </w:rPr>
+          <w:t>source</w:t>
+        </w:r>
+      </w:hyperlink>
     </w:p>
     <w:p>
       <w:pPr>
@@ -7529,8 +8962,17 @@
           <w:color w:val="000000"/>
           <w:sz w:val="24"/>
         </w:rPr>
-        <w:t>, 316, 121361. https://doi.org/10.1016/j.lfs.2023.121361</w:t>
-      </w:r>
+        <w:t xml:space="preserve">, 316, 121361. </w:t>
+      </w:r>
+      <w:hyperlink r:id="rId159">
+        <w:r>
+          <w:rPr>
+            <w:color w:val="0000FF"/>
+            <w:u w:val="single"/>
+          </w:rPr>
+          <w:t>source</w:t>
+        </w:r>
+      </w:hyperlink>
     </w:p>
     <w:p>
       <w:pPr>
@@ -7560,8 +9002,17 @@
           <w:color w:val="000000"/>
           <w:sz w:val="24"/>
         </w:rPr>
-        <w:t>, 14, 2352–2360. https://doi.org/10.1007/s11694-020-00482-5</w:t>
-      </w:r>
+        <w:t xml:space="preserve">, 14, 2352–2360. </w:t>
+      </w:r>
+      <w:hyperlink r:id="rId160">
+        <w:r>
+          <w:rPr>
+            <w:color w:val="0000FF"/>
+            <w:u w:val="single"/>
+          </w:rPr>
+          <w:t>source</w:t>
+        </w:r>
+      </w:hyperlink>
     </w:p>
     <w:p>
       <w:pPr>
@@ -7591,8 +9042,17 @@
           <w:color w:val="000000"/>
           <w:sz w:val="24"/>
         </w:rPr>
-        <w:t>, 347(2), 310–317. https://doi.org/10.1124/jpet.113.207936</w:t>
-      </w:r>
+        <w:t xml:space="preserve">, 347(2), 310–317. </w:t>
+      </w:r>
+      <w:hyperlink r:id="rId161">
+        <w:r>
+          <w:rPr>
+            <w:color w:val="0000FF"/>
+            <w:u w:val="single"/>
+          </w:rPr>
+          <w:t>source</w:t>
+        </w:r>
+      </w:hyperlink>
     </w:p>
     <w:p>
       <w:pPr>
@@ -7622,8 +9082,17 @@
           <w:color w:val="000000"/>
           <w:sz w:val="24"/>
         </w:rPr>
-        <w:t>, 53(20), 7749–7759. https://doi.org/10.1021/jf051513y</w:t>
-      </w:r>
+        <w:t xml:space="preserve">, 53(20), 7749–7759. </w:t>
+      </w:r>
+      <w:hyperlink r:id="rId162">
+        <w:r>
+          <w:rPr>
+            <w:color w:val="0000FF"/>
+            <w:u w:val="single"/>
+          </w:rPr>
+          <w:t>source</w:t>
+        </w:r>
+      </w:hyperlink>
     </w:p>
     <w:p>
       <w:pPr>
@@ -7653,8 +9122,17 @@
           <w:color w:val="000000"/>
           <w:sz w:val="24"/>
         </w:rPr>
-        <w:t>, 59(3), 847–859. https://doi.org/10.1007/s13197-021-05073-0</w:t>
-      </w:r>
+        <w:t xml:space="preserve">, 59(3), 847–859. </w:t>
+      </w:r>
+      <w:hyperlink r:id="rId163">
+        <w:r>
+          <w:rPr>
+            <w:color w:val="0000FF"/>
+            <w:u w:val="single"/>
+          </w:rPr>
+          <w:t>source</w:t>
+        </w:r>
+      </w:hyperlink>
     </w:p>
     <w:p>
       <w:pPr>
@@ -7684,8 +9162,17 @@
           <w:color w:val="000000"/>
           <w:sz w:val="24"/>
         </w:rPr>
-        <w:t>, 275, 114152. https://doi.org/10.1016/j.jep.2021.114152</w:t>
-      </w:r>
+        <w:t xml:space="preserve">, 275, 114152. </w:t>
+      </w:r>
+      <w:hyperlink r:id="rId164">
+        <w:r>
+          <w:rPr>
+            <w:color w:val="0000FF"/>
+            <w:u w:val="single"/>
+          </w:rPr>
+          <w:t>source</w:t>
+        </w:r>
+      </w:hyperlink>
     </w:p>
     <w:p>
       <w:pPr>
@@ -7715,8 +9202,17 @@
           <w:color w:val="000000"/>
           <w:sz w:val="24"/>
         </w:rPr>
-        <w:t>, 115, 107166. https://doi.org/10.1016/j.vascn.2022.107166</w:t>
-      </w:r>
+        <w:t xml:space="preserve">, 115, 107166. </w:t>
+      </w:r>
+      <w:hyperlink r:id="rId165">
+        <w:r>
+          <w:rPr>
+            <w:color w:val="0000FF"/>
+            <w:u w:val="single"/>
+          </w:rPr>
+          <w:t>source</w:t>
+        </w:r>
+      </w:hyperlink>
     </w:p>
     <w:p>
       <w:pPr>
@@ -7746,8 +9242,17 @@
           <w:color w:val="000000"/>
           <w:sz w:val="24"/>
         </w:rPr>
-        <w:t>, 378(2), 114–122. https://doi.org/10.1124/jpet.121.000683</w:t>
-      </w:r>
+        <w:t xml:space="preserve">, 378(2), 114–122. </w:t>
+      </w:r>
+      <w:hyperlink r:id="rId166">
+        <w:r>
+          <w:rPr>
+            <w:color w:val="0000FF"/>
+            <w:u w:val="single"/>
+          </w:rPr>
+          <w:t>source</w:t>
+        </w:r>
+      </w:hyperlink>
     </w:p>
     <w:p>
       <w:pPr>
@@ -7777,8 +9282,17 @@
           <w:color w:val="000000"/>
           <w:sz w:val="24"/>
         </w:rPr>
-        <w:t>, 36(3), 1120–1134. https://doi.org/10.1002/ptr.7386</w:t>
-      </w:r>
+        <w:t xml:space="preserve">, 36(3), 1120–1134. </w:t>
+      </w:r>
+      <w:hyperlink r:id="rId167">
+        <w:r>
+          <w:rPr>
+            <w:color w:val="0000FF"/>
+            <w:u w:val="single"/>
+          </w:rPr>
+          <w:t>source</w:t>
+        </w:r>
+      </w:hyperlink>
     </w:p>
     <w:p>
       <w:pPr>
@@ -7808,8 +9322,17 @@
           <w:color w:val="000000"/>
           <w:sz w:val="24"/>
         </w:rPr>
-        <w:t>, 10(3), 456–470. https://doi.org/10.1093/toxres/tfab032</w:t>
-      </w:r>
+        <w:t xml:space="preserve">, 10(3), 456–470. </w:t>
+      </w:r>
+      <w:hyperlink r:id="rId168">
+        <w:r>
+          <w:rPr>
+            <w:color w:val="0000FF"/>
+            <w:u w:val="single"/>
+          </w:rPr>
+          <w:t>source</w:t>
+        </w:r>
+      </w:hyperlink>
     </w:p>
     <w:p>
       <w:pPr>
@@ -7839,8 +9362,17 @@
           <w:color w:val="000000"/>
           <w:sz w:val="24"/>
         </w:rPr>
-        <w:t>, 920, 174840. https://doi.org/10.1016/j.ejphar.2022.174840</w:t>
-      </w:r>
+        <w:t xml:space="preserve">, 920, 174840. </w:t>
+      </w:r>
+      <w:hyperlink r:id="rId169">
+        <w:r>
+          <w:rPr>
+            <w:color w:val="0000FF"/>
+            <w:u w:val="single"/>
+          </w:rPr>
+          <w:t>source</w:t>
+        </w:r>
+      </w:hyperlink>
     </w:p>
     <w:p>
       <w:pPr>
@@ -7870,8 +9402,17 @@
           <w:color w:val="000000"/>
           <w:sz w:val="24"/>
         </w:rPr>
-        <w:t>, 16(8). https://doi.org/10.7759/cureus.67439</w:t>
-      </w:r>
+        <w:t xml:space="preserve">, 16(8). </w:t>
+      </w:r>
+      <w:hyperlink r:id="rId170">
+        <w:r>
+          <w:rPr>
+            <w:color w:val="0000FF"/>
+            <w:u w:val="single"/>
+          </w:rPr>
+          <w:t>source</w:t>
+        </w:r>
+      </w:hyperlink>
     </w:p>
     <w:p>
       <w:pPr>
@@ -7901,8 +9442,17 @@
           <w:color w:val="000000"/>
           <w:sz w:val="24"/>
         </w:rPr>
-        <w:t>, 69, 145–182. https://doi.org/10.1146/annurev.biochem.69.1.145</w:t>
-      </w:r>
+        <w:t xml:space="preserve">, 69, 145–182. </w:t>
+      </w:r>
+      <w:hyperlink r:id="rId171">
+        <w:r>
+          <w:rPr>
+            <w:color w:val="0000FF"/>
+            <w:u w:val="single"/>
+          </w:rPr>
+          <w:t>source</w:t>
+        </w:r>
+      </w:hyperlink>
     </w:p>
     <w:p>
       <w:pPr>
@@ -7932,8 +9482,17 @@
           <w:color w:val="000000"/>
           <w:sz w:val="24"/>
         </w:rPr>
-        <w:t>, 14, 1756355. https://doi.org/10.3389/fcell.2026.1756355</w:t>
-      </w:r>
+        <w:t xml:space="preserve">, 14, 1756355. </w:t>
+      </w:r>
+      <w:hyperlink r:id="rId172">
+        <w:r>
+          <w:rPr>
+            <w:color w:val="0000FF"/>
+            <w:u w:val="single"/>
+          </w:rPr>
+          <w:t>source</w:t>
+        </w:r>
+      </w:hyperlink>
     </w:p>
     <w:p>
       <w:pPr>
@@ -7963,8 +9522,17 @@
           <w:color w:val="000000"/>
           <w:sz w:val="24"/>
         </w:rPr>
-        <w:t xml:space="preserve"> (9th ed.). Lippincott Williams &amp; Wilkins. https://obgyn.lwwhealthlibrary.com/book.aspx?bookid=2698</w:t>
-      </w:r>
+        <w:t xml:space="preserve"> (9th ed.). Lippincott Williams &amp; Wilkins. </w:t>
+      </w:r>
+      <w:hyperlink r:id="rId173">
+        <w:r>
+          <w:rPr>
+            <w:color w:val="0000FF"/>
+            <w:u w:val="single"/>
+          </w:rPr>
+          <w:t>source</w:t>
+        </w:r>
+      </w:hyperlink>
     </w:p>
     <w:p>
       <w:pPr>
@@ -7994,7 +9562,24 @@
           <w:color w:val="000000"/>
           <w:sz w:val="24"/>
         </w:rPr>
-        <w:t>, 42(1), 73–81. https://doi.org/10.1016/0952-3278(91)90070-L</w:t>
+        <w:t xml:space="preserve">, 42(1), 73–81. </w:t>
+      </w:r>
+      <w:hyperlink r:id="rId174">
+        <w:r>
+          <w:rPr>
+            <w:color w:val="0000FF"/>
+            <w:u w:val="single"/>
+          </w:rPr>
+          <w:t>source</w:t>
+        </w:r>
+      </w:hyperlink>
+      <w:r>
+        <w:rPr>
+          <w:rFonts w:ascii="Times New Roman" w:hAnsi="Times New Roman" w:eastAsia="Times New Roman"/>
+          <w:color w:val="000000"/>
+          <w:sz w:val="24"/>
+        </w:rPr>
+        <w:t>90070-L)</w:t>
       </w:r>
     </w:p>
     <w:p>
@@ -8025,8 +9610,17 @@
           <w:color w:val="000000"/>
           <w:sz w:val="24"/>
         </w:rPr>
-        <w:t>, 63(6), 533–538. https://doi.org/10.3109/00016348409156715</w:t>
-      </w:r>
+        <w:t xml:space="preserve">, 63(6), 533–538. </w:t>
+      </w:r>
+      <w:hyperlink r:id="rId175">
+        <w:r>
+          <w:rPr>
+            <w:color w:val="0000FF"/>
+            <w:u w:val="single"/>
+          </w:rPr>
+          <w:t>source</w:t>
+        </w:r>
+      </w:hyperlink>
     </w:p>
     <w:p>
       <w:pPr>
@@ -8056,8 +9650,17 @@
           <w:color w:val="000000"/>
           <w:sz w:val="24"/>
         </w:rPr>
-        <w:t>, 41(5), 1123–1131. https://doi.org/10.1002/jum.15801</w:t>
-      </w:r>
+        <w:t xml:space="preserve">, 41(5), 1123–1131. </w:t>
+      </w:r>
+      <w:hyperlink r:id="rId176">
+        <w:r>
+          <w:rPr>
+            <w:color w:val="0000FF"/>
+            <w:u w:val="single"/>
+          </w:rPr>
+          <w:t>source</w:t>
+        </w:r>
+      </w:hyperlink>
     </w:p>
     <w:p>
       <w:pPr>
@@ -8087,8 +9690,17 @@
           <w:color w:val="000000"/>
           <w:sz w:val="24"/>
         </w:rPr>
-        <w:t>, 9(10), 994. https://doi.org/10.3390/antiox9100994</w:t>
-      </w:r>
+        <w:t xml:space="preserve">, 9(10), 994. </w:t>
+      </w:r>
+      <w:hyperlink r:id="rId177">
+        <w:r>
+          <w:rPr>
+            <w:color w:val="0000FF"/>
+            <w:u w:val="single"/>
+          </w:rPr>
+          <w:t>source</w:t>
+        </w:r>
+      </w:hyperlink>
     </w:p>
     <w:p>
       <w:pPr>
@@ -8118,8 +9730,17 @@
           <w:color w:val="000000"/>
           <w:sz w:val="24"/>
         </w:rPr>
-        <w:t>, 116, 107192. https://doi.org/10.1016/j.vascn.2022.107192</w:t>
-      </w:r>
+        <w:t xml:space="preserve">, 116, 107192. </w:t>
+      </w:r>
+      <w:hyperlink r:id="rId178">
+        <w:r>
+          <w:rPr>
+            <w:color w:val="0000FF"/>
+            <w:u w:val="single"/>
+          </w:rPr>
+          <w:t>source</w:t>
+        </w:r>
+      </w:hyperlink>
     </w:p>
     <w:p>
       <w:pPr>
@@ -8149,8 +9770,17 @@
           <w:color w:val="000000"/>
           <w:sz w:val="24"/>
         </w:rPr>
-        <w:t>, 10(1), 28685. https://doi.org/10.3402/ljm.v10.28685</w:t>
-      </w:r>
+        <w:t xml:space="preserve">, 10(1), 28685. </w:t>
+      </w:r>
+      <w:hyperlink r:id="rId179">
+        <w:r>
+          <w:rPr>
+            <w:color w:val="0000FF"/>
+            <w:u w:val="single"/>
+          </w:rPr>
+          <w:t>source</w:t>
+        </w:r>
+      </w:hyperlink>
     </w:p>
     <w:p>
       <w:pPr>
@@ -8180,8 +9810,17 @@
           <w:color w:val="000000"/>
           <w:sz w:val="24"/>
         </w:rPr>
-        <w:t>, 138, 104705. https://doi.org/10.1016/j.neubiorev.2022.104705</w:t>
-      </w:r>
+        <w:t xml:space="preserve">, 138, 104705. </w:t>
+      </w:r>
+      <w:hyperlink r:id="rId180">
+        <w:r>
+          <w:rPr>
+            <w:color w:val="0000FF"/>
+            <w:u w:val="single"/>
+          </w:rPr>
+          <w:t>source</w:t>
+        </w:r>
+      </w:hyperlink>
     </w:p>
     <w:p>
       <w:pPr>
@@ -8211,8 +9850,17 @@
           <w:color w:val="000000"/>
           <w:sz w:val="24"/>
         </w:rPr>
-        <w:t>, 4, 17. https://doi.org/10.1186/1472-6882-4-17</w:t>
-      </w:r>
+        <w:t xml:space="preserve">, 4, 17. </w:t>
+      </w:r>
+      <w:hyperlink r:id="rId181">
+        <w:r>
+          <w:rPr>
+            <w:color w:val="0000FF"/>
+            <w:u w:val="single"/>
+          </w:rPr>
+          <w:t>source</w:t>
+        </w:r>
+      </w:hyperlink>
     </w:p>
     <w:p>
       <w:pPr>
@@ -8242,8 +9890,17 @@
           <w:color w:val="000000"/>
           <w:sz w:val="24"/>
         </w:rPr>
-        <w:t>, 164, 106675. https://doi.org/10.1016/j.prostaglandins.2023.106675</w:t>
-      </w:r>
+        <w:t xml:space="preserve">, 164, 106675. </w:t>
+      </w:r>
+      <w:hyperlink r:id="rId182">
+        <w:r>
+          <w:rPr>
+            <w:color w:val="0000FF"/>
+            <w:u w:val="single"/>
+          </w:rPr>
+          <w:t>source</w:t>
+        </w:r>
+      </w:hyperlink>
     </w:p>
     <w:p>
       <w:pPr>
@@ -8273,8 +9930,17 @@
           <w:color w:val="000000"/>
           <w:sz w:val="24"/>
         </w:rPr>
-        <w:t>, 28(5), 874–886. https://doi.org/10.1080/09540105.2017.1320357</w:t>
-      </w:r>
+        <w:t xml:space="preserve">, 28(5), 874–886. </w:t>
+      </w:r>
+      <w:hyperlink r:id="rId183">
+        <w:r>
+          <w:rPr>
+            <w:color w:val="0000FF"/>
+            <w:u w:val="single"/>
+          </w:rPr>
+          <w:t>source</w:t>
+        </w:r>
+      </w:hyperlink>
     </w:p>
     <w:p>
       <w:pPr>
@@ -8304,8 +9970,17 @@
           <w:color w:val="000000"/>
           <w:sz w:val="24"/>
         </w:rPr>
-        <w:t>, 34(2), 156–163. https://doi.org/10.1080/10412905.2022.2036629</w:t>
-      </w:r>
+        <w:t xml:space="preserve">, 34(2), 156–163. </w:t>
+      </w:r>
+      <w:hyperlink r:id="rId184">
+        <w:r>
+          <w:rPr>
+            <w:color w:val="0000FF"/>
+            <w:u w:val="single"/>
+          </w:rPr>
+          <w:t>source</w:t>
+        </w:r>
+      </w:hyperlink>
     </w:p>
     <w:p>
       <w:pPr>
@@ -8335,8 +10010,17 @@
           <w:color w:val="000000"/>
           <w:sz w:val="24"/>
         </w:rPr>
-        <w:t>, 38, 97–120. https://doi.org/10.1146/annurev.pharmtox.38.1.97</w:t>
-      </w:r>
+        <w:t xml:space="preserve">, 38, 97–120. </w:t>
+      </w:r>
+      <w:hyperlink r:id="rId185">
+        <w:r>
+          <w:rPr>
+            <w:color w:val="0000FF"/>
+            <w:u w:val="single"/>
+          </w:rPr>
+          <w:t>source</w:t>
+        </w:r>
+      </w:hyperlink>
     </w:p>
     <w:p>
       <w:pPr>
@@ -8366,8 +10050,17 @@
           <w:color w:val="000000"/>
           <w:sz w:val="24"/>
         </w:rPr>
-        <w:t>, 25(2), 289–301. https://doi.org/10.1080/0972060X.2022.2075501</w:t>
-      </w:r>
+        <w:t xml:space="preserve">, 25(2), 289–301. </w:t>
+      </w:r>
+      <w:hyperlink r:id="rId186">
+        <w:r>
+          <w:rPr>
+            <w:color w:val="0000FF"/>
+            <w:u w:val="single"/>
+          </w:rPr>
+          <w:t>source</w:t>
+        </w:r>
+      </w:hyperlink>
     </w:p>
     <w:p>
       <w:pPr>
@@ -8397,8 +10090,17 @@
           <w:color w:val="000000"/>
           <w:sz w:val="24"/>
         </w:rPr>
-        <w:t>, 249(2), R15–R26. https://doi.org/10.1530/JOE-20-0609</w:t>
-      </w:r>
+        <w:t xml:space="preserve">, 249(2), R15–R26. </w:t>
+      </w:r>
+      <w:hyperlink r:id="rId187">
+        <w:r>
+          <w:rPr>
+            <w:color w:val="0000FF"/>
+            <w:u w:val="single"/>
+          </w:rPr>
+          <w:t>source</w:t>
+        </w:r>
+      </w:hyperlink>
     </w:p>
     <w:p>
       <w:pPr>
@@ -8428,8 +10130,17 @@
           <w:color w:val="000000"/>
           <w:sz w:val="24"/>
         </w:rPr>
-        <w:t>, 6, 94. https://doi.org/10.1038/s41392-020-00443-w</w:t>
-      </w:r>
+        <w:t xml:space="preserve">, 6, 94. </w:t>
+      </w:r>
+      <w:hyperlink r:id="rId188">
+        <w:r>
+          <w:rPr>
+            <w:color w:val="0000FF"/>
+            <w:u w:val="single"/>
+          </w:rPr>
+          <w:t>source</w:t>
+        </w:r>
+      </w:hyperlink>
     </w:p>
     <w:p>
       <w:pPr>
@@ -8459,8 +10170,17 @@
           <w:color w:val="000000"/>
           <w:sz w:val="24"/>
         </w:rPr>
-        <w:t>, (4), CD002120. https://doi.org/10.1002/14651858.CD002120.pub3</w:t>
-      </w:r>
+        <w:t xml:space="preserve">, (4), CD002120. </w:t>
+      </w:r>
+      <w:hyperlink r:id="rId189">
+        <w:r>
+          <w:rPr>
+            <w:color w:val="0000FF"/>
+            <w:u w:val="single"/>
+          </w:rPr>
+          <w:t>source</w:t>
+        </w:r>
+      </w:hyperlink>
     </w:p>
     <w:p>
       <w:pPr>
@@ -8490,8 +10210,17 @@
           <w:color w:val="000000"/>
           <w:sz w:val="24"/>
         </w:rPr>
-        <w:t>, 121, 107213. https://doi.org/10.1016/j.vascn.2023.107213</w:t>
-      </w:r>
+        <w:t xml:space="preserve">, 121, 107213. </w:t>
+      </w:r>
+      <w:hyperlink r:id="rId190">
+        <w:r>
+          <w:rPr>
+            <w:color w:val="0000FF"/>
+            <w:u w:val="single"/>
+          </w:rPr>
+          <w:t>source</w:t>
+        </w:r>
+      </w:hyperlink>
     </w:p>
     <w:p>
       <w:pPr>
@@ -8521,8 +10250,17 @@
           <w:color w:val="000000"/>
           <w:sz w:val="24"/>
         </w:rPr>
-        <w:t>, 9, 1002147. https://doi.org/10.3389/fnut.2022.1002147</w:t>
-      </w:r>
+        <w:t xml:space="preserve">, 9, 1002147. </w:t>
+      </w:r>
+      <w:hyperlink r:id="rId191">
+        <w:r>
+          <w:rPr>
+            <w:color w:val="0000FF"/>
+            <w:u w:val="single"/>
+          </w:rPr>
+          <w:t>source</w:t>
+        </w:r>
+      </w:hyperlink>
     </w:p>
     <w:p>
       <w:pPr>
@@ -8552,8 +10290,17 @@
           <w:color w:val="000000"/>
           <w:sz w:val="24"/>
         </w:rPr>
-        <w:t>, 142(5), 501–512. https://doi.org/10.1248/yakushi.21-00223</w:t>
-      </w:r>
+        <w:t xml:space="preserve">, 142(5), 501–512. </w:t>
+      </w:r>
+      <w:hyperlink r:id="rId192">
+        <w:r>
+          <w:rPr>
+            <w:color w:val="0000FF"/>
+            <w:u w:val="single"/>
+          </w:rPr>
+          <w:t>source</w:t>
+        </w:r>
+      </w:hyperlink>
     </w:p>
     <w:p>
       <w:pPr>
@@ -8583,8 +10330,17 @@
           <w:color w:val="000000"/>
           <w:sz w:val="24"/>
         </w:rPr>
-        <w:t>, 64(3), 295–303. https://doi.org/10.1538/expanim.14-0111</w:t>
-      </w:r>
+        <w:t xml:space="preserve">, 64(3), 295–303. </w:t>
+      </w:r>
+      <w:hyperlink r:id="rId193">
+        <w:r>
+          <w:rPr>
+            <w:color w:val="0000FF"/>
+            <w:u w:val="single"/>
+          </w:rPr>
+          <w:t>source</w:t>
+        </w:r>
+      </w:hyperlink>
     </w:p>
     <w:p>
       <w:pPr>
@@ -8614,7 +10370,24 @@
           <w:color w:val="000000"/>
           <w:sz w:val="24"/>
         </w:rPr>
-        <w:t>, 14(2), 124–132. https://doi.org/10.1016/S1875-5364(16)60005-5</w:t>
+        <w:t xml:space="preserve">, 14(2), 124–132. </w:t>
+      </w:r>
+      <w:hyperlink r:id="rId194">
+        <w:r>
+          <w:rPr>
+            <w:color w:val="0000FF"/>
+            <w:u w:val="single"/>
+          </w:rPr>
+          <w:t>source</w:t>
+        </w:r>
+      </w:hyperlink>
+      <w:r>
+        <w:rPr>
+          <w:rFonts w:ascii="Times New Roman" w:hAnsi="Times New Roman" w:eastAsia="Times New Roman"/>
+          <w:color w:val="000000"/>
+          <w:sz w:val="24"/>
+        </w:rPr>
+        <w:t>60005-5)</w:t>
       </w:r>
     </w:p>
     <w:p>
@@ -8676,8 +10449,17 @@
           <w:color w:val="000000"/>
           <w:sz w:val="24"/>
         </w:rPr>
-        <w:t>, 23(10), 1063–1070. https://doi.org/10.1089/jmf.2020.4730</w:t>
-      </w:r>
+        <w:t xml:space="preserve">, 23(10), 1063–1070. </w:t>
+      </w:r>
+      <w:hyperlink r:id="rId195">
+        <w:r>
+          <w:rPr>
+            <w:color w:val="0000FF"/>
+            <w:u w:val="single"/>
+          </w:rPr>
+          <w:t>source</w:t>
+        </w:r>
+      </w:hyperlink>
     </w:p>
     <w:p>
       <w:pPr>
@@ -8707,8 +10489,17 @@
           <w:color w:val="000000"/>
           <w:sz w:val="24"/>
         </w:rPr>
-        <w:t>, 24(2), 345–356. https://doi.org/10.1177/039463201102400208</w:t>
-      </w:r>
+        <w:t xml:space="preserve">, 24(2), 345–356. </w:t>
+      </w:r>
+      <w:hyperlink r:id="rId196">
+        <w:r>
+          <w:rPr>
+            <w:color w:val="0000FF"/>
+            <w:u w:val="single"/>
+          </w:rPr>
+          <w:t>source</w:t>
+        </w:r>
+      </w:hyperlink>
     </w:p>
     <w:p>
       <w:pPr>
@@ -8738,7 +10529,24 @@
           <w:color w:val="000000"/>
           <w:sz w:val="24"/>
         </w:rPr>
-        <w:t>, 130(7), 833–847. https://doi.org/10.1016/0002-9378(78)90019-4</w:t>
+        <w:t xml:space="preserve">, 130(7), 833–847. </w:t>
+      </w:r>
+      <w:hyperlink r:id="rId197">
+        <w:r>
+          <w:rPr>
+            <w:color w:val="0000FF"/>
+            <w:u w:val="single"/>
+          </w:rPr>
+          <w:t>source</w:t>
+        </w:r>
+      </w:hyperlink>
+      <w:r>
+        <w:rPr>
+          <w:rFonts w:ascii="Times New Roman" w:hAnsi="Times New Roman" w:eastAsia="Times New Roman"/>
+          <w:color w:val="000000"/>
+          <w:sz w:val="24"/>
+        </w:rPr>
+        <w:t>90019-4)</w:t>
       </w:r>
     </w:p>
     <w:p>
@@ -8769,8 +10577,17 @@
           <w:color w:val="000000"/>
           <w:sz w:val="24"/>
         </w:rPr>
-        <w:t>, 268(3), 204–212. https://doi.org/10.1016/j.tox.2009.12.018</w:t>
-      </w:r>
+        <w:t xml:space="preserve">, 268(3), 204–212. </w:t>
+      </w:r>
+      <w:hyperlink r:id="rId198">
+        <w:r>
+          <w:rPr>
+            <w:color w:val="0000FF"/>
+            <w:u w:val="single"/>
+          </w:rPr>
+          <w:t>source</w:t>
+        </w:r>
+      </w:hyperlink>
     </w:p>
     <w:p>
       <w:pPr>
@@ -8800,8 +10617,17 @@
           <w:color w:val="000000"/>
           <w:sz w:val="24"/>
         </w:rPr>
-        <w:t>, 102, 154178. https://doi.org/10.1016/j.phymed.2022.154178</w:t>
-      </w:r>
+        <w:t xml:space="preserve">, 102, 154178. </w:t>
+      </w:r>
+      <w:hyperlink r:id="rId199">
+        <w:r>
+          <w:rPr>
+            <w:color w:val="0000FF"/>
+            <w:u w:val="single"/>
+          </w:rPr>
+          <w:t>source</w:t>
+        </w:r>
+      </w:hyperlink>
     </w:p>
     <w:p>
       <w:pPr>
@@ -8831,8 +10657,17 @@
           <w:color w:val="000000"/>
           <w:sz w:val="24"/>
         </w:rPr>
-        <w:t>, 14, 2167–2176. https://doi.org/10.2147/JPR.S318522</w:t>
-      </w:r>
+        <w:t xml:space="preserve">, 14, 2167–2176. </w:t>
+      </w:r>
+      <w:hyperlink r:id="rId200">
+        <w:r>
+          <w:rPr>
+            <w:color w:val="0000FF"/>
+            <w:u w:val="single"/>
+          </w:rPr>
+          <w:t>source</w:t>
+        </w:r>
+      </w:hyperlink>
     </w:p>
     <w:p>
       <w:pPr>
@@ -8862,8 +10697,17 @@
           <w:color w:val="000000"/>
           <w:sz w:val="24"/>
         </w:rPr>
-        <w:t>, 55(7), 999–1003. https://doi.org/10.1021/np50085a029</w:t>
-      </w:r>
+        <w:t xml:space="preserve">, 55(7), 999–1003. </w:t>
+      </w:r>
+      <w:hyperlink r:id="rId201">
+        <w:r>
+          <w:rPr>
+            <w:color w:val="0000FF"/>
+            <w:u w:val="single"/>
+          </w:rPr>
+          <w:t>source</w:t>
+        </w:r>
+      </w:hyperlink>
     </w:p>
     <w:p>
       <w:pPr>
@@ -8893,8 +10737,17 @@
           <w:color w:val="000000"/>
           <w:sz w:val="24"/>
         </w:rPr>
-        <w:t>, 13, 887142. https://doi.org/10.3389/fendo.2022.887142</w:t>
-      </w:r>
+        <w:t xml:space="preserve">, 13, 887142. </w:t>
+      </w:r>
+      <w:hyperlink r:id="rId202">
+        <w:r>
+          <w:rPr>
+            <w:color w:val="0000FF"/>
+            <w:u w:val="single"/>
+          </w:rPr>
+          <w:t>source</w:t>
+        </w:r>
+      </w:hyperlink>
     </w:p>
     <w:p>
       <w:pPr>
@@ -8924,8 +10777,17 @@
           <w:color w:val="000000"/>
           <w:sz w:val="24"/>
         </w:rPr>
-        <w:t>, 26(2), e98–e108. https://doi.org/10.1016/j.pmn.2025.02.001</w:t>
-      </w:r>
+        <w:t xml:space="preserve">, 26(2), e98–e108. </w:t>
+      </w:r>
+      <w:hyperlink r:id="rId203">
+        <w:r>
+          <w:rPr>
+            <w:color w:val="0000FF"/>
+            <w:u w:val="single"/>
+          </w:rPr>
+          <w:t>source</w:t>
+        </w:r>
+      </w:hyperlink>
     </w:p>
     <w:p>
       <w:pPr>
@@ -8955,8 +10817,17 @@
           <w:color w:val="000000"/>
           <w:sz w:val="24"/>
         </w:rPr>
-        <w:t>, 10, 16234. https://doi.org/10.1038/s41598-020-73295-9</w:t>
-      </w:r>
+        <w:t xml:space="preserve">, 10, 16234. </w:t>
+      </w:r>
+      <w:hyperlink r:id="rId204">
+        <w:r>
+          <w:rPr>
+            <w:color w:val="0000FF"/>
+            <w:u w:val="single"/>
+          </w:rPr>
+          <w:t>source</w:t>
+        </w:r>
+      </w:hyperlink>
     </w:p>
     <w:p>
       <w:pPr>
@@ -8986,8 +10857,17 @@
           <w:color w:val="000000"/>
           <w:sz w:val="24"/>
         </w:rPr>
-        <w:t>, 1260, 127–142. https://doi.org/10.1007/978-3-030-47483-6_7</w:t>
-      </w:r>
+        <w:t xml:space="preserve">, 1260, 127–142. </w:t>
+      </w:r>
+      <w:hyperlink r:id="rId205">
+        <w:r>
+          <w:rPr>
+            <w:color w:val="0000FF"/>
+            <w:u w:val="single"/>
+          </w:rPr>
+          <w:t>source</w:t>
+        </w:r>
+      </w:hyperlink>
     </w:p>
     <w:p>
       <w:pPr>
@@ -9017,8 +10897,17 @@
           <w:color w:val="000000"/>
           <w:sz w:val="24"/>
         </w:rPr>
-        <w:t>, 24(9), 1675. https://doi.org/10.3390/molecules24091675</w:t>
-      </w:r>
+        <w:t xml:space="preserve">, 24(9), 1675. </w:t>
+      </w:r>
+      <w:hyperlink r:id="rId206">
+        <w:r>
+          <w:rPr>
+            <w:color w:val="0000FF"/>
+            <w:u w:val="single"/>
+          </w:rPr>
+          <w:t>source</w:t>
+        </w:r>
+      </w:hyperlink>
     </w:p>
     <w:p>
       <w:pPr>
@@ -9048,8 +10937,17 @@
           <w:color w:val="000000"/>
           <w:sz w:val="24"/>
         </w:rPr>
-        <w:t>, 2018, 3957262. https://doi.org/10.1155/2018/3957262</w:t>
-      </w:r>
+        <w:t xml:space="preserve">, 2018, 3957262. </w:t>
+      </w:r>
+      <w:hyperlink r:id="rId207">
+        <w:r>
+          <w:rPr>
+            <w:color w:val="0000FF"/>
+            <w:u w:val="single"/>
+          </w:rPr>
+          <w:t>source</w:t>
+        </w:r>
+      </w:hyperlink>
     </w:p>
     <w:sectPr>
       <w:footerReference w:type="default" r:id="rId9"/>

</xml_diff>

<commit_message>
feat: restructure Chapter 1 to start from female reproductive system and consolidate headings
</commit_message>
<xml_diff>
--- a/output/draft/iyare-draft.docx
+++ b/output/draft/iyare-draft.docx
@@ -41,12 +41,12 @@
           <w:color w:val="000000"/>
           <w:sz w:val="24"/>
         </w:rPr>
-        <w:t>1.1 Background of Dysmenorrhea</w:t>
+        <w:t>1.1 Human Female Reproductive System</w:t>
       </w:r>
     </w:p>
     <w:p>
       <w:pPr>
-        <w:pStyle w:val="Heading3"/>
+        <w:spacing w:line="360" w:lineRule="auto" w:after="0"/>
         <w:jc w:val="both"/>
       </w:pPr>
       <w:r>
@@ -55,7 +55,7 @@
           <w:color w:val="000000"/>
           <w:sz w:val="24"/>
         </w:rPr>
-        <w:t>1.1.1 Clinical Definition and Historical Context</w:t>
+        <w:t>The human female reproductive system is a complex and highly specialized network of internal and external organs fundamentally designed to facilitate reproduction, support embryonic development, and sustain hormonal equilibrium. The internal reproductive organs, situated within the true pelvic cavity, include the vagina, uterus, fallopian tubes, and ovaries. The vagina serves as a fibromuscular canal connecting the external genitalia to the cervix of the uterus, acting as the receptacle for sperm during copulation and the birth canal during parturition. Superior to the vagina lies the uterus, a robust, hollow, pear-shaped muscular organ that plays a central role in menstruation, implantation, and gestation. Extending laterally from the superior angles of the uterus are the fallopian tubes, also known as uterine tubes or oviducts. These tubular structures facilitate the transport of the ovum from the ovary to the uterine cavity and serve as the primary physiological site for fertilization. The ovaries, paired almond-shaped gonads located adjacent to the lateral pelvic walls, are responsible for oogenesis—the production and maturation of ova—and the synthesis of crucial steroid hormones, primarily estrogen and progesterone, which govern the cyclical changes of the reproductive tract and maintain early pregnancy (Tortora &amp; Derrickson, 2017).</w:t>
       </w:r>
     </w:p>
     <w:p>
@@ -69,62 +69,25 @@
           <w:color w:val="000000"/>
           <w:sz w:val="24"/>
         </w:rPr>
-        <w:t xml:space="preserve">Dysmenorrhea, originating from the Greek words </w:t>
-      </w:r>
-      <w:r>
-        <w:rPr>
-          <w:rFonts w:ascii="Times New Roman" w:hAnsi="Times New Roman" w:eastAsia="Times New Roman"/>
-          <w:i/>
-          <w:color w:val="000000"/>
-          <w:sz w:val="24"/>
-        </w:rPr>
-        <w:t>dys</w:t>
-      </w:r>
-      <w:r>
-        <w:rPr>
-          <w:rFonts w:ascii="Times New Roman" w:hAnsi="Times New Roman" w:eastAsia="Times New Roman"/>
-          <w:color w:val="000000"/>
-          <w:sz w:val="24"/>
-        </w:rPr>
-        <w:t xml:space="preserve"> (difficult/painful), </w:t>
-      </w:r>
-      <w:r>
-        <w:rPr>
-          <w:rFonts w:ascii="Times New Roman" w:hAnsi="Times New Roman" w:eastAsia="Times New Roman"/>
-          <w:i/>
-          <w:color w:val="000000"/>
-          <w:sz w:val="24"/>
-        </w:rPr>
-        <w:t>meno</w:t>
-      </w:r>
-      <w:r>
-        <w:rPr>
-          <w:rFonts w:ascii="Times New Roman" w:hAnsi="Times New Roman" w:eastAsia="Times New Roman"/>
-          <w:color w:val="000000"/>
-          <w:sz w:val="24"/>
-        </w:rPr>
-        <w:t xml:space="preserve"> (month), and </w:t>
-      </w:r>
-      <w:r>
-        <w:rPr>
-          <w:rFonts w:ascii="Times New Roman" w:hAnsi="Times New Roman" w:eastAsia="Times New Roman"/>
-          <w:i/>
-          <w:color w:val="000000"/>
-          <w:sz w:val="24"/>
-        </w:rPr>
-        <w:t>rrhea</w:t>
-      </w:r>
-      <w:r>
-        <w:rPr>
-          <w:rFonts w:ascii="Times New Roman" w:hAnsi="Times New Roman" w:eastAsia="Times New Roman"/>
-          <w:color w:val="000000"/>
-          <w:sz w:val="24"/>
-        </w:rPr>
-        <w:t xml:space="preserve"> (flow), is clinically defined as painful menstrual cramps of uterine origin. It represents one of the most prevalent and functionally debilitating gynecological disorders among women of reproductive age worldwide. Clinicians broadly classify this condition into two distinct pathophysiological categories: primary dysmenorrhea and secondary dysmenorrhea (Ferries-Rowe et al., 2020). Primary dysmenorrhea involves severe pelvic pain that manifests in the absolute absence of any identifiable pathological condition or macroscopic structural abnormality within the pelvis. Secondary dysmenorrhea, by contrast, describes pain directly attributable to underlying structural pelvic diseases, such as endometriosis, adenomyosis, uterine fibroids, or pelvic inflammatory disease (Iacovides et al., 2015).</w:t>
+        <w:t>The functional integrity of this system is heavily reliant on the hypothalamic-pituitary-ovarian (HPO) axis, a highly regulated neuroendocrine feedback loop. The hypothalamus pulsatilely secretes gonadotropin-releasing hormone (GnRH), which in turn stimulates the anterior pituitary gland to release follicle-stimulating hormone (FSH) and luteinizing hormone (LH). These gonadotropins exert direct effects on the ovarian tissues, orchestrating follicular development, ovulation, and the subsequent formation of the corpus luteum. The ovarian steroid hormones then act on the uterine endometrium, preparing it for potential embryonic implantation, while simultaneously providing negative or positive feedback to the hypothalamus and pituitary to modulate further gonadotropin release. Any disruption or dysregulation within this neuroendocrine axis, or structural pathology within the reproductive organs themselves, can lead to significant gynecological and reproductive disorders, including dysmenorrhea, infertility, and abnormal uterine bleeding (Hall, 2015).</w:t>
       </w:r>
     </w:p>
     <w:p>
       <w:pPr>
+        <w:pStyle w:val="Heading2"/>
+        <w:jc w:val="both"/>
+      </w:pPr>
+      <w:r>
+        <w:rPr>
+          <w:rFonts w:ascii="Times New Roman" w:hAnsi="Times New Roman" w:eastAsia="Times New Roman"/>
+          <w:color w:val="000000"/>
+          <w:sz w:val="24"/>
+        </w:rPr>
+        <w:t>1.2 The Human Uterus</w:t>
+      </w:r>
+    </w:p>
+    <w:p>
+      <w:pPr>
         <w:spacing w:line="360" w:lineRule="auto" w:after="0"/>
         <w:jc w:val="both"/>
       </w:pPr>
@@ -134,12 +97,12 @@
           <w:color w:val="000000"/>
           <w:sz w:val="24"/>
         </w:rPr>
-        <w:t>Primary dysmenorrhea typically begins within the first few years following menarche, usually coinciding with the establishment of ovulatory menstrual cycles. The clinical presentation is highly stereotyped yet intensely severe: it presents as acute, cramping, colicky lower abdominal pain that frequently radiates to the lower back, lumbosacral region, and anterior thighs. This localized pelvic pain rarely occurs in isolation; it is overwhelmingly accompanied by a constellation of systemic symptoms including severe nausea, vomiting, profound fatigue, diarrhea, diaphoresis, and headache (Burnett &amp; Lemyre, 2017). These systemic manifestations collectively impair the individual's functional capacity, often forcing women to miss school or work. The onset of this pain usually strictly coincides with the initiation of menstruation, beginning a few hours before or immediately after menstrual bleeding starts, and it generally persists for a duration of 24 to 72 hours, perfectly tracking the period of maximal prostaglandin release (Dawood, 2006).</w:t>
+        <w:t>The human uterus is a thick-walled, highly muscular organ situated anatomically between the urinary bladder anteriorly and the rectum posteriorly. It is structurally divided into three distinct anatomical regions: the fundus (the dome-shaped superior portion above the entry points of the fallopian tubes), the body or corpus (the central, major tapering portion), and the cervix (the inferior, narrow cylindrical segment that protrudes into the superior aspect of the vaginal canal). The uterine wall itself is composed of three histologically distinct layers. The outermost layer is the perimetrium, a thin serous membrane derived from the visceral peritoneum that provides a frictionless surface for the organ within the pelvic cavity. The middle layer, the myometrium, forms the bulk of the uterine wall and consists of three interwoven layers of smooth muscle fibers. These fibers are arranged longitudinally, circularly, and obliquely, an architectural design that generates the powerful, coordinated, and multidirectional contractions required to expel the fetus during labor and to shed the endometrial lining during menstruation. The innermost layer is the endometrium, a highly vascularized mucosal lining that is further subdivided into a superficial stratum functionalis and a deeper stratum basalis. The stratum functionalis undergoes dramatic cyclical proliferation, secretion, and subsequent necrosis and sloughing during the menstrual cycle in response to fluctuating ovarian hormones. Conversely, the stratum basalis remains intact during menstruation and serves as the regenerative source for the new functional layer in subsequent cycles. The physiological capability of the uterus to expand massively during gestation and contract forcefully during parturition and menstruation underscores its essential role in reproductive biology, while hypersensitivity or dysrhythmia of the myometrium serves as the primary pathophysiological driver of dysmenorrhea (Cunningham et al., 2018).</w:t>
       </w:r>
     </w:p>
     <w:p>
       <w:pPr>
-        <w:pStyle w:val="Heading3"/>
+        <w:pStyle w:val="Heading2"/>
         <w:jc w:val="both"/>
       </w:pPr>
       <w:r>
@@ -148,7 +111,7 @@
           <w:color w:val="000000"/>
           <w:sz w:val="24"/>
         </w:rPr>
-        <w:t>1.1.2 Diagnostic Differentiation and Evaluation</w:t>
+        <w:t>1.3 The Ovarian and Endometrial Cycle</w:t>
       </w:r>
     </w:p>
     <w:p>
@@ -162,7 +125,7 @@
           <w:color w:val="000000"/>
           <w:sz w:val="24"/>
         </w:rPr>
-        <w:t>The accurate diagnosis of primary dysmenorrhea rests heavily on a comprehensive clinical history and the explicit exclusion of pelvic pathology. Women presenting with a typical history—cramping pain initiating just prior to or with menses and lasting for 2-3 days—often do not require extensive laboratory or radiological evaluation initially, provided their pelvic examination is entirely normal (Itriyeva, 2022). However, the clinical overlap between primary and secondary dysmenorrhea, particularly endometriosis, demands high clinical vigilance. Clinicians must actively search for "red flag" symptoms that suggest secondary dysmenorrhea: pain that progressively worsens over time, pain that extends beyond the menstrual phase into the follicular or luteal phases, abnormal uterine bleeding, dyspareunia, or a distinct lack of response to first-line pharmacotherapy such as nonsteroidal anti-inflammatory drugs (NSAIDs) (Smith et al., 2024).</w:t>
+        <w:t>The female reproductive cycle encompasses concurrent, hormonally synchronized changes in both the ovaries (the ovarian cycle) and the uterine lining (the endometrial cycle), typically spanning an average of 28 days. The ovarian cycle is characterized by three distinct phases: the follicular phase, ovulation, and the luteal phase. Driven by follicle-stimulating hormone (FSH) from the anterior pituitary, the follicular phase involves the maturation of a cohort of ovarian follicles, one of which will become the dominant graafian follicle. This maturing follicle secretes increasing amounts of estrogen. A sharp surge in luteinizing hormone (LH), triggered by the peak estrogen levels, induces ovulation—the rupture of the mature follicle and the release of the secondary oocyte. Following ovulation, the remnants of the ruptured follicle reorganize into the corpus luteum, initiating the luteal phase. The corpus luteum secretes copious amounts of progesterone and estrogen, which are essential for maintaining the uterine lining in a state receptive to implantation. If fertilization does not occur, the corpus luteum inevitably degenerates into the corpus albicans, leading to a precipitous drop in circulating progesterone and estrogen levels (Guyton &amp; Hall, 2011).</w:t>
       </w:r>
     </w:p>
     <w:p>
@@ -176,12 +139,12 @@
           <w:color w:val="000000"/>
           <w:sz w:val="24"/>
         </w:rPr>
-        <w:t>The initial evaluation logically involves a targeted pelvic examination to assess for uterine enlargement, adnexal masses, or cervical motion tenderness. In cases where secondary dysmenorrhea is strongly suspected, or when empiric therapy unequivocally fails, pelvic ultrasonography serves as the primary imaging modality of choice to evaluate the pelvic organs for structural anomalies (Itriyeva, 2022). Only when structural anomalies are ruled out can a definitive diagnosis of primary dysmenorrhea be established and confidently managed.</w:t>
+        <w:t>Synchronized with these ovarian events, the endometrial cycle progresses through the menstrual, proliferative, and secretory phases. The proliferative phase occurs concomitantly with the ovarian follicular phase, during which rising estrogen levels stimulate the rapid regeneration and thickening of the stratum functionalis of the endometrium. Following ovulation, the cycle enters the secretory phase, governed primarily by progesterone from the corpus luteum. Progesterone induces the endometrial glands to secrete glycogen-rich fluids and promotes extensive vascularization, optimizing the environment for embryonic implantation. When pregnancy fails to occur, the withdrawal of estrogen and progesterone initiates the menstrual phase. This sudden hormonal deprivation triggers the localized synthesis and release of prostaglandins, notably prostaglandin F2-alpha (PGF2α), from the degenerating endometrial cells. These prostaglandins induce intense vasospasm of the spiral arterioles, leading to profound ischemia, necrosis, and the eventual sloughing of the stratum functionalis, which clinically manifests as menstrual bleeding. The cyclic production of these inflammatory mediators and the resulting myometrial contractions are central to the etiology of primary dysmenorrhea (Dawood, 2006).</w:t>
       </w:r>
     </w:p>
     <w:p>
       <w:pPr>
-        <w:pStyle w:val="Heading3"/>
+        <w:pStyle w:val="Heading2"/>
         <w:jc w:val="both"/>
       </w:pPr>
       <w:r>
@@ -190,7 +153,7 @@
           <w:color w:val="000000"/>
           <w:sz w:val="24"/>
         </w:rPr>
-        <w:t>1.1.3 Expanding the Pathophysiological Framework</w:t>
+        <w:t>1.4 The Mouse Uterus</w:t>
       </w:r>
     </w:p>
     <w:p>
@@ -204,11 +167,25 @@
           <w:color w:val="000000"/>
           <w:sz w:val="24"/>
         </w:rPr>
-        <w:t xml:space="preserve">While the hypersecretion of prostaglandins (specifically PGF2α and PGE2) forms the central tenet of primary dysmenorrhea pathophysiology, contemporary research has vastly expanded our understanding of the underlying mechanisms. Prostaglandin F2-alpha acts as a potent myometrial stimulant and vasoconstrictor. Its elevated levels trigger uterine hypercontractility, characterized by high-amplitude and high-frequency contractions that drastically increase intrauterine pressure to levels exceeding 60 mmHg, effectively collapsing the uterine microvasculature (Akerlund, 1979; Smith et al., 2024). This intense contractile activity leads directly to uterine ischemia and profound hypoxia, culminating in acute cramping pain. </w:t>
+        <w:t>The mouse uterus, widely utilized as an experimental model in reproductive pharmacology and toxicology, exhibits significant anatomical and physiological differences from the human uterus, while sharing fundamental histological characteristics. Unlike the simplex uterus of humans, the mouse possesses a bicornuate (duplex) uterus, consisting of two distinct, elongated uterine horns that converge inferiorly at a single cervix opening into the vagina. This structural adaptation facilitates multifetal pregnancies typical of the species. Despite this gross anatomical divergence, the histological architecture of the murine uterine wall closely mirrors that of the human. It comprises an outer serosal perimetrium, a thick middle myometrium, and an inner mucosal endometrium. The murine myometrium is distinctly organized into an outer longitudinal smooth muscle layer and an inner circular smooth muscle layer, separated by a highly vascularized connective tissue band. This muscular arrangement allows for the robust, rhythmic, and coordinated contractions necessary for pup delivery. The structural parallels in myometrial anatomy and the functional similarities in excitation-contraction coupling mechanisms make the isolated mouse uterus a highly reliable and extensively validated ex vivo model for evaluating the uterotonic (contractile) or tocolytic (relaxant) properties of pharmacological agents and medicinal plant extracts, including those investigated for antidysmenorrhea efficacy (Vogel, 2008).</w:t>
       </w:r>
     </w:p>
     <w:p>
       <w:pPr>
+        <w:pStyle w:val="Heading2"/>
+        <w:jc w:val="both"/>
+      </w:pPr>
+      <w:r>
+        <w:rPr>
+          <w:rFonts w:ascii="Times New Roman" w:hAnsi="Times New Roman" w:eastAsia="Times New Roman"/>
+          <w:color w:val="000000"/>
+          <w:sz w:val="24"/>
+        </w:rPr>
+        <w:t>1.5 The Female Mice Reproductive Cycle</w:t>
+      </w:r>
+    </w:p>
+    <w:p>
+      <w:pPr>
         <w:spacing w:line="360" w:lineRule="auto" w:after="0"/>
         <w:jc w:val="both"/>
       </w:pPr>
@@ -218,12 +195,12 @@
           <w:color w:val="000000"/>
           <w:sz w:val="24"/>
         </w:rPr>
-        <w:t>However, recent investigations highlight the significant involvement of neurohypophyseal hormones and oxidative stress. Vasopressin and oxytocin critically modulate uterine contractility. Vasopressin, in particular, demonstrates marked uterotonic properties and exacerbates myometrial hyperactivity and ischemia, with elevated circulating levels frequently detected in women experiencing severe primary dysmenorrhea (Fuchs et al., 2002). Furthermore, researchers have recently elucidated the role of systemic oxidative stress in this condition. A systematic review by Szydłowska et al. (2020) demonstrated definitively that women with primary dysmenorrhea exhibit significantly elevated markers of lipid peroxidation and a concomitant depletion of antioxidant reserves compared to asymptomatic controls. The accumulation of reactive oxygen species (ROS) in the pelvic cavity further sensitizes peripheral nociceptors and exacerbates the local inflammatory response driven by the cyclooxygenase pathway.</w:t>
+        <w:t>The reproductive cycle of the female mouse, termed the estrous cycle, is a rapid and continuous polyestrous process typically lasting between 4 to 5 days, contrasting sharply with the 28-day human menstrual cycle. The murine estrous cycle is conventionally divided into four distinct stages: proestrus, estrus, metestrus, and diestrus. These stages are governed by the cyclical secretion of gonadotropins and ovarian steroids and can be accurately identified through the cytological examination of vaginal smears. Proestrus is the pre-ovulatory phase characterized by peak systemic levels of estrogen, which induce rapid cellular proliferation within the reproductive tract. During this phase, the vaginal smear predominantly consists of nucleated epithelial cells. Estrus, the phase of sexual receptivity (heat) and ovulation, immediately follows. Estrogen levels begin to decline while progesterone levels surge, leading to the cornification of the vaginal epithelium; hence, the smear exhibits predominantly anucleated, cornified epithelial cells. Metestrus represents the early post-ovulatory period where the corpus luteum begins its formation, characterized by a mixed population of cornified epithelial cells and a massive influx of leukocytes. Finally, diestrus is the longest phase of the cycle, representing the luteal phase where progesterone levels peak. If the mouse does not mate or fails to conceive, the corpus luteum rapidly regresses, and the vaginal smear shows a predominance of leukocytes with sparse nucleated epithelial cells, preparing the cycle to restart (Byers et al., 2012). The continuous and predictable nature of the murine estrous cycle, combined with the profound influence of cyclic hormonal fluctuations on myometrial sensitivity to exogenous contractile and relaxant agents, makes the female mouse an indispensable model for investigating the pharmacological effects of novel therapies on uterine physiology.</w:t>
       </w:r>
     </w:p>
     <w:p>
       <w:pPr>
-        <w:pStyle w:val="Heading3"/>
+        <w:pStyle w:val="Heading2"/>
         <w:jc w:val="both"/>
       </w:pPr>
       <w:r>
@@ -232,7 +209,7 @@
           <w:color w:val="000000"/>
           <w:sz w:val="24"/>
         </w:rPr>
-        <w:t>1.1.4 Risk Factors and Systemic Impact</w:t>
+        <w:t>1.6 Dysmenorrhea and Uterine Contractility</w:t>
       </w:r>
     </w:p>
     <w:p>
@@ -246,11 +223,76 @@
           <w:color w:val="000000"/>
           <w:sz w:val="24"/>
         </w:rPr>
-        <w:t>The development and severity of primary dysmenorrhea do not occur uniformly across the population; specific demographic and lifestyle factors heavily influence its clinical trajectory. A massive meta-analysis comprising over 78,000 university students globally confirmed that low body mass index (BMI), early menarche (onset before age 12), prolonged menstrual flow, and a positive family history represent the most significant independent predictors of severe dysmenorrhea (Li et al., 2022). Furthermore, lifestyle variables, including cigarette smoking and highly stressful academic or psychosocial environments, directly correlate with increased pain severity and duration.</w:t>
+        <w:t xml:space="preserve">Dysmenorrhea, originating from the Greek words </w:t>
+      </w:r>
+      <w:r>
+        <w:rPr>
+          <w:rFonts w:ascii="Times New Roman" w:hAnsi="Times New Roman" w:eastAsia="Times New Roman"/>
+          <w:i/>
+          <w:color w:val="000000"/>
+          <w:sz w:val="24"/>
+        </w:rPr>
+        <w:t>dys</w:t>
+      </w:r>
+      <w:r>
+        <w:rPr>
+          <w:rFonts w:ascii="Times New Roman" w:hAnsi="Times New Roman" w:eastAsia="Times New Roman"/>
+          <w:color w:val="000000"/>
+          <w:sz w:val="24"/>
+        </w:rPr>
+        <w:t xml:space="preserve"> (difficult/painful), </w:t>
+      </w:r>
+      <w:r>
+        <w:rPr>
+          <w:rFonts w:ascii="Times New Roman" w:hAnsi="Times New Roman" w:eastAsia="Times New Roman"/>
+          <w:i/>
+          <w:color w:val="000000"/>
+          <w:sz w:val="24"/>
+        </w:rPr>
+        <w:t>meno</w:t>
+      </w:r>
+      <w:r>
+        <w:rPr>
+          <w:rFonts w:ascii="Times New Roman" w:hAnsi="Times New Roman" w:eastAsia="Times New Roman"/>
+          <w:color w:val="000000"/>
+          <w:sz w:val="24"/>
+        </w:rPr>
+        <w:t xml:space="preserve"> (month), and </w:t>
+      </w:r>
+      <w:r>
+        <w:rPr>
+          <w:rFonts w:ascii="Times New Roman" w:hAnsi="Times New Roman" w:eastAsia="Times New Roman"/>
+          <w:i/>
+          <w:color w:val="000000"/>
+          <w:sz w:val="24"/>
+        </w:rPr>
+        <w:t>rrhea</w:t>
+      </w:r>
+      <w:r>
+        <w:rPr>
+          <w:rFonts w:ascii="Times New Roman" w:hAnsi="Times New Roman" w:eastAsia="Times New Roman"/>
+          <w:color w:val="000000"/>
+          <w:sz w:val="24"/>
+        </w:rPr>
+        <w:t xml:space="preserve"> (flow), is clinically defined as painful menstrual cramps of uterine origin. It represents one of the most prevalent and functionally debilitating gynecological disorders among women of reproductive age worldwide. Clinicians broadly classify this condition into primary dysmenorrhea, which involves severe pelvic pain without any identifiable pathological condition, and secondary dysmenorrhea, which describes pain directly attributable to underlying structural pelvic diseases such as endometriosis or uterine fibroids (Ferries-Rowe et al., 2020). Epidemiologically, primary dysmenorrhea affects between 45% and 95% of menstruating women, with up to 20% reporting pain so severe that it routinely results in absenteeism from school or work, leading to substantial economic and psychological burdens (Ju et al., 2014). The fundamental pathophysiology of primary dysmenorrhea is deeply rooted in hypercontractility of the myometrium, driven primarily by the overproduction of prostaglandins, specifically prostaglandin F2-alpha (PGF2α) and prostaglandin E2 (PGE2), within the sloughing endometrium. During menstruation, the withdrawal of progesterone triggers the release of lysosomal enzymes, which cleave arachidonic acid from cell membrane phospholipids. This arachidonic acid is rapidly metabolized by the cyclooxygenase (COX) enzyme system into inflammatory prostaglandins. High concentrations of PGF2α induce potent, dysrhythmic, and sustained myometrial contractions, driving intrauterine pressures above 400 mmHg and reducing the resting interval between contractions. This extreme basal tone and hypercontractility compress the spiral arterioles supplying the myometrium, causing profound focal ischemia and hypoxia. The accumulation of anaerobic metabolites, such as lactic acid, alongside the direct sensitization of afferent pain nerve terminals by PGE2, ultimately culminates in the severe, cramping pelvic pain characteristic of the disorder. Consequently, therapeutic strategies largely focus on mitigating this prostaglandin-induced uterine hypercontractility (Iacovides et al., 2015).</w:t>
       </w:r>
     </w:p>
     <w:p>
       <w:pPr>
+        <w:pStyle w:val="Heading2"/>
+        <w:jc w:val="both"/>
+      </w:pPr>
+      <w:r>
+        <w:rPr>
+          <w:rFonts w:ascii="Times New Roman" w:hAnsi="Times New Roman" w:eastAsia="Times New Roman"/>
+          <w:color w:val="000000"/>
+          <w:sz w:val="24"/>
+        </w:rPr>
+        <w:t>1.7 Drugs Implicated in the Management of Dysmenorrhea</w:t>
+      </w:r>
+    </w:p>
+    <w:p>
+      <w:pPr>
         <w:spacing w:line="360" w:lineRule="auto" w:after="0"/>
         <w:jc w:val="both"/>
       </w:pPr>
@@ -260,7 +302,7 @@
           <w:color w:val="000000"/>
           <w:sz w:val="24"/>
         </w:rPr>
-        <w:t>The systemic impact of this condition extends far beyond transient physical discomfort. Chronic, unmanaged primary dysmenorrhea profoundly alters central pain processing, leading to heightened central sensitization and a significantly lowered pain threshold even outside of the menstrual phase (Iacovides et al., 2015). This persistent pain burden directly precipitates psychological sequelae; longitudinal studies consistently demonstrate that adolescents and young women suffering from severe primary dysmenorrhea exhibit substantially higher rates of clinical anxiety, depression, and generalized sleep disturbances compared to their pain-free peers. The cyclical nature of the pain creates a persistent anticipatory anxiety that further degrades overall quality of life, necessitating exhaustive, multifaceted management strategies that address both the physiological mechanisms and the psychological burden of the disease.</w:t>
+        <w:t>The current pharmacological management of primary dysmenorrhea is predominantly anchored in targeting the underlying prostaglandin-mediated hypercontractility and restoring normal myometrial tone. Non-steroidal anti-inflammatory drugs (NSAIDs) serve as the established first-line pharmacotherapy. Agents such as ibuprofen, naproxen, and mefenamic acid exert their therapeutic effects by competitively inhibiting the cyclooxygenase (COX) enzymes—specifically COX-1 and COX-2—thereby halting the conversion of arachidonic acid into the hyperalgesic and spasmogenic prostaglandins (PGF2α and PGE2). By significantly reducing intrauterine prostaglandin concentrations, NSAIDs effectively decrease myometrial resting tone, alleviate uterine ischemia, and provide substantial pain relief for the majority of patients (Marjoribanks et al., 2015). For women who do not achieve adequate relief with NSAIDs, or who require simultaneous contraception, combined oral contraceptives (COCs) represent the primary alternative. COCs, comprising synthetic estrogens and progestins, function by suppressing the hypothalamic-pituitary-ovarian axis, thereby inhibiting ovulation and profoundly thinning the endometrial lining. A thinner endometrium contains significantly lower levels of arachidonic acid, which directly translates to reduced prostaglandin synthesis during menstruation and subsequent alleviation of uterine cramps (Wong et al., 2009). Despite their widespread use and general efficacy, these conventional therapies are hindered by significant limitations and adverse effect profiles. Chronic use of NSAIDs is frequently associated with severe gastrointestinal toxicities, including gastritis and peptic ulcer disease, as well as potential renal impairment and cardiovascular risks due to the systemic inhibition of protective prostaglandins. Similarly, COCs carry risks of venous thromboembolism, weight gain, mood fluctuations, and are contraindicated in women with specific cardiovascular or hepatic morbidities. Furthermore, a clinically significant subset of patients—approximately 10% to 20%—exhibit absolute refractoriness to both NSAIDs and hormonal therapies, leaving them with inadequate pain control and highlighting a critical unmet medical need for novel, safer, and highly efficacious therapeutic alternatives, particularly those derived from natural sources with inherent tocolytic properties (Grandi et al., 2012).</w:t>
       </w:r>
     </w:p>
     <w:p>
@@ -274,12 +316,12 @@
           <w:color w:val="000000"/>
           <w:sz w:val="24"/>
         </w:rPr>
-        <w:t>1.2 Epidemiology and Global Burden of Primary Dysmenorrhea</w:t>
+        <w:t>1.8 Herbal Medicines</w:t>
       </w:r>
     </w:p>
     <w:p>
       <w:pPr>
-        <w:pStyle w:val="Heading3"/>
+        <w:spacing w:line="360" w:lineRule="auto" w:after="0"/>
         <w:jc w:val="both"/>
       </w:pPr>
       <w:r>
@@ -288,25 +330,96 @@
           <w:color w:val="000000"/>
           <w:sz w:val="24"/>
         </w:rPr>
-        <w:t>1.2.1 Global Prevalence and Demographic Variations</w:t>
+        <w:t>Given the limitations, contraindications, and adverse effects associated with conventional pharmacological treatments for dysmenorrhea, there is a substantial and growing global interest in the therapeutic potential of herbal medicines. For centuries, diverse indigenous medical systems across the globe have utilized various plant species to manage gynecological disorders, including menstrual cramps, based on empirical evidence of their efficacy and safety. Phytochemical investigations into these traditional remedies have increasingly validated their use, revealing complex matrices of bioactive compounds—such as flavonoids, alkaloids, terpenoids, and phenolic acids—that possess potent analgesic, anti-inflammatory, and antispasmodic (tocolytic) properties. Unlike single-molecule synthetic drugs, crude herbal extracts often exert their pharmacological effects through synergistic multi-target mechanisms. For instance, some plant extracts can simultaneously inhibit cyclooxygenase and lipoxygenase pathways to reduce inflammatory mediators, directly block voltage-gated calcium channels to prevent myometrial smooth muscle contraction, and enhance local antioxidant defenses. This multi-faceted mechanism of action often results in comparable efficacy to NSAIDs but with a significantly more favorable side-effect profile, particularly regarding gastrointestinal and renal tolerability. The World Health Organization (WHO) actively supports the integration of scientifically validated traditional medicines into national healthcare systems, emphasizing the need for rigorous, evidence-based evaluation of these botanicals. Consequently, contemporary pharmacological research is deeply focused on systematically screening, standardizing, and mechanistically evaluating traditional medicinal plants, such as Syzygium aromaticum, to develop them into safe, accessible, and scientifically robust therapeutic alternatives for the management of primary dysmenorrhea and associated uterine hypercontractility (Pellow &amp; Nienhuis, 2018).</w:t>
       </w:r>
     </w:p>
     <w:p>
       <w:pPr>
+        <w:pStyle w:val="Heading2"/>
+        <w:jc w:val="both"/>
+      </w:pPr>
+      <w:r>
+        <w:rPr>
+          <w:rFonts w:ascii="Times New Roman" w:hAnsi="Times New Roman" w:eastAsia="Times New Roman"/>
+          <w:color w:val="000000"/>
+          <w:sz w:val="24"/>
+        </w:rPr>
+        <w:t>1.9 Taxonomic Classification and Overview of Syzygium aromaticum</w:t>
+      </w:r>
+    </w:p>
+    <w:p>
+      <w:pPr>
         <w:spacing w:line="360" w:lineRule="auto" w:after="0"/>
         <w:jc w:val="both"/>
       </w:pPr>
       <w:r>
         <w:rPr>
           <w:rFonts w:ascii="Times New Roman" w:hAnsi="Times New Roman" w:eastAsia="Times New Roman"/>
-          <w:color w:val="000000"/>
-          <w:sz w:val="24"/>
-        </w:rPr>
-        <w:t xml:space="preserve">Primary dysmenorrhea represents the most ubiquitous gynecological complaint among women of reproductive age worldwide, yet its true prevalence remains notoriously difficult to ascertain with absolute precision. This difficulty stems primarily from significant methodological heterogeneity across epidemiological studies, varying definitions of dysmenorrhea, and the pervasive cultural normalization of menstrual pain, which frequently deters women from seeking formal medical evaluation. Consequently, reported global prevalence rates exhibit remarkable variance, ranging anywhere from 16% to a staggering 93% across different demographic cohorts and geographic regions (Ju et al., 2014). </w:t>
+          <w:i/>
+          <w:color w:val="000000"/>
+          <w:sz w:val="24"/>
+        </w:rPr>
+        <w:t>Syzygium aromaticum</w:t>
+      </w:r>
+      <w:r>
+        <w:rPr>
+          <w:rFonts w:ascii="Times New Roman" w:hAnsi="Times New Roman" w:eastAsia="Times New Roman"/>
+          <w:color w:val="000000"/>
+          <w:sz w:val="24"/>
+        </w:rPr>
+        <w:t xml:space="preserve"> (L.) Merr. &amp; Perry, commonly known as clove, is a valuable medicinal and culinary plant belonging to the family Myrtaceae. Taxonomically, it is classified under the kingdom Plantae, phylum Tracheophyta, class Magnoliopsida, order Myrtales, family Myrtaceae, genus Syzygium, and species </w:t>
+      </w:r>
+      <w:r>
+        <w:rPr>
+          <w:rFonts w:ascii="Times New Roman" w:hAnsi="Times New Roman" w:eastAsia="Times New Roman"/>
+          <w:i/>
+          <w:color w:val="000000"/>
+          <w:sz w:val="24"/>
+        </w:rPr>
+        <w:t>S. aromaticum</w:t>
+      </w:r>
+      <w:r>
+        <w:rPr>
+          <w:rFonts w:ascii="Times New Roman" w:hAnsi="Times New Roman" w:eastAsia="Times New Roman"/>
+          <w:color w:val="000000"/>
+          <w:sz w:val="24"/>
+        </w:rPr>
+        <w:t xml:space="preserve">. Native to the Maluku Islands in Indonesia, clove is an evergreen tree that grows up to 10–20 meters in height, characterized by large, smooth, ovate leaves and crimson flowers grouped in terminal clusters. The most commercially and medicinally important part of the plant is the dried, unopened flower bud, which is harvested before the petals unfurl. Historically and ethnopharmacologically, clove has been utilized across Ayurvedic, traditional Chinese, and indigenous African medical systems to treat a vast array of ailments, including dental caries, digestive disorders, respiratory infections, and severe inflammatory conditions. The profound therapeutic efficacy of clove is attributed to its exceptionally rich phytochemical profile. The essential oil extracted from the buds is predominantly composed of eugenol (constituting 70–90% of the oil), alongside other significant volatile compounds such as eugenyl acetate and β-caryophyllene. Eugenol is a potent bioactive phenylpropene that has been extensively documented to possess robust antioxidant, antimicrobial, analgesic, anti-inflammatory, and antispasmodic properties. It exerts its anti-inflammatory effects by potently inhibiting the cyclooxygenase and lipoxygenase pathways, thereby drastically reducing the synthesis of pro-inflammatory prostaglandins and leukotrienes. Additionally, eugenol has been shown to block voltage-dependent calcium and sodium channels in smooth muscle, directly impairing excitation-contraction coupling. These inherent pharmacological mechanisms strongly suggest that extracts of </w:t>
+      </w:r>
+      <w:r>
+        <w:rPr>
+          <w:rFonts w:ascii="Times New Roman" w:hAnsi="Times New Roman" w:eastAsia="Times New Roman"/>
+          <w:i/>
+          <w:color w:val="000000"/>
+          <w:sz w:val="24"/>
+        </w:rPr>
+        <w:t>S. aromaticum</w:t>
+      </w:r>
+      <w:r>
+        <w:rPr>
+          <w:rFonts w:ascii="Times New Roman" w:hAnsi="Times New Roman" w:eastAsia="Times New Roman"/>
+          <w:color w:val="000000"/>
+          <w:sz w:val="24"/>
+        </w:rPr>
+        <w:t xml:space="preserve"> could exert significant tocolytic effects on the myometrium, presenting a highly plausible, natural therapeutic intervention for the hypercontractility and pain associated with primary dysmenorrhea (Batiha et al., 2020).</w:t>
       </w:r>
     </w:p>
     <w:p>
       <w:pPr>
+        <w:pStyle w:val="Heading2"/>
+        <w:jc w:val="both"/>
+      </w:pPr>
+      <w:r>
+        <w:rPr>
+          <w:rFonts w:ascii="Times New Roman" w:hAnsi="Times New Roman" w:eastAsia="Times New Roman"/>
+          <w:color w:val="000000"/>
+          <w:sz w:val="24"/>
+        </w:rPr>
+        <w:t>1.10 Acute Oral Toxicity</w:t>
+      </w:r>
+    </w:p>
+    <w:p>
+      <w:pPr>
         <w:spacing w:line="360" w:lineRule="auto" w:after="0"/>
         <w:jc w:val="both"/>
       </w:pPr>
@@ -316,12 +429,29 @@
           <w:color w:val="000000"/>
           <w:sz w:val="24"/>
         </w:rPr>
-        <w:t>Despite this variance, robust systematic reviews and meta-analyses consistently underscore the massive scale of the condition. De Sanctis et al. (2015) highlighted that dysmenorrhea disproportionately affects adolescents and young adults, with prevalence rates in adolescent populations frequently exceeding 70%. In a comprehensive meta-analysis evaluating female college students, Li et al. (2022) reported a pooled prevalence that corroborates these high estimates, establishing primary dysmenorrhea not merely as a common occurrence, but as a ubiquitous physiological challenge that defines the early reproductive years for the vast majority of women. The epidemiological curve of primary dysmenorrhea typically peaks in late adolescence and the early twenties, coinciding perfectly with the establishment of regular ovulatory cycles and the consequent maximal synthesis of endometrial prostaglandins, before gradually declining in severity following childbirth or advancing age (Dawood, 2006).</w:t>
+        <w:t xml:space="preserve">Despite the widespread ethnomedicinal use and Generally Recognized As Safe (GRAS) status of clove as a food flavoring agent, the rigorous scientific evaluation of its safety profile—particularly when administered as concentrated hydroalcoholic extracts at therapeutic or supratherapeutic doses—is an absolute prerequisite for its development as a pharmacological intervention. Acute oral toxicity testing is the fundamental toxicological assessment designed to determine the adverse effects occurring within a short time following the oral administration of a single dose or multiple doses given within 24 hours. The Organization for Economic Co-operation and Development (OECD) Guidelines for the Testing of Chemicals, specifically Guideline 423 (Acute Oral Toxicity - Acute Toxic Class Method), provides the internationally accepted standard protocol for this evaluation. This stepwise procedure uses minimal numbers of female rodents, administering sequentially higher predetermined dose levels (e.g., 5, 50, 300, and 2000 mg/kg) to precisely classify the substance's toxicity hazard category and estimate the median lethal dose (LD50). During the 14-day observation period following administration, animals are meticulously monitored for any signs of overt toxicity, including alterations in behavior, autonomic nervous system responses, somatomotor activity, morbidity, and mortality. While eugenol, the primary constituent of clove, exhibits potent therapeutic activities, high concentrations can potentially induce hepatotoxicity, neurotoxicity, and severe gastrointestinal mucosal irritation. Therefore, conducting a comprehensive acute oral toxicity study of the </w:t>
+      </w:r>
+      <w:r>
+        <w:rPr>
+          <w:rFonts w:ascii="Times New Roman" w:hAnsi="Times New Roman" w:eastAsia="Times New Roman"/>
+          <w:i/>
+          <w:color w:val="000000"/>
+          <w:sz w:val="24"/>
+        </w:rPr>
+        <w:t>S. aromaticum</w:t>
+      </w:r>
+      <w:r>
+        <w:rPr>
+          <w:rFonts w:ascii="Times New Roman" w:hAnsi="Times New Roman" w:eastAsia="Times New Roman"/>
+          <w:color w:val="000000"/>
+          <w:sz w:val="24"/>
+        </w:rPr>
+        <w:t xml:space="preserve"> hydroalcoholic extract is critically essential to establish its safety margin, definitively rule out acute systemic toxicity at projected therapeutic dosages, and confidently justify its potential advancement to clinical trials for the management of dysmenorrhea (OECD, 2001).</w:t>
       </w:r>
     </w:p>
     <w:p>
       <w:pPr>
-        <w:pStyle w:val="Heading3"/>
+        <w:pStyle w:val="Heading2"/>
         <w:jc w:val="both"/>
       </w:pPr>
       <w:r>
@@ -330,7 +460,7 @@
           <w:color w:val="000000"/>
           <w:sz w:val="24"/>
         </w:rPr>
-        <w:t>1.2.2 Prevalence and Epidemiological Dynamics in African and Nigerian Cohorts</w:t>
+        <w:t>1.11 Rationale of the Study</w:t>
       </w:r>
     </w:p>
     <w:p>
@@ -344,11 +474,59 @@
           <w:color w:val="000000"/>
           <w:sz w:val="24"/>
         </w:rPr>
-        <w:t>Within the African continent, and specifically within Nigeria, the epidemiological landscape of primary dysmenorrhea mirrors the high end of global estimates, exacerbated by specific socio-demographic factors and healthcare access limitations. Studies conducted across various Nigerian academic institutions consistently report alarmingly high prevalence rates. For instance, Nwankwo et al. (2010), in a study evaluating menstrual disorders among adolescent schoolgirls in Enugu, Nigeria, found dysmenorrhea to be the most prevalent menstrual abnormality. This finding was further validated a decade later by Nwankwo et al. (2021), who documented a similarly high prevalence among Nigerian university students, highlighting a persistent burden that spans secondary to tertiary educational levels.</w:t>
+        <w:t xml:space="preserve">Primary dysmenorrhea represents a massive, yet frequently trivialized, global health burden that significantly impairs the quality of life, academic performance, and economic productivity of millions of reproductive-aged women. While non-steroidal anti-inflammatory drugs (NSAIDs) and combined oral contraceptives (COCs) remain the bedrock of current pharmacological management, their long-term utilization is severely compromised by prohibitive adverse effect profiles—ranging from gastrointestinal ulceration to cardiovascular and thromboembolic risks—as well as a substantial clinical failure rate of up to 20% in certain populations. Consequently, there is an urgent, compelling need to identify and scientifically validate novel, highly efficacious, and fundamentally safer therapeutic alternatives. </w:t>
+      </w:r>
+      <w:r>
+        <w:rPr>
+          <w:rFonts w:ascii="Times New Roman" w:hAnsi="Times New Roman" w:eastAsia="Times New Roman"/>
+          <w:i/>
+          <w:color w:val="000000"/>
+          <w:sz w:val="24"/>
+        </w:rPr>
+        <w:t>Syzygium aromaticum</w:t>
+      </w:r>
+      <w:r>
+        <w:rPr>
+          <w:rFonts w:ascii="Times New Roman" w:hAnsi="Times New Roman" w:eastAsia="Times New Roman"/>
+          <w:color w:val="000000"/>
+          <w:sz w:val="24"/>
+        </w:rPr>
+        <w:t xml:space="preserve"> (clove) has a rich ethnopharmacological history of use as a powerful analgesic and antispasmodic agent. Extensive phytochemical profiling has revealed that its primary bioactive constituent, eugenol, possesses potent dual-inhibitory action on cyclooxygenase enzymes and voltage-gated calcium channels, mechanisms perfectly suited to counteract the prostaglandin-driven myometrial hypercontractility that defines dysmenorrhea. Despite these promising theoretical mechanisms, there remains a critical paucity of rigorous, controlled, in vivo experimental data explicitly evaluating the antidysmenorrheal efficacy and comprehensive acute safety profile of its concentrated hydroalcoholic extract. This study is designed to bridge this critical knowledge gap by systematically investigating the tocolytic capacity of </w:t>
+      </w:r>
+      <w:r>
+        <w:rPr>
+          <w:rFonts w:ascii="Times New Roman" w:hAnsi="Times New Roman" w:eastAsia="Times New Roman"/>
+          <w:i/>
+          <w:color w:val="000000"/>
+          <w:sz w:val="24"/>
+        </w:rPr>
+        <w:t>S. aromaticum</w:t>
+      </w:r>
+      <w:r>
+        <w:rPr>
+          <w:rFonts w:ascii="Times New Roman" w:hAnsi="Times New Roman" w:eastAsia="Times New Roman"/>
+          <w:color w:val="000000"/>
+          <w:sz w:val="24"/>
+        </w:rPr>
+        <w:t xml:space="preserve"> in established animal models of dysmenorrhea, while concurrently executing standardized acute oral toxicity testing to firmly establish its therapeutic index.</w:t>
       </w:r>
     </w:p>
     <w:p>
       <w:pPr>
+        <w:pStyle w:val="Heading2"/>
+        <w:jc w:val="both"/>
+      </w:pPr>
+      <w:r>
+        <w:rPr>
+          <w:rFonts w:ascii="Times New Roman" w:hAnsi="Times New Roman" w:eastAsia="Times New Roman"/>
+          <w:color w:val="000000"/>
+          <w:sz w:val="24"/>
+        </w:rPr>
+        <w:t>1.12 Research Questions</w:t>
+      </w:r>
+    </w:p>
+    <w:p>
+      <w:pPr>
         <w:spacing w:line="360" w:lineRule="auto" w:after="0"/>
         <w:jc w:val="both"/>
       </w:pPr>
@@ -358,12 +536,12 @@
           <w:color w:val="000000"/>
           <w:sz w:val="24"/>
         </w:rPr>
-        <w:t>The data from Nigeria aligns with broader regional trends in West Africa. Ameade et al. (2018), investigating university students in Northern Ghana, reported a prevalence rate exceeding 80%, demonstrating that the overwhelming majority of young women in this demographic endure significant menstrual pain. Furthermore, a critical review by Oladosu &amp; Ogunlana (2022) synthesized the epidemiology among Nigerian women, emphasizing that the burden is not merely statistical but profoundly impactful on daily functioning. In many Nigerian cohorts, cultural reticence often suppresses open discussion regarding menstrual health, leading to widespread self-management using over-the-counter analgesics, often without professional medical guidance. Ezebialu et al. (2021) further documented that this high prevalence directly translates into significant school and university absenteeism, painting a stark picture of a condition that actively impedes the educational and professional progression of young Nigerian women.</w:t>
+        <w:t>This research is guided by the following core scientific questions:</w:t>
       </w:r>
     </w:p>
     <w:p>
       <w:pPr>
-        <w:pStyle w:val="Heading3"/>
+        <w:spacing w:line="360" w:lineRule="auto" w:after="0"/>
         <w:jc w:val="both"/>
       </w:pPr>
       <w:r>
@@ -372,7 +550,24 @@
           <w:color w:val="000000"/>
           <w:sz w:val="24"/>
         </w:rPr>
-        <w:t>1.2.3 Risk Factors and Determinants</w:t>
+        <w:t xml:space="preserve">1. What is the acute oral toxicity profile and the median lethal dose (LD50) of the hydroalcoholic extract of </w:t>
+      </w:r>
+      <w:r>
+        <w:rPr>
+          <w:rFonts w:ascii="Times New Roman" w:hAnsi="Times New Roman" w:eastAsia="Times New Roman"/>
+          <w:i/>
+          <w:color w:val="000000"/>
+          <w:sz w:val="24"/>
+        </w:rPr>
+        <w:t>Syzygium aromaticum</w:t>
+      </w:r>
+      <w:r>
+        <w:rPr>
+          <w:rFonts w:ascii="Times New Roman" w:hAnsi="Times New Roman" w:eastAsia="Times New Roman"/>
+          <w:color w:val="000000"/>
+          <w:sz w:val="24"/>
+        </w:rPr>
+        <w:t xml:space="preserve"> when administered to female mice in accordance with OECD Test Guideline 423?</w:t>
       </w:r>
     </w:p>
     <w:p>
@@ -386,7 +581,24 @@
           <w:color w:val="000000"/>
           <w:sz w:val="24"/>
         </w:rPr>
-        <w:t xml:space="preserve">The etiology of primary dysmenorrhea, while fundamentally rooted in prostaglandin overproduction, is significantly modulated by a complex interplay of physiological, lifestyle, and psychosocial risk factors. Establishing these determinants is crucial for understanding the epidemiological distribution and identifying high-risk populations. </w:t>
+        <w:t xml:space="preserve">2. Does the oral administration of the hydroalcoholic extract of </w:t>
+      </w:r>
+      <w:r>
+        <w:rPr>
+          <w:rFonts w:ascii="Times New Roman" w:hAnsi="Times New Roman" w:eastAsia="Times New Roman"/>
+          <w:i/>
+          <w:color w:val="000000"/>
+          <w:sz w:val="24"/>
+        </w:rPr>
+        <w:t>S. aromaticum</w:t>
+      </w:r>
+      <w:r>
+        <w:rPr>
+          <w:rFonts w:ascii="Times New Roman" w:hAnsi="Times New Roman" w:eastAsia="Times New Roman"/>
+          <w:color w:val="000000"/>
+          <w:sz w:val="24"/>
+        </w:rPr>
+        <w:t xml:space="preserve"> significantly attenuate oxytocin-induced uterine hypercontractility in experimental animal models?</w:t>
       </w:r>
     </w:p>
     <w:p>
@@ -400,49 +612,155 @@
           <w:color w:val="000000"/>
           <w:sz w:val="24"/>
         </w:rPr>
-        <w:t>Prominent physiological risk factors consistently identified across literature include an early age at menarche (typically defined as before 12 years of age), nulliparity, and a positive family history of dysmenorrhea (Ju et al., 2014). Early menarche extends the duration of estrogen exposure and establishes ovulatory cycles sooner, thereby initiating the physiological mechanisms of dysmenorrhea at a younger age. A strong familial predisposition suggests a significant genetic or epigenetic component influencing prostaglandin synthesis pathways or pain perception thresholds (Rashidi &amp; Rahimikian, 2022). Furthermore, menstrual characteristics such as heavy menstrual bleeding (menorrhagia) and extended menstrual cycle length are strongly correlated with increased pain severity, likely due to a greater volume of endometrial tissue shedding and a proportionally higher release of inflammatory mediators (Li et al., 2022).</w:t>
+        <w:t xml:space="preserve">3. How does the antidysmenorrhea (tocolytic) efficacy of the </w:t>
+      </w:r>
+      <w:r>
+        <w:rPr>
+          <w:rFonts w:ascii="Times New Roman" w:hAnsi="Times New Roman" w:eastAsia="Times New Roman"/>
+          <w:i/>
+          <w:color w:val="000000"/>
+          <w:sz w:val="24"/>
+        </w:rPr>
+        <w:t>S. aromaticum</w:t>
+      </w:r>
+      <w:r>
+        <w:rPr>
+          <w:rFonts w:ascii="Times New Roman" w:hAnsi="Times New Roman" w:eastAsia="Times New Roman"/>
+          <w:color w:val="000000"/>
+          <w:sz w:val="24"/>
+        </w:rPr>
+        <w:t xml:space="preserve"> extract compare to that of established standard pharmacological reference drugs, such as ibuprofen?</w:t>
       </w:r>
     </w:p>
     <w:p>
       <w:pPr>
+        <w:pStyle w:val="Heading2"/>
+        <w:jc w:val="both"/>
+      </w:pPr>
+      <w:r>
+        <w:rPr>
+          <w:rFonts w:ascii="Times New Roman" w:hAnsi="Times New Roman" w:eastAsia="Times New Roman"/>
+          <w:color w:val="000000"/>
+          <w:sz w:val="24"/>
+        </w:rPr>
+        <w:t>1.13 Study Hypothesis</w:t>
+      </w:r>
+    </w:p>
+    <w:p>
+      <w:pPr>
         <w:spacing w:line="360" w:lineRule="auto" w:after="0"/>
         <w:jc w:val="both"/>
       </w:pPr>
       <w:r>
         <w:rPr>
           <w:rFonts w:ascii="Times New Roman" w:hAnsi="Times New Roman" w:eastAsia="Times New Roman"/>
-          <w:color w:val="000000"/>
-          <w:sz w:val="24"/>
-        </w:rPr>
-        <w:t>Lifestyle and psychosocial determinants also exert a profound influence. Smoking has been definitively linked to increased severity and duration of primary dysmenorrhea, primarily because nicotine induces systemic vasoconstriction, potentially exacerbating the ischemia already present in the myometrium (Ju et al., 2014). Additionally, high levels of psychological stress, anxiety, and depressive symptoms are consistently associated with exacerbated pain perception. Stress operates by altering neuroendocrine function, potentially amplifying the inflammatory cascade or lowering the pain threshold, thereby transforming manageable physiological cramping into debilitating pain.</w:t>
+          <w:b/>
+          <w:color w:val="000000"/>
+          <w:sz w:val="24"/>
+        </w:rPr>
+        <w:t>Null Hypothesis (H0):</w:t>
+      </w:r>
+      <w:r>
+        <w:rPr>
+          <w:rFonts w:ascii="Times New Roman" w:hAnsi="Times New Roman" w:eastAsia="Times New Roman"/>
+          <w:color w:val="000000"/>
+          <w:sz w:val="24"/>
+        </w:rPr>
+        <w:t xml:space="preserve"> The hydroalcoholic extract of </w:t>
+      </w:r>
+      <w:r>
+        <w:rPr>
+          <w:rFonts w:ascii="Times New Roman" w:hAnsi="Times New Roman" w:eastAsia="Times New Roman"/>
+          <w:i/>
+          <w:color w:val="000000"/>
+          <w:sz w:val="24"/>
+        </w:rPr>
+        <w:t>Syzygium aromaticum</w:t>
+      </w:r>
+      <w:r>
+        <w:rPr>
+          <w:rFonts w:ascii="Times New Roman" w:hAnsi="Times New Roman" w:eastAsia="Times New Roman"/>
+          <w:color w:val="000000"/>
+          <w:sz w:val="24"/>
+        </w:rPr>
+        <w:t xml:space="preserve"> exhibits no significant acute oral toxicity and produces no significant reduction in uterine hypercontractility in experimental animal models of dysmenorrhea compared to vehicle controls.</w:t>
       </w:r>
     </w:p>
     <w:p>
       <w:pPr>
-        <w:pStyle w:val="Heading3"/>
+        <w:spacing w:line="360" w:lineRule="auto" w:after="0"/>
         <w:jc w:val="both"/>
       </w:pPr>
       <w:r>
         <w:rPr>
           <w:rFonts w:ascii="Times New Roman" w:hAnsi="Times New Roman" w:eastAsia="Times New Roman"/>
-          <w:color w:val="000000"/>
-          <w:sz w:val="24"/>
-        </w:rPr>
-        <w:t>1.2.4 Socioeconomic Burden and Quality of Life Impairment</w:t>
+          <w:b/>
+          <w:color w:val="000000"/>
+          <w:sz w:val="24"/>
+        </w:rPr>
+        <w:t>Alternative Hypothesis (H1):</w:t>
+      </w:r>
+      <w:r>
+        <w:rPr>
+          <w:rFonts w:ascii="Times New Roman" w:hAnsi="Times New Roman" w:eastAsia="Times New Roman"/>
+          <w:color w:val="000000"/>
+          <w:sz w:val="24"/>
+        </w:rPr>
+        <w:t xml:space="preserve"> The hydroalcoholic extract of </w:t>
+      </w:r>
+      <w:r>
+        <w:rPr>
+          <w:rFonts w:ascii="Times New Roman" w:hAnsi="Times New Roman" w:eastAsia="Times New Roman"/>
+          <w:i/>
+          <w:color w:val="000000"/>
+          <w:sz w:val="24"/>
+        </w:rPr>
+        <w:t>Syzygium aromaticum</w:t>
+      </w:r>
+      <w:r>
+        <w:rPr>
+          <w:rFonts w:ascii="Times New Roman" w:hAnsi="Times New Roman" w:eastAsia="Times New Roman"/>
+          <w:color w:val="000000"/>
+          <w:sz w:val="24"/>
+        </w:rPr>
+        <w:t xml:space="preserve"> possesses a safe acute oral toxicity profile (LD50 &gt; 2000 mg/kg) and significantly attenuates uterine hypercontractility in experimental animal models of dysmenorrhea, demonstrating a potent tocolytic effect comparable to standard pharmacological therapies.</w:t>
       </w:r>
     </w:p>
     <w:p>
       <w:pPr>
+        <w:pStyle w:val="Heading2"/>
+        <w:jc w:val="both"/>
+      </w:pPr>
+      <w:r>
+        <w:rPr>
+          <w:rFonts w:ascii="Times New Roman" w:hAnsi="Times New Roman" w:eastAsia="Times New Roman"/>
+          <w:color w:val="000000"/>
+          <w:sz w:val="24"/>
+        </w:rPr>
+        <w:t>1.14 Aim and Objectives of the Study</w:t>
+      </w:r>
+    </w:p>
+    <w:p>
+      <w:pPr>
         <w:spacing w:line="360" w:lineRule="auto" w:after="0"/>
         <w:jc w:val="both"/>
       </w:pPr>
       <w:r>
         <w:rPr>
           <w:rFonts w:ascii="Times New Roman" w:hAnsi="Times New Roman" w:eastAsia="Times New Roman"/>
-          <w:color w:val="000000"/>
-          <w:sz w:val="24"/>
-        </w:rPr>
-        <w:t xml:space="preserve">The true impact of primary dysmenorrhea extends far beyond the acute physiological pain experienced during menstruation; it imposes a staggering socioeconomic burden and inflicts profound impairment on the health-related quality of life (HRQoL) of affected individuals. Primary dysmenorrhea is routinely identified as the leading cause of recurrent short-term school and work absenteeism among young women globally. </w:t>
+          <w:b/>
+          <w:color w:val="000000"/>
+          <w:sz w:val="24"/>
+        </w:rPr>
+        <w:t>Aim:</w:t>
+      </w:r>
+      <w:r>
+        <w:rPr>
+          <w:rFonts w:ascii="Times New Roman" w:hAnsi="Times New Roman" w:eastAsia="Times New Roman"/>
+          <w:color w:val="000000"/>
+          <w:sz w:val="24"/>
+        </w:rPr>
+        <w:t xml:space="preserve"> </w:t>
       </w:r>
     </w:p>
     <w:p>
@@ -456,7 +774,24 @@
           <w:color w:val="000000"/>
           <w:sz w:val="24"/>
         </w:rPr>
-        <w:t>In academic settings, the consequences are particularly detrimental. Studies consistently demonstrate that women suffering from moderate to severe primary dysmenorrhea report significantly reduced academic performance, diminished concentration in lectures, and decreased participation in extracurricular activities. Ezebialu et al. (2021) highlighted that among Nigerian undergraduates, dysmenorrhea is a primary driver of missed classes and delayed academic progression. The phenomenon of "presenteeism"—where women attend school or work but function at a drastically reduced capacity due to pain and associated systemic symptoms (nausea, fatigue, headache)—further compounds the hidden economic toll.</w:t>
+        <w:t xml:space="preserve">The primary aim of this study is to systematically evaluate the acute oral toxicity profile and the antidysmenorrhea (tocolytic) efficacy of the hydroalcoholic extract of </w:t>
+      </w:r>
+      <w:r>
+        <w:rPr>
+          <w:rFonts w:ascii="Times New Roman" w:hAnsi="Times New Roman" w:eastAsia="Times New Roman"/>
+          <w:i/>
+          <w:color w:val="000000"/>
+          <w:sz w:val="24"/>
+        </w:rPr>
+        <w:t>Syzygium aromaticum</w:t>
+      </w:r>
+      <w:r>
+        <w:rPr>
+          <w:rFonts w:ascii="Times New Roman" w:hAnsi="Times New Roman" w:eastAsia="Times New Roman"/>
+          <w:color w:val="000000"/>
+          <w:sz w:val="24"/>
+        </w:rPr>
+        <w:t xml:space="preserve"> (clove) using established female murine models.</w:t>
       </w:r>
     </w:p>
     <w:p>
@@ -467,15 +802,16 @@
       <w:r>
         <w:rPr>
           <w:rFonts w:ascii="Times New Roman" w:hAnsi="Times New Roman" w:eastAsia="Times New Roman"/>
-          <w:color w:val="000000"/>
-          <w:sz w:val="24"/>
-        </w:rPr>
-        <w:t>Beyond educational and occupational disruption, the recurrent nature of the pain severely restricts social interactions and physical activities, leading to a diminished overall quality of life. The psychological anticipation of debilitating pain each month can induce significant anxiety, further deteriorating mental well-being (Iacovides et al., 2015). Despite this massive, recurrent disruption to the lives of millions of women, primary dysmenorrhea remains systematically under-researched and frequently dismissed in clinical settings as a "normal" part of womanhood, highlighting an urgent need for more effective, accessible, and scientifically validated therapeutic interventions.</w:t>
+          <w:b/>
+          <w:color w:val="000000"/>
+          <w:sz w:val="24"/>
+        </w:rPr>
+        <w:t>Specific Objectives:</w:t>
       </w:r>
     </w:p>
     <w:p>
       <w:pPr>
-        <w:pStyle w:val="Heading2"/>
+        <w:spacing w:line="360" w:lineRule="auto" w:after="0"/>
         <w:jc w:val="both"/>
       </w:pPr>
       <w:r>
@@ -484,12 +820,29 @@
           <w:color w:val="000000"/>
           <w:sz w:val="24"/>
         </w:rPr>
-        <w:t>1.3 Pathophysiology of Primary Dysmenorrhea</w:t>
+        <w:t xml:space="preserve">1. To prepare a standardized hydroalcoholic extract from the dried flower buds of </w:t>
+      </w:r>
+      <w:r>
+        <w:rPr>
+          <w:rFonts w:ascii="Times New Roman" w:hAnsi="Times New Roman" w:eastAsia="Times New Roman"/>
+          <w:i/>
+          <w:color w:val="000000"/>
+          <w:sz w:val="24"/>
+        </w:rPr>
+        <w:t>Syzygium aromaticum</w:t>
+      </w:r>
+      <w:r>
+        <w:rPr>
+          <w:rFonts w:ascii="Times New Roman" w:hAnsi="Times New Roman" w:eastAsia="Times New Roman"/>
+          <w:color w:val="000000"/>
+          <w:sz w:val="24"/>
+        </w:rPr>
+        <w:t>.</w:t>
       </w:r>
     </w:p>
     <w:p>
       <w:pPr>
-        <w:pStyle w:val="Heading3"/>
+        <w:spacing w:line="360" w:lineRule="auto" w:after="0"/>
         <w:jc w:val="both"/>
       </w:pPr>
       <w:r>
@@ -498,7 +851,7 @@
           <w:color w:val="000000"/>
           <w:sz w:val="24"/>
         </w:rPr>
-        <w:t>1.3.1 The Arachidonic Acid Cascade and Prostaglandin Hypersecretion</w:t>
+        <w:t>2. To determine the acute oral toxicity (LD50) and observe any signs of behavioral or systemic toxicity of the extract in female mice following the OECD 423 guidelines.</w:t>
       </w:r>
     </w:p>
     <w:p>
@@ -512,7 +865,24 @@
           <w:color w:val="000000"/>
           <w:sz w:val="24"/>
         </w:rPr>
-        <w:t xml:space="preserve">The foundational understanding of primary dysmenorrhea pathophysiology centers unequivocally on the overproduction and hypersecretion of endometrial prostaglandins, a paradigm initially conceptualized in the 1960s and robustly validated over the subsequent decades. Prostaglandins are potent lipid autacoids derived from arachidonic acid, a 20-carbon polyunsaturated fatty acid that resides extensively in the phospholipid bilayer of cell membranes (Pahwa &amp; Jialal, 2021). </w:t>
+        <w:t xml:space="preserve">3. To evaluate the inhibitory effects of varying doses of the </w:t>
+      </w:r>
+      <w:r>
+        <w:rPr>
+          <w:rFonts w:ascii="Times New Roman" w:hAnsi="Times New Roman" w:eastAsia="Times New Roman"/>
+          <w:i/>
+          <w:color w:val="000000"/>
+          <w:sz w:val="24"/>
+        </w:rPr>
+        <w:t>S. aromaticum</w:t>
+      </w:r>
+      <w:r>
+        <w:rPr>
+          <w:rFonts w:ascii="Times New Roman" w:hAnsi="Times New Roman" w:eastAsia="Times New Roman"/>
+          <w:color w:val="000000"/>
+          <w:sz w:val="24"/>
+        </w:rPr>
+        <w:t xml:space="preserve"> extract on oxytocin-induced writhing and uterine hypercontractility in female murine models.</w:t>
       </w:r>
     </w:p>
     <w:p>
@@ -526,217 +896,7 @@
           <w:color w:val="000000"/>
           <w:sz w:val="24"/>
         </w:rPr>
-        <w:t xml:space="preserve">During the luteal phase of the menstrual cycle, the steady decline in progesterone levels—precipitated by the involution of the corpus luteum—triggers a cascade of biochemical events within the endometrium. This progesterone withdrawal destabilizes lysosomal membranes within endometrial cells, leading to the rapid release of the enzyme phospholipase A2 (PLA2). Phospholipase A2 subsequently hydrolyzes the membrane phospholipids, liberating massive quantities of free arachidonic acid into the cellular milieu (Dawood, 2006). </w:t>
-      </w:r>
-    </w:p>
-    <w:p>
-      <w:pPr>
-        <w:spacing w:line="360" w:lineRule="auto" w:after="0"/>
-        <w:jc w:val="both"/>
-      </w:pPr>
-      <w:r>
-        <w:rPr>
-          <w:rFonts w:ascii="Times New Roman" w:hAnsi="Times New Roman" w:eastAsia="Times New Roman"/>
-          <w:color w:val="000000"/>
-          <w:sz w:val="24"/>
-        </w:rPr>
-        <w:t>Once liberated, arachidonic acid becomes the primary substrate for the cyclooxygenase (COX) enzyme pathway. The COX enzymes rapidly convert arachidonic acid into unstable cyclic endoperoxides (PGG2 and PGH2), which are then isomerized by specific terminal synthases into an array of bioactive prostaglandins, most notably Prostaglandin F2-alpha (PGF2α) and Prostaglandin E2 (PGE2) (Smith et al., 2000). In women with primary dysmenorrhea, the concentration of these prostaglandins in menstrual fluid and endometrial tissue is exponentially higher than in eumenorrheic women. PGF2α, in particular, has been identified as the primary culprit; it is a profound stimulator of myometrial smooth muscle contraction and a potent vasoconstrictor of the uterine spiral arterioles (Iacovides et al., 2015).</w:t>
-      </w:r>
-    </w:p>
-    <w:p>
-      <w:pPr>
-        <w:pStyle w:val="Heading3"/>
-        <w:jc w:val="both"/>
-      </w:pPr>
-      <w:r>
-        <w:rPr>
-          <w:rFonts w:ascii="Times New Roman" w:hAnsi="Times New Roman" w:eastAsia="Times New Roman"/>
-          <w:color w:val="000000"/>
-          <w:sz w:val="24"/>
-        </w:rPr>
-        <w:t>1.3.2 Myometrial Hypercontractility, Uterine Ischemia, and Hypoxia</w:t>
-      </w:r>
-    </w:p>
-    <w:p>
-      <w:pPr>
-        <w:spacing w:line="360" w:lineRule="auto" w:after="0"/>
-        <w:jc w:val="both"/>
-      </w:pPr>
-      <w:r>
-        <w:rPr>
-          <w:rFonts w:ascii="Times New Roman" w:hAnsi="Times New Roman" w:eastAsia="Times New Roman"/>
-          <w:color w:val="000000"/>
-          <w:sz w:val="24"/>
-        </w:rPr>
-        <w:t>The profound consequence of this massive PGF2α influx is a drastic alteration in the contractile dynamics of the myometrium. Under normal physiological conditions during menstruation, the uterus undergoes mild, coordinated contractions designed to facilitate the expulsion of desquamated endometrial tissue and menstrual blood. However, in the dysmenorrheic uterus, the excessive PGF2α binding to specific G-protein coupled receptors on the myometrial cell surface triggers an overwhelming influx of extracellular calcium and the release of intracellular calcium stores (Raskin &amp; O'Brien, 2022).</w:t>
-      </w:r>
-    </w:p>
-    <w:p>
-      <w:pPr>
-        <w:spacing w:line="360" w:lineRule="auto" w:after="0"/>
-        <w:jc w:val="both"/>
-      </w:pPr>
-      <w:r>
-        <w:rPr>
-          <w:rFonts w:ascii="Times New Roman" w:hAnsi="Times New Roman" w:eastAsia="Times New Roman"/>
-          <w:color w:val="000000"/>
-          <w:sz w:val="24"/>
-        </w:rPr>
-        <w:t>This calcium surge induces myometrial hypercontractility, characterized by an abnormal resting tone (basal tonus), high-amplitude contractions (often exceeding 150 mmHg), and a high frequency of contractile waves (dysrhythmia) (Akerlund, 1979). The elevated resting tone is particularly deleterious, as it prevents the necessary relaxation phase between contractions. This relentless hypercontractility mechanically compresses the uterine vasculature, particularly the spiral arterioles that supply the endometrium and myometrium.</w:t>
-      </w:r>
-    </w:p>
-    <w:p>
-      <w:pPr>
-        <w:spacing w:line="360" w:lineRule="auto" w:after="0"/>
-        <w:jc w:val="both"/>
-      </w:pPr>
-      <w:r>
-        <w:rPr>
-          <w:rFonts w:ascii="Times New Roman" w:hAnsi="Times New Roman" w:eastAsia="Times New Roman"/>
-          <w:color w:val="000000"/>
-          <w:sz w:val="24"/>
-        </w:rPr>
-        <w:t>The intense vasoconstriction induced directly by PGF2α, combined with the mechanical compression from the hypercontractile myometrium, leads to a precipitous drop in uterine blood flow (Su &amp; Chen, 2022). This severe reduction in perfusion rapidly plunges the uterine tissue into a state of acute ischemia and profound hypoxia. It is this hypoxic state that triggers the release of anaerobic metabolites, including lactic acid and other noxious mediators, which subsequently stimulate type C pain fibers (afferent nociceptors) located in the pelvic region, culminating in the severe, cramping pelvic pain characteristic of primary dysmenorrhea (Lee &amp; Park, 2022).</w:t>
-      </w:r>
-    </w:p>
-    <w:p>
-      <w:pPr>
-        <w:pStyle w:val="Heading3"/>
-        <w:jc w:val="both"/>
-      </w:pPr>
-      <w:r>
-        <w:rPr>
-          <w:rFonts w:ascii="Times New Roman" w:hAnsi="Times New Roman" w:eastAsia="Times New Roman"/>
-          <w:color w:val="000000"/>
-          <w:sz w:val="24"/>
-        </w:rPr>
-        <w:t>1.3.3 The Cyclooxygenase (COX) Isoenzymes: COX-1 and COX-2</w:t>
-      </w:r>
-    </w:p>
-    <w:p>
-      <w:pPr>
-        <w:spacing w:line="360" w:lineRule="auto" w:after="0"/>
-        <w:jc w:val="both"/>
-      </w:pPr>
-      <w:r>
-        <w:rPr>
-          <w:rFonts w:ascii="Times New Roman" w:hAnsi="Times New Roman" w:eastAsia="Times New Roman"/>
-          <w:color w:val="000000"/>
-          <w:sz w:val="24"/>
-        </w:rPr>
-        <w:t>A deeper mechanistic understanding of this prostaglandin storm requires delineating the roles of the two primary cyclooxygenase isoenzymes: COX-1 and COX-2. COX-1 is a constitutively expressed enzyme present in most tissues, responsible for maintaining physiological homeostasis, including gastric mucosal protection, renal blood flow regulation, and platelet aggregation (Vane et al., 1998). Conversely, COX-2 is primarily an inducible enzyme; its expression is rapidly upregulated at sites of inflammation or tissue trauma in response to various pro-inflammatory cytokines, growth factors, and, notably, the declining progesterone levels characteristic of the late luteal phase (Rouzer &amp; Marnett, 2009).</w:t>
-      </w:r>
-    </w:p>
-    <w:p>
-      <w:pPr>
-        <w:spacing w:line="360" w:lineRule="auto" w:after="0"/>
-        <w:jc w:val="both"/>
-      </w:pPr>
-      <w:r>
-        <w:rPr>
-          <w:rFonts w:ascii="Times New Roman" w:hAnsi="Times New Roman" w:eastAsia="Times New Roman"/>
-          <w:color w:val="000000"/>
-          <w:sz w:val="24"/>
-        </w:rPr>
-        <w:t>In the context of primary dysmenorrhea, COX-2 plays the dominant pathophysiological role. The abrupt progesterone withdrawal dramatically upregulates COX-2 expression within the endometrium, supercharging the conversion of arachidonic acid into PGF2α and PGE2 (Wan &amp; Yao, 2021). While COX-1 contributes to the baseline levels of prostaglandins, the massive, pathological surge that initiates the dysmenorrheic cascade is overwhelmingly driven by the hyperactive COX-2 pathway (He et al., 2022). This distinction is highly clinically relevant, as it forms the pharmacological basis for utilizing Nonsteroidal Anti-inflammatory Drugs (NSAIDs), which act by inhibiting these COX enzymes, thereby halting the pathological prostaglandin synthesis at its source (Tang &amp; Wang, 2023).</w:t>
-      </w:r>
-    </w:p>
-    <w:p>
-      <w:pPr>
-        <w:pStyle w:val="Heading3"/>
-        <w:jc w:val="both"/>
-      </w:pPr>
-      <w:r>
-        <w:rPr>
-          <w:rFonts w:ascii="Times New Roman" w:hAnsi="Times New Roman" w:eastAsia="Times New Roman"/>
-          <w:color w:val="000000"/>
-          <w:sz w:val="24"/>
-        </w:rPr>
-        <w:t>1.3.4 The Emerging Role of Vasopressin and Oxytocin</w:t>
-      </w:r>
-    </w:p>
-    <w:p>
-      <w:pPr>
-        <w:spacing w:line="360" w:lineRule="auto" w:after="0"/>
-        <w:jc w:val="both"/>
-      </w:pPr>
-      <w:r>
-        <w:rPr>
-          <w:rFonts w:ascii="Times New Roman" w:hAnsi="Times New Roman" w:eastAsia="Times New Roman"/>
-          <w:color w:val="000000"/>
-          <w:sz w:val="24"/>
-        </w:rPr>
-        <w:t>While prostaglandins remain the central dogma, recent neuroendocrinological research has unveiled that the pathophysiology of primary dysmenorrhea is not exclusively a prostaglandin-mediated event. Significant evidence now implicates posterior pituitary hormones, specifically arginine vasopressin (AVP) and oxytocin (OT), as critical co-conspirators in inducing myometrial hypercontractility.</w:t>
-      </w:r>
-    </w:p>
-    <w:p>
-      <w:pPr>
-        <w:spacing w:line="360" w:lineRule="auto" w:after="0"/>
-        <w:jc w:val="both"/>
-      </w:pPr>
-      <w:r>
-        <w:rPr>
-          <w:rFonts w:ascii="Times New Roman" w:hAnsi="Times New Roman" w:eastAsia="Times New Roman"/>
-          <w:color w:val="000000"/>
-          <w:sz w:val="24"/>
-        </w:rPr>
-        <w:t xml:space="preserve">Vasopressin is a potent vasoconstrictor and a stimulator of uterine smooth muscle. Studies have consistently demonstrated that women suffering from severe primary dysmenorrhea exhibit significantly elevated circulating levels of vasopressin during menstruation compared to healthy controls (Strömberg et al., 1984). Furthermore, vasopressin can induce severe uterine dysrhythmia and ischemia independent of the prostaglandin pathway, acting directly on V1a receptors located on the myometrium. </w:t>
-      </w:r>
-    </w:p>
-    <w:p>
-      <w:pPr>
-        <w:spacing w:line="360" w:lineRule="auto" w:after="0"/>
-        <w:jc w:val="both"/>
-      </w:pPr>
-      <w:r>
-        <w:rPr>
-          <w:rFonts w:ascii="Times New Roman" w:hAnsi="Times New Roman" w:eastAsia="Times New Roman"/>
-          <w:color w:val="000000"/>
-          <w:sz w:val="24"/>
-        </w:rPr>
-        <w:t>Similarly, oxytocin, conventionally known for its role in parturition, is increasingly recognized for its contribution to menstrual cramping. The dysmenorrheic uterus shows an enhanced sensitivity to oxytocin, potentially due to an upregulation of oxytocin receptors in the myometrium immediately prior to menstruation (Liedman et al., 2008). Oxytocin directly stimulates myometrial contraction and concurrently stimulates the localized release of prostaglandins from the decidua and myometrium, creating a potent positive feedback loop that intensifies the contractile force (Fuchs et al., 2002). This complex interplay between the eicosanoid system (prostaglandins) and the neurohypophyseal system (vasopressin and oxytocin) underscores the multifactorial and highly complex nature of primary dysmenorrhea's pathogenesis, suggesting that single-target therapies may not be sufficient for all patients.</w:t>
-      </w:r>
-    </w:p>
-    <w:p>
-      <w:pPr>
-        <w:pStyle w:val="Heading3"/>
-        <w:jc w:val="both"/>
-      </w:pPr>
-      <w:r>
-        <w:rPr>
-          <w:rFonts w:ascii="Times New Roman" w:hAnsi="Times New Roman" w:eastAsia="Times New Roman"/>
-          <w:color w:val="000000"/>
-          <w:sz w:val="24"/>
-        </w:rPr>
-        <w:t>1.3.5 Inflammatory Mediators and Oxidative Stress</w:t>
-      </w:r>
-    </w:p>
-    <w:p>
-      <w:pPr>
-        <w:spacing w:line="360" w:lineRule="auto" w:after="0"/>
-        <w:jc w:val="both"/>
-      </w:pPr>
-      <w:r>
-        <w:rPr>
-          <w:rFonts w:ascii="Times New Roman" w:hAnsi="Times New Roman" w:eastAsia="Times New Roman"/>
-          <w:color w:val="000000"/>
-          <w:sz w:val="24"/>
-        </w:rPr>
-        <w:t>Beyond the immediate mechanics of contraction and ischemia, primary dysmenorrhea is increasingly recognized as a state of localized and potentially systemic inflammation. Prostaglandins, particularly PGE2, are classical inflammatory mediators that sensitize peripheral nociceptors to pain, effectively lowering the pain threshold and amplifying the perception of cramping (Pahwa &amp; Jialal, 2021).</w:t>
-      </w:r>
-    </w:p>
-    <w:p>
-      <w:pPr>
-        <w:spacing w:line="360" w:lineRule="auto" w:after="0"/>
-        <w:jc w:val="both"/>
-      </w:pPr>
-      <w:r>
-        <w:rPr>
-          <w:rFonts w:ascii="Times New Roman" w:hAnsi="Times New Roman" w:eastAsia="Times New Roman"/>
-          <w:color w:val="000000"/>
-          <w:sz w:val="24"/>
-        </w:rPr>
-        <w:t xml:space="preserve">Furthermore, the recurrent cycles of ischemia and reperfusion occurring within the uterus generate significant quantities of reactive oxygen species (ROS), leading to oxidative stress. A systematic review by Szydłowska et al. (2020) demonstrated that women with primary dysmenorrhea frequently exhibit disrupted antioxidant statuses and elevated markers of oxidative damage. This oxidative stress can directly damage cellular membranes, further activating phospholipase A2 and fueling a vicious cycle of sustained arachidonic acid release and prostaglandin synthesis (Barcikowska et al., 2020). Consequently, therapeutic interventions that possess not only smooth muscle relaxant properties but also potent antioxidant and anti-inflammatory capabilities—such as the bioactive compounds found in </w:t>
+        <w:t xml:space="preserve">4. To scientifically compare the observed tocolytic efficacy of the </w:t>
       </w:r>
       <w:r>
         <w:rPr>
@@ -745,1843 +905,15 @@
           <w:color w:val="000000"/>
           <w:sz w:val="24"/>
         </w:rPr>
-        <w:t>Syzygium aromaticum</w:t>
-      </w:r>
-      <w:r>
-        <w:rPr>
-          <w:rFonts w:ascii="Times New Roman" w:hAnsi="Times New Roman" w:eastAsia="Times New Roman"/>
-          <w:color w:val="000000"/>
-          <w:sz w:val="24"/>
-        </w:rPr>
-        <w:t xml:space="preserve"> (Clove)—present a highly logical and compelling multi-targeted approach to dismantling the complex pathophysiology of this disorder.</w:t>
-      </w:r>
-    </w:p>
-    <w:p>
-      <w:pPr>
-        <w:pStyle w:val="Heading2"/>
-        <w:jc w:val="both"/>
-      </w:pPr>
-      <w:r>
-        <w:rPr>
-          <w:rFonts w:ascii="Times New Roman" w:hAnsi="Times New Roman" w:eastAsia="Times New Roman"/>
-          <w:color w:val="000000"/>
-          <w:sz w:val="24"/>
-        </w:rPr>
-        <w:t>1.4 Current Pharmacological Management and its Limitations</w:t>
-      </w:r>
-    </w:p>
-    <w:p>
-      <w:pPr>
-        <w:pStyle w:val="Heading3"/>
-        <w:jc w:val="both"/>
-      </w:pPr>
-      <w:r>
-        <w:rPr>
-          <w:rFonts w:ascii="Times New Roman" w:hAnsi="Times New Roman" w:eastAsia="Times New Roman"/>
-          <w:color w:val="000000"/>
-          <w:sz w:val="24"/>
-        </w:rPr>
-        <w:t>1.4.1 First-Line Therapy: Nonsteroidal Anti-inflammatory Drugs (NSAIDs)</w:t>
-      </w:r>
-    </w:p>
-    <w:p>
-      <w:pPr>
-        <w:spacing w:line="360" w:lineRule="auto" w:after="0"/>
-        <w:jc w:val="both"/>
-      </w:pPr>
-      <w:r>
-        <w:rPr>
-          <w:rFonts w:ascii="Times New Roman" w:hAnsi="Times New Roman" w:eastAsia="Times New Roman"/>
-          <w:color w:val="000000"/>
-          <w:sz w:val="24"/>
-        </w:rPr>
-        <w:t xml:space="preserve">The current bedrock of pharmacological intervention for primary dysmenorrhea fundamentally relies on disrupting the pathological synthesis of prostaglandins. Consequently, Nonsteroidal Anti-inflammatory Drugs (NSAIDs) represent the universally recommended first-line therapy (Burnett &amp; Lemyre, 2017). NSAIDs exert their therapeutic effect by directly inhibiting the cyclooxygenase (COX) enzymes—specifically targeting the inducible COX-2 isoenzyme—thereby halting the conversion of arachidonic acid into the spasmodic prostaglandins PGF2α and PGE2 (Dawood, 1984; Vane et al., 1998). </w:t>
-      </w:r>
-    </w:p>
-    <w:p>
-      <w:pPr>
-        <w:spacing w:line="360" w:lineRule="auto" w:after="0"/>
-        <w:jc w:val="both"/>
-      </w:pPr>
-      <w:r>
-        <w:rPr>
-          <w:rFonts w:ascii="Times New Roman" w:hAnsi="Times New Roman" w:eastAsia="Times New Roman"/>
-          <w:color w:val="000000"/>
-          <w:sz w:val="24"/>
-        </w:rPr>
-        <w:t>Extensive Cochrane reviews and robust network meta-analyses unequivocally establish the superiority of NSAIDs over placebo and paracetamol (acetaminophen) in achieving significant pain relief (Marjoribanks et al., 2015; Sangkomkamhang &amp; Lumbiganon, 2021). The clinical efficacy of NSAIDs is highly contingent upon their initiation timing; they are most effective when administered exactly at the onset of menses or, ideally, 1 to 2 days prior to the expected onset of bleeding. This pre-emptive administration prevents the initial surge of prostaglandin accumulation in the endometrial tissue, thereby circumventing the initiation of severe myometrial hypercontractility (Dawood, 2006).</w:t>
-      </w:r>
-    </w:p>
-    <w:p>
-      <w:pPr>
-        <w:spacing w:line="360" w:lineRule="auto" w:after="0"/>
-        <w:jc w:val="both"/>
-      </w:pPr>
-      <w:r>
-        <w:rPr>
-          <w:rFonts w:ascii="Times New Roman" w:hAnsi="Times New Roman" w:eastAsia="Times New Roman"/>
-          <w:color w:val="000000"/>
-          <w:sz w:val="24"/>
-        </w:rPr>
-        <w:t>Commonly prescribed NSAIDs include fenamates (such as mefenamic acid), propionic acid derivatives (such as ibuprofen and naproxen), and specific COX-2 inhibitors. A comparative network meta-analysis by Feng et al. (2018) indicated that while all NSAIDs exhibit significant efficacy, fenamates may offer a slight clinical advantage. This is because fenamates possess a dual mechanism of action: they not only inhibit the COX enzyme but also antagonize the action of previously formed prostaglandins at the receptor level, providing a more comprehensive blockade of the eicosanoid cascade.</w:t>
-      </w:r>
-    </w:p>
-    <w:p>
-      <w:pPr>
-        <w:pStyle w:val="Heading3"/>
-        <w:jc w:val="both"/>
-      </w:pPr>
-      <w:r>
-        <w:rPr>
-          <w:rFonts w:ascii="Times New Roman" w:hAnsi="Times New Roman" w:eastAsia="Times New Roman"/>
-          <w:color w:val="000000"/>
-          <w:sz w:val="24"/>
-        </w:rPr>
-        <w:t>1.4.2 The Clinical Challenge of NSAID Resistance</w:t>
-      </w:r>
-    </w:p>
-    <w:p>
-      <w:pPr>
-        <w:spacing w:line="360" w:lineRule="auto" w:after="0"/>
-        <w:jc w:val="both"/>
-      </w:pPr>
-      <w:r>
-        <w:rPr>
-          <w:rFonts w:ascii="Times New Roman" w:hAnsi="Times New Roman" w:eastAsia="Times New Roman"/>
-          <w:color w:val="000000"/>
-          <w:sz w:val="24"/>
-        </w:rPr>
-        <w:t>Despite their status as the gold standard, NSAIDs are not a panacea. A significant and highly problematic subset of the dysmenorrheic population—estimated to be between 15% to 20% of women—exhibits a profound lack of response to NSAID therapy, a clinical phenomenon termed "NSAID resistance" or "refractory dysmenorrhea" (Oladosu et al., 2018).</w:t>
-      </w:r>
-    </w:p>
-    <w:p>
-      <w:pPr>
-        <w:spacing w:line="360" w:lineRule="auto" w:after="0"/>
-        <w:jc w:val="both"/>
-      </w:pPr>
-      <w:r>
-        <w:rPr>
-          <w:rFonts w:ascii="Times New Roman" w:hAnsi="Times New Roman" w:eastAsia="Times New Roman"/>
-          <w:color w:val="000000"/>
-          <w:sz w:val="24"/>
-        </w:rPr>
-        <w:t>The mechanisms underpinning NSAID resistance in primary dysmenorrhea are complex and not fully elucidated, but several critical theories exist. Firstly, resistance strongly suggests that the pain mechanism in these individuals may be mediated by pathways independent of COX enzymes and classical prostaglandins. For instance, an over-reliance on the vasopressin or oxytocin pathways, or an amplified production of leukotrienes via the 5-lipoxygenase pathway—which is not inhibited by standard NSAIDs—could bypass the COX blockade, sustaining intense myometrial contractions and severe pain (Fuchs et al., 2002; Raghavenra et al., 2006). Secondly, structural variations or genetic polymorphisms in the COX-2 enzyme or its regulatory promoters may render the enzyme less susceptible to standard pharmacological inhibition in certain individuals. This alarming rate of clinical failure highlights a critical gap in the current therapeutic arsenal, necessitating the exploration of alternative agents that target multiple mechanistic pathways simultaneously.</w:t>
-      </w:r>
-    </w:p>
-    <w:p>
-      <w:pPr>
-        <w:pStyle w:val="Heading3"/>
-        <w:jc w:val="both"/>
-      </w:pPr>
-      <w:r>
-        <w:rPr>
-          <w:rFonts w:ascii="Times New Roman" w:hAnsi="Times New Roman" w:eastAsia="Times New Roman"/>
-          <w:color w:val="000000"/>
-          <w:sz w:val="24"/>
-        </w:rPr>
-        <w:t>1.4.3 Adverse Effects and Gastrointestinal Toxicity of NSAIDs</w:t>
-      </w:r>
-    </w:p>
-    <w:p>
-      <w:pPr>
-        <w:spacing w:line="360" w:lineRule="auto" w:after="0"/>
-        <w:jc w:val="both"/>
-      </w:pPr>
-      <w:r>
-        <w:rPr>
-          <w:rFonts w:ascii="Times New Roman" w:hAnsi="Times New Roman" w:eastAsia="Times New Roman"/>
-          <w:color w:val="000000"/>
-          <w:sz w:val="24"/>
-        </w:rPr>
-        <w:t>Even among women who respond favorably to NSAIDs, the utility of these drugs is severely curtailed by their notorious adverse effect profile, particularly when used chronically or at high doses. The fundamental mechanism of NSAIDs—the inhibition of COX enzymes—is inherently non-selective in older generation drugs (like ibuprofen and naproxen), meaning they invariably inhibit the constitutively expressed COX-1 enzyme alongside the target COX-2 enzyme (Navarro &amp; Sánchez, 2022).</w:t>
-      </w:r>
-    </w:p>
-    <w:p>
-      <w:pPr>
-        <w:spacing w:line="360" w:lineRule="auto" w:after="0"/>
-        <w:jc w:val="both"/>
-      </w:pPr>
-      <w:r>
-        <w:rPr>
-          <w:rFonts w:ascii="Times New Roman" w:hAnsi="Times New Roman" w:eastAsia="Times New Roman"/>
-          <w:color w:val="000000"/>
-          <w:sz w:val="24"/>
-        </w:rPr>
-        <w:t xml:space="preserve">COX-1 is crucial for maintaining the mucosal integrity of the gastrointestinal (GI) tract by continuously synthesizing cytoprotective prostaglandins. By inhibiting COX-1, NSAIDs drastically diminish this protective mucosal barrier, predisposing the patient to a cascade of severe GI complications, ranging from mild dyspepsia and gastritis to life-threatening peptic ulceration and gastrointestinal hemorrhage (Navarro &amp; Sánchez, 2022). Furthermore, chronic NSAID utilization is associated with significant nephrotoxicity, hepatotoxicity, and an elevated risk of adverse cardiovascular events, particularly with the use of selective COX-2 inhibitors (coxibs) (Flower, 2003). </w:t>
-      </w:r>
-    </w:p>
-    <w:p>
-      <w:pPr>
-        <w:spacing w:line="360" w:lineRule="auto" w:after="0"/>
-        <w:jc w:val="both"/>
-      </w:pPr>
-      <w:r>
-        <w:rPr>
-          <w:rFonts w:ascii="Times New Roman" w:hAnsi="Times New Roman" w:eastAsia="Times New Roman"/>
-          <w:color w:val="000000"/>
-          <w:sz w:val="24"/>
-        </w:rPr>
-        <w:t>For many young women, the requirement to consume high doses of NSAIDs every month for several decades presents an unacceptable long-term toxicological risk. This risk is further amplified in populations with pre-existing gastrointestinal sensitivities or bleeding disorders, rendering the primary pharmacological solution inaccessible or dangerous for a vast demographic of dysmenorrheic patients.</w:t>
-      </w:r>
-    </w:p>
-    <w:p>
-      <w:pPr>
-        <w:pStyle w:val="Heading3"/>
-        <w:jc w:val="both"/>
-      </w:pPr>
-      <w:r>
-        <w:rPr>
-          <w:rFonts w:ascii="Times New Roman" w:hAnsi="Times New Roman" w:eastAsia="Times New Roman"/>
-          <w:color w:val="000000"/>
-          <w:sz w:val="24"/>
-        </w:rPr>
-        <w:t>1.4.4 Second-Line Therapy: Hormonal Contraceptives</w:t>
-      </w:r>
-    </w:p>
-    <w:p>
-      <w:pPr>
-        <w:spacing w:line="360" w:lineRule="auto" w:after="0"/>
-        <w:jc w:val="both"/>
-      </w:pPr>
-      <w:r>
-        <w:rPr>
-          <w:rFonts w:ascii="Times New Roman" w:hAnsi="Times New Roman" w:eastAsia="Times New Roman"/>
-          <w:color w:val="000000"/>
-          <w:sz w:val="24"/>
-        </w:rPr>
-        <w:t>For women who are refractory to NSAIDs, who cannot tolerate their adverse effects, or who concurrently desire reliable contraception, combined oral contraceptives (COCs) serve as the primary second-line therapy (Burnett &amp; Lemyre, 2017). COCs suppress ovulation by inhibiting the release of gonadotropins from the anterior pituitary gland. Consequently, they prevent the profound fluctuations in estrogen and progesterone that characterize a normal ovulatory cycle (Wong et al., 2009).</w:t>
-      </w:r>
-    </w:p>
-    <w:p>
-      <w:pPr>
-        <w:spacing w:line="360" w:lineRule="auto" w:after="0"/>
-        <w:jc w:val="both"/>
-      </w:pPr>
-      <w:r>
-        <w:rPr>
-          <w:rFonts w:ascii="Times New Roman" w:hAnsi="Times New Roman" w:eastAsia="Times New Roman"/>
-          <w:color w:val="000000"/>
-          <w:sz w:val="24"/>
-        </w:rPr>
-        <w:t xml:space="preserve">By inducing a state of anovulation and maintaining a thin, atrophic endometrium, COCs drastically reduce the volume of endometrial tissue available for shedding. This anatomical alteration directly correlates with a massive reduction in the synthesis and subsequent release of endometrial prostaglandins and leukotrienes during the withdrawal bleed, effectively mitigating the physiological trigger for myometrial hypercontractility (Speroff &amp; Fritz, 2020). </w:t>
-      </w:r>
-    </w:p>
-    <w:p>
-      <w:pPr>
-        <w:spacing w:line="360" w:lineRule="auto" w:after="0"/>
-        <w:jc w:val="both"/>
-      </w:pPr>
-      <w:r>
-        <w:rPr>
-          <w:rFonts w:ascii="Times New Roman" w:hAnsi="Times New Roman" w:eastAsia="Times New Roman"/>
-          <w:color w:val="000000"/>
-          <w:sz w:val="24"/>
-        </w:rPr>
-        <w:t>While highly effective, the application of COCs specifically for dysmenorrhea management is frequently complicated by poor patient compliance and significant adverse effects. Systemic hormonal manipulation often induces undesirable side effects, including weight gain, severe mood lability, nausea, mastalgia, and an increased risk of venous thromboembolism (VTE) (Speroff &amp; Fritz, 2020). Furthermore, the use of hormonal contraceptives is culturally or religiously unacceptable for many adolescent girls and unmarried young women, particularly in conservative societies, severely limiting their utility as a universal therapeutic option (Nwankwo et al., 2021).</w:t>
-      </w:r>
-    </w:p>
-    <w:p>
-      <w:pPr>
-        <w:pStyle w:val="Heading3"/>
-        <w:jc w:val="both"/>
-      </w:pPr>
-      <w:r>
-        <w:rPr>
-          <w:rFonts w:ascii="Times New Roman" w:hAnsi="Times New Roman" w:eastAsia="Times New Roman"/>
-          <w:color w:val="000000"/>
-          <w:sz w:val="24"/>
-        </w:rPr>
-        <w:t>1.4.5 The Unmet Clinical Need and the Paradigm Shift Towards Phytomedicine</w:t>
-      </w:r>
-    </w:p>
-    <w:p>
-      <w:pPr>
-        <w:spacing w:line="360" w:lineRule="auto" w:after="0"/>
-        <w:jc w:val="both"/>
-      </w:pPr>
-      <w:r>
-        <w:rPr>
-          <w:rFonts w:ascii="Times New Roman" w:hAnsi="Times New Roman" w:eastAsia="Times New Roman"/>
-          <w:color w:val="000000"/>
-          <w:sz w:val="24"/>
-        </w:rPr>
-        <w:t>The critical analysis of current pharmacological management reveals a glaring unmet clinical need. The heavy reliance on NSAIDs and hormonal contraceptives leaves millions of women worldwide either undertreated due to resistance, or suffering from unacceptable iatrogenic side effects. The clinical mandate is clear: there is an urgent and critical requirement to develop novel, safe, effective, and accessible therapeutics that circumvent the limitations of conventional medicine (Rahnama &amp; Montazeri, 2021).</w:t>
-      </w:r>
-    </w:p>
-    <w:p>
-      <w:pPr>
-        <w:spacing w:line="360" w:lineRule="auto" w:after="0"/>
-        <w:jc w:val="both"/>
-      </w:pPr>
-      <w:r>
-        <w:rPr>
-          <w:rFonts w:ascii="Times New Roman" w:hAnsi="Times New Roman" w:eastAsia="Times New Roman"/>
-          <w:color w:val="000000"/>
-          <w:sz w:val="24"/>
-        </w:rPr>
-        <w:t xml:space="preserve">In response to this significant gap, both patients and the scientific community are increasingly executing a paradigm shift towards complementary and alternative medicine (CAM), with a specific focus on rigorous, evidence-based phytomedicine (herbal medicine) (Sargin, 2021). Historically, medicinal plants have provided the chemical scaffolds for a vast majority of modern pharmaceuticals. The exploration of botanicals that possess innate, multi-targeted pharmacological properties—such as concurrent antispasmodic, anti-inflammatory, and analgesic activities, without the severe gastrointestinal toxicity of NSAIDs—represents the most promising frontier in dysmenorrhea research (Ramezani &amp; Jalali, 2021). It is within this precise scientific context that the therapeutic potential of </w:t>
-      </w:r>
-      <w:r>
-        <w:rPr>
-          <w:rFonts w:ascii="Times New Roman" w:hAnsi="Times New Roman" w:eastAsia="Times New Roman"/>
-          <w:i/>
-          <w:color w:val="000000"/>
-          <w:sz w:val="24"/>
-        </w:rPr>
-        <w:t>Syzygium aromaticum</w:t>
-      </w:r>
-      <w:r>
-        <w:rPr>
-          <w:rFonts w:ascii="Times New Roman" w:hAnsi="Times New Roman" w:eastAsia="Times New Roman"/>
-          <w:color w:val="000000"/>
-          <w:sz w:val="24"/>
-        </w:rPr>
-        <w:t xml:space="preserve"> (clove) demands rigorous preclinical evaluation.</w:t>
-      </w:r>
-    </w:p>
-    <w:p>
-      <w:pPr>
-        <w:pStyle w:val="Heading2"/>
-        <w:jc w:val="both"/>
-      </w:pPr>
-      <w:r>
-        <w:rPr>
-          <w:rFonts w:ascii="Times New Roman" w:hAnsi="Times New Roman" w:eastAsia="Times New Roman"/>
-          <w:color w:val="000000"/>
-          <w:sz w:val="24"/>
-        </w:rPr>
-        <w:t>1.5 Overview of *Syzygium aromaticum* (Clove)</w:t>
-      </w:r>
-    </w:p>
-    <w:p>
-      <w:pPr>
-        <w:pStyle w:val="Heading3"/>
-        <w:jc w:val="both"/>
-      </w:pPr>
-      <w:r>
-        <w:rPr>
-          <w:rFonts w:ascii="Times New Roman" w:hAnsi="Times New Roman" w:eastAsia="Times New Roman"/>
-          <w:color w:val="000000"/>
-          <w:sz w:val="24"/>
-        </w:rPr>
-        <w:t>1.5.1 Botanical Description and Taxonomy</w:t>
-      </w:r>
-    </w:p>
-    <w:p>
-      <w:pPr>
-        <w:spacing w:line="360" w:lineRule="auto" w:after="0"/>
-        <w:jc w:val="both"/>
-      </w:pPr>
-      <w:r>
-        <w:rPr>
-          <w:rFonts w:ascii="Times New Roman" w:hAnsi="Times New Roman" w:eastAsia="Times New Roman"/>
-          <w:i/>
-          <w:color w:val="000000"/>
-          <w:sz w:val="24"/>
-        </w:rPr>
-        <w:t>Syzygium aromaticum</w:t>
-      </w:r>
-      <w:r>
-        <w:rPr>
-          <w:rFonts w:ascii="Times New Roman" w:hAnsi="Times New Roman" w:eastAsia="Times New Roman"/>
-          <w:color w:val="000000"/>
-          <w:sz w:val="24"/>
-        </w:rPr>
-        <w:t xml:space="preserve"> (L.) Merr. &amp; L.M.Perry, universally recognized by its common name 'clove', is a highly prized, aromatic medicinal plant belonging to the Myrtaceae family. The Myrtaceae family is renowned for its diverse array of essential oil-producing species, including eucalyptus and myrtle. Clove itself is an evergreen tree that thrives in tropical climates, typically growing to a height of 8 to 12 meters, characterized by a smooth, grey bark and dense, heavily foliaged canopy composed of large, opposite, ovate-lanceolate leaves that are highly gland-dotted and inherently aromatic (Batiha et al., 2020).</w:t>
-      </w:r>
-    </w:p>
-    <w:p>
-      <w:pPr>
-        <w:spacing w:line="360" w:lineRule="auto" w:after="0"/>
-        <w:jc w:val="both"/>
-      </w:pPr>
-      <w:r>
-        <w:rPr>
-          <w:rFonts w:ascii="Times New Roman" w:hAnsi="Times New Roman" w:eastAsia="Times New Roman"/>
-          <w:color w:val="000000"/>
-          <w:sz w:val="24"/>
-        </w:rPr>
-        <w:t>The botanical entity of primary pharmacological and economic importance is the dried, unopened flower bud. The harvesting of these buds must occur with precise timing—specifically when their basal calyx transitions from a pale green to a distinct, vivid crimson red, immediately prior to the unfurling of the petals. Once meticulously hand-harvested, the buds are subjected to a rigorous sun-drying process. This desiccation halts enzymatic degradation and dramatically concentrates the volatile essential oils within the bud. The final dried product—the commercial clove—is structurally composed of a long, cylindrical hypanthium terminating in four prominent calyx teeth, which tightly enclose a small, ball-like corolla containing the unexpanded petals and numerous stamens (Karabacak &amp; Sener, 2021).</w:t>
-      </w:r>
-    </w:p>
-    <w:p>
-      <w:pPr>
-        <w:spacing w:line="360" w:lineRule="auto" w:after="0"/>
-        <w:jc w:val="both"/>
-      </w:pPr>
-      <w:r>
-        <w:rPr>
-          <w:rFonts w:ascii="Times New Roman" w:hAnsi="Times New Roman" w:eastAsia="Times New Roman"/>
-          <w:color w:val="000000"/>
-          <w:sz w:val="24"/>
-        </w:rPr>
-        <w:t xml:space="preserve">Taxonomically, the plant is classified under the domain Eukaryota, kingdom Plantae, phylum Tracheophyta, class Magnoliopsida, order Myrtales, family Myrtaceae, and genus </w:t>
-      </w:r>
-      <w:r>
-        <w:rPr>
-          <w:rFonts w:ascii="Times New Roman" w:hAnsi="Times New Roman" w:eastAsia="Times New Roman"/>
-          <w:i/>
-          <w:color w:val="000000"/>
-          <w:sz w:val="24"/>
-        </w:rPr>
-        <w:t>Syzygium</w:t>
-      </w:r>
-      <w:r>
-        <w:rPr>
-          <w:rFonts w:ascii="Times New Roman" w:hAnsi="Times New Roman" w:eastAsia="Times New Roman"/>
-          <w:color w:val="000000"/>
-          <w:sz w:val="24"/>
-        </w:rPr>
-        <w:t xml:space="preserve">. While </w:t>
-      </w:r>
-      <w:r>
-        <w:rPr>
-          <w:rFonts w:ascii="Times New Roman" w:hAnsi="Times New Roman" w:eastAsia="Times New Roman"/>
-          <w:i/>
-          <w:color w:val="000000"/>
-          <w:sz w:val="24"/>
-        </w:rPr>
-        <w:t>Eugenia caryophyllata</w:t>
-      </w:r>
-      <w:r>
-        <w:rPr>
-          <w:rFonts w:ascii="Times New Roman" w:hAnsi="Times New Roman" w:eastAsia="Times New Roman"/>
-          <w:color w:val="000000"/>
-          <w:sz w:val="24"/>
-        </w:rPr>
-        <w:t xml:space="preserve"> is frequently encountered in older pharmacological literature as a synonym, </w:t>
-      </w:r>
-      <w:r>
-        <w:rPr>
-          <w:rFonts w:ascii="Times New Roman" w:hAnsi="Times New Roman" w:eastAsia="Times New Roman"/>
-          <w:i/>
-          <w:color w:val="000000"/>
-          <w:sz w:val="24"/>
-        </w:rPr>
-        <w:t>Syzygium aromaticum</w:t>
-      </w:r>
-      <w:r>
-        <w:rPr>
-          <w:rFonts w:ascii="Times New Roman" w:hAnsi="Times New Roman" w:eastAsia="Times New Roman"/>
-          <w:color w:val="000000"/>
-          <w:sz w:val="24"/>
-        </w:rPr>
-        <w:t xml:space="preserve"> remains the scientifically accepted botanical nomenclature in contemporary pharmacognosy (Xue et al., 2022).</w:t>
-      </w:r>
-    </w:p>
-    <w:p>
-      <w:pPr>
-        <w:pStyle w:val="Heading3"/>
-        <w:jc w:val="both"/>
-      </w:pPr>
-      <w:r>
-        <w:rPr>
-          <w:rFonts w:ascii="Times New Roman" w:hAnsi="Times New Roman" w:eastAsia="Times New Roman"/>
-          <w:color w:val="000000"/>
-          <w:sz w:val="24"/>
-        </w:rPr>
-        <w:t>1.5.2 Historical Context and Traditional Ethnomedicine</w:t>
-      </w:r>
-    </w:p>
-    <w:p>
-      <w:pPr>
-        <w:spacing w:line="360" w:lineRule="auto" w:after="0"/>
-        <w:jc w:val="both"/>
-      </w:pPr>
-      <w:r>
-        <w:rPr>
-          <w:rFonts w:ascii="Times New Roman" w:hAnsi="Times New Roman" w:eastAsia="Times New Roman"/>
-          <w:color w:val="000000"/>
-          <w:sz w:val="24"/>
-        </w:rPr>
-        <w:t xml:space="preserve">The historical utilization of clove is as rich and complex as its chemical profile. Indigenous to the volcanic Maluku Islands (historically known as the "Spice Islands") in eastern Indonesia, clove has been a cornerstone of global trade and traditional medicine for over two millennia. Archaeological evidence suggests its use in the Middle East as early as 1700 BCE, and historical records indicate that courtiers in the Han Dynasty of ancient China (circa 200 BCE) were mandated to chew clove buds to sweeten their breath before addressing the Emperor (Gorji &amp; Khaleghi Ghadiri, 2021). </w:t>
-      </w:r>
-    </w:p>
-    <w:p>
-      <w:pPr>
-        <w:spacing w:line="360" w:lineRule="auto" w:after="0"/>
-        <w:jc w:val="both"/>
-      </w:pPr>
-      <w:r>
-        <w:rPr>
-          <w:rFonts w:ascii="Times New Roman" w:hAnsi="Times New Roman" w:eastAsia="Times New Roman"/>
-          <w:color w:val="000000"/>
-          <w:sz w:val="24"/>
-        </w:rPr>
-        <w:t xml:space="preserve">Beyond its utility as a luxury culinary spice and preservative, clove possesses a deeply entrenched history in traditional ethnomedicine across diverse global cultures. In Traditional Chinese Medicine (TCM), clove (known as 'Ding Xiang') is classified as an acrid and warm herb, utilized extensively to warm the middle, direct rebellious Qi downward, and critically, to warm the kidneys and fortify Yang. It has been historically prescribed to treat severe digestive disorders, intractable hiccups, vomiting, and cold-induced abdominal pain (Sargin, 2021). </w:t>
-      </w:r>
-    </w:p>
-    <w:p>
-      <w:pPr>
-        <w:spacing w:line="360" w:lineRule="auto" w:after="0"/>
-        <w:jc w:val="both"/>
-      </w:pPr>
-      <w:r>
-        <w:rPr>
-          <w:rFonts w:ascii="Times New Roman" w:hAnsi="Times New Roman" w:eastAsia="Times New Roman"/>
-          <w:color w:val="000000"/>
-          <w:sz w:val="24"/>
-        </w:rPr>
-        <w:t>In Ayurveda, the traditional medicinal system of India, clove (Lavanga) is revered for its profound kapha and vata pacifying properties. It is a fundamental component of numerous polyherbal formulations designed to treat respiratory ailments (such as asthma and chronic bronchitis), severe dental pathologies, and gastrointestinal spasms. Significantly, within various indigenous tribal communities and traditional healers in Southeast Asia and Africa, clove decoctions and essential oils have been empirically employed for centuries to alleviate severe gynecological pain, induce uterine relaxation during obstructed labor, and explicitly manage the debilitating symptoms of primary dysmenorrhea, hinting at a profound, unrecognized antispasmodic mechanism (Aziz et al., 2018).</w:t>
-      </w:r>
-    </w:p>
-    <w:p>
-      <w:pPr>
-        <w:pStyle w:val="Heading3"/>
-        <w:jc w:val="both"/>
-      </w:pPr>
-      <w:r>
-        <w:rPr>
-          <w:rFonts w:ascii="Times New Roman" w:hAnsi="Times New Roman" w:eastAsia="Times New Roman"/>
-          <w:color w:val="000000"/>
-          <w:sz w:val="24"/>
-        </w:rPr>
-        <w:t>1.5.3 Global Production and Economic Significance</w:t>
-      </w:r>
-    </w:p>
-    <w:p>
-      <w:pPr>
-        <w:spacing w:line="360" w:lineRule="auto" w:after="0"/>
-        <w:jc w:val="both"/>
-      </w:pPr>
-      <w:r>
-        <w:rPr>
-          <w:rFonts w:ascii="Times New Roman" w:hAnsi="Times New Roman" w:eastAsia="Times New Roman"/>
-          <w:color w:val="000000"/>
-          <w:sz w:val="24"/>
-        </w:rPr>
-        <w:t xml:space="preserve">From its restricted origins in the remote Maluku Islands, the cultivation of </w:t>
-      </w:r>
-      <w:r>
-        <w:rPr>
-          <w:rFonts w:ascii="Times New Roman" w:hAnsi="Times New Roman" w:eastAsia="Times New Roman"/>
-          <w:i/>
-          <w:color w:val="000000"/>
-          <w:sz w:val="24"/>
-        </w:rPr>
-        <w:t>Syzygium aromaticum</w:t>
-      </w:r>
-      <w:r>
-        <w:rPr>
-          <w:rFonts w:ascii="Times New Roman" w:hAnsi="Times New Roman" w:eastAsia="Times New Roman"/>
-          <w:color w:val="000000"/>
-          <w:sz w:val="24"/>
-        </w:rPr>
-        <w:t xml:space="preserve"> has expanded significantly, driven initially by the lucrative spice trade of the 16th and 17th centuries, which sparked global geopolitical conflicts between European maritime powers. Today, the tree is extensively cultivated in tropical coastal regions globally. </w:t>
-      </w:r>
-    </w:p>
-    <w:p>
-      <w:pPr>
-        <w:spacing w:line="360" w:lineRule="auto" w:after="0"/>
-        <w:jc w:val="both"/>
-      </w:pPr>
-      <w:r>
-        <w:rPr>
-          <w:rFonts w:ascii="Times New Roman" w:hAnsi="Times New Roman" w:eastAsia="Times New Roman"/>
-          <w:color w:val="000000"/>
-          <w:sz w:val="24"/>
-        </w:rPr>
-        <w:t xml:space="preserve">Indonesia remains the undisputed global leader in clove production, accounting for approximately 70-80% of the world's supply. However, the majority of the Indonesian yield is domestically consumed in the production of "Kretek" cigarettes—a unique blend of tobacco and crushed cloves that defines the Indonesian tobacco industry. The remaining global demand for high-quality culinary and pharmaceutical grade clove is supplied primarily by Madagascar, the United Republic of Tanzania (specifically the Zanzibar archipelago, which historically built its economy almost entirely on clove exports), Sri Lanka, and the Comoros (Devkota &amp; Devkota, 2022). </w:t>
-      </w:r>
-    </w:p>
-    <w:p>
-      <w:pPr>
-        <w:spacing w:line="360" w:lineRule="auto" w:after="0"/>
-        <w:jc w:val="both"/>
-      </w:pPr>
-      <w:r>
-        <w:rPr>
-          <w:rFonts w:ascii="Times New Roman" w:hAnsi="Times New Roman" w:eastAsia="Times New Roman"/>
-          <w:color w:val="000000"/>
-          <w:sz w:val="24"/>
-        </w:rPr>
-        <w:t>The economic significance of clove is immense. Beyond the massive culinary spice market, the extraction of its essential oil fuels multi-billion-dollar global industries ranging from cosmetics and high-end perfumery to food preservation and the synthesis of vanilla flavoring (vanillin). Crucially, its potent biological activities have cemented its role as a high-value commodity in the global pharmaceutical and nutraceutical sectors, where standardized extracts and isolated compounds (particularly eugenol) are rigorously utilized in the formulation of modern analgesics, dental cements, and broad-spectrum antimicrobial agents (Khan &amp; Ahmad, 2021).</w:t>
-      </w:r>
-    </w:p>
-    <w:p>
-      <w:pPr>
-        <w:pStyle w:val="Heading3"/>
-        <w:jc w:val="both"/>
-      </w:pPr>
-      <w:r>
-        <w:rPr>
-          <w:rFonts w:ascii="Times New Roman" w:hAnsi="Times New Roman" w:eastAsia="Times New Roman"/>
-          <w:color w:val="000000"/>
-          <w:sz w:val="24"/>
-        </w:rPr>
-        <w:t>1.5.4 Pharmacological Versatility</w:t>
-      </w:r>
-    </w:p>
-    <w:p>
-      <w:pPr>
-        <w:spacing w:line="360" w:lineRule="auto" w:after="0"/>
-        <w:jc w:val="both"/>
-      </w:pPr>
-      <w:r>
-        <w:rPr>
-          <w:rFonts w:ascii="Times New Roman" w:hAnsi="Times New Roman" w:eastAsia="Times New Roman"/>
-          <w:color w:val="000000"/>
-          <w:sz w:val="24"/>
-        </w:rPr>
-        <w:t xml:space="preserve">The contemporary scientific investigation of </w:t>
-      </w:r>
-      <w:r>
-        <w:rPr>
-          <w:rFonts w:ascii="Times New Roman" w:hAnsi="Times New Roman" w:eastAsia="Times New Roman"/>
-          <w:i/>
-          <w:color w:val="000000"/>
-          <w:sz w:val="24"/>
-        </w:rPr>
-        <w:t>Syzygium aromaticum</w:t>
-      </w:r>
-      <w:r>
-        <w:rPr>
-          <w:rFonts w:ascii="Times New Roman" w:hAnsi="Times New Roman" w:eastAsia="Times New Roman"/>
-          <w:color w:val="000000"/>
-          <w:sz w:val="24"/>
-        </w:rPr>
-        <w:t xml:space="preserve"> has successfully validated many of its ancient ethnomedical applications, revealing a plant possessing extraordinary pharmacological versatility. Rigorous in vitro and in vivo studies have confirmed that clove extracts and its essential oil exhibit a massive spectrum of biological activities. </w:t>
-      </w:r>
-    </w:p>
-    <w:p>
-      <w:pPr>
-        <w:spacing w:line="360" w:lineRule="auto" w:after="0"/>
-        <w:jc w:val="both"/>
-      </w:pPr>
-      <w:r>
-        <w:rPr>
-          <w:rFonts w:ascii="Times New Roman" w:hAnsi="Times New Roman" w:eastAsia="Times New Roman"/>
-          <w:color w:val="000000"/>
-          <w:sz w:val="24"/>
-        </w:rPr>
-        <w:t xml:space="preserve">Foremost among these is its remarkable antimicrobial efficacy. Clove oil is a potent, broad-spectrum biocide, demonstrating profound bactericidal activity against numerous Gram-positive and Gram-negative pathogens (including multi-drug resistant strains), as well as potent fungicidal and antiviral properties (Dorman &amp; Deans, 2000; Nuñez &amp; D'Aquino, 2021). Furthermore, the bud possesses one of the highest recorded antioxidant capacities among all known spices and medicinal plants, capable of effectively scavenging free radicals, preventing lipid peroxidation, and shielding cellular membranes from severe oxidative stress (Shan et al., 2005; Park &amp; Lee, 2021). </w:t>
-      </w:r>
-    </w:p>
-    <w:p>
-      <w:pPr>
-        <w:spacing w:line="360" w:lineRule="auto" w:after="0"/>
-        <w:jc w:val="both"/>
-      </w:pPr>
-      <w:r>
-        <w:rPr>
-          <w:rFonts w:ascii="Times New Roman" w:hAnsi="Times New Roman" w:eastAsia="Times New Roman"/>
-          <w:color w:val="000000"/>
-          <w:sz w:val="24"/>
-        </w:rPr>
-        <w:t>However, it is the profound analgesic, anti-inflammatory, and local anesthetic properties of clove that are of paramount interest to modern pharmacology (Halder et al., 2011). These specific properties—traditionally exploited for the immediate relief of acute dental pain—suggest a complex interaction with nociceptive pathways and inflammatory cascades. The hypothesis driving current gynecological research is that this exact combination of potent anti-inflammatory action, radical scavenging, and acute analgesia provides the perfect pharmacological profile required to dismantle the complex, multi-pathway pathophysiology driving primary dysmenorrhea (Lakshmi &amp; Geetha, 2021).</w:t>
-      </w:r>
-    </w:p>
-    <w:p>
-      <w:pPr>
-        <w:pStyle w:val="Heading2"/>
-        <w:jc w:val="both"/>
-      </w:pPr>
-      <w:r>
-        <w:rPr>
-          <w:rFonts w:ascii="Times New Roman" w:hAnsi="Times New Roman" w:eastAsia="Times New Roman"/>
-          <w:color w:val="000000"/>
-          <w:sz w:val="24"/>
-        </w:rPr>
-        <w:t>1.6 Phytochemical Composition of *Syzygium aromaticum*</w:t>
-      </w:r>
-    </w:p>
-    <w:p>
-      <w:pPr>
-        <w:pStyle w:val="Heading3"/>
-        <w:jc w:val="both"/>
-      </w:pPr>
-      <w:r>
-        <w:rPr>
-          <w:rFonts w:ascii="Times New Roman" w:hAnsi="Times New Roman" w:eastAsia="Times New Roman"/>
-          <w:color w:val="000000"/>
-          <w:sz w:val="24"/>
-        </w:rPr>
-        <w:t>1.6.1 The Complex Phytochemistry of Clove Bud Extract</w:t>
-      </w:r>
-    </w:p>
-    <w:p>
-      <w:pPr>
-        <w:spacing w:line="360" w:lineRule="auto" w:after="0"/>
-        <w:jc w:val="both"/>
-      </w:pPr>
-      <w:r>
-        <w:rPr>
-          <w:rFonts w:ascii="Times New Roman" w:hAnsi="Times New Roman" w:eastAsia="Times New Roman"/>
-          <w:color w:val="000000"/>
-          <w:sz w:val="24"/>
-        </w:rPr>
-        <w:t xml:space="preserve">The immense pharmacological versatility of </w:t>
-      </w:r>
-      <w:r>
-        <w:rPr>
-          <w:rFonts w:ascii="Times New Roman" w:hAnsi="Times New Roman" w:eastAsia="Times New Roman"/>
-          <w:i/>
-          <w:color w:val="000000"/>
-          <w:sz w:val="24"/>
-        </w:rPr>
-        <w:t>Syzygium aromaticum</w:t>
-      </w:r>
-      <w:r>
-        <w:rPr>
-          <w:rFonts w:ascii="Times New Roman" w:hAnsi="Times New Roman" w:eastAsia="Times New Roman"/>
-          <w:color w:val="000000"/>
-          <w:sz w:val="24"/>
-        </w:rPr>
-        <w:t xml:space="preserve"> is inextricably linked to its exceptionally complex and highly concentrated phytochemical profile. The dried clove bud is a veritable biochemical factory, yielding an essential oil content that is extraordinarily high compared to other medicinal plants, typically ranging between 15% and 20% by weight (Bhosle et al., 2022). This essential oil, alongside a rich matrix of non-volatile compounds, constitutes the biologically active fraction of the plant.</w:t>
-      </w:r>
-    </w:p>
-    <w:p>
-      <w:pPr>
-        <w:spacing w:line="360" w:lineRule="auto" w:after="0"/>
-        <w:jc w:val="both"/>
-      </w:pPr>
-      <w:r>
-        <w:rPr>
-          <w:rFonts w:ascii="Times New Roman" w:hAnsi="Times New Roman" w:eastAsia="Times New Roman"/>
-          <w:color w:val="000000"/>
-          <w:sz w:val="24"/>
-        </w:rPr>
-        <w:t>Advanced chromatographic and spectroscopic analyses, primarily utilizing Gas Chromatography-Mass Spectrometry (GC-MS), have definitively elucidated the chemical architecture of clove bud extracts. These studies consistently demonstrate that the extract is not a simple, single-component drug, but rather a highly sophisticated, multi-component amalgam of phenylpropanoids, monoterpenes, sesquiterpenes, phenolic acids, and complex flavonoids (Dobreva &amp; Milcheva, 2021). The precise quantitative composition of these secondary metabolites exhibits natural variation, influenced by geographical origin, precise harvesting time, environmental stressors, and the specific solvent extraction methodology employed (e.g., hydrodistillation versus ethanolic extraction). Despite this natural variance, the overarching qualitative profile and the dominance of key bioactive molecules remain remarkably consistent across global samples (El-Ghallab et al., 2020; Uysal &amp; Ustun, 2022).</w:t>
-      </w:r>
-    </w:p>
-    <w:p>
-      <w:pPr>
-        <w:pStyle w:val="Heading3"/>
-        <w:jc w:val="both"/>
-      </w:pPr>
-      <w:r>
-        <w:rPr>
-          <w:rFonts w:ascii="Times New Roman" w:hAnsi="Times New Roman" w:eastAsia="Times New Roman"/>
-          <w:color w:val="000000"/>
-          <w:sz w:val="24"/>
-        </w:rPr>
-        <w:t>1.6.2 Eugenol: The Primary Bioactive Phenylpropanoid</w:t>
-      </w:r>
-    </w:p>
-    <w:p>
-      <w:pPr>
-        <w:spacing w:line="360" w:lineRule="auto" w:after="0"/>
-        <w:jc w:val="both"/>
-      </w:pPr>
-      <w:r>
-        <w:rPr>
-          <w:rFonts w:ascii="Times New Roman" w:hAnsi="Times New Roman" w:eastAsia="Times New Roman"/>
-          <w:color w:val="000000"/>
-          <w:sz w:val="24"/>
-        </w:rPr>
-        <w:t xml:space="preserve">The defining chemical characteristic of </w:t>
-      </w:r>
-      <w:r>
-        <w:rPr>
-          <w:rFonts w:ascii="Times New Roman" w:hAnsi="Times New Roman" w:eastAsia="Times New Roman"/>
-          <w:i/>
-          <w:color w:val="000000"/>
-          <w:sz w:val="24"/>
-        </w:rPr>
-        <w:t>Syzygium aromaticum</w:t>
-      </w:r>
-      <w:r>
-        <w:rPr>
-          <w:rFonts w:ascii="Times New Roman" w:hAnsi="Times New Roman" w:eastAsia="Times New Roman"/>
-          <w:color w:val="000000"/>
-          <w:sz w:val="24"/>
-        </w:rPr>
-        <w:t xml:space="preserve"> is the overwhelming dominance of eugenol (4-allyl-2-methoxyphenol), a versatile and potently bioactive phenylpropanoid. Eugenol consistently constitutes the vast majority of the essential oil fraction, routinely accounting for 70% to 90% of the total volatile composition, depending on the specific cultivar and extraction parameters (Kamatou et al., 2012).</w:t>
-      </w:r>
-    </w:p>
-    <w:p>
-      <w:pPr>
-        <w:spacing w:line="360" w:lineRule="auto" w:after="0"/>
-        <w:jc w:val="both"/>
-      </w:pPr>
-      <w:r>
-        <w:rPr>
-          <w:rFonts w:ascii="Times New Roman" w:hAnsi="Times New Roman" w:eastAsia="Times New Roman"/>
-          <w:color w:val="000000"/>
-          <w:sz w:val="24"/>
-        </w:rPr>
-        <w:t>Structurally, eugenol possesses a methoxyphenol ring with an allyl hydrocarbon chain. This specific structural configuration is highly significant pharmacologically. The phenolic hydroxyl group provides exceptional electron-donating capability, granting eugenol its profound, well-documented antioxidant and free radical scavenging prowess (Gülçin, 2011). Furthermore, its specific lipophilic profile allows for rapid and extensive penetration across biological membranes, including the blood-brain barrier and the cellular membranes of myometrial smooth muscle, facilitating its rapid onset of action in vivo (Fischer et al., 1990).</w:t>
-      </w:r>
-    </w:p>
-    <w:p>
-      <w:pPr>
-        <w:spacing w:line="360" w:lineRule="auto" w:after="0"/>
-        <w:jc w:val="both"/>
-      </w:pPr>
-      <w:r>
-        <w:rPr>
-          <w:rFonts w:ascii="Times New Roman" w:hAnsi="Times New Roman" w:eastAsia="Times New Roman"/>
-          <w:color w:val="000000"/>
-          <w:sz w:val="24"/>
-        </w:rPr>
-        <w:t>The pharmacological actions of isolated eugenol have been exhaustively documented. It is a proven, potent inhibitor of cyclooxygenase-2 (COX-2) and 5-lipoxygenase (5-LOX), thereby disrupting the synthesis of both prostaglandins and leukotrienes—the primary inflammatory mediators driving dysmenorrhea (Kim et al., 2003; Raghavenra et al., 2006). Additionally, eugenol exerts profound local anesthetic effects by directly blocking voltage-gated sodium channels in peripheral nerves, and acts as a direct smooth muscle relaxant by inhibiting voltage-dependent calcium channels, specifically the CaV2.3 and L-type isoforms, effectively preventing the calcium influx required for severe myometrial contraction (Lee et al., 2008; Peixoto-Neves et al., 2014; Shin &amp; Lee, 2021). Consequently, eugenol is unequivocally recognized as the principal active pharmaceutical ingredient (API) responsible for the antispasmodic and analgesic efficacy of the whole clove extract (Mohammadi &amp; Jafari, 2022).</w:t>
-      </w:r>
-    </w:p>
-    <w:p>
-      <w:pPr>
-        <w:pStyle w:val="Heading3"/>
-        <w:jc w:val="both"/>
-      </w:pPr>
-      <w:r>
-        <w:rPr>
-          <w:rFonts w:ascii="Times New Roman" w:hAnsi="Times New Roman" w:eastAsia="Times New Roman"/>
-          <w:color w:val="000000"/>
-          <w:sz w:val="24"/>
-        </w:rPr>
-        <w:t>1.6.3 Minor Constituents and Synergistic Interactions: Eugenyl Acetate and β-Caryophyllene</w:t>
-      </w:r>
-    </w:p>
-    <w:p>
-      <w:pPr>
-        <w:spacing w:line="360" w:lineRule="auto" w:after="0"/>
-        <w:jc w:val="both"/>
-      </w:pPr>
-      <w:r>
-        <w:rPr>
-          <w:rFonts w:ascii="Times New Roman" w:hAnsi="Times New Roman" w:eastAsia="Times New Roman"/>
-          <w:color w:val="000000"/>
-          <w:sz w:val="24"/>
-        </w:rPr>
-        <w:t>While eugenol dictates the primary pharmacological narrative, the true therapeutic potential of the whole clove extract relies heavily on the critical contributions of its "minor" volatile constituents. The most prominent among these are eugenyl acetate (typically comprising 2% to 15% of the oil) and beta-caryophyllene (accounting for 5% to 14%) (Alma et al., 2007; Ibrahim et al., 2022).</w:t>
-      </w:r>
-    </w:p>
-    <w:p>
-      <w:pPr>
-        <w:spacing w:line="360" w:lineRule="auto" w:after="0"/>
-        <w:jc w:val="both"/>
-      </w:pPr>
-      <w:r>
-        <w:rPr>
-          <w:rFonts w:ascii="Times New Roman" w:hAnsi="Times New Roman" w:eastAsia="Times New Roman"/>
-          <w:color w:val="000000"/>
-          <w:sz w:val="24"/>
-        </w:rPr>
-        <w:t xml:space="preserve">Eugenyl acetate is the acetylated derivative of eugenol. Research indicates that this acetylation may actually enhance specific pharmacological properties; for instance, eugenyl acetate has been shown to exhibit anti-inflammatory activity and antispasmodic effects that sometimes parallel or even exceed those of pure eugenol in specific isolated tissue models (Pramod et al., 2025). </w:t>
-      </w:r>
-    </w:p>
-    <w:p>
-      <w:pPr>
-        <w:spacing w:line="360" w:lineRule="auto" w:after="0"/>
-        <w:jc w:val="both"/>
-      </w:pPr>
-      <w:r>
-        <w:rPr>
-          <w:rFonts w:ascii="Times New Roman" w:hAnsi="Times New Roman" w:eastAsia="Times New Roman"/>
-          <w:color w:val="000000"/>
-          <w:sz w:val="24"/>
-        </w:rPr>
-        <w:t xml:space="preserve">Beta-caryophyllene is a unique bicyclic sesquiterpene that has garnered massive scientific interest because it selectively binds to and activates the Cannabinoid receptor type 2 (CB2) in the peripheral nervous system and immune cells. By acting as a dietary cannabinoid, beta-caryophyllene exerts powerful, receptor-mediated anti-inflammatory and neuropathic pain-relieving effects without inducing the psychoactive properties associated with CB1 receptor activation (Vardhan &amp; Shukla, 2022). </w:t>
-      </w:r>
-    </w:p>
-    <w:p>
-      <w:pPr>
-        <w:spacing w:line="360" w:lineRule="auto" w:after="0"/>
-        <w:jc w:val="both"/>
-      </w:pPr>
-      <w:r>
-        <w:rPr>
-          <w:rFonts w:ascii="Times New Roman" w:hAnsi="Times New Roman" w:eastAsia="Times New Roman"/>
-          <w:color w:val="000000"/>
-          <w:sz w:val="24"/>
-        </w:rPr>
-        <w:t>The presence of these compounds alongside eugenol creates a classic polypharmacological scenario characterized by 'entourage' or synergistic effects. The whole extract—containing eugenol, eugenyl acetate, and beta-caryophyllene—targets the inflammatory and nociceptive cascades via multiple, non-overlapping mechanisms (COX inhibition, calcium channel blockade, and CB2 receptor activation). This multi-targeted approach often results in a significantly enhanced therapeutic outcome and a superior safety profile compared to the administration of isolated, synthesized eugenol alone (Marinković &amp; Radović, 2021).</w:t>
-      </w:r>
-    </w:p>
-    <w:p>
-      <w:pPr>
-        <w:pStyle w:val="Heading3"/>
-        <w:jc w:val="both"/>
-      </w:pPr>
-      <w:r>
-        <w:rPr>
-          <w:rFonts w:ascii="Times New Roman" w:hAnsi="Times New Roman" w:eastAsia="Times New Roman"/>
-          <w:color w:val="000000"/>
-          <w:sz w:val="24"/>
-        </w:rPr>
-        <w:t>1.6.4 Phenolic Compounds and Flavonoids in the Non-Volatile Fraction</w:t>
-      </w:r>
-    </w:p>
-    <w:p>
-      <w:pPr>
-        <w:spacing w:line="360" w:lineRule="auto" w:after="0"/>
-        <w:jc w:val="both"/>
-      </w:pPr>
-      <w:r>
-        <w:rPr>
-          <w:rFonts w:ascii="Times New Roman" w:hAnsi="Times New Roman" w:eastAsia="Times New Roman"/>
-          <w:color w:val="000000"/>
-          <w:sz w:val="24"/>
-        </w:rPr>
-        <w:t>Beyond the potent volatile essential oils, the non-volatile matrix of the clove bud—extractable via aqueous or ethanolic solvents—is exceptionally rich in complex phenolic compounds, tannins, and specific flavonoids. These highly polar compounds contribute significantly to the overall therapeutic architecture of the plant (Nassar et al., 2007).</w:t>
-      </w:r>
-    </w:p>
-    <w:p>
-      <w:pPr>
-        <w:spacing w:line="360" w:lineRule="auto" w:after="0"/>
-        <w:jc w:val="both"/>
-      </w:pPr>
-      <w:r>
-        <w:rPr>
-          <w:rFonts w:ascii="Times New Roman" w:hAnsi="Times New Roman" w:eastAsia="Times New Roman"/>
-          <w:color w:val="000000"/>
-          <w:sz w:val="24"/>
-        </w:rPr>
-        <w:t xml:space="preserve">Prominent among these are hydrolyzable tannins (such as strictinin and casuarictin), phenolic acids (including gallic acid and caffeic acid derivatives), and a unique array of flavonol glucuronides specific to </w:t>
-      </w:r>
-      <w:r>
-        <w:rPr>
-          <w:rFonts w:ascii="Times New Roman" w:hAnsi="Times New Roman" w:eastAsia="Times New Roman"/>
-          <w:i/>
-          <w:color w:val="000000"/>
-          <w:sz w:val="24"/>
-        </w:rPr>
-        <w:t>Syzygium aromaticum</w:t>
-      </w:r>
-      <w:r>
-        <w:rPr>
-          <w:rFonts w:ascii="Times New Roman" w:hAnsi="Times New Roman" w:eastAsia="Times New Roman"/>
-          <w:color w:val="000000"/>
-          <w:sz w:val="24"/>
-        </w:rPr>
-        <w:t xml:space="preserve"> (Ryu et al., 2016). These non-volatile polyphenols are characterized by an extremely high density of hydroxyl groups, endowing the extract with a profound, sustained antioxidant capacity that complements the rapid, volatile action of eugenol (Li et al., 2022).</w:t>
-      </w:r>
-    </w:p>
-    <w:p>
-      <w:pPr>
-        <w:spacing w:line="360" w:lineRule="auto" w:after="0"/>
-        <w:jc w:val="both"/>
-      </w:pPr>
-      <w:r>
-        <w:rPr>
-          <w:rFonts w:ascii="Times New Roman" w:hAnsi="Times New Roman" w:eastAsia="Times New Roman"/>
-          <w:color w:val="000000"/>
-          <w:sz w:val="24"/>
-        </w:rPr>
-        <w:t>In the context of primary dysmenorrhea—a condition intrinsically linked to significant, recurrent oxidative stress and the generation of reactive oxygen species within the ischemic myometrium—these complex phenolics play a crucial protective role. By aggressively scavenging free radicals and neutralizing oxidative damage at the cellular level, these flavonoids prevent the secondary, oxidative-stress-induced activation of phospholipase A2. This effectively starves the cyclooxygenase enzymes of their arachidonic acid substrate, providing a crucial secondary mechanism to suppress prostaglandin synthesis and alleviate pain (Szydłowska et al., 2020; Xue et al., 2022). The integration of both the volatile and non-volatile phytochemical fractions is what renders the total ethanolic extract of clove a highly formidable candidate for the holistic management of dysmenorrhea.</w:t>
-      </w:r>
-    </w:p>
-    <w:p>
-      <w:pPr>
-        <w:pStyle w:val="Heading2"/>
-        <w:jc w:val="both"/>
-      </w:pPr>
-      <w:r>
-        <w:rPr>
-          <w:rFonts w:ascii="Times New Roman" w:hAnsi="Times New Roman" w:eastAsia="Times New Roman"/>
-          <w:color w:val="000000"/>
-          <w:sz w:val="24"/>
-        </w:rPr>
-        <w:t>1.7 Preclinical Safety Evaluation: Acute Oral Toxicity</w:t>
-      </w:r>
-    </w:p>
-    <w:p>
-      <w:pPr>
-        <w:pStyle w:val="Heading3"/>
-        <w:jc w:val="both"/>
-      </w:pPr>
-      <w:r>
-        <w:rPr>
-          <w:rFonts w:ascii="Times New Roman" w:hAnsi="Times New Roman" w:eastAsia="Times New Roman"/>
-          <w:color w:val="000000"/>
-          <w:sz w:val="24"/>
-        </w:rPr>
-        <w:t>1.7.1 The Necessity of Rigorous Preclinical Toxicological Evaluation</w:t>
-      </w:r>
-    </w:p>
-    <w:p>
-      <w:pPr>
-        <w:spacing w:line="360" w:lineRule="auto" w:after="0"/>
-        <w:jc w:val="both"/>
-      </w:pPr>
-      <w:r>
-        <w:rPr>
-          <w:rFonts w:ascii="Times New Roman" w:hAnsi="Times New Roman" w:eastAsia="Times New Roman"/>
-          <w:color w:val="000000"/>
-          <w:sz w:val="24"/>
-        </w:rPr>
-        <w:t xml:space="preserve">A pervasive, dangerous, and scientifically inaccurate assumption persists within both the general public and certain sectors of alternative medicine: the belief that "natural" inherently equates to "safe." While medicinal plants like </w:t>
-      </w:r>
-      <w:r>
-        <w:rPr>
-          <w:rFonts w:ascii="Times New Roman" w:hAnsi="Times New Roman" w:eastAsia="Times New Roman"/>
-          <w:i/>
-          <w:color w:val="000000"/>
-          <w:sz w:val="24"/>
-        </w:rPr>
-        <w:t>Syzygium aromaticum</w:t>
-      </w:r>
-      <w:r>
-        <w:rPr>
-          <w:rFonts w:ascii="Times New Roman" w:hAnsi="Times New Roman" w:eastAsia="Times New Roman"/>
-          <w:color w:val="000000"/>
-          <w:sz w:val="24"/>
-        </w:rPr>
-        <w:t xml:space="preserve"> possess massive therapeutic potential and have been utilized empirically for centuries, their complex phytochemical matrices consist of potent, active chemical compounds capable of inducing significant, and sometimes lethal, toxicity if administered at inappropriate dosages or utilizing incorrect extraction methodologies (Singh &amp; Singh, 2021). </w:t>
-      </w:r>
-    </w:p>
-    <w:p>
-      <w:pPr>
-        <w:spacing w:line="360" w:lineRule="auto" w:after="0"/>
-        <w:jc w:val="both"/>
-      </w:pPr>
-      <w:r>
-        <w:rPr>
-          <w:rFonts w:ascii="Times New Roman" w:hAnsi="Times New Roman" w:eastAsia="Times New Roman"/>
-          <w:color w:val="000000"/>
-          <w:sz w:val="24"/>
-        </w:rPr>
-        <w:t>Consequently, the translation of any herbal remedy from traditional ethnomedical use to a scientifically validated, standardized pharmacological intervention mandates a rigorous, objective, and highly systematic preclinical toxicological evaluation. Before any definitive claims regarding the in vivo efficacy of a clove extract for dysmenorrhea can be made, its fundamental safety profile, specifically its lethality and severe adverse effect threshold, must be definitively established (Graves, 2019). The acute oral toxicity study represents the critical first and most fundamental step in this mandatory toxicological cascade, providing the essential foundational data required to justify and safely design all subsequent in vivo pharmacological efficacy trials and chronic toxicity evaluations (Pal &amp; Dutta, 2022).</w:t>
-      </w:r>
-    </w:p>
-    <w:p>
-      <w:pPr>
-        <w:pStyle w:val="Heading3"/>
-        <w:jc w:val="both"/>
-      </w:pPr>
-      <w:r>
-        <w:rPr>
-          <w:rFonts w:ascii="Times New Roman" w:hAnsi="Times New Roman" w:eastAsia="Times New Roman"/>
-          <w:color w:val="000000"/>
-          <w:sz w:val="24"/>
-        </w:rPr>
-        <w:t>1.7.2 Principles and Rationale of the OECD Test Guideline 423</w:t>
-      </w:r>
-    </w:p>
-    <w:p>
-      <w:pPr>
-        <w:spacing w:line="360" w:lineRule="auto" w:after="0"/>
-        <w:jc w:val="both"/>
-      </w:pPr>
-      <w:r>
-        <w:rPr>
-          <w:rFonts w:ascii="Times New Roman" w:hAnsi="Times New Roman" w:eastAsia="Times New Roman"/>
-          <w:color w:val="000000"/>
-          <w:sz w:val="24"/>
-        </w:rPr>
-        <w:t xml:space="preserve">Historically, acute toxicity was evaluated using the classical LD50 test, a method designed to determine the exact statistical dose required to kill exactly 50% of a large cohort of experimental animals. This classical approach was highly resource-intensive and necessitated the lethality of a massive number of animals, raising severe ethical concerns globally (Madhavi &amp; Rao, 2022). </w:t>
-      </w:r>
-    </w:p>
-    <w:p>
-      <w:pPr>
-        <w:spacing w:line="360" w:lineRule="auto" w:after="0"/>
-        <w:jc w:val="both"/>
-      </w:pPr>
-      <w:r>
-        <w:rPr>
-          <w:rFonts w:ascii="Times New Roman" w:hAnsi="Times New Roman" w:eastAsia="Times New Roman"/>
-          <w:color w:val="000000"/>
-          <w:sz w:val="24"/>
-        </w:rPr>
-        <w:t>In response to these ethical mandates, the Organization for Economic Co-operation and Development (OECD) developed and formalized advanced, scientifically robust, and humane alternative methodologies, most notably the OECD Test Guideline 423: Acute Toxic Class (ATC) Method (OECD, 2002). The ATC method fundamentally abandons the objective of calculating a precise point-estimate of the LD50. Instead, it utilizes a highly structured, step-wise, sequential testing procedure to classify the test substance into a specific, globally recognized toxicity category (ranging from highly toxic to relatively harmless) defined by the Globally Harmonized System (GHS) (Sánchez &amp; García, 2022).</w:t>
-      </w:r>
-    </w:p>
-    <w:p>
-      <w:pPr>
-        <w:spacing w:line="360" w:lineRule="auto" w:after="0"/>
-        <w:jc w:val="both"/>
-      </w:pPr>
-      <w:r>
-        <w:rPr>
-          <w:rFonts w:ascii="Times New Roman" w:hAnsi="Times New Roman" w:eastAsia="Times New Roman"/>
-          <w:color w:val="000000"/>
-          <w:sz w:val="24"/>
-        </w:rPr>
-        <w:t>The core principle of the OECD 423 protocol is the minimization of animal use. The methodology dictates using the absolute minimum number of animals per sequential step (typically only three animals of a single sex, conventionally females, as they are statistically generally more sensitive to xenobiotic insults). The starting dose is selected from a set of fixed, pre-defined levels (e.g., 5, 50, 300, or 2000 mg/kg body weight). The occurrence or precise absence of substance-related mortality in this initial small group dictates the subsequent step: either halting testing entirely (if no toxicity is observed), proceeding to test at a higher dose, or moving to a lower dose (Monica &amp; Kumar, 2021). This highly optimized algorithmic approach ensures that the extract is accurately classified regarding its acute hazard potential while reducing animal lethality by up to 70% compared to obsolete, classical LD50 testing.</w:t>
-      </w:r>
-    </w:p>
-    <w:p>
-      <w:pPr>
-        <w:pStyle w:val="Heading3"/>
-        <w:jc w:val="both"/>
-      </w:pPr>
-      <w:r>
-        <w:rPr>
-          <w:rFonts w:ascii="Times New Roman" w:hAnsi="Times New Roman" w:eastAsia="Times New Roman"/>
-          <w:color w:val="000000"/>
-          <w:sz w:val="24"/>
-        </w:rPr>
-        <w:t>1.7.3 Existing Toxicological Data on *Syzygium aromaticum*</w:t>
-      </w:r>
-    </w:p>
-    <w:p>
-      <w:pPr>
-        <w:spacing w:line="360" w:lineRule="auto" w:after="0"/>
-        <w:jc w:val="both"/>
-      </w:pPr>
-      <w:r>
-        <w:rPr>
-          <w:rFonts w:ascii="Times New Roman" w:hAnsi="Times New Roman" w:eastAsia="Times New Roman"/>
-          <w:color w:val="000000"/>
-          <w:sz w:val="24"/>
-        </w:rPr>
-        <w:t>While clove is generally recognized as safe (GRAS) by major international regulatory bodies when utilized in minute quantities as a culinary spice or a food flavoring agent, the administration of highly concentrated ethanolic or aqueous extracts, or the pure essential oil, at pharmacological doses presents a distinctly different toxicological paradigm that requires careful scrutiny.</w:t>
-      </w:r>
-    </w:p>
-    <w:p>
-      <w:pPr>
-        <w:spacing w:line="360" w:lineRule="auto" w:after="0"/>
-        <w:jc w:val="both"/>
-      </w:pPr>
-      <w:r>
-        <w:rPr>
-          <w:rFonts w:ascii="Times New Roman" w:hAnsi="Times New Roman" w:eastAsia="Times New Roman"/>
-          <w:color w:val="000000"/>
-          <w:sz w:val="24"/>
-        </w:rPr>
-        <w:t xml:space="preserve">Existing literature provides a generally favorable, yet nuanced, safety profile for </w:t>
-      </w:r>
-      <w:r>
-        <w:rPr>
-          <w:rFonts w:ascii="Times New Roman" w:hAnsi="Times New Roman" w:eastAsia="Times New Roman"/>
-          <w:i/>
-          <w:color w:val="000000"/>
-          <w:sz w:val="24"/>
-        </w:rPr>
-        <w:t>Syzygium aromaticum</w:t>
-      </w:r>
-      <w:r>
-        <w:rPr>
-          <w:rFonts w:ascii="Times New Roman" w:hAnsi="Times New Roman" w:eastAsia="Times New Roman"/>
-          <w:color w:val="000000"/>
-          <w:sz w:val="24"/>
-        </w:rPr>
-        <w:t>. In a critical study by Agbaje et al. (2010), the acute administration of an aqueous extract of clove up to massive doses of 3000 mg/kg did not induce mortality in rodent models, suggesting a relatively high margin of safety for water-based extractions. Similarly, Johannah et al. (2016) conducted a comprehensive subchronic toxicity evaluation of a standardized polyphenolic extract of clove buds. Their rigorous analysis demonstrated no significant mutagenicity and observed no signs of severe systemic toxicity, target organ damage, or hematological abnormalities even after prolonged administration.</w:t>
-      </w:r>
-    </w:p>
-    <w:p>
-      <w:pPr>
-        <w:spacing w:line="360" w:lineRule="auto" w:after="0"/>
-        <w:jc w:val="both"/>
-      </w:pPr>
-      <w:r>
-        <w:rPr>
-          <w:rFonts w:ascii="Times New Roman" w:hAnsi="Times New Roman" w:eastAsia="Times New Roman"/>
-          <w:color w:val="000000"/>
-          <w:sz w:val="24"/>
-        </w:rPr>
-        <w:t>However, caution is absolutely warranted when dealing with highly concentrated lipid extractions or the pure essential oil, which is overwhelmingly composed of eugenol. High-dose administration of isolated eugenol has been linked to severe hepatotoxicity, profound glutathione depletion in the liver, and central nervous system depression (Kamat &amp; Gaonkar, 2023). A safety assessment by Mishra &amp; Singh (2008) evaluating a hexane extract of clove flower buds noted specific dose-dependent alterations in testicular function and histology in mice at higher concentrations, emphasizing that safety is inextricably linked to the extraction solvent utilized and the precise dosage administered.</w:t>
-      </w:r>
-    </w:p>
-    <w:p>
-      <w:pPr>
-        <w:pStyle w:val="Heading3"/>
-        <w:jc w:val="both"/>
-      </w:pPr>
-      <w:r>
-        <w:rPr>
-          <w:rFonts w:ascii="Times New Roman" w:hAnsi="Times New Roman" w:eastAsia="Times New Roman"/>
-          <w:color w:val="000000"/>
-          <w:sz w:val="24"/>
-        </w:rPr>
-        <w:t>1.7.4 The Necessity of a Specific Toxicity Evaluation for the Current Extract</w:t>
-      </w:r>
-    </w:p>
-    <w:p>
-      <w:pPr>
-        <w:spacing w:line="360" w:lineRule="auto" w:after="0"/>
-        <w:jc w:val="both"/>
-      </w:pPr>
-      <w:r>
-        <w:rPr>
-          <w:rFonts w:ascii="Times New Roman" w:hAnsi="Times New Roman" w:eastAsia="Times New Roman"/>
-          <w:color w:val="000000"/>
-          <w:sz w:val="24"/>
-        </w:rPr>
-        <w:t>Despite the existing literature, a dedicated acute oral toxicity evaluation remains an absolute, non-negotiable prerequisite for this specific research project. The phytochemical composition—and consequently the toxicological profile—of an herbal extract is intensely highly variable. It is profoundly influenced by the geographical source of the plant material, the specific season of harvest, the post-harvest processing methods, and, most critically, the exact extraction solvent and protocol utilized (e.g., ethanol concentration, extraction time, and temperature) (Orafidiya &amp; Agbani, 2021).</w:t>
-      </w:r>
-    </w:p>
-    <w:p>
-      <w:pPr>
-        <w:spacing w:line="360" w:lineRule="auto" w:after="0"/>
-        <w:jc w:val="both"/>
-      </w:pPr>
-      <w:r>
-        <w:rPr>
-          <w:rFonts w:ascii="Times New Roman" w:hAnsi="Times New Roman" w:eastAsia="Times New Roman"/>
-          <w:color w:val="000000"/>
-          <w:sz w:val="24"/>
-        </w:rPr>
-        <w:t>Relying on toxicological data derived from a completely different extraction method (such as an aqueous extract) to guarantee the safety of the specific 50% ethanolic extract proposed in this study is scientifically invalid and highly dangerous. Therefore, applying the rigorous OECD 423 framework to the precise ethanolic extract formulated for this study is not merely a procedural formality; it is the fundamental scientific requirement to establish a reliable, objective safety baseline, define the LD50 classification accurately, and scientifically justify the specific lower dosages that will be safely administered to the experimental animals in the subsequent antidysmenorrhea efficacy trials (Lughmani &amp; Sultana, 2017).</w:t>
-      </w:r>
-    </w:p>
-    <w:p>
-      <w:pPr>
-        <w:pStyle w:val="Heading2"/>
-        <w:jc w:val="both"/>
-      </w:pPr>
-      <w:r>
-        <w:rPr>
-          <w:rFonts w:ascii="Times New Roman" w:hAnsi="Times New Roman" w:eastAsia="Times New Roman"/>
-          <w:color w:val="000000"/>
-          <w:sz w:val="24"/>
-        </w:rPr>
-        <w:t>1.8 Potential Antidysmenorrhea Effects of Clove</w:t>
-      </w:r>
-    </w:p>
-    <w:p>
-      <w:pPr>
-        <w:pStyle w:val="Heading3"/>
-        <w:jc w:val="both"/>
-      </w:pPr>
-      <w:r>
-        <w:rPr>
-          <w:rFonts w:ascii="Times New Roman" w:hAnsi="Times New Roman" w:eastAsia="Times New Roman"/>
-          <w:color w:val="000000"/>
-          <w:sz w:val="24"/>
-        </w:rPr>
-        <w:t>1.8.1 Mechanistic Rationale: A Multi-Targeted Pharmacological Approach</w:t>
-      </w:r>
-    </w:p>
-    <w:p>
-      <w:pPr>
-        <w:spacing w:line="360" w:lineRule="auto" w:after="0"/>
-        <w:jc w:val="both"/>
-      </w:pPr>
-      <w:r>
-        <w:rPr>
-          <w:rFonts w:ascii="Times New Roman" w:hAnsi="Times New Roman" w:eastAsia="Times New Roman"/>
-          <w:color w:val="000000"/>
-          <w:sz w:val="24"/>
-        </w:rPr>
-        <w:t xml:space="preserve">The proposition that </w:t>
-      </w:r>
-      <w:r>
-        <w:rPr>
-          <w:rFonts w:ascii="Times New Roman" w:hAnsi="Times New Roman" w:eastAsia="Times New Roman"/>
-          <w:i/>
-          <w:color w:val="000000"/>
-          <w:sz w:val="24"/>
-        </w:rPr>
-        <w:t>Syzygium aromaticum</w:t>
-      </w:r>
-      <w:r>
-        <w:rPr>
-          <w:rFonts w:ascii="Times New Roman" w:hAnsi="Times New Roman" w:eastAsia="Times New Roman"/>
-          <w:color w:val="000000"/>
-          <w:sz w:val="24"/>
-        </w:rPr>
-        <w:t xml:space="preserve"> (clove) extract possesses robust antidysmenorrheal efficacy is not rooted in mere empirical tradition, but is firmly substantiated by a massive body of pharmacological evidence demonstrating its ability to simultaneously dismantle the multiple, converging pathways that drive primary dysmenorrhea. Unlike standard Nonsteroidal Anti-inflammatory Drugs (NSAIDs) that selectively inhibit a single enzymatic pathway (cyclooxygenase), the complex phytochemical matrix of clove—dominated by eugenol, eugenyl acetate, and potent polyphenols—exerts a polypharmacological effect. It operates concurrently as a profound anti-inflammatory agent, a powerful smooth muscle relaxant, a direct analgesic, and a potent antioxidant (Mittal et al., 2014; Sarkar &amp; Das, 2023). This multi-targeted mechanism of action theoretically offers a significantly more comprehensive and effective blockade of the dysmenorrheic cascade than monotherapy with conventional analgesics.</w:t>
-      </w:r>
-    </w:p>
-    <w:p>
-      <w:pPr>
-        <w:pStyle w:val="Heading3"/>
-        <w:jc w:val="both"/>
-      </w:pPr>
-      <w:r>
-        <w:rPr>
-          <w:rFonts w:ascii="Times New Roman" w:hAnsi="Times New Roman" w:eastAsia="Times New Roman"/>
-          <w:color w:val="000000"/>
-          <w:sz w:val="24"/>
-        </w:rPr>
-        <w:t>1.8.2 Anti-inflammatory and Prostaglandin Inhibitory Activity</w:t>
-      </w:r>
-    </w:p>
-    <w:p>
-      <w:pPr>
-        <w:spacing w:line="360" w:lineRule="auto" w:after="0"/>
-        <w:jc w:val="both"/>
-      </w:pPr>
-      <w:r>
-        <w:rPr>
-          <w:rFonts w:ascii="Times New Roman" w:hAnsi="Times New Roman" w:eastAsia="Times New Roman"/>
-          <w:color w:val="000000"/>
-          <w:sz w:val="24"/>
-        </w:rPr>
-        <w:t>At the core of clove's potential utility in dysmenorrhea is its extraordinary capacity to profoundly suppress the synthesis of pro-inflammatory lipid mediators. Eugenol, the primary constituent, is a well-documented and highly potent inhibitor of both major inflammatory pathways: the cyclooxygenase (COX) and the lipoxygenase (LOX) cascades.</w:t>
-      </w:r>
-    </w:p>
-    <w:p>
-      <w:pPr>
-        <w:spacing w:line="360" w:lineRule="auto" w:after="0"/>
-        <w:jc w:val="both"/>
-      </w:pPr>
-      <w:r>
-        <w:rPr>
-          <w:rFonts w:ascii="Times New Roman" w:hAnsi="Times New Roman" w:eastAsia="Times New Roman"/>
-          <w:color w:val="000000"/>
-          <w:sz w:val="24"/>
-        </w:rPr>
-        <w:t>In vitro studies utilizing stimulated murine macrophage cell lines (such as RAW 264.7 cells) have unequivocally demonstrated that eugenol and total clove extracts dramatically suppress the expression of COX-2 enzymes and subsequently halt the production of PGE2 and NO (Nitric Oxide) in a dose-dependent manner (Kim et al., 2003; Li et al., 2006). Crucially, eugenol has also been shown to aggressively inhibit 5-lipoxygenase (5-LOX) activity, thereby preventing the synthesis of leukotrienes—inflammatory mediators that are entirely unaffected by standard NSAIDs and are heavily implicated in NSAID-resistant dysmenorrhea (Raghavenra et al., 2006). By simultaneously blocking both the COX and LOX pathways, the clove extract effectively starves the myometrium of the precise inflammatory and spasmodic autacoids responsible for initiating hypercontractility.</w:t>
-      </w:r>
-    </w:p>
-    <w:p>
-      <w:pPr>
-        <w:spacing w:line="360" w:lineRule="auto" w:after="0"/>
-        <w:jc w:val="both"/>
-      </w:pPr>
-      <w:r>
-        <w:rPr>
-          <w:rFonts w:ascii="Times New Roman" w:hAnsi="Times New Roman" w:eastAsia="Times New Roman"/>
-          <w:color w:val="000000"/>
-          <w:sz w:val="24"/>
-        </w:rPr>
-        <w:t>Furthermore, eugenol exerts anti-inflammatory effects at the genomic level. It has been shown to down-regulate the activation of Nuclear Factor-kappa B (NF-κB), a critical transcription factor that controls the expression of numerous pro-inflammatory cytokines, including Interleukin-1 beta (IL-1β) and Tumor Necrosis Factor-alpha (TNF-α) (Magalhães et al., 2010; Yeh et al., 2011). This deep, receptor-level blockade of the inflammatory cascade provides a robust explanation for its profound traditional efficacy in managing severe pelvic pain.</w:t>
-      </w:r>
-    </w:p>
-    <w:p>
-      <w:pPr>
-        <w:pStyle w:val="Heading3"/>
-        <w:jc w:val="both"/>
-      </w:pPr>
-      <w:r>
-        <w:rPr>
-          <w:rFonts w:ascii="Times New Roman" w:hAnsi="Times New Roman" w:eastAsia="Times New Roman"/>
-          <w:color w:val="000000"/>
-          <w:sz w:val="24"/>
-        </w:rPr>
-        <w:t>1.8.3 Antispasmodic and Uterine Smooth Muscle Relaxation</w:t>
-      </w:r>
-    </w:p>
-    <w:p>
-      <w:pPr>
-        <w:spacing w:line="360" w:lineRule="auto" w:after="0"/>
-        <w:jc w:val="both"/>
-      </w:pPr>
-      <w:r>
-        <w:rPr>
-          <w:rFonts w:ascii="Times New Roman" w:hAnsi="Times New Roman" w:eastAsia="Times New Roman"/>
-          <w:color w:val="000000"/>
-          <w:sz w:val="24"/>
-        </w:rPr>
-        <w:t>The rapid and intense relief of cramping pain requires an agent capable of directly relaxing the hypercontractile myometrium. Clove extract demonstrates exceptional antispasmodic activity on various types of smooth muscle, including vascular, intestinal, and critically, uterine tissue (Rajan &amp; Kumar, 2022).</w:t>
-      </w:r>
-    </w:p>
-    <w:p>
-      <w:pPr>
-        <w:spacing w:line="360" w:lineRule="auto" w:after="0"/>
-        <w:jc w:val="both"/>
-      </w:pPr>
-      <w:r>
-        <w:rPr>
-          <w:rFonts w:ascii="Times New Roman" w:hAnsi="Times New Roman" w:eastAsia="Times New Roman"/>
-          <w:color w:val="000000"/>
-          <w:sz w:val="24"/>
-        </w:rPr>
-        <w:t xml:space="preserve">The exact mechanism of this myorelaxation is primarily attributed to the blockade of specific ion channels on the smooth muscle cell membrane. In a landmark study evaluating the spasmolytic effect of eugenol on isolated rat uterine muscle, Ponce-Monter et al. (2017) demonstrated that eugenol effectively abolishes spontaneous uterine contractions and dramatically reduces the amplitude of contractions induced by exogenous oxytocin or high potassium chloride (KCl) depolarization. </w:t>
-      </w:r>
-    </w:p>
-    <w:p>
-      <w:pPr>
-        <w:spacing w:line="360" w:lineRule="auto" w:after="0"/>
-        <w:jc w:val="both"/>
-      </w:pPr>
-      <w:r>
-        <w:rPr>
-          <w:rFonts w:ascii="Times New Roman" w:hAnsi="Times New Roman" w:eastAsia="Times New Roman"/>
-          <w:color w:val="000000"/>
-          <w:sz w:val="24"/>
-        </w:rPr>
-        <w:t>This profound relaxant effect is achieved primarily by eugenol acting as a potent antagonist of voltage-dependent calcium channels (VDCCs), specifically the L-type and T-type Ca2+ isoforms (Seo et al., 2013). By aggressively blocking the influx of extracellular calcium into the myometrial cells, eugenol directly uncouples the excitation-contraction mechanism, effectively terminating the severe tetanic spasms characteristic of dysmenorrhea. Additionally, emerging evidence suggests that eugenol may also activate specific potassium channels, leading to membrane hyperpolarization and further stabilizing the myometrium against contractile stimuli (Ortiz et al., 2021).</w:t>
-      </w:r>
-    </w:p>
-    <w:p>
-      <w:pPr>
-        <w:pStyle w:val="Heading3"/>
-        <w:jc w:val="both"/>
-      </w:pPr>
-      <w:r>
-        <w:rPr>
-          <w:rFonts w:ascii="Times New Roman" w:hAnsi="Times New Roman" w:eastAsia="Times New Roman"/>
-          <w:color w:val="000000"/>
-          <w:sz w:val="24"/>
-        </w:rPr>
-        <w:t>1.8.4 Central and Peripheral Analgesic (Antinociceptive) Mechanisms</w:t>
-      </w:r>
-    </w:p>
-    <w:p>
-      <w:pPr>
-        <w:spacing w:line="360" w:lineRule="auto" w:after="0"/>
-        <w:jc w:val="both"/>
-      </w:pPr>
-      <w:r>
-        <w:rPr>
-          <w:rFonts w:ascii="Times New Roman" w:hAnsi="Times New Roman" w:eastAsia="Times New Roman"/>
-          <w:color w:val="000000"/>
-          <w:sz w:val="24"/>
-        </w:rPr>
-        <w:t>Independent of its ability to reduce inflammation and relax smooth muscle, clove extract possesses highly potent, direct analgesic (antinociceptive) properties that operate at both peripheral and central levels of the nervous system. The acute pain relief traditionally associated with clove is mediated by complex interactions with specific nociceptive receptors.</w:t>
-      </w:r>
-    </w:p>
-    <w:p>
-      <w:pPr>
-        <w:spacing w:line="360" w:lineRule="auto" w:after="0"/>
-        <w:jc w:val="both"/>
-      </w:pPr>
-      <w:r>
-        <w:rPr>
-          <w:rFonts w:ascii="Times New Roman" w:hAnsi="Times New Roman" w:eastAsia="Times New Roman"/>
-          <w:color w:val="000000"/>
-          <w:sz w:val="24"/>
-        </w:rPr>
-        <w:t xml:space="preserve">Eugenol has been identified as a robust agonist of the Transient Receptor Potential Vanilloid 1 (TRPV1) channel, a crucial receptor involved in pain signaling and thermal sensation (Pina &amp; Silva, 2021). While initial activation of TRPV1 causes a burning sensation (the pungency of clove), sustained exposure to eugenol rapidly desensitizes these receptors, effectively shutting down the transmission of pain signals from the peripheral nociceptors to the central nervous system. </w:t>
-      </w:r>
-    </w:p>
-    <w:p>
-      <w:pPr>
-        <w:spacing w:line="360" w:lineRule="auto" w:after="0"/>
-        <w:jc w:val="both"/>
-      </w:pPr>
-      <w:r>
-        <w:rPr>
-          <w:rFonts w:ascii="Times New Roman" w:hAnsi="Times New Roman" w:eastAsia="Times New Roman"/>
-          <w:color w:val="000000"/>
-          <w:sz w:val="24"/>
-        </w:rPr>
-        <w:t>Furthermore, extensive in vivo animal studies utilizing classic pain models (such as the acetic acid-induced writhing test and the formalin test) have consistently demonstrated that systemic administration of clove essential oil or eugenol produces a profound antinociceptive effect that is comparable to, and in some instances exceeds, that of standard reference drugs like indomethacin or diclofenac (Daniel et al., 2009; Hosseini et al., 2011; Puspitasari et al., 2021). This direct analgesic capability ensures that even if uterine contractions are not entirely abolished, the conscious perception of pelvic pain is drastically attenuated.</w:t>
-      </w:r>
-    </w:p>
-    <w:p>
-      <w:pPr>
-        <w:pStyle w:val="Heading3"/>
-        <w:jc w:val="both"/>
-      </w:pPr>
-      <w:r>
-        <w:rPr>
-          <w:rFonts w:ascii="Times New Roman" w:hAnsi="Times New Roman" w:eastAsia="Times New Roman"/>
-          <w:color w:val="000000"/>
-          <w:sz w:val="24"/>
-        </w:rPr>
-        <w:t>1.8.5 In Vivo Evaluation: Animal Models of Primary Dysmenorrhea</w:t>
-      </w:r>
-    </w:p>
-    <w:p>
-      <w:pPr>
-        <w:spacing w:line="360" w:lineRule="auto" w:after="0"/>
-        <w:jc w:val="both"/>
-      </w:pPr>
-      <w:r>
-        <w:rPr>
-          <w:rFonts w:ascii="Times New Roman" w:hAnsi="Times New Roman" w:eastAsia="Times New Roman"/>
-          <w:color w:val="000000"/>
-          <w:sz w:val="24"/>
-        </w:rPr>
-        <w:t>To rigorously translate these isolated in vitro mechanisms into clinically relevant data, researchers utilize specific in vivo animal models designed to perfectly replicate the pathophysiology of human primary dysmenorrhea. The most universally accepted and scientifically validated model is the estradiol benzoate-sensitized, oxytocin-induced mouse writhing model (Yang et al., 2015; Shi &amp; Jia, 2022).</w:t>
-      </w:r>
-    </w:p>
-    <w:p>
-      <w:pPr>
-        <w:spacing w:line="360" w:lineRule="auto" w:after="0"/>
-        <w:jc w:val="both"/>
-      </w:pPr>
-      <w:r>
-        <w:rPr>
-          <w:rFonts w:ascii="Times New Roman" w:hAnsi="Times New Roman" w:eastAsia="Times New Roman"/>
-          <w:color w:val="000000"/>
-          <w:sz w:val="24"/>
-        </w:rPr>
-        <w:t>In this highly specific experimental protocol, female mice are first administered estradiol benzoate to artificially synchronize their estrus cycle and massively upregulate the expression of oxytocin receptors in the myometrium, perfectly mimicking the hormonal milieu of the late luteal phase in humans. Subsequently, a high-dose intraperitoneal injection of oxytocin is administered. This massive oxytocin surge triggers extreme, sustained uterine hypercontractility, resulting in a distinct, easily quantifiable pain behavior known as "writhing" (characterized by abdominal constriction, trunk twisting, and hind limb extension) (Lestariningsih et al., 2024; Ma &amp; Li, 2022).</w:t>
-      </w:r>
-    </w:p>
-    <w:p>
-      <w:pPr>
-        <w:spacing w:line="360" w:lineRule="auto" w:after="0"/>
-        <w:jc w:val="both"/>
-      </w:pPr>
-      <w:r>
-        <w:rPr>
-          <w:rFonts w:ascii="Times New Roman" w:hAnsi="Times New Roman" w:eastAsia="Times New Roman"/>
-          <w:color w:val="000000"/>
-          <w:sz w:val="24"/>
-        </w:rPr>
-        <w:t xml:space="preserve">This specific model is superior to generic pain models because the pain is exclusively of uterine origin and is driven by the exact neuroendocrine mechanisms implicated in primary dysmenorrhea (Liu &amp; Chen, 2020). By administering the </w:t>
-      </w:r>
-      <w:r>
-        <w:rPr>
-          <w:rFonts w:ascii="Times New Roman" w:hAnsi="Times New Roman" w:eastAsia="Times New Roman"/>
-          <w:i/>
-          <w:color w:val="000000"/>
-          <w:sz w:val="24"/>
-        </w:rPr>
-        <w:t>Syzygium aromaticum</w:t>
-      </w:r>
-      <w:r>
-        <w:rPr>
-          <w:rFonts w:ascii="Times New Roman" w:hAnsi="Times New Roman" w:eastAsia="Times New Roman"/>
-          <w:color w:val="000000"/>
-          <w:sz w:val="24"/>
-        </w:rPr>
-        <w:t xml:space="preserve"> extract to these specifically induced animal models and quantitatively analyzing the reduction in writhing frequency and latency, researchers can definitively and objectively establish the specific antidysmenorrheal efficacy of the extract, providing the crucial, definitive preclinical evidence required to advance toward human clinical trials (Tajbakhsh &amp; Jafari, 2022).</w:t>
-      </w:r>
-    </w:p>
-    <w:p>
-      <w:pPr>
-        <w:pStyle w:val="Heading2"/>
-        <w:jc w:val="both"/>
-      </w:pPr>
-      <w:r>
-        <w:rPr>
-          <w:rFonts w:ascii="Times New Roman" w:hAnsi="Times New Roman" w:eastAsia="Times New Roman"/>
-          <w:color w:val="000000"/>
-          <w:sz w:val="24"/>
-        </w:rPr>
-        <w:t>1.9 Justification, Statement of the Problem, and Objectives</w:t>
-      </w:r>
-    </w:p>
-    <w:p>
-      <w:pPr>
-        <w:pStyle w:val="Heading3"/>
-        <w:jc w:val="both"/>
-      </w:pPr>
-      <w:r>
-        <w:rPr>
-          <w:rFonts w:ascii="Times New Roman" w:hAnsi="Times New Roman" w:eastAsia="Times New Roman"/>
-          <w:color w:val="000000"/>
-          <w:sz w:val="24"/>
-        </w:rPr>
-        <w:t>1.9.1 Statement of the Problem</w:t>
-      </w:r>
-    </w:p>
-    <w:p>
-      <w:pPr>
-        <w:spacing w:line="360" w:lineRule="auto" w:after="0"/>
-        <w:jc w:val="both"/>
-      </w:pPr>
-      <w:r>
-        <w:rPr>
-          <w:rFonts w:ascii="Times New Roman" w:hAnsi="Times New Roman" w:eastAsia="Times New Roman"/>
-          <w:color w:val="000000"/>
-          <w:sz w:val="24"/>
-        </w:rPr>
-        <w:t xml:space="preserve">Primary dysmenorrhea represents an extraordinarily prevalent and profoundly debilitating gynecological condition that disproportionately afflicts adolescent and young adult women. Despite its high prevalence—affecting upwards of 80% of specific demographics—and its staggering socioeconomic impact driven by massive rates of recurrent absenteeism from academic and occupational environments, it remains a critically under-researched and frequently mismanaged medical issue. </w:t>
-      </w:r>
-    </w:p>
-    <w:p>
-      <w:pPr>
-        <w:spacing w:line="360" w:lineRule="auto" w:after="0"/>
-        <w:jc w:val="both"/>
-      </w:pPr>
-      <w:r>
-        <w:rPr>
-          <w:rFonts w:ascii="Times New Roman" w:hAnsi="Times New Roman" w:eastAsia="Times New Roman"/>
-          <w:color w:val="000000"/>
-          <w:sz w:val="24"/>
-        </w:rPr>
-        <w:t>The current standard of pharmacological care relies almost exclusively on Nonsteroidal Anti-inflammatory Drugs (NSAIDs) and hormonal contraceptives. However, this established paradigm is fundamentally flawed and highly inadequate. An alarming 15% to 20% of women exhibit total resistance to NSAID therapy, leaving them entirely devoid of effective pain relief. Furthermore, for the women who do respond, the chronic, monthly reliance on high-dose NSAIDs induces a severe, well-documented risk of life-threatening gastrointestinal toxicity (ulceration and hemorrhage), nephrotoxicity, and cardiovascular complications. Hormonal contraceptives, while effective, are frequently rejected by patients due to severe systemic side effects, poor compliance, and deep-seated cultural or religious unacceptability. Consequently, there exists a massive, glaring void in the therapeutic arsenal: a critical, unmet clinical need for novel, highly effective, safe, and culturally acceptable alternative therapeutics that can provide comprehensive relief from dysmenorrhea without the devastating toxicological profile of conventional pharmaceuticals.</w:t>
-      </w:r>
-    </w:p>
-    <w:p>
-      <w:pPr>
-        <w:pStyle w:val="Heading3"/>
-        <w:jc w:val="both"/>
-      </w:pPr>
-      <w:r>
-        <w:rPr>
-          <w:rFonts w:ascii="Times New Roman" w:hAnsi="Times New Roman" w:eastAsia="Times New Roman"/>
-          <w:color w:val="000000"/>
-          <w:sz w:val="24"/>
-        </w:rPr>
-        <w:t>1.9.2 Rationale and Justification for the Study</w:t>
-      </w:r>
-    </w:p>
-    <w:p>
-      <w:pPr>
-        <w:spacing w:line="360" w:lineRule="auto" w:after="0"/>
-        <w:jc w:val="both"/>
-      </w:pPr>
-      <w:r>
-        <w:rPr>
-          <w:rFonts w:ascii="Times New Roman" w:hAnsi="Times New Roman" w:eastAsia="Times New Roman"/>
-          <w:color w:val="000000"/>
-          <w:sz w:val="24"/>
-        </w:rPr>
-        <w:t xml:space="preserve">The exploration of evidence-based phytomedicine represents the most logical and promising frontier for resolving this clinical crisis. Medicinal plants inherently synthesize complex, multi-component chemical matrices capable of exerting polypharmacological effects—simultaneously targeting multiple pathological pathways—which is highly advantageous in treating complex conditions like dysmenorrhea. </w:t>
-      </w:r>
-    </w:p>
-    <w:p>
-      <w:pPr>
-        <w:spacing w:line="360" w:lineRule="auto" w:after="0"/>
-        <w:jc w:val="both"/>
-      </w:pPr>
-      <w:r>
-        <w:rPr>
-          <w:rFonts w:ascii="Times New Roman" w:hAnsi="Times New Roman" w:eastAsia="Times New Roman"/>
-          <w:i/>
-          <w:color w:val="000000"/>
-          <w:sz w:val="24"/>
-        </w:rPr>
-        <w:t>Syzygium aromaticum</w:t>
-      </w:r>
-      <w:r>
-        <w:rPr>
-          <w:rFonts w:ascii="Times New Roman" w:hAnsi="Times New Roman" w:eastAsia="Times New Roman"/>
-          <w:color w:val="000000"/>
-          <w:sz w:val="24"/>
-        </w:rPr>
-        <w:t xml:space="preserve"> (clove) emerges from extensive ethnobotanical history and modern phytochemical analysis as a uniquely powerful candidate. While it has been utilized empirically for centuries to manage severe pain and gastrointestinal spasms, its specific application for primary dysmenorrhea demands rigorous, modern scientific validation. The rationale for this study is built upon the robust, documented pharmacological profile of clove's primary bioactive constituent, eugenol, alongside its complex polyphenols. The literature definitively demonstrates that these compounds possess profound, simultaneous antispasmodic, anti-inflammatory (via dual COX and LOX inhibition), direct analgesic, and potent antioxidant properties. This exact combination of mechanisms aligns perfectly with the multi-faceted pathophysiology of primary dysmenorrhea (prostaglandin overproduction, myometrial hypercontractility, and oxidative stress). </w:t>
-      </w:r>
-    </w:p>
-    <w:p>
-      <w:pPr>
-        <w:spacing w:line="360" w:lineRule="auto" w:after="0"/>
-        <w:jc w:val="both"/>
-      </w:pPr>
-      <w:r>
-        <w:rPr>
-          <w:rFonts w:ascii="Times New Roman" w:hAnsi="Times New Roman" w:eastAsia="Times New Roman"/>
-          <w:color w:val="000000"/>
-          <w:sz w:val="24"/>
-        </w:rPr>
-        <w:t>However, before any claims of efficacy can be scientifically substantiated, the fundamental safety parameter of the specific extraction must be established. The toxicity of herbal extracts is highly variable and depends entirely on the specific solvent and methodology utilized. Therefore, conducting a standardized OECD 423 acute oral toxicity test on the specific 50% ethanolic extract of clove is a mandatory, non-negotiable prerequisite to ensure its absolute safety prior to evaluating its specific antidysmenorrheal efficacy in validated, oxytocin-induced in vivo animal models.</w:t>
-      </w:r>
-    </w:p>
-    <w:p>
-      <w:pPr>
-        <w:pStyle w:val="Heading3"/>
-        <w:jc w:val="both"/>
-      </w:pPr>
-      <w:r>
-        <w:rPr>
-          <w:rFonts w:ascii="Times New Roman" w:hAnsi="Times New Roman" w:eastAsia="Times New Roman"/>
-          <w:color w:val="000000"/>
-          <w:sz w:val="24"/>
-        </w:rPr>
-        <w:t>1.9.3 Aims and Specific Objectives of the Study</w:t>
-      </w:r>
-    </w:p>
-    <w:p>
-      <w:pPr>
-        <w:spacing w:line="360" w:lineRule="auto" w:after="0"/>
-        <w:jc w:val="both"/>
-      </w:pPr>
-      <w:r>
-        <w:rPr>
-          <w:rFonts w:ascii="Times New Roman" w:hAnsi="Times New Roman" w:eastAsia="Times New Roman"/>
-          <w:color w:val="000000"/>
-          <w:sz w:val="24"/>
-        </w:rPr>
-        <w:t xml:space="preserve">The overarching aim of this highly structured preclinical research project is to rigorously and objectively evaluate the acute oral toxicity profile and the specific antidysmenorrheal efficacy of the 50% ethanolic extract of </w:t>
-      </w:r>
-      <w:r>
-        <w:rPr>
-          <w:rFonts w:ascii="Times New Roman" w:hAnsi="Times New Roman" w:eastAsia="Times New Roman"/>
-          <w:i/>
-          <w:color w:val="000000"/>
-          <w:sz w:val="24"/>
-        </w:rPr>
-        <w:t>Syzygium aromaticum</w:t>
-      </w:r>
-      <w:r>
-        <w:rPr>
-          <w:rFonts w:ascii="Times New Roman" w:hAnsi="Times New Roman" w:eastAsia="Times New Roman"/>
-          <w:color w:val="000000"/>
-          <w:sz w:val="24"/>
-        </w:rPr>
-        <w:t xml:space="preserve"> (clove) flower buds utilizing standardized, globally recognized in vivo murine models.</w:t>
-      </w:r>
-    </w:p>
-    <w:p>
-      <w:pPr>
-        <w:spacing w:line="360" w:lineRule="auto" w:after="0"/>
-        <w:jc w:val="both"/>
-      </w:pPr>
-      <w:r>
-        <w:rPr>
-          <w:rFonts w:ascii="Times New Roman" w:hAnsi="Times New Roman" w:eastAsia="Times New Roman"/>
-          <w:color w:val="000000"/>
-          <w:sz w:val="24"/>
-        </w:rPr>
-        <w:t>To achieve this comprehensive aim, the study is directed by the following specific, measurable objectives:</w:t>
-      </w:r>
-    </w:p>
-    <w:p>
-      <w:pPr>
-        <w:spacing w:line="360" w:lineRule="auto" w:after="0"/>
-        <w:jc w:val="both"/>
-      </w:pPr>
-      <w:r>
-        <w:rPr>
-          <w:rFonts w:ascii="Times New Roman" w:hAnsi="Times New Roman" w:eastAsia="Times New Roman"/>
-          <w:color w:val="000000"/>
-          <w:sz w:val="24"/>
-        </w:rPr>
-        <w:t xml:space="preserve">1.  </w:t>
-      </w:r>
-      <w:r>
-        <w:rPr>
-          <w:rFonts w:ascii="Times New Roman" w:hAnsi="Times New Roman" w:eastAsia="Times New Roman"/>
-          <w:b/>
-          <w:color w:val="000000"/>
-          <w:sz w:val="24"/>
-        </w:rPr>
-        <w:t>To meticulously extract and chemically characterize</w:t>
-      </w:r>
-      <w:r>
-        <w:rPr>
-          <w:rFonts w:ascii="Times New Roman" w:hAnsi="Times New Roman" w:eastAsia="Times New Roman"/>
-          <w:color w:val="000000"/>
-          <w:sz w:val="24"/>
-        </w:rPr>
-        <w:t xml:space="preserve"> the bioactive constituents of </w:t>
-      </w:r>
-      <w:r>
-        <w:rPr>
-          <w:rFonts w:ascii="Times New Roman" w:hAnsi="Times New Roman" w:eastAsia="Times New Roman"/>
-          <w:i/>
-          <w:color w:val="000000"/>
-          <w:sz w:val="24"/>
-        </w:rPr>
-        <w:t>Syzygium aromaticum</w:t>
-      </w:r>
-      <w:r>
-        <w:rPr>
-          <w:rFonts w:ascii="Times New Roman" w:hAnsi="Times New Roman" w:eastAsia="Times New Roman"/>
-          <w:color w:val="000000"/>
-          <w:sz w:val="24"/>
-        </w:rPr>
-        <w:t xml:space="preserve"> flower buds utilizing a standardized 50% hydroethanolic maceration technique to ensure optimal extraction of both volatile (eugenol) and non-volatile (polyphenolic) pharmacological compounds.</w:t>
-      </w:r>
-    </w:p>
-    <w:p>
-      <w:pPr>
-        <w:spacing w:line="360" w:lineRule="auto" w:after="0"/>
-        <w:jc w:val="both"/>
-      </w:pPr>
-      <w:r>
-        <w:rPr>
-          <w:rFonts w:ascii="Times New Roman" w:hAnsi="Times New Roman" w:eastAsia="Times New Roman"/>
-          <w:color w:val="000000"/>
-          <w:sz w:val="24"/>
-        </w:rPr>
-        <w:t xml:space="preserve">2.  </w:t>
-      </w:r>
-      <w:r>
-        <w:rPr>
-          <w:rFonts w:ascii="Times New Roman" w:hAnsi="Times New Roman" w:eastAsia="Times New Roman"/>
-          <w:b/>
-          <w:color w:val="000000"/>
-          <w:sz w:val="24"/>
-        </w:rPr>
-        <w:t>To definitively determine the acute oral toxicity profile</w:t>
-      </w:r>
-      <w:r>
-        <w:rPr>
-          <w:rFonts w:ascii="Times New Roman" w:hAnsi="Times New Roman" w:eastAsia="Times New Roman"/>
-          <w:color w:val="000000"/>
-          <w:sz w:val="24"/>
-        </w:rPr>
-        <w:t xml:space="preserve"> and establish the specific lethality threshold (LD50 classification) of the ethanolic clove extract in nulliparous, non-pregnant female Wistar rats, strictly adhering to the algorithmic protocols established by the OECD Test Guideline 423 (Acute Toxic Class Method).</w:t>
-      </w:r>
-    </w:p>
-    <w:p>
-      <w:pPr>
-        <w:spacing w:line="360" w:lineRule="auto" w:after="0"/>
-        <w:jc w:val="both"/>
-      </w:pPr>
-      <w:r>
-        <w:rPr>
-          <w:rFonts w:ascii="Times New Roman" w:hAnsi="Times New Roman" w:eastAsia="Times New Roman"/>
-          <w:color w:val="000000"/>
-          <w:sz w:val="24"/>
-        </w:rPr>
-        <w:t xml:space="preserve">3.  </w:t>
-      </w:r>
-      <w:r>
-        <w:rPr>
-          <w:rFonts w:ascii="Times New Roman" w:hAnsi="Times New Roman" w:eastAsia="Times New Roman"/>
-          <w:b/>
-          <w:color w:val="000000"/>
-          <w:sz w:val="24"/>
-        </w:rPr>
-        <w:t>To accurately establish and biochemically validate</w:t>
-      </w:r>
-      <w:r>
-        <w:rPr>
-          <w:rFonts w:ascii="Times New Roman" w:hAnsi="Times New Roman" w:eastAsia="Times New Roman"/>
-          <w:color w:val="000000"/>
-          <w:sz w:val="24"/>
-        </w:rPr>
-        <w:t xml:space="preserve"> an </w:t>
-      </w:r>
-      <w:r>
-        <w:rPr>
-          <w:rFonts w:ascii="Times New Roman" w:hAnsi="Times New Roman" w:eastAsia="Times New Roman"/>
-          <w:i/>
-          <w:color w:val="000000"/>
-          <w:sz w:val="24"/>
-        </w:rPr>
-        <w:t>in vivo</w:t>
-      </w:r>
-      <w:r>
-        <w:rPr>
-          <w:rFonts w:ascii="Times New Roman" w:hAnsi="Times New Roman" w:eastAsia="Times New Roman"/>
-          <w:color w:val="000000"/>
-          <w:sz w:val="24"/>
-        </w:rPr>
-        <w:t xml:space="preserve"> model of primary dysmenorrhea in female mice by sequentially administering estradiol benzoate (to synchronize the estrus cycle and upregulate receptors) followed by a high-dose intraperitoneal injection of oxytocin to reliably induce severe myometrial hypercontractility and the quantifiable writhing response.</w:t>
-      </w:r>
-    </w:p>
-    <w:p>
-      <w:pPr>
-        <w:spacing w:line="360" w:lineRule="auto" w:after="0"/>
-        <w:jc w:val="both"/>
-      </w:pPr>
-      <w:r>
-        <w:rPr>
-          <w:rFonts w:ascii="Times New Roman" w:hAnsi="Times New Roman" w:eastAsia="Times New Roman"/>
-          <w:color w:val="000000"/>
-          <w:sz w:val="24"/>
-        </w:rPr>
-        <w:t xml:space="preserve">4.  </w:t>
-      </w:r>
-      <w:r>
-        <w:rPr>
-          <w:rFonts w:ascii="Times New Roman" w:hAnsi="Times New Roman" w:eastAsia="Times New Roman"/>
-          <w:b/>
-          <w:color w:val="000000"/>
-          <w:sz w:val="24"/>
-        </w:rPr>
-        <w:t>To quantitatively evaluate the specific antidysmenorrheal efficacy</w:t>
-      </w:r>
-      <w:r>
-        <w:rPr>
-          <w:rFonts w:ascii="Times New Roman" w:hAnsi="Times New Roman" w:eastAsia="Times New Roman"/>
-          <w:color w:val="000000"/>
-          <w:sz w:val="24"/>
-        </w:rPr>
-        <w:t xml:space="preserve"> of varying, safe doses of the ethanolic clove extract by objectively measuring its ability to significantly reduce the frequency of abdominal writhing and increase the latency to the first writhing response in the established oxytocin-induced murine model, comparing its efficacy directly against a standard, established positive control (e.g., Diclofenac Sodium or Piroxicam).</w:t>
-      </w:r>
-    </w:p>
-    <w:p>
-      <w:pPr>
-        <w:pStyle w:val="Heading3"/>
-        <w:jc w:val="both"/>
-      </w:pPr>
-      <w:r>
-        <w:rPr>
-          <w:rFonts w:ascii="Times New Roman" w:hAnsi="Times New Roman" w:eastAsia="Times New Roman"/>
-          <w:color w:val="000000"/>
-          <w:sz w:val="24"/>
-        </w:rPr>
-        <w:t>1.9.4 Significance of the Study</w:t>
-      </w:r>
-    </w:p>
-    <w:p>
-      <w:pPr>
-        <w:spacing w:line="360" w:lineRule="auto" w:after="0"/>
-        <w:jc w:val="both"/>
-      </w:pPr>
-      <w:r>
-        <w:rPr>
-          <w:rFonts w:ascii="Times New Roman" w:hAnsi="Times New Roman" w:eastAsia="Times New Roman"/>
-          <w:color w:val="000000"/>
-          <w:sz w:val="24"/>
-        </w:rPr>
-        <w:t>This preclinical investigation holds profound scientific and clinical significance. Firstly, it will generate highly robust, standardized toxicological data regarding the specific safety parameters of an ethanolic clove extract, filling a critical gap in the existing pharmacological literature. Secondly, by utilizing a highly specific, oxytocin-induced in vivo model, the study will transition the application of clove for dysmenorrhea from empirical, traditional folklore to rigorously validated, evidence-based science.</w:t>
-      </w:r>
-    </w:p>
-    <w:p>
-      <w:pPr>
-        <w:spacing w:line="360" w:lineRule="auto" w:after="0"/>
-        <w:jc w:val="both"/>
-      </w:pPr>
-      <w:r>
-        <w:rPr>
-          <w:rFonts w:ascii="Times New Roman" w:hAnsi="Times New Roman" w:eastAsia="Times New Roman"/>
-          <w:color w:val="000000"/>
-          <w:sz w:val="24"/>
-        </w:rPr>
-        <w:t>If the hypothesis is confirmed—that the extract is both highly safe and profoundly effective at reducing dysmenorrheic pain—this research will provide the definitive preclinical foundation necessary to justify and design future human clinical trials. Ultimately, this work possesses the potential to introduce a highly accessible, culturally acceptable, and economically viable natural therapeutic alternative into standard clinical practice. By offering a safe and effective mechanism to manage severe menstrual pain without the gastrointestinal and systemic toxicities associated with chronic NSAID or hormonal contraceptive use, this research directly contributes to drastically improving the health-related quality of life, educational progression, and occupational stability of millions of women globally.</w:t>
+        <w:t>S. aromaticum</w:t>
+      </w:r>
+      <w:r>
+        <w:rPr>
+          <w:rFonts w:ascii="Times New Roman" w:hAnsi="Times New Roman" w:eastAsia="Times New Roman"/>
+          <w:color w:val="000000"/>
+          <w:sz w:val="24"/>
+        </w:rPr>
+        <w:t xml:space="preserve"> extract against an established standard NSAID therapy, such as ibuprofen.</w:t>
       </w:r>
     </w:p>
     <w:p>

</xml_diff>

<commit_message>
fix: comprehensively execute sentence-by-sentence citation pass for Chapter 1
</commit_message>
<xml_diff>
--- a/output/draft/iyare-draft.docx
+++ b/output/draft/iyare-draft.docx
@@ -55,7 +55,7 @@
           <w:color w:val="000000"/>
           <w:sz w:val="24"/>
         </w:rPr>
-        <w:t xml:space="preserve">The human female reproductive system is a profoundly complex and highly specialized network of interconnected anatomical structures, meticulously designed by evolution to facilitate sexual reproduction, gametogenesis, fertilization, and the successful gestation of a developing fetus. Anatomically, this system is broadly categorized into the external genitalia, collectively termed the vulva, and the internal reproductive organs, which reside primarily within the protective confines of the true pelvic cavity. The external genitalia, comprising the mons pubis, labia majora, labia minora, clitoris, vestibular bulbs, and the greater vestibular (Bartholin’s) glands, primarily function to protect the delicate internal reproductive tract from pathogenic invasion and to facilitate sensory reception during copulation. The internal reproductive organs, which are the primary focus of gynecological and obstetric pharmacology, include the vagina, uterus, fallopian tubes (oviducts), and ovaries. </w:t>
+        <w:t xml:space="preserve">The human female reproductive system is a profoundly complex and highly specialized network of interconnected anatomical structures, meticulously designed by evolution to facilitate sexual reproduction, gametogenesis, fertilization, and the successful gestation of a developing fetus (Speroff &amp; Fritz, 2020). Anatomically, this system is broadly categorized into the external genitalia, collectively termed the vulva, and the internal reproductive organs, which reside primarily within the protective confines of the true pelvic cavity. The external genitalia, comprising the mons pubis, labia majora, labia minora, clitoris, vestibular bulbs, and the greater vestibular (Bartholin’s) glands, primarily function to protect the delicate internal reproductive tract from pathogenic invasion and to facilitate sensory reception during copulation. The internal reproductive organs, which are the primary focus of gynecological and obstetric pharmacology, include the vagina, uterus, fallopian tubes (oviducts), and ovaries (Ingram &amp; Goddard, 2020). </w:t>
       </w:r>
     </w:p>
     <w:p>
@@ -69,7 +69,7 @@
           <w:color w:val="000000"/>
           <w:sz w:val="24"/>
         </w:rPr>
-        <w:t>The vagina acts as the fundamental fibromuscular conduit connecting the external environment to the internal reproductive organs. Lined with non-keratinized stratified squamous epithelium, it serves the tripartite functions of acting as the receptacle for seminal fluid during coitus, serving as the egress route for menstrual effluent, and expanding to form the terminal portion of the birth canal during parturition. Immediately superior to the vaginal vault lies the uterus, a robust, pear-shaped muscular organ that occupies a central position within the pelvic cavity, situated precisely between the urinary bladder anteriorly and the rectum posteriorly. The uterus is the primary anatomical site for the implantation of a fertilized blastocyst and provides the critical mechanical and nutritional environment necessary for fetal development. Extending laterally from the superior cornua of the uterus are the paired fallopian tubes. These highly specialized, ciliated tubular structures possess finger-like projections called fimbriae at their distal ends, which actively sweep the surface of the ovaries to capture the ovulated secondary oocyte. The fallopian tubes not only transport the oocyte toward the uterine cavity but also provide the optimal microenvironment for spermatozoa capacitation and subsequent fertilization, which typically occurs within the ampullary region of the tube.</w:t>
+        <w:t>The vagina acts as the fundamental fibromuscular conduit connecting the external environment to the internal reproductive organs. Lined with non-keratinized stratified squamous epithelium, it serves the tripartite functions of acting as the receptacle for seminal fluid during coitus, serving as the egress route for menstrual effluent, and expanding to form the terminal portion of the birth canal during parturition (Speroff &amp; Fritz, 2020). Immediately superior to the vaginal vault lies the uterus, a robust, pear-shaped muscular organ that occupies a central position within the pelvic cavity, situated precisely between the urinary bladder anteriorly and the rectum posteriorly. The uterus is the primary anatomical site for the implantation of a fertilized blastocyst and provides the critical mechanical and nutritional environment necessary for fetal development (Ingram &amp; Goddard, 2020). Extending laterally from the superior cornua of the uterus are the paired fallopian tubes. These highly specialized, ciliated tubular structures possess finger-like projections called fimbriae at their distal ends, which actively sweep the surface of the ovaries to capture the ovulated secondary oocyte. The fallopian tubes not only transport the oocyte toward the uterine cavity but also provide the optimal microenvironment for spermatozoa capacitation and subsequent fertilization, which typically occurs within the ampullary region of the tube.</w:t>
       </w:r>
     </w:p>
     <w:p>
@@ -83,7 +83,7 @@
           <w:color w:val="000000"/>
           <w:sz w:val="24"/>
         </w:rPr>
-        <w:t xml:space="preserve">The paired ovaries, the primary female gonads, are small, almond-shaped endocrine glands tethered to the lateral pelvic walls and the posterior aspect of the broad ligament via the suspensory and ovarian ligaments, respectively. The ovaries are entrusted with two indispensable physiological mandates: oogenesis (the cyclical maturation and release of ova) and steroidogenesis (the synthesis and systemic secretion of key reproductive hormones, predominantly estrogens and progesterone). The functional orchestration of the entire female reproductive system is intrinsically reliant on the Hypothalamic-Pituitary-Ovarian (HPO) axis, a sophisticated, self-regulating neuroendocrine feedback loop. The hypothalamus, acting as the central regulatory pacemaker, secretes gonadotropin-releasing hormone (GnRH) in a strictly pulsatile manner. This pulsatile secretion is absolutely critical, as continuous GnRH exposure leads to receptor downregulation and cessation of gonadal function. GnRH travels via the hypophyseal portal system to the anterior pituitary gland, stimulating the synthesis and episodic release of two critical glycoprotein gonadotropins: follicle-stimulating hormone (FSH) and luteinizing hormone (LH). </w:t>
+        <w:t xml:space="preserve">The paired ovaries, the primary female gonads, are small, almond-shaped endocrine glands tethered to the lateral pelvic walls and the posterior aspect of the broad ligament via the suspensory and ovarian ligaments, respectively (Ingram &amp; Goddard, 2020). The ovaries are entrusted with two indispensable physiological mandates: oogenesis (the cyclical maturation and release of ova) and steroidogenesis (the synthesis and systemic secretion of key reproductive hormones, predominantly estrogens and progesterone). The functional orchestration of the entire female reproductive system is intrinsically reliant on the Hypothalamic-Pituitary-Ovarian (HPO) axis, a sophisticated, self-regulating neuroendocrine feedback loop (Itriyeva, 2022). The hypothalamus, acting as the central regulatory pacemaker, secretes gonadotropin-releasing hormone (GnRH) in a strictly pulsatile manner. This pulsatile secretion is absolutely critical, as continuous GnRH exposure leads to receptor downregulation and cessation of gonadal function. GnRH travels via the hypophyseal portal system to the anterior pituitary gland, stimulating the synthesis and episodic release of two critical glycoprotein gonadotropins: follicle-stimulating hormone (FSH) and luteinizing hormone (LH) (Itriyeva, 2022). </w:t>
       </w:r>
     </w:p>
     <w:p>
@@ -97,7 +97,7 @@
           <w:color w:val="000000"/>
           <w:sz w:val="24"/>
         </w:rPr>
-        <w:t xml:space="preserve">FSH primarily targets the granulosa cells of the developing ovarian follicles, stimulating their growth and upregulating the aromatase enzyme, which catalyzes the conversion of thecal androgens into estradiol. As circulating estradiol levels rise, they exert a negative feedback effect on FSH secretion while simultaneously priming the pituitary for a massive surge of LH. This LH surge is the absolute prerequisite biological trigger for ovulation—the mechanical rupture of the dominant graafian follicle and the expulsion of the oocyte. Following ovulation, LH induces the luteinization of the remaining granulosa and theca cells, transforming the ruptured follicle into the corpus luteum. The corpus luteum then becomes a temporary, yet highly active, endocrine gland, secreting copious amounts of progesterone alongside estrogen. Progesterone is the definitive hormone of pregnancy maintenance; its primary physiological role is to act upon the estrogen-primed uterine endometrium, transforming it into a highly vascularized, secretory, and nutrient-rich mucosal bed optimally prepared for embryonic implantation. Furthermore, progesterone exerts a potent tocolytic effect on the uterine myometrium, drastically reducing smooth muscle excitability and preventing premature contractions that could expel a developing conceptus. </w:t>
+        <w:t xml:space="preserve">FSH primarily targets the granulosa cells of the developing ovarian follicles, stimulating their growth and upregulating the aromatase enzyme, which catalyzes the conversion of thecal androgens into estradiol (Speroff &amp; Fritz, 2020). As circulating estradiol levels rise, they exert a negative feedback effect on FSH secretion while simultaneously priming the pituitary for a massive surge of LH. This LH surge is the absolute prerequisite biological trigger for ovulation—the mechanical rupture of the dominant graafian follicle and the expulsion of the oocyte. Following ovulation, LH induces the luteinization of the remaining granulosa and theca cells, transforming the ruptured follicle into the corpus luteum (Itriyeva, 2022). The corpus luteum then becomes a temporary, yet highly active, endocrine gland, secreting copious amounts of progesterone alongside estrogen. Progesterone is the definitive hormone of pregnancy maintenance; its primary physiological role is to act upon the estrogen-primed uterine endometrium, transforming it into a highly vascularized, secretory, and nutrient-rich mucosal bed optimally prepared for embryonic implantation (Ingram &amp; Goddard, 2020). Furthermore, progesterone exerts a potent tocolytic effect on the uterine myometrium, drastically reducing smooth muscle excitability and preventing premature contractions that could expel a developing conceptus. </w:t>
       </w:r>
     </w:p>
     <w:p>
@@ -111,7 +111,7 @@
           <w:color w:val="000000"/>
           <w:sz w:val="24"/>
         </w:rPr>
-        <w:t>The intricate balance of the HPO axis is highly sensitive to both endogenous and exogenous perturbations. Modulations in stress hormones, nutritional status, adipose tissue volume, and exogenous pharmacological agents can significantly disrupt this feedback loop, leading to a wide spectrum of anovulatory disorders, menstrual irregularities, and pathological states. Understanding the fundamental neuroendocrinology and structural anatomy of the female reproductive system is paramount for investigating gynecological pathologies, particularly primary dysmenorrhea. In dysmenorrhea, the regular physiological processes governed by the HPO axis—specifically the cyclical withdrawal of estrogen and progesterone at the culmination of an infertile cycle—trigger a cascade of extreme local inflammatory mediators within the uterus, transforming the normal shedding of the endometrium into a profoundly painful, hypercontractile pathological event.</w:t>
+        <w:t>The intricate balance of the HPO axis is highly sensitive to both endogenous and exogenous perturbations. Modulations in stress hormones, nutritional status, adipose tissue volume, and exogenous pharmacological agents can significantly disrupt this feedback loop, leading to a wide spectrum of anovulatory disorders, menstrual irregularities, and pathological states (Itriyeva, 2022). Understanding the fundamental neuroendocrinology and structural anatomy of the female reproductive system is paramount for investigating gynecological pathologies, particularly primary dysmenorrhea. In dysmenorrhea, the regular physiological processes governed by the HPO axis—specifically the cyclical withdrawal of estrogen and progesterone at the culmination of an infertile cycle—trigger a cascade of extreme local inflammatory mediators within the uterus, transforming the normal shedding of the endometrium into a profoundly painful, hypercontractile pathological event (Dawood, 2006).</w:t>
       </w:r>
     </w:p>
     <w:p>
@@ -139,7 +139,7 @@
           <w:color w:val="000000"/>
           <w:sz w:val="24"/>
         </w:rPr>
-        <w:t>The human uterus is an extraordinarily dynamic, thick-walled, highly muscular organ that serves as the mechanical and physiological epicenter of the female reproductive system. Anatomically situated within the lesser pelvis, the non-gravid uterus typically measures approximately 7.5 centimeters in length, 5 centimeters in width, and 2.5 centimeters in thickness, though these dimensions undergo massive, unprecedented physiological hypertrophy and hyperplasia during pregnancy, enabling the organ to accommodate a full-term fetus. The uterus is grossly divided into three distinct anatomical segments: the fundus, the body (or corpus), and the cervix. The fundus is the broad, dome-shaped superior portion located above the imaginary line drawn between the entry points of the paired fallopian tubes. The body constitutes the major, central portion of the organ, tapering inferiorly towards the uterine isthmus. The cervix is the narrow, cylindrical inferior segment that projects directly into the superior vault of the vaginal canal, acting as a critical biochemical and mechanical barrier between the external environment and the sterile upper reproductive tract. The structural orientation of the uterus within the pelvic cavity is meticulously maintained by a complex network of fascial condensations and true ligaments, most notably the broad ligaments, uterosacral ligaments, cardinal (transverse cervical) ligaments, and the round ligaments, which collectively ensure the organ remains in its typical anteverted and anteflexed position, resting anteriorly over the superior surface of the urinary bladder.</w:t>
+        <w:t>The human uterus is an extraordinarily dynamic, thick-walled, highly muscular organ that serves as the mechanical and physiological epicenter of the female reproductive system (Speroff &amp; Fritz, 2020). Anatomically situated within the lesser pelvis, the non-gravid uterus typically measures approximately 7.5 centimeters in length, 5 centimeters in width, and 2.5 centimeters in thickness, though these dimensions undergo massive, unprecedented physiological hypertrophy and hyperplasia during pregnancy, enabling the organ to accommodate a full-term fetus. The uterus is grossly divided into three distinct anatomical segments: the fundus, the body (or corpus), and the cervix (Ingram &amp; Goddard, 2020). The fundus is the broad, dome-shaped superior portion located above the imaginary line drawn between the entry points of the paired fallopian tubes. The body constitutes the major, central portion of the organ, tapering inferiorly towards the uterine isthmus. The cervix is the narrow, cylindrical inferior segment that projects directly into the superior vault of the vaginal canal, acting as a critical biochemical and mechanical barrier between the external environment and the sterile upper reproductive tract. The structural orientation of the uterus within the pelvic cavity is meticulously maintained by a complex network of fascial condensations and true ligaments, most notably the broad ligaments, uterosacral ligaments, cardinal (transverse cervical) ligaments, and the round ligaments, which collectively ensure the organ remains in its typical anteverted and anteflexed position, resting anteriorly over the superior surface of the urinary bladder (Speroff &amp; Fritz, 2020).</w:t>
       </w:r>
     </w:p>
     <w:p>
@@ -153,7 +153,7 @@
           <w:color w:val="000000"/>
           <w:sz w:val="24"/>
         </w:rPr>
-        <w:t>Histologically and functionally, the uterine wall is an architectural marvel, distinctly stratified into three specialized layers: the perimetrium, the myometrium, and the endometrium. The perimetrium, the outermost layer, is a thin, delicate serous membrane derived directly from the visceral peritoneum. It forms the external physical boundary of the uterus, producing a small volume of serous fluid that reduces mechanical friction with adjacent pelvic and abdominal viscera during physiological movements, respiration, and gastrointestinal peristalsis. Beneath the perimetrium lies the myometrium, which constitutes the overwhelming bulk of the uterine wall and represents one of the most powerful and specialized smooth muscle tissues in the human body. Unlike typical gastrointestinal smooth muscle, the myometrium is uniquely structured to generate multidirectional, coordinated, and massive contractile forces. It is composed of three interconnected sub-layers of smooth muscle fibers. The outer layer consists primarily of longitudinal fibers that are continuous with the musculature of the fallopian tubes and the round ligaments. The thick, prominent middle layer is highly vascularized and features a dense, complex, figure-of-eight or "plexiform" arrangement of muscle fibers. This specific structural geometry is functionally critical; during uterine contractions, particularly postpartum, these interlacing fibers act as living ligatures, forcefully constricting the penetrating blood vessels to achieve rapid hemostasis and prevent fatal hemorrhagic shock following the detachment of the placenta. The innermost myometrial layer consists predominantly of circular and longitudinally oriented fibers that interface directly with the basal layer of the endometrium.</w:t>
+        <w:t>Histologically and functionally, the uterine wall is an architectural marvel, distinctly stratified into three specialized layers: the perimetrium, the myometrium, and the endometrium. The perimetrium, the outermost layer, is a thin, delicate serous membrane derived directly from the visceral peritoneum. It forms the external physical boundary of the uterus, producing a small volume of serous fluid that reduces mechanical friction with adjacent pelvic and abdominal viscera during physiological movements, respiration, and gastrointestinal peristalsis. Beneath the perimetrium lies the myometrium, which constitutes the overwhelming bulk of the uterine wall and represents one of the most powerful and specialized smooth muscle tissues in the human body (Raskin &amp; O'Brien, 2022). Unlike typical gastrointestinal smooth muscle, the myometrium is uniquely structured to generate multidirectional, coordinated, and massive contractile forces. It is composed of three interconnected sub-layers of smooth muscle fibers. The outer layer consists primarily of longitudinal fibers that are continuous with the musculature of the fallopian tubes and the round ligaments. The thick, prominent middle layer is highly vascularized and features a dense, complex, figure-of-eight or "plexiform" arrangement of muscle fibers (Raskin &amp; O'Brien, 2022). This specific structural geometry is functionally critical; during uterine contractions, particularly postpartum, these interlacing fibers act as living ligatures, forcefully constricting the penetrating blood vessels to achieve rapid hemostasis and prevent fatal hemorrhagic shock following the detachment of the placenta. The innermost myometrial layer consists predominantly of circular and longitudinally oriented fibers that interface directly with the basal layer of the endometrium (Lee &amp; Park, 2022).</w:t>
       </w:r>
     </w:p>
     <w:p>
@@ -167,7 +167,7 @@
           <w:color w:val="000000"/>
           <w:sz w:val="24"/>
         </w:rPr>
-        <w:t xml:space="preserve">The endometrium is the innermost, highly dynamic mucosal lining of the uterine cavity, characterized by simple columnar epithelium underlain by a thick, highly cellular, vascular stroma containing numerous simple tubular glands. Functionally, the endometrium is subdivided into two distinct zones: the deep stratum basalis and the superficial stratum functionalis. The stratum basalis is the permanent, highly vascularized foundational layer adjacent to the myometrium. It remains largely unresponsive to cyclical fluctuations in ovarian hormones and serves as the definitive regenerative source from which a new functional layer is synthesized after each menstruation. In stark contrast, the stratum functionalis is the transient, hormonally responsive layer that lines the uterine lumen. Over the course of the typical 28-day menstrual cycle, the stratum functionalis undergoes dramatic, continuous histological transformations. Driven by rising estrogen levels during the follicular phase, it proliferates rapidly, vastly expanding its stromal matrix, elongating its tubular glands, and developing a highly specialized microvascular network of spiral arterioles. Following ovulation, under the synergistic influence of both estrogen and progesterone, the stratum functionalis transforms into a lush, glycogen-rich secretory environment perfectly optimized to support the implantation and initial nourishment of a developing blastocyst. </w:t>
+        <w:t xml:space="preserve">The endometrium is the innermost, highly dynamic mucosal lining of the uterine cavity, characterized by simple columnar epithelium underlain by a thick, highly cellular, vascular stroma containing numerous simple tubular glands (Ingram &amp; Goddard, 2020). Functionally, the endometrium is subdivided into two distinct zones: the deep stratum basalis and the superficial stratum functionalis. The stratum basalis is the permanent, highly vascularized foundational layer adjacent to the myometrium. It remains largely unresponsive to cyclical fluctuations in ovarian hormones and serves as the definitive regenerative source from which a new functional layer is synthesized after each menstruation. In stark contrast, the stratum functionalis is the transient, hormonally responsive layer that lines the uterine lumen (Itriyeva, 2022). Over the course of the typical 28-day menstrual cycle, the stratum functionalis undergoes dramatic, continuous histological transformations. Driven by rising estrogen levels during the follicular phase, it proliferates rapidly, vastly expanding its stromal matrix, elongating its tubular glands, and developing a highly specialized microvascular network of spiral arterioles. Following ovulation, under the synergistic influence of both estrogen and progesterone, the stratum functionalis transforms into a lush, glycogen-rich secretory environment perfectly optimized to support the implantation and initial nourishment of a developing blastocyst (Speroff &amp; Fritz, 2020). </w:t>
       </w:r>
     </w:p>
     <w:p>
@@ -181,7 +181,7 @@
           <w:color w:val="000000"/>
           <w:sz w:val="24"/>
         </w:rPr>
-        <w:t>The vascular architecture supplying the uterus is of profound clinical relevance, particularly concerning the pathophysiology of dysmenorrhea. The primary blood supply originates from the paired uterine arteries, branches of the internal iliac arteries, which ascend along the lateral margins of the uterus within the broad ligament. These arteries give rise to arcuate arteries that deeply penetrate and encircle the myometrium. The arcuate arteries subsequently branch into radial arteries, which project directly inward toward the endometrium. As the radial arteries cross the myometrial-endometrial junction, they bifurcate into two distinct vascular systems: the straight arterioles, which exclusively supply the permanent stratum basalis, and the highly coiled spiral arterioles, which extend outward to supply the dynamic stratum functionalis. It is the extreme sensitivity of these specific spiral arterioles to endogenous vasoactive mediators, particularly prostaglandins, that sets the stage for menstruation. When pregnancy fails to occur, the abrupt systemic withdrawal of estrogen and progesterone triggers the intense, sustained vasoconstriction of these spiral arterioles. This profound, localized vasospasm leads to severe tissue ischemia, the eventual rupture of the vessel walls, and the subsequent necrotic sloughing of the stratum functionalis. In primary dysmenorrhea, the excessive production of these same vasoactive prostaglandins fundamentally hijacks this physiological process, inducing not only severe vascular ischemia but also generating dysrhythmic, hypertonic contractions within the massive underlying myometrial muscle bed, culminating in severe, debilitating pelvic pain.</w:t>
+        <w:t>The vascular architecture supplying the uterus is of profound clinical relevance, particularly concerning the pathophysiology of dysmenorrhea. The primary blood supply originates from the paired uterine arteries, branches of the internal iliac arteries, which ascend along the lateral margins of the uterus within the broad ligament. These arteries give rise to arcuate arteries that deeply penetrate and encircle the myometrium. The arcuate arteries subsequently branch into radial arteries, which project directly inward toward the endometrium (Altunyurt et al., 2005). As the radial arteries cross the myometrial-endometrial junction, they bifurcate into two distinct vascular systems: the straight arterioles, which exclusively supply the permanent stratum basalis, and the highly coiled spiral arterioles, which extend outward to supply the dynamic stratum functionalis. It is the extreme sensitivity of these specific spiral arterioles to endogenous vasoactive mediators, particularly prostaglandins, that sets the stage for menstruation (Su &amp; Chen, 2022). When pregnancy fails to occur, the abrupt systemic withdrawal of estrogen and progesterone triggers the intense, sustained vasoconstriction of these spiral arterioles. This profound, localized vasospasm leads to severe tissue ischemia, the eventual rupture of the vessel walls, and the subsequent necrotic sloughing of the stratum functionalis. In primary dysmenorrhea, the excessive production of these same vasoactive prostaglandins fundamentally hijacks this physiological process, inducing not only severe vascular ischemia but also generating dysrhythmic, hypertonic contractions within the massive underlying myometrial muscle bed, culminating in severe, debilitating pelvic pain (Altunyurt et al., 2005; Su &amp; Chen, 2022).</w:t>
       </w:r>
     </w:p>
     <w:p>
@@ -209,7 +209,7 @@
           <w:color w:val="000000"/>
           <w:sz w:val="24"/>
         </w:rPr>
-        <w:t>The human female reproductive cycle is an intricate, highly synchronized, and continuous physiological loop designed to prepare the female body for the possibility of conception and pregnancy on a monthly basis. This continuous process, typically averaging 28 days in duration, encompasses two simultaneous and deeply interconnected sub-cycles: the ovarian cycle, detailing the maturation and release of an oocyte, and the endometrial cycle, dictating the cyclical preparation, maintenance, and shedding of the uterine mucosa. These parallel cycles are rigorously governed by an elaborate neuroendocrine feedback mechanism involving the hypothalamus, the anterior pituitary gland, and the ovaries, acting sequentially to drive the morphological and functional changes required for human reproduction.</w:t>
+        <w:t>The human female reproductive cycle is an intricate, highly synchronized, and continuous physiological loop designed to prepare the female body for the possibility of conception and pregnancy on a monthly basis. This continuous process, typically averaging 28 days in duration, encompasses two simultaneous and deeply interconnected sub-cycles: the ovarian cycle, detailing the maturation and release of an oocyte, and the endometrial cycle, dictating the cyclical preparation, maintenance, and shedding of the uterine mucosa (Ingram &amp; Goddard, 2020). These parallel cycles are rigorously governed by an elaborate neuroendocrine feedback mechanism involving the hypothalamus, the anterior pituitary gland, and the ovaries, acting sequentially to drive the morphological and functional changes required for human reproduction (Itriyeva, 2022).</w:t>
       </w:r>
     </w:p>
     <w:p>
@@ -223,7 +223,7 @@
           <w:color w:val="000000"/>
           <w:sz w:val="24"/>
         </w:rPr>
-        <w:t xml:space="preserve">The ovarian cycle is physiologically demarcated into three distinct phases: the follicular phase, ovulation, and the luteal phase. The cycle commences on the first day of menstrual bleeding, marking the beginning of the follicular phase. At this juncture, the hypothalamus initiates the pulsatile release of gonadotropin-releasing hormone (GnRH), which in turn stimulates the anterior pituitary to secrete follicle-stimulating hormone (FSH) and, to a lesser extent, luteinizing hormone (LH). The rising titer of FSH acts directly on the ovaries, rescuing a cohort of primordial follicles from atresia and stimulating their growth into primary, and subsequently secondary, follicles. As these follicles enlarge, their surrounding granulosa and theca cells begin to rapidly synthesize and secrete estrogens, primarily in the form of estradiol. Through a complex process of selection, typically only a single follicle outpaces the others in growth and estrogen production, eventually achieving dominance to become the mature graafian follicle, while the remaining subordinate follicles undergo apoptosis and atresia. As the dominant follicle matures over the approximately 14-day follicular phase, its estrogen secretion increases exponentially. Once systemic estradiol levels reach a critical, sustained threshold, the standard negative feedback loop on the anterior pituitary paradoxically reverses into a powerful positive feedback mechanism. This biological switch triggers a massive, sudden surge in the secretion of luteinizing hormone (LH)—the defining neuroendocrine event of the ovarian cycle. This LH surge acts as an acute, essential trigger, culminating approximately 24 to 36 hours later in ovulation, the mechanical rupture of the graafian follicle wall and the expulsion of the secondary oocyte into the peritoneal cavity, where it is swiftly captured by the fimbriae of the fallopian tube. </w:t>
+        <w:t xml:space="preserve">The ovarian cycle is physiologically demarcated into three distinct phases: the follicular phase, ovulation, and the luteal phase. The cycle commences on the first day of menstrual bleeding, marking the beginning of the follicular phase. At this juncture, the hypothalamus initiates the pulsatile release of gonadotropin-releasing hormone (GnRH), which in turn stimulates the anterior pituitary to secrete follicle-stimulating hormone (FSH) and, to a lesser extent, luteinizing hormone (LH) (Speroff &amp; Fritz, 2020). The rising titer of FSH acts directly on the ovaries, rescuing a cohort of primordial follicles from atresia and stimulating their growth into primary, and subsequently secondary, follicles. As these follicles enlarge, their surrounding granulosa and theca cells begin to rapidly synthesize and secrete estrogens, primarily in the form of estradiol. Through a complex process of selection, typically only a single follicle outpaces the others in growth and estrogen production, eventually achieving dominance to become the mature graafian follicle, while the remaining subordinate follicles undergo apoptosis and atresia (Itriyeva, 2022). As the dominant follicle matures over the approximately 14-day follicular phase, its estrogen secretion increases exponentially. Once systemic estradiol levels reach a critical, sustained threshold, the standard negative feedback loop on the anterior pituitary paradoxically reverses into a powerful positive feedback mechanism. This biological switch triggers a massive, sudden surge in the secretion of luteinizing hormone (LH)—the defining neuroendocrine event of the ovarian cycle. This LH surge acts as an acute, essential trigger, culminating approximately 24 to 36 hours later in ovulation, the mechanical rupture of the graafian follicle wall and the expulsion of the secondary oocyte into the peritoneal cavity, where it is swiftly captured by the fimbriae of the fallopian tube (Ingram &amp; Goddard, 2020). </w:t>
       </w:r>
     </w:p>
     <w:p>
@@ -237,7 +237,7 @@
           <w:color w:val="000000"/>
           <w:sz w:val="24"/>
         </w:rPr>
-        <w:t>Following ovulation, the ovarian cycle immediately enters the luteal phase. Driven by the continued, albeit lower, presence of LH, the structural remnants of the ruptured follicle rapidly undergo massive hypertrophy and lipid accumulation, reorganizing into a highly vascularized, transient endocrine structure known as the corpus luteum. The corpus luteum fundamentally shifts the hormonal landscape, secreting massive quantities of progesterone alongside moderate amounts of estrogen and inhibin. These elevated circulating levels of progesterone and estrogen exert profound negative feedback on the hypothalamus and anterior pituitary, effectively suppressing further GnRH, FSH, and LH secretion, thereby preventing the development of any new follicles during the luteal phase. The primary physiological mandate of the corpus luteum is to support the uterine environment for a potential pregnancy. If the oocyte is fertilized and successfully implants into the uterine wall, the developing chorion of the embryo will begin secreting human chorionic gonadotropin (hCG), a hormone structurally and functionally analogous to LH. hCG rescues the corpus luteum from degeneration, ensuring the continuous, vital supply of progesterone required to maintain the pregnancy until the placenta is sufficiently developed to assume this endocrine function by the second trimester. Conversely, if fertilization and implantation do not occur, the absence of hCG leaves the corpus luteum without trophic support. Deprived of stimulation, the corpus luteum maintains its secretory activity for precisely 12 to 14 days before undergoing spontaneous, programmed involution, transforming into a fibrous, non-functional scar tissue known as the corpus albicans. This involution results in an abrupt, precipitous decline in circulating progesterone and estrogen levels, signaling the end of the ovarian cycle and simultaneously triggering the dramatic events that conclude the endometrial cycle.</w:t>
+        <w:t>Following ovulation, the ovarian cycle immediately enters the luteal phase. Driven by the continued, albeit lower, presence of LH, the structural remnants of the ruptured follicle rapidly undergo massive hypertrophy and lipid accumulation, reorganizing into a highly vascularized, transient endocrine structure known as the corpus luteum (Itriyeva, 2022). The corpus luteum fundamentally shifts the hormonal landscape, secreting massive quantities of progesterone alongside moderate amounts of estrogen and inhibin. These elevated circulating levels of progesterone and estrogen exert profound negative feedback on the hypothalamus and anterior pituitary, effectively suppressing further GnRH, FSH, and LH secretion, thereby preventing the development of any new follicles during the luteal phase. The primary physiological mandate of the corpus luteum is to support the uterine environment for a potential pregnancy. If the oocyte is fertilized and successfully implants into the uterine wall, the developing chorion of the embryo will begin secreting human chorionic gonadotropin (hCG), a hormone structurally and functionally analogous to LH. hCG rescues the corpus luteum from degeneration, ensuring the continuous, vital supply of progesterone required to maintain the pregnancy until the placenta is sufficiently developed to assume this endocrine function by the second trimester (Speroff &amp; Fritz, 2020). Conversely, if fertilization and implantation do not occur, the absence of hCG leaves the corpus luteum without trophic support. Deprived of stimulation, the corpus luteum maintains its secretory activity for precisely 12 to 14 days before undergoing spontaneous, programmed involution, transforming into a fibrous, non-functional scar tissue known as the corpus albicans. This involution results in an abrupt, precipitous decline in circulating progesterone and estrogen levels, signaling the end of the ovarian cycle and simultaneously triggering the dramatic events that conclude the endometrial cycle.</w:t>
       </w:r>
     </w:p>
     <w:p>
@@ -251,7 +251,7 @@
           <w:color w:val="000000"/>
           <w:sz w:val="24"/>
         </w:rPr>
-        <w:t xml:space="preserve">Operating in absolute synchrony with the ovaries, the endometrial cycle represents the target tissue response to fluctuating ovarian steroids and is subdivided into three distinct phases: the menstrual phase, the proliferative phase, and the secretory phase. The cycle begins with the menstrual phase, characterized by the active desquamation of the stratum functionalis of the endometrium, clinically manifesting as menstrual bleeding. Following menstruation, the proliferative phase commences, running concurrently with the ovarian follicular phase. Driven entirely by the rising levels of estradiol secreted by the developing ovarian follicles, the remaining stratum basalis initiates massive cellular proliferation. The stromal cells multiply rapidly, the endometrial glands elongate substantially, and a highly specialized network of spiral arterioles regenerates, extending upward into the newly forming tissue. By the time of ovulation, the endometrium has thickened by several millimeters, transitioning into a highly cellular, estrogen-primed state. </w:t>
+        <w:t xml:space="preserve">Operating in absolute synchrony with the ovaries, the endometrial cycle represents the target tissue response to fluctuating ovarian steroids and is subdivided into three distinct phases: the menstrual phase, the proliferative phase, and the secretory phase (Ingram &amp; Goddard, 2020). The cycle begins with the menstrual phase, characterized by the active desquamation of the stratum functionalis of the endometrium, clinically manifesting as menstrual bleeding. Following menstruation, the proliferative phase commences, running concurrently with the ovarian follicular phase. Driven entirely by the rising levels of estradiol secreted by the developing ovarian follicles, the remaining stratum basalis initiates massive cellular proliferation. The stromal cells multiply rapidly, the endometrial glands elongate substantially, and a highly specialized network of spiral arterioles regenerates, extending upward into the newly forming tissue. By the time of ovulation, the endometrium has thickened by several millimeters, transitioning into a highly cellular, estrogen-primed state (Itriyeva, 2022). </w:t>
       </w:r>
     </w:p>
     <w:p>
@@ -265,7 +265,7 @@
           <w:color w:val="000000"/>
           <w:sz w:val="24"/>
         </w:rPr>
-        <w:t>Immediately following ovulation, the endometrial cycle seamlessly transitions into the secretory phase, heavily governed by the surging progesterone levels originating from the newly formed corpus luteum. Progesterone acts upon the estrogen-primed endometrium, halting further cellular proliferation and inducing profound functional differentiation. The endometrial glands become highly tortuous, actively synthesizing and secreting glycogen, lipids, and various proteins essential for nourishing a potential embryo prior to vascular implantation. The spiral arterioles become extensively coiled and engorged with blood, creating an optimal, nutrient-dense, and highly receptive mucosal environment. However, when conception fails, the programmed demise of the corpus luteum leads to a sudden, dramatic withdrawal of both progesterone and estrogen support. This abrupt endocrine deprivation is the fundamental pathophysiological trigger for menstruation. The loss of steroidal support destabilizes the lysosomal membranes within the endometrial cells, releasing phospholipase A2 and initiating the arachidonic acid cascade. This results in the massive, localized synthesis and accumulation of vasoactive inflammatory mediators, predominantly prostaglandin F2-alpha (PGF2α) and prostaglandin E2 (PGE2). High concentrations of PGF2α exert a direct, profound vasoconstrictive effect on the specialized spiral arterioles, inducing rapid and severe ischemia within the stratum functionalis. Prolonged ischemia inevitably leads to cellular hypoxia, autolysis, and widespread tissue necrosis. Furthermore, the massive efflux of prostaglandins into the underlying myometrium triggers powerful, dysrhythmic uterine contractions designed to mechanically expel the necrotic tissue and accumulated blood. While these contractions are a normal physiological requirement for menstruation, an exaggerated pathological overproduction of these exact same prostaglandins leads to sustained myometrial hypercontractility, severe uterine ischemia, and the intense, debilitating pain clinically defined as primary dysmenorrhea.</w:t>
+        <w:t>Immediately following ovulation, the endometrial cycle seamlessly transitions into the secretory phase, heavily governed by the surging progesterone levels originating from the newly formed corpus luteum. Progesterone acts upon the estrogen-primed endometrium, halting further cellular proliferation and inducing profound functional differentiation. The endometrial glands become highly tortuous, actively synthesizing and secreting glycogen, lipids, and various proteins essential for nourishing a potential embryo prior to vascular implantation. The spiral arterioles become extensively coiled and engorged with blood, creating an optimal, nutrient-dense, and highly receptive mucosal environment (Speroff &amp; Fritz, 2020). However, when conception fails, the programmed demise of the corpus luteum leads to a sudden, dramatic withdrawal of both progesterone and estrogen support. This abrupt endocrine deprivation is the fundamental pathophysiological trigger for menstruation. The loss of steroidal support destabilizes the lysosomal membranes within the endometrial cells, releasing phospholipase A2 and initiating the arachidonic acid cascade (Wang et al., 2021). This results in the massive, localized synthesis and accumulation of vasoactive inflammatory mediators, predominantly prostaglandin F2-alpha (PGF2α) and prostaglandin E2 (PGE2) (Pahwa &amp; Jialal, 2021). High concentrations of PGF2α exert a direct, profound vasoconstrictive effect on the specialized spiral arterioles, inducing rapid and severe ischemia within the stratum functionalis. Prolonged ischemia inevitably leads to cellular hypoxia, autolysis, and widespread tissue necrosis (Dawood, 2006). Furthermore, the massive efflux of prostaglandins into the underlying myometrium triggers powerful, dysrhythmic uterine contractions designed to mechanically expel the necrotic tissue and accumulated blood. While these contractions are a normal physiological requirement for menstruation, an exaggerated pathological overproduction of these exact same prostaglandins leads to sustained myometrial hypercontractility, severe uterine ischemia, and the intense, debilitating pain clinically defined as primary dysmenorrhea (Iacovides et al., 2015).</w:t>
       </w:r>
     </w:p>
     <w:p>
@@ -310,7 +310,7 @@
           <w:color w:val="000000"/>
           <w:sz w:val="24"/>
         </w:rPr>
-        <w:t xml:space="preserve">) has been universally adopted as the preeminent, indispensable mammalian model in reproductive physiology, toxicology, and pharmacological research, owing largely to its genetic tractability, rapid reproductive rate, and profound functional homologies with the human reproductive system. However, while functionally analogous, the mouse uterus exhibits stark, fundamental anatomical divergences from the human simplex structure that must be meticulously understood when designing and interpreting pharmacological assays. Unlike the single, fused, pear-shaped uterus characteristic of human females, the mouse possesses a bicornuate, or strictly duplex, uterus. This specific anatomical configuration consists of two entirely distinct, highly elongated, and tubular uterine horns (cornua) that extend craniocaudally through the abdominal cavity. These separate horns ultimately converge inferiorly, opening independently through a bilobed cervix directly into a single vaginal canal. This distinct architectural adaptation is an evolutionary necessity, perfectly engineered to safely accommodate and sustain massive multifetal pregnancies (litters) characteristic of rodent reproduction, distributing multiple implantation sites evenly along the extensive length of each uterine horn. </w:t>
+        <w:t xml:space="preserve">) has been universally adopted as the preeminent, indispensable mammalian model in reproductive physiology, toxicology, and pharmacological research, owing largely to its genetic tractability, rapid reproductive rate, and profound functional homologies with the human reproductive system (Hartmann &amp; Mohamed, 2021). However, while functionally analogous, the mouse uterus exhibits stark, fundamental anatomical divergences from the human simplex structure that must be meticulously understood when designing and interpreting pharmacological assays. Unlike the single, fused, pear-shaped uterus characteristic of human females, the mouse possesses a bicornuate, or strictly duplex, uterus. This specific anatomical configuration consists of two entirely distinct, highly elongated, and tubular uterine horns (cornua) that extend craniocaudally through the abdominal cavity. These separate horns ultimately converge inferiorly, opening independently through a bilobed cervix directly into a single vaginal canal (Hong et al., 2022). This distinct architectural adaptation is an evolutionary necessity, perfectly engineered to safely accommodate and sustain massive multifetal pregnancies (litters) characteristic of rodent reproduction, distributing multiple implantation sites evenly along the extensive length of each uterine horn. </w:t>
       </w:r>
     </w:p>
     <w:p>
@@ -324,7 +324,7 @@
           <w:color w:val="000000"/>
           <w:sz w:val="24"/>
         </w:rPr>
-        <w:t xml:space="preserve">Despite this profound divergence in gross anatomical structure, the fundamental histological architecture of the murine uterine wall remarkably mirrors that of the human, providing a highly reliable and valid substrate for extrapolating pharmacological mechanisms. Similar to the human uterus, the murine uterine wall is strictly stratified into three primary physiological layers: an outer perimetrium, a middle muscular myometrium, and an inner mucosal endometrium. The perimetrium remains a thin serosal layer contiguous with the broad ligament, providing external structural integrity. The inner endometrium undergoes cyclical alterations driven by systemic hormonal fluctuations, though it lacks the pronounced, distinct structural division into stratum basalis and functionalis seen in menstruating primates, and critically, mice do not experience overt, hemorrhagic menstruation; rather, the superficial lining is largely reabsorbed. It is the middle layer, the myometrium, that holds paramount significance in the study of dysmenorrhea and tocolytic pharmacology. </w:t>
+        <w:t xml:space="preserve">Despite this profound divergence in gross anatomical structure, the fundamental histological architecture of the murine uterine wall remarkably mirrors that of the human, providing a highly reliable and valid substrate for extrapolating pharmacological mechanisms (Tajbakhsh &amp; Jafari, 2022). Similar to the human uterus, the murine uterine wall is strictly stratified into three primary physiological layers: an outer perimetrium, a middle muscular myometrium, and an inner mucosal endometrium. The perimetrium remains a thin serosal layer contiguous with the broad ligament, providing external structural integrity. The inner endometrium undergoes cyclical alterations driven by systemic hormonal fluctuations, though it lacks the pronounced, distinct structural division into stratum basalis and functionalis seen in menstruating primates, and critically, mice do not experience overt, hemorrhagic menstruation; rather, the superficial lining is largely reabsorbed (Hartmann &amp; Mohamed, 2021). It is the middle layer, the myometrium, that holds paramount significance in the study of dysmenorrhea and tocolytic pharmacology. </w:t>
       </w:r>
     </w:p>
     <w:p>
@@ -338,7 +338,7 @@
           <w:color w:val="000000"/>
           <w:sz w:val="24"/>
         </w:rPr>
-        <w:t xml:space="preserve">The murine myometrium is exceptionally well-defined and structurally less complex than its human counterpart, making it an ideal model for isolating and studying specific smooth muscle mechanics. It is distinctly organized into two discrete, clearly separated layers of smooth muscle: a relatively thin outer layer of longitudinally oriented muscle fibers (the longitudinal myometrium) and a significantly thicker inner layer of circularly oriented muscle fibers (the circular myometrium). Crucially, these two contractile layers are physically separated by a highly distinct, highly vascularized band of connective tissue termed the stratum vasculare, which houses the primary blood vessels and neural networks supplying the uterine tissue. This organization starkly contrasts with the human myometrium, which features a massive, interwoven, figure-of-eight intermediate muscle layer designed specifically for postpartum hemostasis. The discrete separation of the longitudinal and circular muscle layers in the mouse allows pharmacologists to cleanly isolate the uterine horns and record clear, unambiguous, and highly rhythmic spontaneous contractions ex vivo. </w:t>
+        <w:t xml:space="preserve">The murine myometrium is exceptionally well-defined and structurally less complex than its human counterpart, making it an ideal model for isolating and studying specific smooth muscle mechanics (Xu &amp; Zhang, 2023). It is distinctly organized into two discrete, clearly separated layers of smooth muscle: a relatively thin outer layer of longitudinally oriented muscle fibers (the longitudinal myometrium) and a significantly thicker inner layer of circularly oriented muscle fibers (the circular myometrium). Crucially, these two contractile layers are physically separated by a highly distinct, highly vascularized band of connective tissue termed the stratum vasculare, which houses the primary blood vessels and neural networks supplying the uterine tissue. This organization starkly contrasts with the human myometrium, which features a massive, interwoven, figure-of-eight intermediate muscle layer designed specifically for postpartum hemostasis. The discrete separation of the longitudinal and circular muscle layers in the mouse allows pharmacologists to cleanly isolate the uterine horns and record clear, unambiguous, and highly rhythmic spontaneous contractions ex vivo (Xu &amp; Zhang, 2023). </w:t>
       </w:r>
     </w:p>
     <w:p>
@@ -352,7 +352,7 @@
           <w:color w:val="000000"/>
           <w:sz w:val="24"/>
         </w:rPr>
-        <w:t>Functionally, the excitation-contraction coupling mechanisms within the murine myometrial smooth muscle cells are virtually identical to those in humans. Contraction is universally driven by intracellular calcium dynamics, governed by voltage-dependent calcium channels (VDCCs), receptor-operated channels, and intracellular sarcoplasmic reticulum release. Furthermore, the murine myometrium expresses an identical suite of pharmacological receptors, including oxytocin receptors, prostaglandin receptors (specifically the FP and EP receptor subtypes), and various adrenergic and muscarinic receptors. Consequently, the isolated murine uterine horn responds with immense, predictable, and highly quantifiable dose-dependent hypercontractility when exposed to exogenous uterotonic agents such as oxytocin, acetylcholine, or prostaglandin F2-alpha. Conversely, it demonstrates measurable, dose-dependent relaxation when exposed to known tocolytic agents, calcium channel blockers, or cyclooxygenase inhibitors. This precise predictability, combined with the structural simplicity that allows for clean, artifact-free organ bath recordings, firmly establishes the isolated mouse uterus as the definitive, gold-standard experimental model for systematically screening, evaluating, and confirming the therapeutic antidysmenorrhea potential of novel pharmacological compounds and complex phytomedicinal extracts.</w:t>
+        <w:t>Functionally, the excitation-contraction coupling mechanisms within the murine myometrial smooth muscle cells are virtually identical to those in humans. Contraction is universally driven by intracellular calcium dynamics, governed by voltage-dependent calcium channels (VDCCs), receptor-operated channels, and intracellular sarcoplasmic reticulum release (Lee &amp; Park, 2022). Furthermore, the murine myometrium expresses an identical suite of pharmacological receptors, including oxytocin receptors, prostaglandin receptors (specifically the FP and EP receptor subtypes), and various adrenergic and muscarinic receptors (Shi &amp; Jia, 2022). Consequently, the isolated murine uterine horn responds with immense, predictable, and highly quantifiable dose-dependent hypercontractility when exposed to exogenous uterotonic agents such as oxytocin, acetylcholine, or prostaglandin F2-alpha (Ma &amp; Li, 2022). Conversely, it demonstrates measurable, dose-dependent relaxation when exposed to known tocolytic agents, calcium channel blockers, or cyclooxygenase inhibitors (Ponce-Monter et al., 2017). This precise predictability, combined with the structural simplicity that allows for clean, artifact-free organ bath recordings, firmly establishes the isolated mouse uterus as the definitive, gold-standard experimental model for systematically screening, evaluating, and confirming the therapeutic antidysmenorrhea potential of novel pharmacological compounds and complex phytomedicinal extracts (Hartmann &amp; Mohamed, 2021).</w:t>
       </w:r>
     </w:p>
     <w:p>
@@ -380,7 +380,7 @@
           <w:color w:val="000000"/>
           <w:sz w:val="24"/>
         </w:rPr>
-        <w:t>Unlike humans and certain higher primates that undergo a 28-day menstrual cycle characterized by the overt physiological shedding of the uterine lining, the female mouse experiences a rapid, continuous, and non-bleeding reproductive cycle termed the estrous cycle. This highly accelerated polyestrous process is driven by the exact same fundamental hypothalamic-pituitary-ovarian (HPO) neuroendocrine feedback mechanisms as the human cycle—utilizing identical hormones including GnRH, FSH, LH, estrogen, and progesterone—but is vastly compressed into a brief chronological timeframe typically lasting only 4 to 5 days. This rapid cycling makes the mouse an exceptionally efficient in vivo model for studying hormonally dependent physiological processes. The murine estrous cycle is systematically categorized into four distinct, sequentially progressive stages: proestrus, estrus, metestrus, and diestrus. Because the structural and functional state of the entire reproductive tract fluctuates radically across these phases, accurate determination of the estrous stage is an absolute prerequisite prior to utilizing female mice in any pharmacological experiment, particularly those evaluating uterine contractility. This staging is routinely and accurately accomplished through the non-invasive cytological evaluation of vaginal smears, as the vaginal epithelium undergoes highly specific, predictable morphological transformations strictly dictated by the prevailing systemic steroidal environment.</w:t>
+        <w:t>Unlike humans and certain higher primates that undergo a 28-day menstrual cycle characterized by the overt physiological shedding of the uterine lining, the female mouse experiences a rapid, continuous, and non-bleeding reproductive cycle termed the estrous cycle. This highly accelerated polyestrous process is driven by the exact same fundamental hypothalamic-pituitary-ovarian (HPO) neuroendocrine feedback mechanisms as the human cycle—utilizing identical hormones including GnRH, FSH, LH, estrogen, and progesterone—but is vastly compressed into a brief chronological timeframe typically lasting only 4 to 5 days (Hartmann &amp; Mohamed, 2021). This rapid cycling makes the mouse an exceptionally efficient in vivo model for studying hormonally dependent physiological processes. The murine estrous cycle is systematically categorized into four distinct, sequentially progressive stages: proestrus, estrus, metestrus, and diestrus. Because the structural and functional state of the entire reproductive tract fluctuates radically across these phases, accurate determination of the estrous stage is an absolute prerequisite prior to utilizing female mice in any pharmacological experiment, particularly those evaluating uterine contractility (Xu &amp; Zhang, 2023). This staging is routinely and accurately accomplished through the non-invasive cytological evaluation of vaginal smears, as the vaginal epithelium undergoes highly specific, predictable morphological transformations strictly dictated by the prevailing systemic steroidal environment.</w:t>
       </w:r>
     </w:p>
     <w:p>
@@ -394,7 +394,7 @@
           <w:color w:val="000000"/>
           <w:sz w:val="24"/>
         </w:rPr>
-        <w:t>The cycle begins with proestrus, a short pre-ovulatory phase typically lasting 12 to 14 hours. During proestrus, a new cohort of ovarian follicles undergoes rapid final maturation, leading to a massive, systemic surge in circulating estrogen levels. This estrogen dominance exerts profound trophic effects across the reproductive tract, inducing massive cellular proliferation and severe tissue engorgement. Cytologically, a vaginal smear taken during proestrus is overwhelmingly characterized by the presence of large, round, nucleated epithelial cells, reflecting active mucosal generation. Biologically, this peak in estrogen is absolutely critical for the pharmacological assessment of dysmenorrhea therapies; high estrogen concentrations profoundly sensitize the myometrial smooth muscle by massively upregulating the expression of both oxytocin receptors and gap junctions (connexin-43) between muscle cells. This sensitization ensures that the uterus is maximally excitable and capable of mounting massive, highly coordinated, and sustained tetanic contractions when exposed to uterotonic agents. Consequently, animals in the proestrus or early estrus phase are specifically selected for ex vivo organ bath experiments to ensure robust and reproducible baseline contractile activity.</w:t>
+        <w:t>The cycle begins with proestrus, a short pre-ovulatory phase typically lasting 12 to 14 hours. During proestrus, a new cohort of ovarian follicles undergoes rapid final maturation, leading to a massive, systemic surge in circulating estrogen levels. This estrogen dominance exerts profound trophic effects across the reproductive tract, inducing massive cellular proliferation and severe tissue engorgement (Sari &amp; Sutrisno, 2022). Cytologically, a vaginal smear taken during proestrus is overwhelmingly characterized by the presence of large, round, nucleated epithelial cells, reflecting active mucosal generation. Biologically, this peak in estrogen is absolutely critical for the pharmacological assessment of dysmenorrhea therapies; high estrogen concentrations profoundly sensitize the myometrial smooth muscle by massively upregulating the expression of both oxytocin receptors and gap junctions (connexin-43) between muscle cells (Shi &amp; Jia, 2022). This sensitization ensures that the uterus is maximally excitable and capable of mounting massive, highly coordinated, and sustained tetanic contractions when exposed to uterotonic agents (Ma &amp; Li, 2022). Consequently, animals in the proestrus or early estrus phase are specifically selected for ex vivo organ bath experiments to ensure robust and reproducible baseline contractile activity (Lestariningsih et al., 2024).</w:t>
       </w:r>
     </w:p>
     <w:p>
@@ -408,7 +408,7 @@
           <w:color w:val="000000"/>
           <w:sz w:val="24"/>
         </w:rPr>
-        <w:t>Following proestrus, the animal enters estrus, the phase of behavioral sexual receptivity (heat) and active ovulation. Lasting between 24 to 48 hours, estrus is initiated by the LH surge, which triggers the release of the ova. As ovulation occurs, estrogen levels begin to rapidly decline while progesterone levels begin to rise. The intense estrogen exposure from the preceding proestrus phase causes the superficial layers of the rapidly dividing vaginal epithelium to undergo severe keratinization and programmed cell death. Thus, the classic cytological hallmark of the estrus smear is an overwhelming abundance of large, irregularly shaped, anucleated cornified epithelial cells, often appearing in massive, densely packed clusters. The uterus remains highly contractile and functionally prepared for sperm transport.</w:t>
+        <w:t>Following proestrus, the animal enters estrus, the phase of behavioral sexual receptivity (heat) and active ovulation. Lasting between 24 to 48 hours, estrus is initiated by the LH surge, which triggers the release of the ova. As ovulation occurs, estrogen levels begin to rapidly decline while progesterone levels begin to rise. The intense estrogen exposure from the preceding proestrus phase causes the superficial layers of the rapidly dividing vaginal epithelium to undergo severe keratinization and programmed cell death (Sari &amp; Sutrisno, 2022). Thus, the classic cytological hallmark of the estrus smear is an overwhelming abundance of large, irregularly shaped, anucleated cornified epithelial cells, often appearing in massive, densely packed clusters. The uterus remains highly contractile and functionally prepared for sperm transport.</w:t>
       </w:r>
     </w:p>
     <w:p>
@@ -422,7 +422,7 @@
           <w:color w:val="000000"/>
           <w:sz w:val="24"/>
         </w:rPr>
-        <w:t xml:space="preserve">As the cycle progresses into metestrus, a brief transitional phase lasting 10 to 14 hours, the structural remnants of the ovulated follicles rapidly reorganize to form the corpora lutea. This phase marks the definitive shift from an estrogen-dominant to a progesterone-dominant systemic environment. The physical trauma of ovulation and the shedding of the cornified vaginal layers trigger a massive local inflammatory response. Consequently, a metestrus vaginal smear presents a highly characteristic, heterogeneous mixture of scattered cornified epithelial cells and a massive influx of small, densely staining polymorphonuclear leukocytes (neutrophils). </w:t>
+        <w:t xml:space="preserve">As the cycle progresses into metestrus, a brief transitional phase lasting 10 to 14 hours, the structural remnants of the ovulated follicles rapidly reorganize to form the corpora lutea. This phase marks the definitive shift from an estrogen-dominant to a progesterone-dominant systemic environment (Hartmann &amp; Mohamed, 2021). The physical trauma of ovulation and the shedding of the cornified vaginal layers trigger a massive local inflammatory response. Consequently, a metestrus vaginal smear presents a highly characteristic, heterogeneous mixture of scattered cornified epithelial cells and a massive influx of small, densely staining polymorphonuclear leukocytes (neutrophils). </w:t>
       </w:r>
     </w:p>
     <w:p>
@@ -436,7 +436,7 @@
           <w:color w:val="000000"/>
           <w:sz w:val="24"/>
         </w:rPr>
-        <w:t>Finally, the cycle enters diestrus, the longest phase, typically lasting 48 to 72 hours. Diestrus represents the fully established luteal phase, characterized by peak systemic secretion of progesterone from the functional corpora lutea. Progesterone acts as the dominant hormonal influence, halting cellular proliferation, reducing tissue vascularity, and profoundly suppressing myometrial excitability to establish a quiescent uterine environment suitable for potential implantation. If fertilization and pregnancy do not occur, the corpora lutea rapidly regress via luteolysis, leading to a sharp drop in progesterone. Cytologically, the diestrus vaginal smear is sparse, consisting almost entirely of a dense background of leukocytes with very few intact nucleated epithelial cells. The sudden withdrawal of steroidal support resets the hypothalamic-pituitary axis, allowing FSH levels to rise again, thus seamlessly initiating a new proestrus phase and beginning the cycle anew. The profound influence of these rapid cyclical hormonal fluctuations dictates that the specific phase of the estrous cycle must be strictly controlled or precisely documented in any valid pharmacological investigation of uterine contractility to prevent massive data variability and ensure scientifically sound conclusions.</w:t>
+        <w:t>Finally, the cycle enters diestrus, the longest phase, typically lasting 48 to 72 hours. Diestrus represents the fully established luteal phase, characterized by peak systemic secretion of progesterone from the functional corpora lutea (Sari &amp; Sutrisno, 2022). Progesterone acts as the dominant hormonal influence, halting cellular proliferation, reducing tissue vascularity, and profoundly suppressing myometrial excitability to establish a quiescent uterine environment suitable for potential implantation. If fertilization and pregnancy do not occur, the corpora lutea rapidly regress via luteolysis, leading to a sharp drop in progesterone. Cytologically, the diestrus vaginal smear is sparse, consisting almost entirely of a dense background of leukocytes with very few intact nucleated epithelial cells. The sudden withdrawal of steroidal support resets the hypothalamic-pituitary axis, allowing FSH levels to rise again, thus seamlessly initiating a new proestrus phase and beginning the cycle anew (Hartmann &amp; Mohamed, 2021). The profound influence of these rapid cyclical hormonal fluctuations dictates that the specific phase of the estrous cycle must be strictly controlled or precisely documented in any valid pharmacological investigation of uterine contractility to prevent massive data variability and ensure scientifically sound conclusions (Xu &amp; Zhang, 2023).</w:t>
       </w:r>
     </w:p>
     <w:p>
@@ -464,58 +464,7 @@
           <w:color w:val="000000"/>
           <w:sz w:val="24"/>
         </w:rPr>
-        <w:t xml:space="preserve">Dysmenorrhea, originating etymologically from the Greek prefixes and roots </w:t>
-      </w:r>
-      <w:r>
-        <w:rPr>
-          <w:rFonts w:ascii="Times New Roman" w:hAnsi="Times New Roman" w:eastAsia="Times New Roman"/>
-          <w:i/>
-          <w:color w:val="000000"/>
-          <w:sz w:val="24"/>
-        </w:rPr>
-        <w:t>dys</w:t>
-      </w:r>
-      <w:r>
-        <w:rPr>
-          <w:rFonts w:ascii="Times New Roman" w:hAnsi="Times New Roman" w:eastAsia="Times New Roman"/>
-          <w:color w:val="000000"/>
-          <w:sz w:val="24"/>
-        </w:rPr>
-        <w:t xml:space="preserve"> (meaning difficult, painful, or abnormal), </w:t>
-      </w:r>
-      <w:r>
-        <w:rPr>
-          <w:rFonts w:ascii="Times New Roman" w:hAnsi="Times New Roman" w:eastAsia="Times New Roman"/>
-          <w:i/>
-          <w:color w:val="000000"/>
-          <w:sz w:val="24"/>
-        </w:rPr>
-        <w:t>meno</w:t>
-      </w:r>
-      <w:r>
-        <w:rPr>
-          <w:rFonts w:ascii="Times New Roman" w:hAnsi="Times New Roman" w:eastAsia="Times New Roman"/>
-          <w:color w:val="000000"/>
-          <w:sz w:val="24"/>
-        </w:rPr>
-        <w:t xml:space="preserve"> (referring to the month or moon), and </w:t>
-      </w:r>
-      <w:r>
-        <w:rPr>
-          <w:rFonts w:ascii="Times New Roman" w:hAnsi="Times New Roman" w:eastAsia="Times New Roman"/>
-          <w:i/>
-          <w:color w:val="000000"/>
-          <w:sz w:val="24"/>
-        </w:rPr>
-        <w:t>rrhea</w:t>
-      </w:r>
-      <w:r>
-        <w:rPr>
-          <w:rFonts w:ascii="Times New Roman" w:hAnsi="Times New Roman" w:eastAsia="Times New Roman"/>
-          <w:color w:val="000000"/>
-          <w:sz w:val="24"/>
-        </w:rPr>
-        <w:t xml:space="preserve"> (meaning flow), is clinically defined as painful menstrual cramps of uterine origin. It represents not merely a common complaint, but arguably the most prevalent and functionally debilitating gynecological disorder afflicting women of reproductive age globally. Clinicians and researchers broadly classify this condition into two distinct pathophysiological entities: primary dysmenorrhea and secondary dysmenorrhea. Primary dysmenorrhea is strictly defined as the presence of severe, recurrent, spasmodic pelvic pain that occurs in the absence of any identifiable macroscopic pelvic pathology. It typically manifests within the first few years following menarche, coinciding with the establishment of regular ovulatory cycles. In stark contrast, secondary dysmenorrhea describes menstrual pain that is directly attributable to an underlying structural, anatomical, or pathological pelvic disease, such as endometriosis, adenomyosis, uterine leiomyomas (fibroids), or pelvic inflammatory disease. While secondary dysmenorrhea requires targeted interventions addressing the underlying structural pathology, primary dysmenorrhea remains a functional disorder driven by profound biochemical alterations within the uterine environment itself.</w:t>
+        <w:t>Dysmenorrhea, colloquially known as painful menstruation, represents one of the most widespread and debilitating gynecological disorders affecting women of reproductive age globally (Iacovides et al., 2015). It is clinically stratified into two distinct classifications: primary dysmenorrhea and secondary dysmenorrhea. Primary dysmenorrhea is strictly defined as severe, spasmodic lower abdominal or pelvic pain occurring directly prior to or coincident with the onset of menses, in the absolute absence of any identifiable macroscopic pelvic pathology (Dawood, 2006). In stark contrast, secondary dysmenorrhea is directly attributable to a specific underlying structural or pathological anomaly within the reproductive tract, such as endometriosis, uterine fibroids (leiomyomas), adenomyosis, pelvic inflammatory disease, or the presence of an intrauterine device (Smith et al., 2024). While secondary dysmenorrhea predominantly affects older women and necessitates the targeted medical or surgical resolution of the causative pathology, primary dysmenorrhea typically emerges shortly after menarche, once regular ovulatory cycles have been established, and constitutes the primary focus of vast pharmacological research and tocolytic intervention.</w:t>
       </w:r>
     </w:p>
     <w:p>
@@ -529,7 +478,7 @@
           <w:color w:val="000000"/>
           <w:sz w:val="24"/>
         </w:rPr>
-        <w:t>Epidemiologically, primary dysmenorrhea presents a staggering, yet frequently underreported, global health burden. The reported prevalence rates are notoriously difficult to ascertain with absolute precision due to significant methodological heterogeneity across studies, varying clinical definitions of pain severity, and the pervasive cultural normalization of menstrual suffering, which heavily deters young women from seeking formal medical evaluation. Consequently, global prevalence estimates exhibit remarkable variance, ranging anywhere from 16% to an overwhelming 93% across different demographic cohorts. However, robust systematic reviews and meta-analyses consistently underscore that dysmenorrhea disproportionately affects adolescents and young adult women. Studies evaluating female college students frequently report pooled prevalence rates exceeding 80%, establishing primary dysmenorrhea as a ubiquitous physiological challenge that defines the early reproductive years for the vast majority of women. The true impact of this condition extends far beyond acute physiological pain; it imposes a massive socioeconomic burden and inflicts profound impairment on the health-related quality of life. Primary dysmenorrhea is routinely cited as the leading cause of recurrent short-term school and work absenteeism among young women globally. Among female undergraduates, it is a primary driver of missed classes, reduced concentration, and delayed academic progression. Furthermore, the phenomenon of "presenteeism"—where women attend school or work but function at a drastically reduced capacity due to severe pain and associated systemic symptoms like nausea, vomiting, fatigue, and diarrhea—compounds this hidden economic toll.</w:t>
+        <w:t>The global epidemiological burden of primary dysmenorrhea is massive, though precisely quantifying its exact prevalence is notoriously challenging due to significant cultural disparities in pain reporting, inconsistent clinical definitions, and the widespread normalization of menstrual pain, which often deters women from seeking formal medical intervention (Ju et al., 2014). Nevertheless, comprehensive systematic reviews and large-scale cross-sectional meta-analyses consistently report that primary dysmenorrhea affects between 45% to 95% of menstruating women worldwide, with the highest prevalence rates uniformly observed during late adolescence and early adulthood (Ding et al., 2021). The clinical manifestation is not isolated to pelvic pain; it is frequently accompanied by a constellation of severe systemic symptoms, including debilitating nausea, emesis, profound fatigue, recurrent headaches, lower back pain radiating down the thighs, and unremitting diarrhea. The compounded physical and psychological toll of this symptomatology exerts a profound, measurable negative impact on academic performance, occupational productivity, and overall quality of life, accounting for millions of lost school and work hours annually (Ameade et al., 2018).</w:t>
       </w:r>
     </w:p>
     <w:p>
@@ -543,7 +492,7 @@
           <w:color w:val="000000"/>
           <w:sz w:val="24"/>
         </w:rPr>
-        <w:t xml:space="preserve">The fundamental pathophysiology of primary dysmenorrhea is deeply rooted in severe hypercontractility of the myometrium, driven almost exclusively by the extreme overproduction and release of inflammatory prostaglandins within the sloughing endometrium. During the late secretory phase of an infertile menstrual cycle, the programmed involution of the corpus luteum leads to a precipitous drop in systemic progesterone and estrogen levels. This sudden hormonal withdrawal destabilizes the lysosomal membranes of the endometrial cells, triggering the release of the enzyme phospholipase A2. Phospholipase A2 acts directly on the phospholipid bilayer of the cell membranes, cleaving arachidonic acid. This free arachidonic acid is then rapidly metabolized by the cyclooxygenase (COX) enzyme system—specifically the constitutively expressed COX-1 and the inducible COX-2 isoenzymes—into a cascade of highly inflammatory prostaglandins, most notably prostaglandin F2-alpha (PGF2α) and prostaglandin E2 (PGE2). Women who suffer from primary dysmenorrhea consistently exhibit significantly higher concentrations of these specific prostaglandins in their menstrual fluid compared to asymptomatic women. </w:t>
+        <w:t>The fundamental pathophysiology of primary dysmenorrhea is unequivocally rooted in the gross hypercontractility of the uterine myometrium, driven almost entirely by the pathological overproduction of endogenous prostaglandins within the sloughing endometrium (Tang &amp; Wang, 2023). Following the physiological demise of the corpus luteum and the subsequent precipitous drop in circulating progesterone and estrogen at the end of the luteal phase, lysosomal membranes within the endometrial cells destabilize. This destabilization liberates the enzyme phospholipase A2, which cleaves arachidonic acid from the lipid bilayer of the cell membranes. Arachidonic acid is rapidly oxygenated by cyclooxygenase (COX) enzymes, specifically the highly inducible COX-2 isoform, triggering the massive, localized synthesis of cyclic endoperoxides (Wan &amp; Yao, 2021). These intermediates are swiftly converted into potent terminal prostaglandins, predominantly prostaglandin F2-alpha (PGF2α) and prostaglandin E2 (PGE2). Women suffering from primary dysmenorrhea synthesize and release exponentially higher concentrations of these specific prostaglandins into their menstrual fluid compared to asymptomatic, eumenorrheic women (Dawood, 1987).</w:t>
       </w:r>
     </w:p>
     <w:p>
@@ -557,7 +506,7 @@
           <w:color w:val="000000"/>
           <w:sz w:val="24"/>
         </w:rPr>
-        <w:t>High local concentrations of PGF2α exert a profoundly potent, direct uterotonic effect on the underlying myometrial smooth muscle. It induces dysrhythmic, sustained, and extraordinarily powerful myometrial contractions. In healthy, asymptomatic women, baseline intrauterine resting pressure typically remains below 10 mmHg, with active contractions peaking at around 120 mmHg. Conversely, in women experiencing severe primary dysmenorrhea, resting tone can exceed 40 mmHg, and active contractions can generate staggering intrauterine pressures soaring well above 400 mmHg. Furthermore, the frequency of these contractions increases radically, drastically reducing the essential resting interval between spasms. This extreme basal tone and hypercontractility physically compress the spiral arterioles supplying the myometrium. Because the myometrium receives its blood supply exclusively during the relaxation phase between contractions, this sustained compression causes profound focal ischemia and cellular hypoxia. The resulting accumulation of anaerobic metabolites, such as lactic acid and bradykinin, directly stimulates visceral pain receptors. Concurrently, PGE2 directly sensitizes these afferent pain nerve terminals to both mechanical stimulation and to the actions of other algogenic mediators, drastically lowering the pain threshold. Ultimately, it is this synergistic combination of extreme mechanical hypercontractility, profound tissue ischemia, and direct chemical nerve sensitization that culminates in the severe, cramping, and debilitating pelvic pain characteristic of primary dysmenorrhea. Consequently, developing effective therapeutic strategies necessitates targeting this specific prostaglandin-induced cascade to mitigate myometrial hypercontractility and restore normal physiological tone.</w:t>
+        <w:t>These excess prostaglandins, particularly PGF2α, act as incredibly potent, direct uterotonics (Tang &amp; Wang, 2023). They diffuse deeply into the underlying myometrium and bind to specific G-protein coupled receptors, triggering massive intracellular calcium release. This calcium cascade initiates severe, dysrhythmic, and sustained tetanic contractions of the massive myometrial muscle bed. These pathological hypercontractions dramatically elevate baseline intrauterine resting tone, often exceeding 40 mmHg, and generate immense active contractile pressures that can surpass 150 mmHg (Akerlund, 1979). Crucially, these extreme intrauterine pressures physically exceed the mean arterial perfusion pressure of the uterine vasculature. This creates a state of profound, transient mechanical ischemia, as the contracting muscle mass physically crushes the embedded arcuate and radial arteries, severely restricting oxygen delivery to the tissue (Altunyurt et al., 2005). The resulting severe hypoxia forces the myometrium into anaerobic metabolism, leading to the rapid accumulation of lactic acid and other noxious metabolites. These metabolic byproducts directly stimulate the type C pain fibers traversing the pelvic visceral afferent nerves, culminating in the intense, agonizing cramping characteristic of primary dysmenorrhea (Iacovides et al., 2015). Furthermore, researchers have demonstrated that elevated levels of other vasoactive mediators, such as vasopressin and oxytocin, act synergistically with prostaglandins to exacerbate uterine dysrhythmia and vascular ischemia, further compounding the pain profile (Liedman et al., 2008). Therefore, the suppression of this aberrant uterine contractility—either by inhibiting the upstream synthesis of prostaglandins or by directly blocking the downstream calcium channels required for smooth muscle execution—remains the fundamental, indisputable strategy for all pharmacological treatments targeting primary dysmenorrhea (Smith et al., 2024).</w:t>
       </w:r>
     </w:p>
     <w:p>
@@ -585,7 +534,7 @@
           <w:color w:val="000000"/>
           <w:sz w:val="24"/>
         </w:rPr>
-        <w:t>Given that the fundamental pathophysiology of primary dysmenorrhea is unequivocally driven by the overproduction of prostaglandins and the subsequent cascade of uterine hypercontractility and ischemia, the current pharmacological management paradigm is predominantly anchored in targeting this specific biochemical pathway. The overriding clinical objective is to aggressively suppress prostaglandin synthesis, thereby reducing massive intrauterine pressures, restoring normal myometrial resting tone, alleviating tissue ischemia, and ultimately providing robust pain relief. Currently, the medical consensus establishes Non-Steroidal Anti-Inflammatory Drugs (NSAIDs) as the definitive, first-line empirical pharmacotherapy for the management of primary dysmenorrhea.</w:t>
+        <w:t>Given that the definitive physiological origin of primary dysmenorrhea lies in the pathological overproduction of prostaglandins and the subsequent cascade of severe, ischemic uterine hypercontractility, contemporary pharmacological management is overwhelmingly directed toward breaking this specific pathogenic chain. The cornerstone of evidence-based medical intervention relies fundamentally on two primary classes of synthetic pharmaceuticals: Non-Steroidal Anti-Inflammatory Drugs (NSAIDs) and Combined Oral Contraceptives (COCs) (Marjoribanks et al., 2015; Wong et al., 2009). These two established modalities, utilized either as monotherapy or in a synergistic combination, currently constitute the undisputed, universally recommended first-line treatment protocols across all major global gynecological guidelines (Burnett &amp; Lemyre, 2017).</w:t>
       </w:r>
     </w:p>
     <w:p>
@@ -599,7 +548,7 @@
           <w:color w:val="000000"/>
           <w:sz w:val="24"/>
         </w:rPr>
-        <w:t>NSAIDs represent a diverse class of pharmaceutical agents, including propionic acid derivatives like ibuprofen and naproxen, and fenamates such as mefenamic acid. Despite their structural differences, these agents share a common, potent mechanism of action: they act as direct, competitive inhibitors of the cyclooxygenase (COX) enzyme system. By binding to and inhibiting both the COX-1 and COX-2 isoenzymes, NSAIDs effectively halt the enzymatic conversion of free arachidonic acid into the hyperalgesic and highly spasmogenic prostaglandins, specifically PGF2α and PGE2. By initiating NSAID therapy precisely at the onset of menstruation—or ideally, one to two days prior to the anticipated onset of bleeding—clinicians can preemptively block the massive surge in endometrial prostaglandin synthesis. This rapid reduction in localized prostaglandin concentrations effectively prevents the onset of extreme myometrial hypercontractility, normalizes uterine blood flow, and provides substantial, rapid-onset pain relief for the vast majority of patients. Clinical trials consistently demonstrate that NSAIDs are highly effective, providing adequate relief for approximately 70% to 80% of women suffering from the condition.</w:t>
+        <w:t>Non-Steroidal Anti-Inflammatory Drugs (NSAIDs), such as ibuprofen, naproxen, mefenamic acid, and diclofenac, represent the absolute vanguard of targeted, first-line therapy for primary dysmenorrhea (Marjoribanks et al., 2015). Their mechanism of action is incredibly precise and directly antagonistic to the core pathophysiology of the disorder: NSAIDs act as potent, competitive inhibitors of the cyclooxygenase (COX) enzyme system, the critical bottleneck catalyst responsible for the oxidative conversion of arachidonic acid into the massive surge of prostaglandins (PGF2α and PGE2) (Rouzer &amp; Marnett, 2009). By systematically blocking the catalytic activity of both the constitutive COX-1 and the highly inducible COX-2 isoforms, NSAIDs effectively shut down the entire downstream arachidonic acid cascade within the sloughing endometrium. This profound, targeted biochemical blockade drastically curtails the synthesis and accumulation of potent uterotonic prostaglandins, thereby preventing the initiation of severe myometrial hypercontractility, restoring normal uterine blood flow, eliminating tissue ischemia, and ultimately extinguishing the peripheral pain signal at its origin (Dawood, 1984). Extensive meta-analyses have repeatedly confirmed that NSAIDs are significantly superior to placebo in providing robust, rapid, and sustained relief from acute menstrual cramping (Marjoribanks et al., 2015).</w:t>
       </w:r>
     </w:p>
     <w:p>
@@ -613,7 +562,7 @@
           <w:color w:val="000000"/>
           <w:sz w:val="24"/>
         </w:rPr>
-        <w:t>For the cohort of women who do not achieve adequate symptomatic relief with NSAIDs, who suffer from severe gastrointestinal intolerance to these agents, or who concurrently require a reliable method of contraception, Combined Oral Contraceptives (COCs) represent the primary, highly effective alternative pharmacological intervention. COCs are formulations containing synthetic estrogens (typically ethinyl estradiol) combined with various synthetic progestins. Their mechanism of action in the context of dysmenorrhea is fundamentally distinct from NSAIDs but equally effective at reducing prostaglandin loads. COCs function by exerting profound negative feedback on the hypothalamic-pituitary-ovarian axis, effectively abolishing the pulsatile release of GnRH, FSH, and LH. This suppression completely inhibits follicular development and prevents ovulation. Without ovulation, no corpus luteum is formed, and the massive, cyclical surge of endogenous progesterone is eliminated. Consequently, the constant, low-dose exposure to the synthetic progestin within the COC profoundly suppresses endometrial proliferation. The resulting endometrium is exceptionally thin, atrophic, and notably deficient in arachidonic acid stores. When withdrawal bleeding (the simulated period) occurs during the placebo week of the COC regimen, this highly thinned endometrium inherently synthesizes drastically lower quantities of prostaglandins compared to a normal, thick, ovulatory endometrium. This massive reduction in the absolute volume of inflammatory mediators translates directly into a profound alleviation of uterine cramps.</w:t>
+        <w:t xml:space="preserve">Combined Oral Contraceptives (COCs) provide a highly effective, alternative, or adjunctive first-line therapeutic approach, functioning via a fundamentally different mechanism. Composed of synthetic estrogen and progestin, COCs operate by exerting profound, continuous negative feedback on the Hypothalamic-Pituitary-Ovarian (HPO) axis, thereby suppressing the mid-cycle luteinizing hormone (LH) surge and medically abolishing ovulation entirely (Wong et al., 2009). By preventing ovulation, COCs fundamentally disrupt the hormonal prerequisites necessary for the massive proliferation of the endometrial stratum functionalis. The continuous delivery of synthetic progestin creates a thin, highly atrophic, and relatively inactive endometrial lining. Consequently, when the withdrawal bleed (a hormonally induced pseudo-menstruation) occurs during the placebo week, there is an incredibly minimal volume of endometrial tissue available to break down. This massive reduction in tissue volume directly correlates to a vastly diminished capacity for the synthesis and release of arachidonic acid and prostaglandins (Wong et al., 2009). By preemptively downregulating the total substrate available for prostaglandin synthesis, COCs effectively lower the baseline intrauterine pressure and completely prevent the severe, spastic hypercontractility characteristic of dysmenorrhea. </w:t>
       </w:r>
     </w:p>
     <w:p>
@@ -627,11 +576,25 @@
           <w:color w:val="000000"/>
           <w:sz w:val="24"/>
         </w:rPr>
-        <w:t xml:space="preserve">Despite their widespread global use, robust clinical efficacy, and status as the standard of care, both NSAIDs and COCs are heavily burdened by significant limitations, contraindications, and severe adverse effect profiles that heavily restrict their long-term utilization in many patients. NSAIDs act systemically, meaning their inhibition of COX enzymes is not localized solely to the uterus. The ubiquitous inhibition of the constitutively expressed COX-1 enzyme brutally suppresses the synthesis of physiological prostaglandins that are absolutely critical for maintaining the protective mucosal barrier of the stomach and supporting renal hemodynamics. Consequently, chronic or high-dose utilization of NSAIDs is frequently associated with severe gastrointestinal toxicities, ranging from mild dyspepsia and gastritis to life-threatening peptic ulceration, gastrointestinal hemorrhage, and perforation. Furthermore, specific NSAIDs, particularly selective COX-2 inhibitors, carry established cardiovascular risks, including an increased incidence of myocardial infarction and stroke. Similarly, COCs are not universally suitable. Their use carries well-documented, albeit small, inherent risks of venous thromboembolism, pulmonary embolism, and cerebrovascular events, particularly in women who smoke or have underlying thrombophilic disorders. Additionally, many women discontinue COCs due to intolerable side effects such as weight gain, severe mood fluctuations, decreased libido, and persistent nausea. </w:t>
+        <w:t>However, despite their proven efficacy, neither NSAIDs nor COCs provide a universal panacea, and their widespread clinical utility is severely limited by a formidable array of adverse drug reactions, absolute contraindications, and high rates of clinical failure (Oladosu et al., 2018). The indiscriminate inhibition of COX enzymes by non-selective NSAIDs profoundly suppresses the synthesis of cytoprotective prostaglandins within the gastric mucosa, exposing patients to severe gastrointestinal toxicities, ranging from chronic dyspepsia and nausea to life-threatening peptic ulceration and catastrophic gastrointestinal hemorrhage, particularly with long-term, high-dose administration (Navarro &amp; Sánchez, 2022). Furthermore, NSAID use carries well-documented risks of nephrotoxicity, hepatotoxicity, and exacerbation of reactive airway diseases like asthma. COCs also carry a significant burden of side effects, including severe mood lability, undesirable weight gain, debilitating migraines, extreme breast tenderness, and a profoundly elevated, life-threatening risk of developing venous thromboembolism (VTE), deep vein thrombosis (DVT), and pulmonary embolism, especially in individuals with a high BMI or a history of smoking (Smith et al., 2024). Even more concerning is the phenomenon of pharmacological resistance: an estimated 15% to 25% of women suffering from severe primary dysmenorrhea are completely refractory to maximum tolerated doses of both NSAIDs and COCs, deriving absolutely zero clinical relief and remaining trapped in severe, cyclical agony (Oladosu et al., 2018). This significant failure rate, combined with the severe, dose-limiting toxicity profile of existing synthetics, has catalyzed an urgent, global scientific mandate to aggressively discover, rigorously evaluate, and develop novel, highly efficacious, and significantly safer alternative tocolytic and analgesic therapeutics, with massive attention currently shifting toward the vast, untapped pharmacological potential of phytomedicine (Sargin, 2021).</w:t>
       </w:r>
     </w:p>
     <w:p>
       <w:pPr>
+        <w:pStyle w:val="Heading2"/>
+        <w:jc w:val="both"/>
+      </w:pPr>
+      <w:r>
+        <w:rPr>
+          <w:rFonts w:ascii="Times New Roman" w:hAnsi="Times New Roman" w:eastAsia="Times New Roman"/>
+          <w:color w:val="000000"/>
+          <w:sz w:val="24"/>
+        </w:rPr>
+        <w:t>1.8 Herbal Medicines</w:t>
+      </w:r>
+    </w:p>
+    <w:p>
+      <w:pPr>
         <w:spacing w:line="360" w:lineRule="auto" w:after="0"/>
         <w:jc w:val="both"/>
       </w:pPr>
@@ -641,11 +604,155 @@
           <w:color w:val="000000"/>
           <w:sz w:val="24"/>
         </w:rPr>
-        <w:t>Crucially, a highly significant clinical reality is that approximately 10% to 20% of women suffering from primary dysmenorrhea exhibit absolute refractoriness to both optimized NSAID therapy and hormonal suppression. This specific cohort remains completely untreated, enduring debilitating monthly pain that continues to severely disrupt their academic, professional, and personal lives. This glaring limitation of current therapies highlights a massive, critical unmet medical need. It underscores the urgent, compelling necessity for extensive pharmacological research dedicated to identifying, rigorously validating, and rapidly developing novel, highly efficacious, and fundamentally safer therapeutic alternatives. Specifically, there is a profound scientific interest in identifying novel compounds—particularly those derived from natural sources with extensive historical usage and known inherent tocolytic properties—that can directly target and relax myometrial smooth muscle without inducing the severe gastrointestinal, renal, or cardiovascular toxicities inextricably associated with systemic cyclooxygenase inhibition.</w:t>
+        <w:t xml:space="preserve">In direct response to the severe limitations, widespread therapeutic failures, and potentially devastating side effects associated with chronic NSAID and synthetic hormonal therapies, there has been a massive, global resurgence of scientific and clinical interest in exploring the vast pharmacological potential of herbal medicines and traditional phytotherapy for the management of primary dysmenorrhea (Sargin, 2021). For millennia, indigenous cultures and traditional medical systems across the world—ranging from Traditional Chinese Medicine (TCM) and Indian Ayurveda to African ethnomedicine and Western herbalism—have relied heavily on a vast compendium of specific botanical extracts, complex herbal formulations, and essential oils to successfully mitigate menstrual pain, regulate highly erratic cycles, and completely resolve severe pelvic cramping (Aziz et al., 2018). While these ancestral remedies were historically dismissed by allopathic medicine as mere folklore or potent placebo effects, contemporary pharmacological research has fundamentally validated their efficacy, proving that many of these botanicals contain incredibly potent, highly active phytochemical constituents that exert complex, measurable, and highly specific physiological effects (Kaur &amp; Kaushal, 2019). </w:t>
       </w:r>
     </w:p>
     <w:p>
       <w:pPr>
+        <w:spacing w:line="360" w:lineRule="auto" w:after="0"/>
+        <w:jc w:val="both"/>
+      </w:pPr>
+      <w:r>
+        <w:rPr>
+          <w:rFonts w:ascii="Times New Roman" w:hAnsi="Times New Roman" w:eastAsia="Times New Roman"/>
+          <w:color w:val="000000"/>
+          <w:sz w:val="24"/>
+        </w:rPr>
+        <w:t>Modern scientific investigations into these traditional botanical medicines have isolated an immense array of bioactive secondary metabolites—including complex flavonoids, highly volatile essential oils (terpenes and terpenoids), potent alkaloids, and specialized phenolic compounds—that exhibit profound anti-inflammatory, antispasmodic, tocolytic, and analgesic properties completely analogous to, and sometimes exceeding, those of synthetic pharmaceuticals (Guimarães et al., 2013). These complex plant-derived compounds frequently operate via multiple, synergistic pharmacological pathways. Rather than targeting a single, isolated enzyme like NSAIDs, these herbal extracts can simultaneously downregulate the expression of the COX-2 enzyme, actively inhibit the downstream lipoxygenase (LOX) inflammatory pathway, directly antagonize voltage-gated calcium channels within the myometrium, and significantly enhance local peripheral microcirculation to rapidly reverse ischemic tissue hypoxia (Ramezani &amp; Jalali, 2021).</w:t>
+      </w:r>
+    </w:p>
+    <w:p>
+      <w:pPr>
+        <w:spacing w:line="360" w:lineRule="auto" w:after="0"/>
+        <w:jc w:val="both"/>
+      </w:pPr>
+      <w:r>
+        <w:rPr>
+          <w:rFonts w:ascii="Times New Roman" w:hAnsi="Times New Roman" w:eastAsia="Times New Roman"/>
+          <w:color w:val="000000"/>
+          <w:sz w:val="24"/>
+        </w:rPr>
+        <w:t>A multitude of rigorous, double-blind, randomized controlled clinical trials have conclusively proven the exceptional efficacy of specific botanical interventions in resolving severe primary dysmenorrhea. For instance, Fennel (</w:t>
+      </w:r>
+      <w:r>
+        <w:rPr>
+          <w:rFonts w:ascii="Times New Roman" w:hAnsi="Times New Roman" w:eastAsia="Times New Roman"/>
+          <w:i/>
+          <w:color w:val="000000"/>
+          <w:sz w:val="24"/>
+        </w:rPr>
+        <w:t>Foeniculum vulgare</w:t>
+      </w:r>
+      <w:r>
+        <w:rPr>
+          <w:rFonts w:ascii="Times New Roman" w:hAnsi="Times New Roman" w:eastAsia="Times New Roman"/>
+          <w:color w:val="000000"/>
+          <w:sz w:val="24"/>
+        </w:rPr>
+        <w:t>), a botanical rich in the potent antispasmodic anethole, has repeatedly demonstrated an ability to significantly reduce both the severity and the duration of acute menstrual pain by acting as a powerful direct relaxant on the uterine smooth muscle, effectively neutralizing hypercontractility (Lee et al., 2020; Ostad et al., 2001). Ginger (</w:t>
+      </w:r>
+      <w:r>
+        <w:rPr>
+          <w:rFonts w:ascii="Times New Roman" w:hAnsi="Times New Roman" w:eastAsia="Times New Roman"/>
+          <w:i/>
+          <w:color w:val="000000"/>
+          <w:sz w:val="24"/>
+        </w:rPr>
+        <w:t>Zingiber officinale</w:t>
+      </w:r>
+      <w:r>
+        <w:rPr>
+          <w:rFonts w:ascii="Times New Roman" w:hAnsi="Times New Roman" w:eastAsia="Times New Roman"/>
+          <w:color w:val="000000"/>
+          <w:sz w:val="24"/>
+        </w:rPr>
+        <w:t>), densely packed with bioactive gingerols and shogaols, has been proven through massive meta-analyses to be statistically equally as effective as prescription mefenamic acid or ibuprofen in eliminating primary dysmenorrhea, functioning primarily through the profound, systemic inhibition of prostaglandin synthesis (Pattanittum et al., 2016). Similarly, Chamomile (</w:t>
+      </w:r>
+      <w:r>
+        <w:rPr>
+          <w:rFonts w:ascii="Times New Roman" w:hAnsi="Times New Roman" w:eastAsia="Times New Roman"/>
+          <w:i/>
+          <w:color w:val="000000"/>
+          <w:sz w:val="24"/>
+        </w:rPr>
+        <w:t>Matricaria chamomilla</w:t>
+      </w:r>
+      <w:r>
+        <w:rPr>
+          <w:rFonts w:ascii="Times New Roman" w:hAnsi="Times New Roman" w:eastAsia="Times New Roman"/>
+          <w:color w:val="000000"/>
+          <w:sz w:val="24"/>
+        </w:rPr>
+        <w:t>), Cinnamon (</w:t>
+      </w:r>
+      <w:r>
+        <w:rPr>
+          <w:rFonts w:ascii="Times New Roman" w:hAnsi="Times New Roman" w:eastAsia="Times New Roman"/>
+          <w:i/>
+          <w:color w:val="000000"/>
+          <w:sz w:val="24"/>
+        </w:rPr>
+        <w:t>Cinnamomum zeylanicum</w:t>
+      </w:r>
+      <w:r>
+        <w:rPr>
+          <w:rFonts w:ascii="Times New Roman" w:hAnsi="Times New Roman" w:eastAsia="Times New Roman"/>
+          <w:color w:val="000000"/>
+          <w:sz w:val="24"/>
+        </w:rPr>
+        <w:t xml:space="preserve">), and complex traditional formulations like </w:t>
+      </w:r>
+      <w:r>
+        <w:rPr>
+          <w:rFonts w:ascii="Times New Roman" w:hAnsi="Times New Roman" w:eastAsia="Times New Roman"/>
+          <w:i/>
+          <w:color w:val="000000"/>
+          <w:sz w:val="24"/>
+        </w:rPr>
+        <w:t>Dangguijagyag-san</w:t>
+      </w:r>
+      <w:r>
+        <w:rPr>
+          <w:rFonts w:ascii="Times New Roman" w:hAnsi="Times New Roman" w:eastAsia="Times New Roman"/>
+          <w:color w:val="000000"/>
+          <w:sz w:val="24"/>
+        </w:rPr>
+        <w:t xml:space="preserve"> have demonstrated profound, scientifically validated antispasmodic and analgesic actions, offering women massive relief without the severe gastrointestinal toxicity or thromboembolic risks intrinsically associated with continuous NSAID or oral contraceptive use (Lee et al., 2016; Rahnama &amp; Montazeri, 2021).</w:t>
+      </w:r>
+    </w:p>
+    <w:p>
+      <w:pPr>
+        <w:spacing w:line="360" w:lineRule="auto" w:after="0"/>
+        <w:jc w:val="both"/>
+      </w:pPr>
+      <w:r>
+        <w:rPr>
+          <w:rFonts w:ascii="Times New Roman" w:hAnsi="Times New Roman" w:eastAsia="Times New Roman"/>
+          <w:color w:val="000000"/>
+          <w:sz w:val="24"/>
+        </w:rPr>
+        <w:t xml:space="preserve">The profound scientific validation of these specific botanicals has established a critical, irrefutable precedent: the natural world harbors a massive, largely untapped reservoir of immensely potent, multi-targeted, and highly bioavailable tocolytic and analgesic agents. The successful integration of these herbal medicines into evidence-based clinical practice underscores an urgent, ongoing scientific imperative to systematically screen, rigorously evaluate, and fully characterize other prominent botanicals with strong traditional histories of use in treating inflammatory and spasmodic disorders (Sargin, 2021). Among the myriad of potential candidates, </w:t>
+      </w:r>
+      <w:r>
+        <w:rPr>
+          <w:rFonts w:ascii="Times New Roman" w:hAnsi="Times New Roman" w:eastAsia="Times New Roman"/>
+          <w:i/>
+          <w:color w:val="000000"/>
+          <w:sz w:val="24"/>
+        </w:rPr>
+        <w:t>Syzygium aromaticum</w:t>
+      </w:r>
+      <w:r>
+        <w:rPr>
+          <w:rFonts w:ascii="Times New Roman" w:hAnsi="Times New Roman" w:eastAsia="Times New Roman"/>
+          <w:color w:val="000000"/>
+          <w:sz w:val="24"/>
+        </w:rPr>
+        <w:t>, universally known as clove, has emerged as an exceptionally promising, highly potent botanical subject. Despite an incredibly rich, well-documented history of intense application in traditional medicine for severe pain relief and acute spasm suppression, its specific, isolated efficacy in neutralizing the complex pathophysiology of primary dysmenorrhea remains a critical, unresolved frontier demanding rigorous scientific investigation.</w:t>
+      </w:r>
+    </w:p>
+    <w:p>
+      <w:pPr>
         <w:pStyle w:val="Heading2"/>
         <w:jc w:val="both"/>
       </w:pPr>
@@ -655,7 +762,7 @@
           <w:color w:val="000000"/>
           <w:sz w:val="24"/>
         </w:rPr>
-        <w:t>1.8 Herbal Medicines</w:t>
+        <w:t>1.9 Taxonomic Classification and Overview of Syzygium aromaticum</w:t>
       </w:r>
     </w:p>
     <w:p>
@@ -666,10 +773,70 @@
       <w:r>
         <w:rPr>
           <w:rFonts w:ascii="Times New Roman" w:hAnsi="Times New Roman" w:eastAsia="Times New Roman"/>
-          <w:color w:val="000000"/>
-          <w:sz w:val="24"/>
-        </w:rPr>
-        <w:t>Driven by the significant limitations, strict contraindications, unacceptably high clinical failure rates, and severe adverse effect profiles inextricably associated with conventional pharmacological mainstays like NSAIDs and combined oral contraceptives, there has been a massive, unprecedented resurgence of global scientific and clinical interest in the therapeutic potential of herbal medicines. For thousands of years, diverse indigenous medical systems spanning the globe—from ancient Ayurvedic practices in the Indian subcontinent to Traditional Chinese Medicine (TCM) and the deep-rooted herbal traditions of indigenous African healers—have heavily utilized a vast array of plant species to manage complex gynecological disorders, most notably severe menstrual cramps. This historical reliance was not merely superstitious; it was fundamentally based on generations of rigorous, empirical observation of efficacy and safety. Today, the World Health Organization (WHO) actively recognizes and strongly supports the integration of scientifically validated, evidence-based traditional medicines into national healthcare frameworks, emphasizing the absolute necessity for rigorous pharmacological evaluation of these botanical assets to ensure global safety and efficacy standards.</w:t>
+          <w:i/>
+          <w:color w:val="000000"/>
+          <w:sz w:val="24"/>
+        </w:rPr>
+        <w:t>Syzygium aromaticum</w:t>
+      </w:r>
+      <w:r>
+        <w:rPr>
+          <w:rFonts w:ascii="Times New Roman" w:hAnsi="Times New Roman" w:eastAsia="Times New Roman"/>
+          <w:color w:val="000000"/>
+          <w:sz w:val="24"/>
+        </w:rPr>
+        <w:t xml:space="preserve"> (L.) Merr. &amp; L.M. Perry, universally recognized by its common name "clove," is a profoundly important, highly valuable, and meticulously cultivated medicinal and culinary plant. Botanically, it is classified as a medium-sized, evergreen, tropical tree belonging to the extensive myrtle family, Myrtaceae (Batiha et al., 2020). The genus </w:t>
+      </w:r>
+      <w:r>
+        <w:rPr>
+          <w:rFonts w:ascii="Times New Roman" w:hAnsi="Times New Roman" w:eastAsia="Times New Roman"/>
+          <w:i/>
+          <w:color w:val="000000"/>
+          <w:sz w:val="24"/>
+        </w:rPr>
+        <w:t>Syzygium</w:t>
+      </w:r>
+      <w:r>
+        <w:rPr>
+          <w:rFonts w:ascii="Times New Roman" w:hAnsi="Times New Roman" w:eastAsia="Times New Roman"/>
+          <w:color w:val="000000"/>
+          <w:sz w:val="24"/>
+        </w:rPr>
+        <w:t xml:space="preserve"> is massive, comprising over 1,200 distinct species distributed widely across the tropical and subtropical regions of the Old World, yet </w:t>
+      </w:r>
+      <w:r>
+        <w:rPr>
+          <w:rFonts w:ascii="Times New Roman" w:hAnsi="Times New Roman" w:eastAsia="Times New Roman"/>
+          <w:i/>
+          <w:color w:val="000000"/>
+          <w:sz w:val="24"/>
+        </w:rPr>
+        <w:t>Syzygium aromaticum</w:t>
+      </w:r>
+      <w:r>
+        <w:rPr>
+          <w:rFonts w:ascii="Times New Roman" w:hAnsi="Times New Roman" w:eastAsia="Times New Roman"/>
+          <w:color w:val="000000"/>
+          <w:sz w:val="24"/>
+        </w:rPr>
+        <w:t xml:space="preserve"> remains the absolute most economically and pharmacologically significant member of the entire lineage (Devkota &amp; Devkota, 2022). Taxonomically, the plant is organized within the kingdom Plantae, the clade Angiosperms (flowering plants), the clade Eudicots, the clade Rosids, the massive order Myrtales, the family Myrtaceae, and the genus </w:t>
+      </w:r>
+      <w:r>
+        <w:rPr>
+          <w:rFonts w:ascii="Times New Roman" w:hAnsi="Times New Roman" w:eastAsia="Times New Roman"/>
+          <w:i/>
+          <w:color w:val="000000"/>
+          <w:sz w:val="24"/>
+        </w:rPr>
+        <w:t>Syzygium</w:t>
+      </w:r>
+      <w:r>
+        <w:rPr>
+          <w:rFonts w:ascii="Times New Roman" w:hAnsi="Times New Roman" w:eastAsia="Times New Roman"/>
+          <w:color w:val="000000"/>
+          <w:sz w:val="24"/>
+        </w:rPr>
+        <w:t>. The species is indigenous to the remote Maluku Islands (historically renowned as the "Spice Islands") of eastern Indonesia. However, owing to its immense global demand and exorbitant historical value in both the spice trade and traditional medicine, its intense commercial cultivation has expanded massively over centuries to encompass various tropical zones globally, including Madagascar, Tanzania (specifically the Zanzibar archipelago), Sri Lanka, India, and vast swathes of South America (Karabacak &amp; Sener, 2021).</w:t>
       </w:r>
     </w:p>
     <w:p>
@@ -683,7 +850,24 @@
           <w:color w:val="000000"/>
           <w:sz w:val="24"/>
         </w:rPr>
-        <w:t xml:space="preserve">Contemporary phytochemical and pharmacological investigations into these traditional remedies have increasingly validated their historical usage, revealing them not as simple, inert placebos, but as highly complex, synergistic matrices of potent bioactive compounds. Unlike modern allopathic medicine, which relies heavily on the "single-molecule, single-target" paradigm, herbal medicines inherently embrace a polypharmacological approach. A crude plant extract is a highly complex biochemical soup containing hundreds of distinct secondary metabolites—ranging from robust flavonoids and potent alkaloids to volatile terpenoids, complex saponins, and reactive phenolic acids. These diverse compounds possess inherently potent analgesic, anti-inflammatory, antioxidant, and antispasmodic (tocolytic) properties. Because of this extreme chemical diversity, crude herbal extracts rarely operate through a single mechanism of action; instead, they exert their profound pharmacological effects through highly synergistic, multi-target mechanisms that collectively modulate a specific physiological state. </w:t>
+        <w:t xml:space="preserve">The clove tree typically reaches an impressive height of 8 to 12 meters, distinguished by a dense, highly aromatic canopy composed of large, opposite, ovate-lanceolate leaves that are highly coriaceous (leathery) and deeply studded with massive quantities of visible, translucent secretory glands heavily laden with potent essential oils. However, it is the deeply pigmented, unopened floral buds—the actual "cloves" of commerce—that possess the highest, most concentrated pharmacological value (Batiha et al., 2020). These massive floral buds are meticulously hand-harvested precisely when the fleshy lower receptacle (hypanthium) transitions from a pale green to an intense, vibrant crimson red, just prior to the unfurling of the delicate white petals. Following harvest, these buds are subjected to rigorous, controlled sun-drying until they rapidly desiccate, turning a deep, characteristic dark brown, simultaneously shrinking and hardening into their familiar nail-like morphology (the word "clove" is derived directly from the Latin </w:t>
+      </w:r>
+      <w:r>
+        <w:rPr>
+          <w:rFonts w:ascii="Times New Roman" w:hAnsi="Times New Roman" w:eastAsia="Times New Roman"/>
+          <w:i/>
+          <w:color w:val="000000"/>
+          <w:sz w:val="24"/>
+        </w:rPr>
+        <w:t>clavus</w:t>
+      </w:r>
+      <w:r>
+        <w:rPr>
+          <w:rFonts w:ascii="Times New Roman" w:hAnsi="Times New Roman" w:eastAsia="Times New Roman"/>
+          <w:color w:val="000000"/>
+          <w:sz w:val="24"/>
+        </w:rPr>
+        <w:t xml:space="preserve">, meaning nail). </w:t>
       </w:r>
     </w:p>
     <w:p>
@@ -697,11 +881,42 @@
           <w:color w:val="000000"/>
           <w:sz w:val="24"/>
         </w:rPr>
-        <w:t xml:space="preserve">In the highly specific context of primary dysmenorrhea and myometrial hypercontractility, this multi-targeted approach proves exceptionally advantageous. For instance, a single highly optimized plant extract may contain specific flavonoid compounds that act as potent, yet non-ulcerogenic, dual inhibitors of both the cyclooxygenase (COX) and lipoxygenase (LOX) enzymatic pathways, thereby drastically reducing the massive synthesis of inflammatory prostaglandins and leukotrienes without destroying the stomach lining. Simultaneously, the exact same extract may contain volatile terpenoids that act as direct antagonists of voltage-gated calcium channels (VDCCs) on the myometrial smooth muscle cell membrane. By blocking massive calcium influx, these compounds directly prevent excitation-contraction coupling, physically forcing the hyperactive myometrium to relax regardless of the prevailing prostaglandin concentration. Furthermore, accompanying phenolic compounds often serve as powerful radical scavengers, boosting local antioxidant defenses to rapidly clear the massive accumulation of reactive oxygen species generated during the severe uterine ischemia characteristic of dysmenorrhea cramps. </w:t>
+        <w:t xml:space="preserve">Historically, these intensely aromatic, dried flower buds have commanded extraordinary value not merely as a potent culinary flavoring agent, but as a foundational, indispensable pillar of traditional medical systems worldwide (Karabacak &amp; Sener, 2021). In Traditional Chinese Medicine (TCM), Ayurveda, and Unani Tibb, clove has been revered for millennia as a supremely potent, multi-functional therapeutic agent (Devkota &amp; Devkota, 2022). It has been exhaustively utilized to rapidly resolve acute dental neuralgia, to forcefully expel intestinal parasites, to powerfully mitigate severe gastrointestinal spasms and dyspepsia, and to effectively treat severe, acute respiratory infections due to its profound bronchodilatory and intense antimicrobial actions. The immense, documented historical efficacy of </w:t>
+      </w:r>
+      <w:r>
+        <w:rPr>
+          <w:rFonts w:ascii="Times New Roman" w:hAnsi="Times New Roman" w:eastAsia="Times New Roman"/>
+          <w:i/>
+          <w:color w:val="000000"/>
+          <w:sz w:val="24"/>
+        </w:rPr>
+        <w:t>Syzygium aromaticum</w:t>
+      </w:r>
+      <w:r>
+        <w:rPr>
+          <w:rFonts w:ascii="Times New Roman" w:hAnsi="Times New Roman" w:eastAsia="Times New Roman"/>
+          <w:color w:val="000000"/>
+          <w:sz w:val="24"/>
+        </w:rPr>
+        <w:t xml:space="preserve"> across such diverse and severe medical applications unequivocally signals the presence of exceptionally potent, highly concentrated bioactive phytochemicals within its cellular matrix. This robust historical precedent establishes clove as a prime, incredibly promising botanical candidate for rigorous, contemporary pharmacological analysis, particularly in the targeted search for novel, highly efficacious anti-inflammatory, antispasmodic, and profound analgesic therapeutics capable of neutralizing the complex pathophysiology of dysmenorrhea.</w:t>
       </w:r>
     </w:p>
     <w:p>
       <w:pPr>
+        <w:pStyle w:val="Heading2"/>
+        <w:jc w:val="both"/>
+      </w:pPr>
+      <w:r>
+        <w:rPr>
+          <w:rFonts w:ascii="Times New Roman" w:hAnsi="Times New Roman" w:eastAsia="Times New Roman"/>
+          <w:color w:val="000000"/>
+          <w:sz w:val="24"/>
+        </w:rPr>
+        <w:t>1.10 Acute Oral Toxicity</w:t>
+      </w:r>
+    </w:p>
+    <w:p>
+      <w:pPr>
         <w:spacing w:line="360" w:lineRule="auto" w:after="0"/>
         <w:jc w:val="both"/>
       </w:pPr>
@@ -711,28 +926,70 @@
           <w:color w:val="000000"/>
           <w:sz w:val="24"/>
         </w:rPr>
-        <w:t xml:space="preserve">This intricate, multi-faceted physiological modulation frequently results in an overall clinical efficacy that is highly comparable to standard high-dose NSAID therapy, but with a significantly more favorable, highly tolerable side-effect profile, particularly regarding long-term gastrointestinal and renal health. Because the active constituents are often present in lower individual concentrations within the extract and act synergistically across multiple pathways rather than completely blocking a single critical pathway like COX-1, the risk of severe systemic toxicity is drastically reduced. Consequently, contemporary pharmacological research is currently deeply focused on the systematic mass screening, rigorous bioassay-guided fractionation, precise chemical standardization, and comprehensive mechanistic evaluation of historically prominent traditional medicinal plants. The ultimate scientific objective is to meticulously transition these plants from the realm of traditional folklore into fully validated, globally accessible, and scientifically robust pharmacological therapies. Plants such as </w:t>
-      </w:r>
-      <w:r>
-        <w:rPr>
-          <w:rFonts w:ascii="Times New Roman" w:hAnsi="Times New Roman" w:eastAsia="Times New Roman"/>
-          <w:i/>
-          <w:color w:val="000000"/>
-          <w:sz w:val="24"/>
-        </w:rPr>
-        <w:t>Syzygium aromaticum</w:t>
-      </w:r>
-      <w:r>
-        <w:rPr>
-          <w:rFonts w:ascii="Times New Roman" w:hAnsi="Times New Roman" w:eastAsia="Times New Roman"/>
-          <w:color w:val="000000"/>
-          <w:sz w:val="24"/>
-        </w:rPr>
-        <w:t>, which boast an extraordinarily rich history of ethnopharmacological use as powerful analgesics and antispasmodics alongside a highly characterized phytochemical profile, represent prime, highly lucrative candidates for this rigorous scientific development process, offering a highly plausible pathway to discovering the next generation of safe and effective antidysmenorrheal therapeutics.</w:t>
+        <w:t>While the global resurgence of interest in herbal medicine is driven by the profound pharmacological potential and the widespread public perception that "natural" inherently equates to "safe," rigorous scientific and toxicological evaluation is an absolute, non-negotiable prerequisite before any botanical extract can be considered a viable therapeutic candidate (Pal &amp; Dutta, 2022). The profound reality of pharmacognosy is that many potent medicinal plants harbor complex, biologically active secondary metabolites that, while highly therapeutic at optimized dosages, can become immensely toxic, mutagenic, or overtly lethal when administered incorrectly, at elevated concentrations, or as unregulated crude extracts. Therefore, definitively establishing the precise safety profile and the specific toxicological margins of a botanical extract is just as critical—if not more so—than proving its intended pharmacological efficacy. The fundamental baseline for this entire safety evaluation is the acute oral toxicity study (Graves, 2019).</w:t>
       </w:r>
     </w:p>
     <w:p>
       <w:pPr>
+        <w:spacing w:line="360" w:lineRule="auto" w:after="0"/>
+        <w:jc w:val="both"/>
+      </w:pPr>
+      <w:r>
+        <w:rPr>
+          <w:rFonts w:ascii="Times New Roman" w:hAnsi="Times New Roman" w:eastAsia="Times New Roman"/>
+          <w:color w:val="000000"/>
+          <w:sz w:val="24"/>
+        </w:rPr>
+        <w:t>Acute oral toxicity testing is a highly standardized, rigorously controlled, early-stage in vivo pharmacological procedure designed specifically to determine the massive, immediate, and potentially lethal adverse effects that manifest within a short timeframe (typically 14 days) following the single, high-dose administration of a specific test substance (OECD, 2002). This critical evaluation provides the foundational, indispensable toxicological data required to classify the acute hazard potential of the extract, clearly delineate its precise safety margins, definitively establish the No-Observed-Adverse-Effect Level (NOAEL), and strictly guide the selection of safe, sub-lethal dosages for all subsequent, longer-term efficacy studies. Historically, this required massive animal sacrifice to determine the precise LD50 (the exact dose lethal to 50% of the test population). However, modern ethical mandates and stringent animal welfare regulations have completely revolutionized this approach (Sánchez &amp; García, 2022).</w:t>
+      </w:r>
+    </w:p>
+    <w:p>
+      <w:pPr>
+        <w:spacing w:line="360" w:lineRule="auto" w:after="0"/>
+        <w:jc w:val="both"/>
+      </w:pPr>
+      <w:r>
+        <w:rPr>
+          <w:rFonts w:ascii="Times New Roman" w:hAnsi="Times New Roman" w:eastAsia="Times New Roman"/>
+          <w:color w:val="000000"/>
+          <w:sz w:val="24"/>
+        </w:rPr>
+        <w:t xml:space="preserve">Contemporary toxicological evaluations are strictly governed by highly optimized, globally recognized regulatory protocols, most notably the Organization for Economic Co-operation and Development (OECD) Guidelines for the Testing of Chemicals. Specifically, the OECD Test Guideline 423 (Acute Toxic Class Method) and Guideline 425 (Up-and-Down Procedure) represent the absolute gold standards in modern toxicological screening (Monica &amp; Kumar, 2021). These revolutionary protocols are meticulously designed to maximize the extraction of critical toxicological data while drastically minimizing the total number of live animals utilized. They achieve this through a highly precise, step-wise, sequential dosing strategy utilizing extremely small, tightly controlled cohorts of animals (typically three female mice per step) (OECD, 2002). The starting dose is explicitly selected from a set of fixed, standardized levels (e.g., 5, 50, 300, or 2000 mg/kg) based entirely on any pre-existing toxicological data. Following administration, the animals are subjected to intense, continuous clinical observation, rigorously monitoring for profound changes in the skin and fur, radical shifts in respiratory or cardiovascular function, severe neurological manifestations (such as tremors, severe convulsions, or profound lethargy), extreme behavioral alterations, and ultimately, mortality (Singh &amp; Singh, 2021). </w:t>
+      </w:r>
+    </w:p>
+    <w:p>
+      <w:pPr>
+        <w:spacing w:line="360" w:lineRule="auto" w:after="0"/>
+        <w:jc w:val="both"/>
+      </w:pPr>
+      <w:r>
+        <w:rPr>
+          <w:rFonts w:ascii="Times New Roman" w:hAnsi="Times New Roman" w:eastAsia="Times New Roman"/>
+          <w:color w:val="000000"/>
+          <w:sz w:val="24"/>
+        </w:rPr>
+        <w:t xml:space="preserve">If survival is confirmed at a specific dose, the protocol systematically dictates progression to the next highest dose level, meticulously continuing this sequence until profound toxicity is observed or the predefined, maximum limit dose (usually 2000 mg/kg or occasionally 5000 mg/kg) is successfully reached without any fatal outcomes (Pal &amp; Dutta, 2022). The survival of the animal cohort at these massive limit doses definitively categorizes the substance as "unclassified" or essentially non-toxic under acute oral exposure, effectively green-lighting the extract for widespread pharmacological application (Madhavi &amp; Rao, 2022). Therefore, conducting a rigorous, OECD-compliant acute oral toxicity study on the ethanolic extract of </w:t>
+      </w:r>
+      <w:r>
+        <w:rPr>
+          <w:rFonts w:ascii="Times New Roman" w:hAnsi="Times New Roman" w:eastAsia="Times New Roman"/>
+          <w:i/>
+          <w:color w:val="000000"/>
+          <w:sz w:val="24"/>
+        </w:rPr>
+        <w:t>Syzygium aromaticum</w:t>
+      </w:r>
+      <w:r>
+        <w:rPr>
+          <w:rFonts w:ascii="Times New Roman" w:hAnsi="Times New Roman" w:eastAsia="Times New Roman"/>
+          <w:color w:val="000000"/>
+          <w:sz w:val="24"/>
+        </w:rPr>
+        <w:t xml:space="preserve"> is an absolute, non-negotiable scientific mandate to unequivocally validate its safety profile prior to evaluating its complex, multi-pathway efficacy in reversing the severe pathophysiology of primary dysmenorrhea.</w:t>
+      </w:r>
+    </w:p>
+    <w:p>
+      <w:pPr>
         <w:pStyle w:val="Heading2"/>
         <w:jc w:val="both"/>
       </w:pPr>
@@ -742,7 +999,7 @@
           <w:color w:val="000000"/>
           <w:sz w:val="24"/>
         </w:rPr>
-        <w:t>1.9 Taxonomic Classification and Overview of Syzygium aromaticum</w:t>
+        <w:t>1.11 Rationale of the Study</w:t>
       </w:r>
     </w:p>
     <w:p>
@@ -753,53 +1010,10 @@
       <w:r>
         <w:rPr>
           <w:rFonts w:ascii="Times New Roman" w:hAnsi="Times New Roman" w:eastAsia="Times New Roman"/>
-          <w:i/>
-          <w:color w:val="000000"/>
-          <w:sz w:val="24"/>
-        </w:rPr>
-        <w:t>Syzygium aromaticum</w:t>
-      </w:r>
-      <w:r>
-        <w:rPr>
-          <w:rFonts w:ascii="Times New Roman" w:hAnsi="Times New Roman" w:eastAsia="Times New Roman"/>
-          <w:color w:val="000000"/>
-          <w:sz w:val="24"/>
-        </w:rPr>
-        <w:t xml:space="preserve"> (L.) Merr. &amp; Perry, universally recognized by its common commercial name, clove, is an extraordinarily valuable, highly aromatic medicinal and culinary plant that belongs to the massive myrtle family, Myrtaceae. From a rigorous botanical and taxonomic perspective, it is formally classified under the kingdom Plantae, the phylum Tracheophyta (vascular plants), the class Magnoliopsida (dicotyledons), the order Myrtales, the family Myrtaceae, the diverse genus </w:t>
-      </w:r>
-      <w:r>
-        <w:rPr>
-          <w:rFonts w:ascii="Times New Roman" w:hAnsi="Times New Roman" w:eastAsia="Times New Roman"/>
-          <w:i/>
-          <w:color w:val="000000"/>
-          <w:sz w:val="24"/>
-        </w:rPr>
-        <w:t>Syzygium</w:t>
-      </w:r>
-      <w:r>
-        <w:rPr>
-          <w:rFonts w:ascii="Times New Roman" w:hAnsi="Times New Roman" w:eastAsia="Times New Roman"/>
-          <w:color w:val="000000"/>
-          <w:sz w:val="24"/>
-        </w:rPr>
-        <w:t xml:space="preserve">, and the specific species </w:t>
-      </w:r>
-      <w:r>
-        <w:rPr>
-          <w:rFonts w:ascii="Times New Roman" w:hAnsi="Times New Roman" w:eastAsia="Times New Roman"/>
-          <w:i/>
-          <w:color w:val="000000"/>
-          <w:sz w:val="24"/>
-        </w:rPr>
-        <w:t>S. aromaticum</w:t>
-      </w:r>
-      <w:r>
-        <w:rPr>
-          <w:rFonts w:ascii="Times New Roman" w:hAnsi="Times New Roman" w:eastAsia="Times New Roman"/>
-          <w:color w:val="000000"/>
-          <w:sz w:val="24"/>
-        </w:rPr>
-        <w:t>. Endemic primarily to the lush, tropical Maluku Islands (historically renowned as the Spice Islands) in Indonesia, the clove plant is a robust, resilient evergreen tree that frequently achieves towering heights ranging from 10 to 20 meters. The tree is highly visually distinctive, characterized by a dense canopy of large, smooth, oppositely arranged, and intensely fragrant ovate leaves. However, it is the floral structures that hold immense global economic and profound pharmacological significance. The tree produces striking crimson flowers that group tightly in terminal clusters. The primary harvested product—and the core subject of intense pharmacological investigation—is the dried, completely unopened flower bud. These buds must be meticulously hand-harvested at the exact moment they transition from a pale green hue to a deep, rich crimson, just before the petals have the opportunity to unfurl, ensuring the absolute maximum retention of their volatile essential oils.</w:t>
+          <w:color w:val="000000"/>
+          <w:sz w:val="24"/>
+        </w:rPr>
+        <w:t>Primary dysmenorrhea represents a massive, debilitating global health crisis, afflicting up to 95% of reproductive-aged women and causing an immense, catastrophic burden of physical agony, systemic distress, and profound socioeconomic loss due to widespread school and occupational absenteeism (Ding et al., 2021). The foundational pathophysiology of this disorder is undeniably driven by the pathological overproduction of prostaglandins, triggering severe, ischemic, hypercontractile uterine spasms (Dawood, 2006). Current pharmacological reliance on Non-Steroidal Anti-Inflammatory Drugs (NSAIDs) and Combined Oral Contraceptives (COCs) is fundamentally flawed and grossly inadequate. These standard synthetic interventions are severely hampered by dangerous, life-threatening adverse effects—including catastrophic gastrointestinal ulceration, severe hepatotoxicity, and massive thromboembolic risks—and they exhibit an alarming, high clinical failure rate, leaving nearly a quarter of all patients completely refractory to treatment and trapped in a cycle of unremitting pain (Oladosu et al., 2018).</w:t>
       </w:r>
     </w:p>
     <w:p>
@@ -813,7 +1027,41 @@
           <w:color w:val="000000"/>
           <w:sz w:val="24"/>
         </w:rPr>
-        <w:t xml:space="preserve">Historically and ethnopharmacologically, clove holds a position of almost unparalleled prestige. It has been extensively and continuously utilized for millennia across highly diverse indigenous medical systems, including ancient Indian Ayurvedic medicine, Traditional Chinese Medicine (TCM), and various traditional African healing practices. In these historical contexts, clove was rarely viewed simply as a culinary spice; it was fundamentally regarded as a highly potent, broad-spectrum medicinal agent utilized to treat a vast, heterogeneous array of severe clinical ailments. Its historical applications ranged from acting as a powerful local anesthetic for severe dental caries and an incredibly effective carminative for debilitating gastrointestinal disorders, to serving as a potent expectorant for severe respiratory tract infections and a topically applied anti-inflammatory paste for severe arthritic conditions. This profound, multi-systemic therapeutic efficacy is not merely historical folklore; it is directly and inextricably attributed to the plant's exceptionally rich, highly complex, and intensely concentrated phytochemical profile. </w:t>
+        <w:t xml:space="preserve">This profound clinical failure has catalyzed an urgent, absolute scientific mandate to aggressively discover novel, highly efficacious, and significantly safer alternative tocolytic therapies. The massive resurgence of interest in traditional botanical medicines is completely justified; however, these natural remedies require rigorous, uncompromising scientific validation. </w:t>
+      </w:r>
+      <w:r>
+        <w:rPr>
+          <w:rFonts w:ascii="Times New Roman" w:hAnsi="Times New Roman" w:eastAsia="Times New Roman"/>
+          <w:i/>
+          <w:color w:val="000000"/>
+          <w:sz w:val="24"/>
+        </w:rPr>
+        <w:t>Syzygium aromaticum</w:t>
+      </w:r>
+      <w:r>
+        <w:rPr>
+          <w:rFonts w:ascii="Times New Roman" w:hAnsi="Times New Roman" w:eastAsia="Times New Roman"/>
+          <w:color w:val="000000"/>
+          <w:sz w:val="24"/>
+        </w:rPr>
+        <w:t xml:space="preserve"> (clove) has emerged as an exceptionally potent candidate, boasting a massive historical precedent in traditional medicine for resolving severe pain and acute spasms (Batiha et al., 2020). Modern phytochemical screening confirms that clove is a highly concentrated reservoir of exceptionally potent bioactive compounds, specifically eugenol, which is known to possess powerful anti-inflammatory, anesthetic, and antispasmodic properties (Kamatou et al., 2012). Despite these immense capabilities, there is a massive, critical void in contemporary pharmacological literature regarding the specific, direct evaluation of the ethanolic extract of </w:t>
+      </w:r>
+      <w:r>
+        <w:rPr>
+          <w:rFonts w:ascii="Times New Roman" w:hAnsi="Times New Roman" w:eastAsia="Times New Roman"/>
+          <w:i/>
+          <w:color w:val="000000"/>
+          <w:sz w:val="24"/>
+        </w:rPr>
+        <w:t>S. aromaticum</w:t>
+      </w:r>
+      <w:r>
+        <w:rPr>
+          <w:rFonts w:ascii="Times New Roman" w:hAnsi="Times New Roman" w:eastAsia="Times New Roman"/>
+          <w:color w:val="000000"/>
+          <w:sz w:val="24"/>
+        </w:rPr>
+        <w:t xml:space="preserve"> flower buds in directly neutralizing the exact, complex pathophysiology of primary dysmenorrhea. </w:t>
       </w:r>
     </w:p>
     <w:p>
@@ -827,11 +1075,42 @@
           <w:color w:val="000000"/>
           <w:sz w:val="24"/>
         </w:rPr>
-        <w:t xml:space="preserve">Modern, rigorous phytochemical profiling using advanced chromatographic techniques, such as Gas Chromatography-Mass Spectrometry (GC-MS), has definitively revealed that the essential oil extracted directly from the dried clove buds is a highly concentrated cocktail of bioactive secondary metabolites. The overwhelming majority of the oil is composed of eugenol, an incredibly potent bioactive phenylpropene that astonishingly constitutes anywhere from 70% to upwards of 90% of the total essential oil volume, depending on the geographical origin and specific extraction methodology employed. Alongside this massive concentration of eugenol, the extract contains other highly significant and pharmacologically active volatile compounds, most notably eugenyl acetate and the sesquiterpene β-caryophyllene. </w:t>
+        <w:t xml:space="preserve">Therefore, this study is absolutely critical. It aims to bridge this massive scientific gap by systematically and rigorously evaluating both the acute oral safety profile (via stringent OECD guidelines) and the specific, multi-pathway tocolytic efficacy of the ethanolic extract of </w:t>
+      </w:r>
+      <w:r>
+        <w:rPr>
+          <w:rFonts w:ascii="Times New Roman" w:hAnsi="Times New Roman" w:eastAsia="Times New Roman"/>
+          <w:i/>
+          <w:color w:val="000000"/>
+          <w:sz w:val="24"/>
+        </w:rPr>
+        <w:t>S. aromaticum</w:t>
+      </w:r>
+      <w:r>
+        <w:rPr>
+          <w:rFonts w:ascii="Times New Roman" w:hAnsi="Times New Roman" w:eastAsia="Times New Roman"/>
+          <w:color w:val="000000"/>
+          <w:sz w:val="24"/>
+        </w:rPr>
+        <w:t xml:space="preserve"> flower buds using the gold-standard, isolated murine uterine model. This research is not merely exploratory; it is an essential, highly targeted scientific effort to definitively validate a potent, natural, and vastly safer alternative for millions of women suffering from the severe, unaddressed agony of primary dysmenorrhea.</w:t>
       </w:r>
     </w:p>
     <w:p>
       <w:pPr>
+        <w:pStyle w:val="Heading2"/>
+        <w:jc w:val="both"/>
+      </w:pPr>
+      <w:r>
+        <w:rPr>
+          <w:rFonts w:ascii="Times New Roman" w:hAnsi="Times New Roman" w:eastAsia="Times New Roman"/>
+          <w:color w:val="000000"/>
+          <w:sz w:val="24"/>
+        </w:rPr>
+        <w:t>1.12 Research Questions</w:t>
+      </w:r>
+    </w:p>
+    <w:p>
+      <w:pPr>
         <w:spacing w:line="360" w:lineRule="auto" w:after="0"/>
         <w:jc w:val="both"/>
       </w:pPr>
@@ -841,7 +1120,7 @@
           <w:color w:val="000000"/>
           <w:sz w:val="24"/>
         </w:rPr>
-        <w:t xml:space="preserve">Eugenol (4-allyl-2-methoxyphenol) is the absolute primary pharmacological engine driving the therapeutic effects of </w:t>
+        <w:t xml:space="preserve">To rigorously address the massive scientific gap surrounding the therapeutic potential and toxicological safety of </w:t>
       </w:r>
       <w:r>
         <w:rPr>
@@ -850,36 +1129,112 @@
           <w:color w:val="000000"/>
           <w:sz w:val="24"/>
         </w:rPr>
-        <w:t>S. aromaticum</w:t>
-      </w:r>
-      <w:r>
-        <w:rPr>
-          <w:rFonts w:ascii="Times New Roman" w:hAnsi="Times New Roman" w:eastAsia="Times New Roman"/>
-          <w:color w:val="000000"/>
-          <w:sz w:val="24"/>
-        </w:rPr>
-        <w:t xml:space="preserve">. It has been the subject of intense, global scientific scrutiny and has been extensively documented in peer-reviewed literature to possess a staggeringly broad spectrum of robust pharmacological activities, including potent antioxidant, broad-spectrum antimicrobial, profound analgesic, massive anti-inflammatory, and highly effective antispasmodic (tocolytic) properties. Mechanistically, eugenol exerts its profound anti-inflammatory effects by potently and simultaneously inhibiting both the cyclooxygenase (COX) and lipoxygenase (LOX) enzymatic pathways. This dual inhibition is highly significant; it effectively and simultaneously blocks the synthesis of both pro-inflammatory prostaglandins and leukotrienes from arachidonic acid, effectively halting the inflammatory cascade at multiple crucial junctures. Furthermore, and of massive importance to the study of dysmenorrhea, eugenol has been definitively shown to interact directly with the myometrial smooth muscle membrane. It acts as a direct antagonist, physically blocking voltage-dependent calcium channels (VDCCs) and significantly modulating voltage-gated sodium channels. By physically preventing the massive influx of extracellular calcium ions into the myometrial smooth muscle cell, eugenol completely disrupts the excitation-contraction coupling mechanism, forcing the muscle to relax regardless of the prevailing hormonal or prostaglandin concentration. These incredibly potent, inherent pharmacological mechanisms—dual COX/LOX inhibition coupled with direct calcium channel blockade—strongly and unequivocally suggest that standardized extracts of </w:t>
-      </w:r>
-      <w:r>
-        <w:rPr>
-          <w:rFonts w:ascii="Times New Roman" w:hAnsi="Times New Roman" w:eastAsia="Times New Roman"/>
-          <w:i/>
-          <w:color w:val="000000"/>
-          <w:sz w:val="24"/>
-        </w:rPr>
-        <w:t>S. aromaticum</w:t>
-      </w:r>
-      <w:r>
-        <w:rPr>
-          <w:rFonts w:ascii="Times New Roman" w:hAnsi="Times New Roman" w:eastAsia="Times New Roman"/>
-          <w:color w:val="000000"/>
-          <w:sz w:val="24"/>
-        </w:rPr>
-        <w:t xml:space="preserve"> could exert massive, highly significant tocolytic effects on the hyperactive myometrium. This presents a highly plausible, scientifically sound, and intensely rational basis for aggressively investigating clove extract as a natural, potent, and fundamentally safer therapeutic intervention for the severe myometrial hypercontractility and devastating pelvic pain inextricably associated with primary dysmenorrhea.</w:t>
+        <w:t>Syzygium aromaticum</w:t>
+      </w:r>
+      <w:r>
+        <w:rPr>
+          <w:rFonts w:ascii="Times New Roman" w:hAnsi="Times New Roman" w:eastAsia="Times New Roman"/>
+          <w:color w:val="000000"/>
+          <w:sz w:val="24"/>
+        </w:rPr>
+        <w:t>, this study is designed to systematically answer the following critical research questions:</w:t>
       </w:r>
     </w:p>
     <w:p>
       <w:pPr>
+        <w:spacing w:line="360" w:lineRule="auto" w:after="0"/>
+        <w:jc w:val="both"/>
+      </w:pPr>
+      <w:r>
+        <w:rPr>
+          <w:rFonts w:ascii="Times New Roman" w:hAnsi="Times New Roman" w:eastAsia="Times New Roman"/>
+          <w:color w:val="000000"/>
+          <w:sz w:val="24"/>
+        </w:rPr>
+        <w:t xml:space="preserve">1. What is the precise acute oral toxicity profile of the ethanolic extract of </w:t>
+      </w:r>
+      <w:r>
+        <w:rPr>
+          <w:rFonts w:ascii="Times New Roman" w:hAnsi="Times New Roman" w:eastAsia="Times New Roman"/>
+          <w:i/>
+          <w:color w:val="000000"/>
+          <w:sz w:val="24"/>
+        </w:rPr>
+        <w:t>Syzygium aromaticum</w:t>
+      </w:r>
+      <w:r>
+        <w:rPr>
+          <w:rFonts w:ascii="Times New Roman" w:hAnsi="Times New Roman" w:eastAsia="Times New Roman"/>
+          <w:color w:val="000000"/>
+          <w:sz w:val="24"/>
+        </w:rPr>
+        <w:t xml:space="preserve"> flower buds when evaluated systematically in female mice according to the rigorous, gold-standard OECD Test Guideline 423 protocols?</w:t>
+      </w:r>
+    </w:p>
+    <w:p>
+      <w:pPr>
+        <w:spacing w:line="360" w:lineRule="auto" w:after="0"/>
+        <w:jc w:val="both"/>
+      </w:pPr>
+      <w:r>
+        <w:rPr>
+          <w:rFonts w:ascii="Times New Roman" w:hAnsi="Times New Roman" w:eastAsia="Times New Roman"/>
+          <w:color w:val="000000"/>
+          <w:sz w:val="24"/>
+        </w:rPr>
+        <w:t xml:space="preserve">2. Does the direct application of the ethanolic extract of </w:t>
+      </w:r>
+      <w:r>
+        <w:rPr>
+          <w:rFonts w:ascii="Times New Roman" w:hAnsi="Times New Roman" w:eastAsia="Times New Roman"/>
+          <w:i/>
+          <w:color w:val="000000"/>
+          <w:sz w:val="24"/>
+        </w:rPr>
+        <w:t>Syzygium aromaticum</w:t>
+      </w:r>
+      <w:r>
+        <w:rPr>
+          <w:rFonts w:ascii="Times New Roman" w:hAnsi="Times New Roman" w:eastAsia="Times New Roman"/>
+          <w:color w:val="000000"/>
+          <w:sz w:val="24"/>
+        </w:rPr>
+        <w:t xml:space="preserve"> flower buds exhibit a massive, statistically significant, and reproducible tocolytic (antispasmodic) effect on the baseline, spontaneous contractile activity of isolated non-pregnant murine uterine tissue?</w:t>
+      </w:r>
+    </w:p>
+    <w:p>
+      <w:pPr>
+        <w:spacing w:line="360" w:lineRule="auto" w:after="0"/>
+        <w:jc w:val="both"/>
+      </w:pPr>
+      <w:r>
+        <w:rPr>
+          <w:rFonts w:ascii="Times New Roman" w:hAnsi="Times New Roman" w:eastAsia="Times New Roman"/>
+          <w:color w:val="000000"/>
+          <w:sz w:val="24"/>
+        </w:rPr>
+        <w:t xml:space="preserve">3. Can the ethanolic extract of </w:t>
+      </w:r>
+      <w:r>
+        <w:rPr>
+          <w:rFonts w:ascii="Times New Roman" w:hAnsi="Times New Roman" w:eastAsia="Times New Roman"/>
+          <w:i/>
+          <w:color w:val="000000"/>
+          <w:sz w:val="24"/>
+        </w:rPr>
+        <w:t>Syzygium aromaticum</w:t>
+      </w:r>
+      <w:r>
+        <w:rPr>
+          <w:rFonts w:ascii="Times New Roman" w:hAnsi="Times New Roman" w:eastAsia="Times New Roman"/>
+          <w:color w:val="000000"/>
+          <w:sz w:val="24"/>
+        </w:rPr>
+        <w:t xml:space="preserve"> effectively, rapidly, and predictably reverse the severe, hypercontractile spasms induced by exogenous oxytocin in the isolated murine uterus, thereby demonstrating its profound capacity to neutralize acute dysmenorrheic pathology?</w:t>
+      </w:r>
+    </w:p>
+    <w:p>
+      <w:pPr>
         <w:pStyle w:val="Heading2"/>
         <w:jc w:val="both"/>
       </w:pPr>
@@ -889,7 +1244,7 @@
           <w:color w:val="000000"/>
           <w:sz w:val="24"/>
         </w:rPr>
-        <w:t>1.10 Acute Oral Toxicity</w:t>
+        <w:t>1.13 Study Hypothesis</w:t>
       </w:r>
     </w:p>
     <w:p>
@@ -903,28 +1258,121 @@
           <w:color w:val="000000"/>
           <w:sz w:val="24"/>
         </w:rPr>
-        <w:t xml:space="preserve">Despite the incredibly widespread ethnobotanical use of clove across multiple continents over millennia, and its formal classification by international regulatory bodies such as the United States Food and Drug Administration (FDA) as Generally Recognized As Safe (GRAS) when utilized strictly as a dietary flavoring agent, the fundamental transition from a culinary spice to a concentrated, highly potent pharmacological intervention absolutely necessitates the rigorous, systematic, and empirical scientific evaluation of its comprehensive safety profile. This is particularly critical when </w:t>
-      </w:r>
-      <w:r>
-        <w:rPr>
-          <w:rFonts w:ascii="Times New Roman" w:hAnsi="Times New Roman" w:eastAsia="Times New Roman"/>
-          <w:i/>
-          <w:color w:val="000000"/>
-          <w:sz w:val="24"/>
-        </w:rPr>
-        <w:t>S. aromaticum</w:t>
-      </w:r>
-      <w:r>
-        <w:rPr>
-          <w:rFonts w:ascii="Times New Roman" w:hAnsi="Times New Roman" w:eastAsia="Times New Roman"/>
-          <w:color w:val="000000"/>
-          <w:sz w:val="24"/>
-        </w:rPr>
-        <w:t xml:space="preserve"> is extracted using organic solvents, such as ethanol or methanol, to create highly concentrated hydroalcoholic extracts designed to be administered at sustained therapeutic or supratherapeutic pharmacological doses. The absolute fundamental prerequisite for advancing any novel botanical extract toward clinical application is the definitive establishment of its toxicity profile, and this process universally begins with Acute Oral Toxicity testing.</w:t>
+        <w:t>This rigorous investigation is driven by the following definitive scientific hypotheses:</w:t>
       </w:r>
     </w:p>
     <w:p>
       <w:pPr>
+        <w:pStyle w:val="ListBullet"/>
+        <w:spacing w:line="360" w:lineRule="auto"/>
+        <w:jc w:val="both"/>
+      </w:pPr>
+      <w:r>
+        <w:rPr>
+          <w:rFonts w:ascii="Times New Roman" w:hAnsi="Times New Roman" w:eastAsia="Times New Roman"/>
+          <w:b/>
+          <w:color w:val="000000"/>
+          <w:sz w:val="24"/>
+        </w:rPr>
+        <w:t>Null Hypothesis (H0):</w:t>
+      </w:r>
+      <w:r>
+        <w:rPr>
+          <w:rFonts w:ascii="Times New Roman" w:hAnsi="Times New Roman" w:eastAsia="Times New Roman"/>
+          <w:color w:val="000000"/>
+          <w:sz w:val="24"/>
+        </w:rPr>
+        <w:t xml:space="preserve"> The ethanolic extract of </w:t>
+      </w:r>
+      <w:r>
+        <w:rPr>
+          <w:rFonts w:ascii="Times New Roman" w:hAnsi="Times New Roman" w:eastAsia="Times New Roman"/>
+          <w:i/>
+          <w:color w:val="000000"/>
+          <w:sz w:val="24"/>
+        </w:rPr>
+        <w:t>Syzygium aromaticum</w:t>
+      </w:r>
+      <w:r>
+        <w:rPr>
+          <w:rFonts w:ascii="Times New Roman" w:hAnsi="Times New Roman" w:eastAsia="Times New Roman"/>
+          <w:color w:val="000000"/>
+          <w:sz w:val="24"/>
+        </w:rPr>
+        <w:t xml:space="preserve"> flower buds exhibits profound acute oral toxicity in vivo and produces absolutely no statistically significant tocolytic or antispasmodic effect on either the spontaneous or oxytocin-induced hypercontractile activity of the isolated murine uterus.</w:t>
+      </w:r>
+    </w:p>
+    <w:p>
+      <w:pPr>
+        <w:pStyle w:val="ListBullet"/>
+        <w:spacing w:line="360" w:lineRule="auto"/>
+        <w:jc w:val="both"/>
+      </w:pPr>
+      <w:r>
+        <w:rPr>
+          <w:rFonts w:ascii="Times New Roman" w:hAnsi="Times New Roman" w:eastAsia="Times New Roman"/>
+          <w:b/>
+          <w:color w:val="000000"/>
+          <w:sz w:val="24"/>
+        </w:rPr>
+        <w:t>Alternative Hypothesis (H1):</w:t>
+      </w:r>
+      <w:r>
+        <w:rPr>
+          <w:rFonts w:ascii="Times New Roman" w:hAnsi="Times New Roman" w:eastAsia="Times New Roman"/>
+          <w:color w:val="000000"/>
+          <w:sz w:val="24"/>
+        </w:rPr>
+        <w:t xml:space="preserve"> The ethanolic extract of </w:t>
+      </w:r>
+      <w:r>
+        <w:rPr>
+          <w:rFonts w:ascii="Times New Roman" w:hAnsi="Times New Roman" w:eastAsia="Times New Roman"/>
+          <w:i/>
+          <w:color w:val="000000"/>
+          <w:sz w:val="24"/>
+        </w:rPr>
+        <w:t>Syzygium aromaticum</w:t>
+      </w:r>
+      <w:r>
+        <w:rPr>
+          <w:rFonts w:ascii="Times New Roman" w:hAnsi="Times New Roman" w:eastAsia="Times New Roman"/>
+          <w:color w:val="000000"/>
+          <w:sz w:val="24"/>
+        </w:rPr>
+        <w:t xml:space="preserve"> flower buds is highly safe, exhibiting zero acute oral toxicity up to the massive limit dose of 2000 mg/kg, and it exerts a profound, statistically significant, dose-dependent tocolytic effect, massively suppressing both spontaneous uterine contractions and effectively reversing oxytocin-induced hypercontractility in the murine model, thereby validating its potent antidysmenorrhea efficacy.</w:t>
+      </w:r>
+    </w:p>
+    <w:p>
+      <w:pPr>
+        <w:pStyle w:val="Heading2"/>
+        <w:jc w:val="both"/>
+      </w:pPr>
+      <w:r>
+        <w:rPr>
+          <w:rFonts w:ascii="Times New Roman" w:hAnsi="Times New Roman" w:eastAsia="Times New Roman"/>
+          <w:color w:val="000000"/>
+          <w:sz w:val="24"/>
+        </w:rPr>
+        <w:t>1.14 Aim and Objectives of the Study</w:t>
+      </w:r>
+    </w:p>
+    <w:p>
+      <w:pPr>
+        <w:pStyle w:val="Heading3"/>
+        <w:jc w:val="both"/>
+      </w:pPr>
+      <w:r>
+        <w:rPr>
+          <w:rFonts w:ascii="Times New Roman" w:hAnsi="Times New Roman" w:eastAsia="Times New Roman"/>
+          <w:color w:val="000000"/>
+          <w:sz w:val="24"/>
+        </w:rPr>
+        <w:t>Aim</w:t>
+      </w:r>
+    </w:p>
+    <w:p>
+      <w:pPr>
         <w:spacing w:line="360" w:lineRule="auto" w:after="0"/>
         <w:jc w:val="both"/>
       </w:pPr>
@@ -934,11 +1382,42 @@
           <w:color w:val="000000"/>
           <w:sz w:val="24"/>
         </w:rPr>
-        <w:t xml:space="preserve">Acute oral toxicity testing is the foundational, indispensable toxicological assessment designed explicitly to determine the immediate, severe adverse effects that occur within a highly restricted timeframe—typically 14 days—following the oral administration of either a single massive dose of a test substance or multiple substantial doses administered within a tight 24-hour window. This testing is not merely a scientific formality; it is a strict regulatory requirement globally mandated before any further, more complex pharmacological or chronic toxicity evaluations can legally proceed. The Organization for Economic Co-operation and Development (OECD), the paramount global authority on standardized chemical and pharmacological testing procedures, specifically outlines the globally accepted protocol for this critical evaluation in OECD Guideline 423: Acute Oral Toxicity - Acute Toxic Class Method. </w:t>
+        <w:t xml:space="preserve">The fundamental, overarching aim of this highly rigorous study is to definitively establish the acute in vivo toxicological safety profile and to systematically, quantitatively evaluate the potent in vitro antidysmenorrhea (tocolytic) efficacy of the ethanolic extract of </w:t>
+      </w:r>
+      <w:r>
+        <w:rPr>
+          <w:rFonts w:ascii="Times New Roman" w:hAnsi="Times New Roman" w:eastAsia="Times New Roman"/>
+          <w:i/>
+          <w:color w:val="000000"/>
+          <w:sz w:val="24"/>
+        </w:rPr>
+        <w:t>Syzygium aromaticum</w:t>
+      </w:r>
+      <w:r>
+        <w:rPr>
+          <w:rFonts w:ascii="Times New Roman" w:hAnsi="Times New Roman" w:eastAsia="Times New Roman"/>
+          <w:color w:val="000000"/>
+          <w:sz w:val="24"/>
+        </w:rPr>
+        <w:t xml:space="preserve"> flower buds using the gold-standard murine experimental model.</w:t>
       </w:r>
     </w:p>
     <w:p>
       <w:pPr>
+        <w:pStyle w:val="Heading3"/>
+        <w:jc w:val="both"/>
+      </w:pPr>
+      <w:r>
+        <w:rPr>
+          <w:rFonts w:ascii="Times New Roman" w:hAnsi="Times New Roman" w:eastAsia="Times New Roman"/>
+          <w:color w:val="000000"/>
+          <w:sz w:val="24"/>
+        </w:rPr>
+        <w:t>Specific Objectives</w:t>
+      </w:r>
+    </w:p>
+    <w:p>
+      <w:pPr>
         <w:spacing w:line="360" w:lineRule="auto" w:after="0"/>
         <w:jc w:val="both"/>
       </w:pPr>
@@ -948,7 +1427,7 @@
           <w:color w:val="000000"/>
           <w:sz w:val="24"/>
         </w:rPr>
-        <w:t xml:space="preserve">OECD Guideline 423 is a highly refined, stepwise, and ethically optimized procedure specifically designed to utilize the absolute minimum number of laboratory animals—exclusively utilizing specific strains of female rodents, as females are generally recognized to be more sensitive to acute toxicological insults in this specific testing paradigm. The protocol strictly dictates administering sequentially higher, pre-determined fixed dose levels—specifically 5, 50, 300, and an absolute ceiling dose of 2000 mg/kg of body weight—to small cohorts of animals. The primary objective is to precisely classify the substance's specific toxicity hazard category under the Globally Harmonized System (GHS) and to mathematically estimate the median lethal dose (LD50), defined as the specific statistical dose expected to cause mortality in exactly 50% of the tested population. </w:t>
+        <w:t>To achieve this massive scientific aim, the study will aggressively execute the following specific, highly targeted methodological objectives:</w:t>
       </w:r>
     </w:p>
     <w:p>
@@ -962,7 +1441,24 @@
           <w:color w:val="000000"/>
           <w:sz w:val="24"/>
         </w:rPr>
-        <w:t xml:space="preserve">Following the precise oral gavage of the extract, the animals enter a critical 14-day observation period. During this time, they are not merely watched; they are meticulously and continuously monitored by trained toxicologists for any highly subtle or overt signs of severe systemic toxicity. This comprehensive monitoring protocol includes tracking acute alterations in autonomic nervous system responses (such as excessive salivation, extreme lacrimation, or profound piloerection), severe changes in somatomotor activity and behavioral patterns (including deep lethargy, extreme hyperreactivity, debilitating tremors, or severe convulsions), signs of acute respiratory distress, severe gastrointestinal disturbances (such as persistent diarrhea), overall morbidity, and ultimately, mortality. </w:t>
+        <w:t xml:space="preserve">1. To meticulously prepare a highly concentrated, standardized ethanolic extract from the dried flower buds of </w:t>
+      </w:r>
+      <w:r>
+        <w:rPr>
+          <w:rFonts w:ascii="Times New Roman" w:hAnsi="Times New Roman" w:eastAsia="Times New Roman"/>
+          <w:i/>
+          <w:color w:val="000000"/>
+          <w:sz w:val="24"/>
+        </w:rPr>
+        <w:t>Syzygium aromaticum</w:t>
+      </w:r>
+      <w:r>
+        <w:rPr>
+          <w:rFonts w:ascii="Times New Roman" w:hAnsi="Times New Roman" w:eastAsia="Times New Roman"/>
+          <w:color w:val="000000"/>
+          <w:sz w:val="24"/>
+        </w:rPr>
+        <w:t xml:space="preserve"> utilizing rigorous cold maceration techniques to ensure maximum yield of intact bioactive phytochemicals.</w:t>
       </w:r>
     </w:p>
     <w:p>
@@ -976,29 +1472,12 @@
           <w:color w:val="000000"/>
           <w:sz w:val="24"/>
         </w:rPr>
-        <w:t xml:space="preserve">While eugenol, the overwhelmingly dominant and primary bioactive constituent of the clove extract, undoubtedly exhibits massive and highly potent therapeutic activities at controlled physiological concentrations, the scientific literature clearly indicates that at excessively high, uncalibrated concentrations, it can potentially act as a severe systemic toxin. Extremely high doses of concentrated eugenol have been documented in various animal models to induce severe, irreversible hepatotoxicity, massive neurotoxicity leading to deep comas, and highly severe, destructive irritation of the gastrointestinal mucosal lining. Therefore, executing a massive, comprehensive, and perfectly controlled acute oral toxicity study of the </w:t>
-      </w:r>
-      <w:r>
-        <w:rPr>
-          <w:rFonts w:ascii="Times New Roman" w:hAnsi="Times New Roman" w:eastAsia="Times New Roman"/>
-          <w:i/>
-          <w:color w:val="000000"/>
-          <w:sz w:val="24"/>
-        </w:rPr>
-        <w:t>S. aromaticum</w:t>
-      </w:r>
-      <w:r>
-        <w:rPr>
-          <w:rFonts w:ascii="Times New Roman" w:hAnsi="Times New Roman" w:eastAsia="Times New Roman"/>
-          <w:color w:val="000000"/>
-          <w:sz w:val="24"/>
-        </w:rPr>
-        <w:t xml:space="preserve"> hydroalcoholic extract following strict OECD guidelines is not optional; it is a critical scientific imperative. This exhaustive evaluation is absolutely essential to definitively establish the extract's precise safety margin, absolutely rule out the possibility of severe acute systemic toxicity at the projected therapeutic dosages required for dysmenorrhea management, and provide the unassailable, rigorous toxicological justification required to safely and confidently advance the extract into subsequent, massive in vivo efficacy trials and potential future human clinical applications.</w:t>
+        <w:t>2. To definitively determine the precise acute oral toxicity and establish the absolute safety margin (NOAEL) of the ethanolic extract in live female mice by strictly adhering to the highly controlled, sequential dosing protocols mandated by the OECD Test Guideline 423.</w:t>
       </w:r>
     </w:p>
     <w:p>
       <w:pPr>
-        <w:pStyle w:val="Heading2"/>
+        <w:spacing w:line="360" w:lineRule="auto" w:after="0"/>
         <w:jc w:val="both"/>
       </w:pPr>
       <w:r>
@@ -1007,7 +1486,24 @@
           <w:color w:val="000000"/>
           <w:sz w:val="24"/>
         </w:rPr>
-        <w:t>1.11 Rationale of the Study</w:t>
+        <w:t xml:space="preserve">3. To quantitatively measure and rigorously evaluate the direct, dose-dependent tocolytic effect of varying concentrations of the </w:t>
+      </w:r>
+      <w:r>
+        <w:rPr>
+          <w:rFonts w:ascii="Times New Roman" w:hAnsi="Times New Roman" w:eastAsia="Times New Roman"/>
+          <w:i/>
+          <w:color w:val="000000"/>
+          <w:sz w:val="24"/>
+        </w:rPr>
+        <w:t>S. aromaticum</w:t>
+      </w:r>
+      <w:r>
+        <w:rPr>
+          <w:rFonts w:ascii="Times New Roman" w:hAnsi="Times New Roman" w:eastAsia="Times New Roman"/>
+          <w:color w:val="000000"/>
+          <w:sz w:val="24"/>
+        </w:rPr>
+        <w:t xml:space="preserve"> extract on the spontaneous, baseline rhythmic contractions of isolated, non-pregnant murine uterine horns suspended in a controlled, physiological tissue bath environment.</w:t>
       </w:r>
     </w:p>
     <w:p>
@@ -1021,7 +1517,7 @@
           <w:color w:val="000000"/>
           <w:sz w:val="24"/>
         </w:rPr>
-        <w:t xml:space="preserve">Primary dysmenorrhea represents a massive, staggering, yet frequently trivialized and critically under-researched global health burden that significantly impairs the overall quality of life, academic trajectory, and economic productivity of hundreds of millions of reproductive-aged women worldwide. While Non-Steroidal Anti-Inflammatory Drugs (NSAIDs) and Combined Oral Contraceptives (COCs) currently remain the absolute bedrock and established standard of care for pharmacological management, their widespread, long-term utilization is severely and inherently compromised. The use of these conventional agents is heavily restricted by prohibitive, sometimes life-threatening adverse effect profiles—ranging from massive gastrointestinal ulceration and severe renal impairment associated with chronic NSAID use, to the significantly elevated cardiovascular and thromboembolic risks associated with hormonal therapies. Furthermore, a substantial and highly significant clinical reality exists: an estimated clinical failure rate of up to 20% in certain populations, leaving a massive cohort of women entirely refractory to these standard treatments and completely without adequate pain relief. Consequently, there is an urgent, highly compelling, and massive global necessity to identify, rigorously research, and scientifically validate novel, highly efficacious, and fundamentally safer therapeutic alternatives. </w:t>
+        <w:t xml:space="preserve">4. To systematically assess and quantify the potent antispasmodic capacity of the </w:t>
       </w:r>
       <w:r>
         <w:rPr>
@@ -1030,40 +1526,6 @@
           <w:color w:val="000000"/>
           <w:sz w:val="24"/>
         </w:rPr>
-        <w:t>Syzygium aromaticum</w:t>
-      </w:r>
-      <w:r>
-        <w:rPr>
-          <w:rFonts w:ascii="Times New Roman" w:hAnsi="Times New Roman" w:eastAsia="Times New Roman"/>
-          <w:color w:val="000000"/>
-          <w:sz w:val="24"/>
-        </w:rPr>
-        <w:t xml:space="preserve"> (clove) possesses an incredibly rich, well-documented ethnopharmacological history of use across diverse cultures as a highly powerful analgesic and antispasmodic botanical agent. Extensive, modern phytochemical profiling has definitively revealed that its primary, dominant bioactive constituent, eugenol, possesses a highly potent, dual-inhibitory action on both inflammatory cyclooxygenase enzymes and myometrial voltage-gated calcium channels. These are exactly the specific, targeted pharmacological mechanisms perfectly suited to counteract and completely dismantle the massive, prostaglandin-driven myometrial hypercontractility that fundamentally defines the pathophysiology of primary dysmenorrhea. However, despite these incredibly promising theoretical mechanisms and highly supportive in vitro data, there remains a massive, critical paucity of rigorous, highly controlled, extensive </w:t>
-      </w:r>
-      <w:r>
-        <w:rPr>
-          <w:rFonts w:ascii="Times New Roman" w:hAnsi="Times New Roman" w:eastAsia="Times New Roman"/>
-          <w:i/>
-          <w:color w:val="000000"/>
-          <w:sz w:val="24"/>
-        </w:rPr>
-        <w:t>in vivo</w:t>
-      </w:r>
-      <w:r>
-        <w:rPr>
-          <w:rFonts w:ascii="Times New Roman" w:hAnsi="Times New Roman" w:eastAsia="Times New Roman"/>
-          <w:color w:val="000000"/>
-          <w:sz w:val="24"/>
-        </w:rPr>
-        <w:t xml:space="preserve"> experimental data explicitly evaluating the absolute antidysmenorrheal efficacy and the comprehensive acute safety profile of its concentrated hydroalcoholic extract in living animal models. This study is meticulously designed to definitively bridge this massive critical knowledge gap by systematically and rigorously investigating the absolute tocolytic capacity of </w:t>
-      </w:r>
-      <w:r>
-        <w:rPr>
-          <w:rFonts w:ascii="Times New Roman" w:hAnsi="Times New Roman" w:eastAsia="Times New Roman"/>
-          <w:i/>
-          <w:color w:val="000000"/>
-          <w:sz w:val="24"/>
-        </w:rPr>
         <w:t>S. aromaticum</w:t>
       </w:r>
       <w:r>
@@ -1072,412 +1534,7 @@
           <w:color w:val="000000"/>
           <w:sz w:val="24"/>
         </w:rPr>
-        <w:t xml:space="preserve"> in established, gold-standard animal models of dysmenorrhea, while concurrently executing standardized, highly rigorous acute oral toxicity testing to firmly and unassailably establish its true therapeutic index and safety profile for future clinical applications.</w:t>
-      </w:r>
-    </w:p>
-    <w:p>
-      <w:pPr>
-        <w:pStyle w:val="Heading2"/>
-        <w:jc w:val="both"/>
-      </w:pPr>
-      <w:r>
-        <w:rPr>
-          <w:rFonts w:ascii="Times New Roman" w:hAnsi="Times New Roman" w:eastAsia="Times New Roman"/>
-          <w:color w:val="000000"/>
-          <w:sz w:val="24"/>
-        </w:rPr>
-        <w:t>1.12 Research Questions</w:t>
-      </w:r>
-    </w:p>
-    <w:p>
-      <w:pPr>
-        <w:spacing w:line="360" w:lineRule="auto" w:after="0"/>
-        <w:jc w:val="both"/>
-      </w:pPr>
-      <w:r>
-        <w:rPr>
-          <w:rFonts w:ascii="Times New Roman" w:hAnsi="Times New Roman" w:eastAsia="Times New Roman"/>
-          <w:color w:val="000000"/>
-          <w:sz w:val="24"/>
-        </w:rPr>
-        <w:t>This comprehensive pharmacological research endeavor is specifically guided by the following core, highly critical scientific questions:</w:t>
-      </w:r>
-    </w:p>
-    <w:p>
-      <w:pPr>
-        <w:spacing w:line="360" w:lineRule="auto" w:after="0"/>
-        <w:jc w:val="both"/>
-      </w:pPr>
-      <w:r>
-        <w:rPr>
-          <w:rFonts w:ascii="Times New Roman" w:hAnsi="Times New Roman" w:eastAsia="Times New Roman"/>
-          <w:color w:val="000000"/>
-          <w:sz w:val="24"/>
-        </w:rPr>
-        <w:t xml:space="preserve">1. What is the exact, comprehensive acute oral toxicity profile, and the precise mathematically estimated median lethal dose (LD50), of the concentrated hydroalcoholic extract of </w:t>
-      </w:r>
-      <w:r>
-        <w:rPr>
-          <w:rFonts w:ascii="Times New Roman" w:hAnsi="Times New Roman" w:eastAsia="Times New Roman"/>
-          <w:i/>
-          <w:color w:val="000000"/>
-          <w:sz w:val="24"/>
-        </w:rPr>
-        <w:t>Syzygium aromaticum</w:t>
-      </w:r>
-      <w:r>
-        <w:rPr>
-          <w:rFonts w:ascii="Times New Roman" w:hAnsi="Times New Roman" w:eastAsia="Times New Roman"/>
-          <w:color w:val="000000"/>
-          <w:sz w:val="24"/>
-        </w:rPr>
-        <w:t xml:space="preserve"> when administered to highly sensitive female murine models in strict accordance with the internationally recognized OECD Test Guideline 423?</w:t>
-      </w:r>
-    </w:p>
-    <w:p>
-      <w:pPr>
-        <w:spacing w:line="360" w:lineRule="auto" w:after="0"/>
-        <w:jc w:val="both"/>
-      </w:pPr>
-      <w:r>
-        <w:rPr>
-          <w:rFonts w:ascii="Times New Roman" w:hAnsi="Times New Roman" w:eastAsia="Times New Roman"/>
-          <w:color w:val="000000"/>
-          <w:sz w:val="24"/>
-        </w:rPr>
-        <w:t xml:space="preserve">2. Does the systemic oral administration of the concentrated hydroalcoholic extract of </w:t>
-      </w:r>
-      <w:r>
-        <w:rPr>
-          <w:rFonts w:ascii="Times New Roman" w:hAnsi="Times New Roman" w:eastAsia="Times New Roman"/>
-          <w:i/>
-          <w:color w:val="000000"/>
-          <w:sz w:val="24"/>
-        </w:rPr>
-        <w:t>S. aromaticum</w:t>
-      </w:r>
-      <w:r>
-        <w:rPr>
-          <w:rFonts w:ascii="Times New Roman" w:hAnsi="Times New Roman" w:eastAsia="Times New Roman"/>
-          <w:color w:val="000000"/>
-          <w:sz w:val="24"/>
-        </w:rPr>
-        <w:t xml:space="preserve"> significantly, reliably, and dose-dependently attenuate extreme oxytocin-induced uterine hypercontractility in established, gold-standard experimental animal models of primary dysmenorrhea?</w:t>
-      </w:r>
-    </w:p>
-    <w:p>
-      <w:pPr>
-        <w:spacing w:line="360" w:lineRule="auto" w:after="0"/>
-        <w:jc w:val="both"/>
-      </w:pPr>
-      <w:r>
-        <w:rPr>
-          <w:rFonts w:ascii="Times New Roman" w:hAnsi="Times New Roman" w:eastAsia="Times New Roman"/>
-          <w:color w:val="000000"/>
-          <w:sz w:val="24"/>
-        </w:rPr>
-        <w:t xml:space="preserve">3. How does the absolute, quantifiable antidysmenorrhea (tocolytic) efficacy of the </w:t>
-      </w:r>
-      <w:r>
-        <w:rPr>
-          <w:rFonts w:ascii="Times New Roman" w:hAnsi="Times New Roman" w:eastAsia="Times New Roman"/>
-          <w:i/>
-          <w:color w:val="000000"/>
-          <w:sz w:val="24"/>
-        </w:rPr>
-        <w:t>S. aromaticum</w:t>
-      </w:r>
-      <w:r>
-        <w:rPr>
-          <w:rFonts w:ascii="Times New Roman" w:hAnsi="Times New Roman" w:eastAsia="Times New Roman"/>
-          <w:color w:val="000000"/>
-          <w:sz w:val="24"/>
-        </w:rPr>
-        <w:t xml:space="preserve"> extract directly compare to the established efficacy of a standard, highly potent pharmacological reference drug, specifically a first-line NSAID such as ibuprofen, under identical experimental conditions?</w:t>
-      </w:r>
-    </w:p>
-    <w:p>
-      <w:pPr>
-        <w:pStyle w:val="Heading2"/>
-        <w:jc w:val="both"/>
-      </w:pPr>
-      <w:r>
-        <w:rPr>
-          <w:rFonts w:ascii="Times New Roman" w:hAnsi="Times New Roman" w:eastAsia="Times New Roman"/>
-          <w:color w:val="000000"/>
-          <w:sz w:val="24"/>
-        </w:rPr>
-        <w:t>1.13 Study Hypothesis</w:t>
-      </w:r>
-    </w:p>
-    <w:p>
-      <w:pPr>
-        <w:spacing w:line="360" w:lineRule="auto" w:after="0"/>
-        <w:jc w:val="both"/>
-      </w:pPr>
-      <w:r>
-        <w:rPr>
-          <w:rFonts w:ascii="Times New Roman" w:hAnsi="Times New Roman" w:eastAsia="Times New Roman"/>
-          <w:b/>
-          <w:color w:val="000000"/>
-          <w:sz w:val="24"/>
-        </w:rPr>
-        <w:t>Null Hypothesis (H0):</w:t>
-      </w:r>
-      <w:r>
-        <w:rPr>
-          <w:rFonts w:ascii="Times New Roman" w:hAnsi="Times New Roman" w:eastAsia="Times New Roman"/>
-          <w:color w:val="000000"/>
-          <w:sz w:val="24"/>
-        </w:rPr>
-        <w:t xml:space="preserve"> The concentrated hydroalcoholic extract of </w:t>
-      </w:r>
-      <w:r>
-        <w:rPr>
-          <w:rFonts w:ascii="Times New Roman" w:hAnsi="Times New Roman" w:eastAsia="Times New Roman"/>
-          <w:i/>
-          <w:color w:val="000000"/>
-          <w:sz w:val="24"/>
-        </w:rPr>
-        <w:t>Syzygium aromaticum</w:t>
-      </w:r>
-      <w:r>
-        <w:rPr>
-          <w:rFonts w:ascii="Times New Roman" w:hAnsi="Times New Roman" w:eastAsia="Times New Roman"/>
-          <w:color w:val="000000"/>
-          <w:sz w:val="24"/>
-        </w:rPr>
-        <w:t xml:space="preserve"> exhibits absolutely no significant or observable acute oral toxicity in murine models, and it produces absolutely no statistically significant reduction in severe, oxytocin-induced uterine hypercontractility in established experimental animal models of primary dysmenorrhea when directly compared to inert vehicle controls.</w:t>
-      </w:r>
-    </w:p>
-    <w:p>
-      <w:pPr>
-        <w:spacing w:line="360" w:lineRule="auto" w:after="0"/>
-        <w:jc w:val="both"/>
-      </w:pPr>
-      <w:r>
-        <w:rPr>
-          <w:rFonts w:ascii="Times New Roman" w:hAnsi="Times New Roman" w:eastAsia="Times New Roman"/>
-          <w:b/>
-          <w:color w:val="000000"/>
-          <w:sz w:val="24"/>
-        </w:rPr>
-        <w:t>Alternative Hypothesis (H1):</w:t>
-      </w:r>
-      <w:r>
-        <w:rPr>
-          <w:rFonts w:ascii="Times New Roman" w:hAnsi="Times New Roman" w:eastAsia="Times New Roman"/>
-          <w:color w:val="000000"/>
-          <w:sz w:val="24"/>
-        </w:rPr>
-        <w:t xml:space="preserve"> The concentrated hydroalcoholic extract of </w:t>
-      </w:r>
-      <w:r>
-        <w:rPr>
-          <w:rFonts w:ascii="Times New Roman" w:hAnsi="Times New Roman" w:eastAsia="Times New Roman"/>
-          <w:i/>
-          <w:color w:val="000000"/>
-          <w:sz w:val="24"/>
-        </w:rPr>
-        <w:t>Syzygium aromaticum</w:t>
-      </w:r>
-      <w:r>
-        <w:rPr>
-          <w:rFonts w:ascii="Times New Roman" w:hAnsi="Times New Roman" w:eastAsia="Times New Roman"/>
-          <w:color w:val="000000"/>
-          <w:sz w:val="24"/>
-        </w:rPr>
-        <w:t xml:space="preserve"> possesses a highly safe, well-tolerated acute oral toxicity profile (characterized by an estimated LD50 significantly exceeding 2000 mg/kg), and it significantly, dose-dependently attenuates extreme uterine hypercontractility in experimental animal models of primary dysmenorrhea, unequivocally demonstrating a highly potent tocolytic effect that is directly comparable, or potentially superior, to standard first-line pharmacological NSAID therapies.</w:t>
-      </w:r>
-    </w:p>
-    <w:p>
-      <w:pPr>
-        <w:pStyle w:val="Heading2"/>
-        <w:jc w:val="both"/>
-      </w:pPr>
-      <w:r>
-        <w:rPr>
-          <w:rFonts w:ascii="Times New Roman" w:hAnsi="Times New Roman" w:eastAsia="Times New Roman"/>
-          <w:color w:val="000000"/>
-          <w:sz w:val="24"/>
-        </w:rPr>
-        <w:t>1.14 Aim and Objectives of the Study</w:t>
-      </w:r>
-    </w:p>
-    <w:p>
-      <w:pPr>
-        <w:spacing w:line="360" w:lineRule="auto" w:after="0"/>
-        <w:jc w:val="both"/>
-      </w:pPr>
-      <w:r>
-        <w:rPr>
-          <w:rFonts w:ascii="Times New Roman" w:hAnsi="Times New Roman" w:eastAsia="Times New Roman"/>
-          <w:b/>
-          <w:color w:val="000000"/>
-          <w:sz w:val="24"/>
-        </w:rPr>
-        <w:t>Aim:</w:t>
-      </w:r>
-      <w:r>
-        <w:rPr>
-          <w:rFonts w:ascii="Times New Roman" w:hAnsi="Times New Roman" w:eastAsia="Times New Roman"/>
-          <w:color w:val="000000"/>
-          <w:sz w:val="24"/>
-        </w:rPr>
-        <w:t xml:space="preserve"> </w:t>
-      </w:r>
-    </w:p>
-    <w:p>
-      <w:pPr>
-        <w:spacing w:line="360" w:lineRule="auto" w:after="0"/>
-        <w:jc w:val="both"/>
-      </w:pPr>
-      <w:r>
-        <w:rPr>
-          <w:rFonts w:ascii="Times New Roman" w:hAnsi="Times New Roman" w:eastAsia="Times New Roman"/>
-          <w:color w:val="000000"/>
-          <w:sz w:val="24"/>
-        </w:rPr>
-        <w:t xml:space="preserve">The primary, overarching aim of this highly comprehensive pharmacological study is to systematically, rigorously, and empirically evaluate the complete acute oral toxicity profile alongside the massive antidysmenorrhea (tocolytic) efficacy of the specifically prepared hydroalcoholic extract of </w:t>
-      </w:r>
-      <w:r>
-        <w:rPr>
-          <w:rFonts w:ascii="Times New Roman" w:hAnsi="Times New Roman" w:eastAsia="Times New Roman"/>
-          <w:i/>
-          <w:color w:val="000000"/>
-          <w:sz w:val="24"/>
-        </w:rPr>
-        <w:t>Syzygium aromaticum</w:t>
-      </w:r>
-      <w:r>
-        <w:rPr>
-          <w:rFonts w:ascii="Times New Roman" w:hAnsi="Times New Roman" w:eastAsia="Times New Roman"/>
-          <w:color w:val="000000"/>
-          <w:sz w:val="24"/>
-        </w:rPr>
-        <w:t xml:space="preserve"> (clove) using universally established, gold-standard female murine experimental models.</w:t>
-      </w:r>
-    </w:p>
-    <w:p>
-      <w:pPr>
-        <w:spacing w:line="360" w:lineRule="auto" w:after="0"/>
-        <w:jc w:val="both"/>
-      </w:pPr>
-      <w:r>
-        <w:rPr>
-          <w:rFonts w:ascii="Times New Roman" w:hAnsi="Times New Roman" w:eastAsia="Times New Roman"/>
-          <w:b/>
-          <w:color w:val="000000"/>
-          <w:sz w:val="24"/>
-        </w:rPr>
-        <w:t>Specific Objectives:</w:t>
-      </w:r>
-    </w:p>
-    <w:p>
-      <w:pPr>
-        <w:spacing w:line="360" w:lineRule="auto" w:after="0"/>
-        <w:jc w:val="both"/>
-      </w:pPr>
-      <w:r>
-        <w:rPr>
-          <w:rFonts w:ascii="Times New Roman" w:hAnsi="Times New Roman" w:eastAsia="Times New Roman"/>
-          <w:color w:val="000000"/>
-          <w:sz w:val="24"/>
-        </w:rPr>
-        <w:t xml:space="preserve">1. To meticulously prepare, process, and completely standardize a highly concentrated hydroalcoholic extract exclusively from the authentic, dried, unexpanded flower buds of </w:t>
-      </w:r>
-      <w:r>
-        <w:rPr>
-          <w:rFonts w:ascii="Times New Roman" w:hAnsi="Times New Roman" w:eastAsia="Times New Roman"/>
-          <w:i/>
-          <w:color w:val="000000"/>
-          <w:sz w:val="24"/>
-        </w:rPr>
-        <w:t>Syzygium aromaticum</w:t>
-      </w:r>
-      <w:r>
-        <w:rPr>
-          <w:rFonts w:ascii="Times New Roman" w:hAnsi="Times New Roman" w:eastAsia="Times New Roman"/>
-          <w:color w:val="000000"/>
-          <w:sz w:val="24"/>
-        </w:rPr>
-        <w:t xml:space="preserve"> using validated extraction protocols.</w:t>
-      </w:r>
-    </w:p>
-    <w:p>
-      <w:pPr>
-        <w:spacing w:line="360" w:lineRule="auto" w:after="0"/>
-        <w:jc w:val="both"/>
-      </w:pPr>
-      <w:r>
-        <w:rPr>
-          <w:rFonts w:ascii="Times New Roman" w:hAnsi="Times New Roman" w:eastAsia="Times New Roman"/>
-          <w:color w:val="000000"/>
-          <w:sz w:val="24"/>
-        </w:rPr>
-        <w:t>2. To definitively determine the acute oral toxicity (LD50) and meticulously observe, record, and analyze any potential signs of severe behavioral, autonomic, or systemic toxicity of the prepared extract in cohorts of female mice, adhering strictly to the stringent protocols outlined in the OECD 423 guidelines.</w:t>
-      </w:r>
-    </w:p>
-    <w:p>
-      <w:pPr>
-        <w:spacing w:line="360" w:lineRule="auto" w:after="0"/>
-        <w:jc w:val="both"/>
-      </w:pPr>
-      <w:r>
-        <w:rPr>
-          <w:rFonts w:ascii="Times New Roman" w:hAnsi="Times New Roman" w:eastAsia="Times New Roman"/>
-          <w:color w:val="000000"/>
-          <w:sz w:val="24"/>
-        </w:rPr>
-        <w:t xml:space="preserve">3. To rigorously evaluate and statistically quantify the highly specific, dose-dependent inhibitory effects of varying concentrations of the </w:t>
-      </w:r>
-      <w:r>
-        <w:rPr>
-          <w:rFonts w:ascii="Times New Roman" w:hAnsi="Times New Roman" w:eastAsia="Times New Roman"/>
-          <w:i/>
-          <w:color w:val="000000"/>
-          <w:sz w:val="24"/>
-        </w:rPr>
-        <w:t>S. aromaticum</w:t>
-      </w:r>
-      <w:r>
-        <w:rPr>
-          <w:rFonts w:ascii="Times New Roman" w:hAnsi="Times New Roman" w:eastAsia="Times New Roman"/>
-          <w:color w:val="000000"/>
-          <w:sz w:val="24"/>
-        </w:rPr>
-        <w:t xml:space="preserve"> extract on massive, oxytocin-induced writhing responses and extreme uterine hypercontractility in well-established female murine models of primary dysmenorrhea.</w:t>
-      </w:r>
-    </w:p>
-    <w:p>
-      <w:pPr>
-        <w:spacing w:line="360" w:lineRule="auto" w:after="0"/>
-        <w:jc w:val="both"/>
-      </w:pPr>
-      <w:r>
-        <w:rPr>
-          <w:rFonts w:ascii="Times New Roman" w:hAnsi="Times New Roman" w:eastAsia="Times New Roman"/>
-          <w:color w:val="000000"/>
-          <w:sz w:val="24"/>
-        </w:rPr>
-        <w:t xml:space="preserve">4. To scientifically, statistically, and definitively compare the directly observed tocolytic efficacy and overall potency of the novel </w:t>
-      </w:r>
-      <w:r>
-        <w:rPr>
-          <w:rFonts w:ascii="Times New Roman" w:hAnsi="Times New Roman" w:eastAsia="Times New Roman"/>
-          <w:i/>
-          <w:color w:val="000000"/>
-          <w:sz w:val="24"/>
-        </w:rPr>
-        <w:t>S. aromaticum</w:t>
-      </w:r>
-      <w:r>
-        <w:rPr>
-          <w:rFonts w:ascii="Times New Roman" w:hAnsi="Times New Roman" w:eastAsia="Times New Roman"/>
-          <w:color w:val="000000"/>
-          <w:sz w:val="24"/>
-        </w:rPr>
-        <w:t xml:space="preserve"> extract against the established therapeutic baseline provided by a standard, highly utilized NSAID therapy, specifically ibuprofen, ensuring a robust evaluation of its comparative pharmacological potential.</w:t>
+        <w:t xml:space="preserve"> extract to rapidly neutralize and completely reverse the severe, tetanic uterine hypercontractility specifically induced by the administration of exogenous oxytocin in the isolated murine uterine model.</w:t>
       </w:r>
     </w:p>
     <w:p>

</xml_diff>

<commit_message>
feat: massively expand Chapter 1 by 15 pages (Neurobiology, Cytokines, Animal Models, Clove Phytochem, Eugenol Pharmacology)
</commit_message>
<xml_diff>
--- a/output/draft/iyare-draft.docx
+++ b/output/draft/iyare-draft.docx
@@ -520,7 +520,7 @@
           <w:color w:val="000000"/>
           <w:sz w:val="24"/>
         </w:rPr>
-        <w:t>1.7 Drugs Implicated in the Management of Dysmenorrhea</w:t>
+        <w:t>1.7 The Neurobiology of Pelvic Pain in Dysmenorrhea</w:t>
       </w:r>
     </w:p>
     <w:p>
@@ -534,7 +534,7 @@
           <w:color w:val="000000"/>
           <w:sz w:val="24"/>
         </w:rPr>
-        <w:t>Given that the definitive physiological origin of primary dysmenorrhea lies in the pathological overproduction of prostaglandins and the subsequent cascade of severe, ischemic uterine hypercontractility, contemporary pharmacological management is overwhelmingly directed toward breaking this specific pathogenic chain. The cornerstone of evidence-based medical intervention relies fundamentally on two primary classes of synthetic pharmaceuticals: Non-Steroidal Anti-Inflammatory Drugs (NSAIDs) and Combined Oral Contraceptives (COCs) (Marjoribanks et al., 2015; Wong et al., 2009). These two established modalities, utilized either as monotherapy or in a synergistic combination, currently constitute the undisputed, universally recommended first-line treatment protocols across all major global gynecological guidelines (Burnett &amp; Lemyre, 2017).</w:t>
+        <w:t>While the mechanical ischemia induced by hypercontractility is the physiological trigger for primary dysmenorrhea, the actual perception of this severe cramping—the translation of tissue hypoxia into the conscious experience of agonizing pain—requires a profound understanding of the neurobiology of pelvic nociception. The uterus is a deeply innervated visceral organ, receiving its primary sensory nerve supply from the autonomic nervous system via the pelvic splanchnic nerves and the inferior hypogastric plexus. The visceral afferent nerve fibers that innervate the myometrium and endometrium are predominantly unmyelinated, slow-conducting C-fibers, which are classically responsible for the transmission of dull, aching, poorly localized, and protracted pain (Iacovides et al., 2015). Unlike somatic pain fibers, which respond to distinct, sharp mechanical stimuli, these visceral C-fibers are polymodal nociceptors. This means they are profoundly sensitive to a complex soup of chemical mediators, specifically the massive efflux of inflammatory metabolites that accumulate during menstruation.</w:t>
       </w:r>
     </w:p>
     <w:p>
@@ -548,7 +548,7 @@
           <w:color w:val="000000"/>
           <w:sz w:val="24"/>
         </w:rPr>
-        <w:t>Non-Steroidal Anti-Inflammatory Drugs (NSAIDs), such as ibuprofen, naproxen, mefenamic acid, and diclofenac, represent the absolute vanguard of targeted, first-line therapy for primary dysmenorrhea (Marjoribanks et al., 2015). Their mechanism of action is incredibly precise and directly antagonistic to the core pathophysiology of the disorder: NSAIDs act as potent, competitive inhibitors of the cyclooxygenase (COX) enzyme system, the critical bottleneck catalyst responsible for the oxidative conversion of arachidonic acid into the massive surge of prostaglandins (PGF2α and PGE2) (Rouzer &amp; Marnett, 2009). By systematically blocking the catalytic activity of both the constitutive COX-1 and the highly inducible COX-2 isoforms, NSAIDs effectively shut down the entire downstream arachidonic acid cascade within the sloughing endometrium. This profound, targeted biochemical blockade drastically curtails the synthesis and accumulation of potent uterotonic prostaglandins, thereby preventing the initiation of severe myometrial hypercontractility, restoring normal uterine blood flow, eliminating tissue ischemia, and ultimately extinguishing the peripheral pain signal at its origin (Dawood, 1984). Extensive meta-analyses have repeatedly confirmed that NSAIDs are significantly superior to placebo in providing robust, rapid, and sustained relief from acute menstrual cramping (Marjoribanks et al., 2015).</w:t>
+        <w:t>The core neurological pathophysiology of primary dysmenorrhea is rooted in a phenomenon known as peripheral sensitization (Li &amp; Wang, 2023). When the sudden withdrawal of progesterone triggers the massive localized synthesis of prostaglandins (PGF2α and PGE2), these lipids do not solely act on smooth muscle receptors to induce tetanic contractions. PGE2, in particular, acts as a profound neuromodulator. It binds directly to specific E-prostanoid (EP) receptors situated on the terminal endings of the visceral C-fibers. This binding initiates a massive intracellular signaling cascade, typically involving the cyclic AMP (cAMP) and protein kinase A (PKA) pathways. The activation of PKA directly phosphorylates and drastically lowers the activation threshold of crucial voltage-gated sodium channels (Nav1.8 and Nav1.9) and transient receptor potential vanilloid 1 (TRPV1) channels located on the nerve membrane (Pina &amp; Silva, 2021). Consequently, the nerve fiber becomes hyper-excitable. Stimuli that would normally be sub-threshold—such as the standard mechanical distension of the uterus or the normal rhythmic contractions of menstruation—are suddenly amplified into massive, sustained bursts of action potentials. This effectively hyper-sensitizes the entire pelvic nerve network, converting normal physiological processes into agonizing nociceptive signals.</w:t>
       </w:r>
     </w:p>
     <w:p>
@@ -562,7 +562,7 @@
           <w:color w:val="000000"/>
           <w:sz w:val="24"/>
         </w:rPr>
-        <w:t xml:space="preserve">Combined Oral Contraceptives (COCs) provide a highly effective, alternative, or adjunctive first-line therapeutic approach, functioning via a fundamentally different mechanism. Composed of synthetic estrogen and progestin, COCs operate by exerting profound, continuous negative feedback on the Hypothalamic-Pituitary-Ovarian (HPO) axis, thereby suppressing the mid-cycle luteinizing hormone (LH) surge and medically abolishing ovulation entirely (Wong et al., 2009). By preventing ovulation, COCs fundamentally disrupt the hormonal prerequisites necessary for the massive proliferation of the endometrial stratum functionalis. The continuous delivery of synthetic progestin creates a thin, highly atrophic, and relatively inactive endometrial lining. Consequently, when the withdrawal bleed (a hormonally induced pseudo-menstruation) occurs during the placebo week, there is an incredibly minimal volume of endometrial tissue available to break down. This massive reduction in tissue volume directly correlates to a vastly diminished capacity for the synthesis and release of arachidonic acid and prostaglandins (Wong et al., 2009). By preemptively downregulating the total substrate available for prostaglandin synthesis, COCs effectively lower the baseline intrauterine pressure and completely prevent the severe, spastic hypercontractility characteristic of dysmenorrhea. </w:t>
+        <w:t>Furthermore, the mechanical ischemia generated by the prostaglandin-induced hypercontractility forces the massive myometrial muscle bed into a state of severe, protracted anaerobic glycolysis. This metabolic shift results in the rapid, localized accumulation of noxious metabolic byproducts, most notably lactic acid, reactive oxygen species (ROS), and bradykinin. The resulting severe tissue acidosis (low pH) directly and powerfully activates acid-sensing ion channels (ASICs) and further stimulates the already hyper-sensitized TRPV1 channels on the C-fibers (Iacovides et al., 2015). Bradykinin, a highly potent endogenous algesic nonapeptide, binds to specific B2 receptors on the nerve terminals, operating synergistically with PGE2 to amplify the peripheral sensitization. This synergistic interaction between mechanical ischemia, metabolic acidosis, and prostaglandin-mediated receptor phosphorylation creates a catastrophic positive feedback loop of unremitting pain transmission.</w:t>
       </w:r>
     </w:p>
     <w:p>
@@ -576,11 +576,25 @@
           <w:color w:val="000000"/>
           <w:sz w:val="24"/>
         </w:rPr>
-        <w:t>However, despite their proven efficacy, neither NSAIDs nor COCs provide a universal panacea, and their widespread clinical utility is severely limited by a formidable array of adverse drug reactions, absolute contraindications, and high rates of clinical failure (Oladosu et al., 2018). The indiscriminate inhibition of COX enzymes by non-selective NSAIDs profoundly suppresses the synthesis of cytoprotective prostaglandins within the gastric mucosa, exposing patients to severe gastrointestinal toxicities, ranging from chronic dyspepsia and nausea to life-threatening peptic ulceration and catastrophic gastrointestinal hemorrhage, particularly with long-term, high-dose administration (Navarro &amp; Sánchez, 2022). Furthermore, NSAID use carries well-documented risks of nephrotoxicity, hepatotoxicity, and exacerbation of reactive airway diseases like asthma. COCs also carry a significant burden of side effects, including severe mood lability, undesirable weight gain, debilitating migraines, extreme breast tenderness, and a profoundly elevated, life-threatening risk of developing venous thromboembolism (VTE), deep vein thrombosis (DVT), and pulmonary embolism, especially in individuals with a high BMI or a history of smoking (Smith et al., 2024). Even more concerning is the phenomenon of pharmacological resistance: an estimated 15% to 25% of women suffering from severe primary dysmenorrhea are completely refractory to maximum tolerated doses of both NSAIDs and COCs, deriving absolutely zero clinical relief and remaining trapped in severe, cyclical agony (Oladosu et al., 2018). This significant failure rate, combined with the severe, dose-limiting toxicity profile of existing synthetics, has catalyzed an urgent, global scientific mandate to aggressively discover, rigorously evaluate, and develop novel, highly efficacious, and significantly safer alternative tocolytic and analgesic therapeutics, with massive attention currently shifting toward the vast, untapped pharmacological potential of phytomedicine (Sargin, 2021).</w:t>
+        <w:t xml:space="preserve">However, the neurobiological complexity of dysmenorrhea does not terminate at the peripheral nerve ending. Chronic, severe primary dysmenorrhea is increasingly recognized as a profound driver of central sensitization—a pathological state wherein the central nervous system itself becomes hyper-responsive to pain (Li &amp; Wang, 2023). The continuous, massive bombardment of the dorsal horn of the spinal cord by hyper-active C-fibers during menstruation leads to the massive release of excitatory neurotransmitters, specifically glutamate and substance P. Over repeated menstrual cycles, this chronic excitatory input induces long-term potentiation (LTP) at the spinal synapses. The post-synaptic neurons in the spinal cord physically upregulate their N-methyl-D-aspartate (NMDA) receptors, drastically amplifying the pain signal before it is relayed to the brain (Song et al., 2025). This central amplification explains why women with severe, untreated primary dysmenorrhea often experience hyperalgesia (an exaggerated response to a painful stimulus) and allodynia (pain generated by a normally non-painful stimulus) not just in the pelvis, but in adjacent somatic dermatomes, leading to the characteristic radiating pain down the thighs and lower back. </w:t>
       </w:r>
     </w:p>
     <w:p>
       <w:pPr>
+        <w:spacing w:line="360" w:lineRule="auto" w:after="0"/>
+        <w:jc w:val="both"/>
+      </w:pPr>
+      <w:r>
+        <w:rPr>
+          <w:rFonts w:ascii="Times New Roman" w:hAnsi="Times New Roman" w:eastAsia="Times New Roman"/>
+          <w:color w:val="000000"/>
+          <w:sz w:val="24"/>
+        </w:rPr>
+        <w:t>Understanding this dual mechanism of peripheral and central sensitization underscores the absolute necessity of profound, early pharmacological intervention. Tocolytic agents that merely relax the uterine muscle without addressing the underlying inflammatory and neuropathic sensitization are often clinically inadequate. Optimal therapeutics must possess the dual capacity to mechanically halt the ischemic hypercontractility while simultaneously suppressing the synthesis of the exact neuro-sensitizing agents (PGE2) and directly antagonizing the hyper-excitable ion channels (such as TRPV1) on the sensory nerve terminals (Pina &amp; Silva, 2021). It is within this specific, highly demanding pharmacological niche that multi-targeted phytomedicines, particularly those rich in neuro-modulatory anesthetics like eugenol, represent an immensely promising therapeutic frontier.</w:t>
+      </w:r>
+    </w:p>
+    <w:p>
+      <w:pPr>
         <w:pStyle w:val="Heading2"/>
         <w:jc w:val="both"/>
       </w:pPr>
@@ -590,7 +604,7 @@
           <w:color w:val="000000"/>
           <w:sz w:val="24"/>
         </w:rPr>
-        <w:t>1.8 Herbal Medicines</w:t>
+        <w:t>1.8 Oxidative Stress and Inflammatory Cytokines in Dysmenorrhea</w:t>
       </w:r>
     </w:p>
     <w:p>
@@ -604,7 +618,7 @@
           <w:color w:val="000000"/>
           <w:sz w:val="24"/>
         </w:rPr>
-        <w:t xml:space="preserve">In direct response to the severe limitations, widespread therapeutic failures, and potentially devastating side effects associated with chronic NSAID and synthetic hormonal therapies, there has been a massive, global resurgence of scientific and clinical interest in exploring the vast pharmacological potential of herbal medicines and traditional phytotherapy for the management of primary dysmenorrhea (Sargin, 2021). For millennia, indigenous cultures and traditional medical systems across the world—ranging from Traditional Chinese Medicine (TCM) and Indian Ayurveda to African ethnomedicine and Western herbalism—have relied heavily on a vast compendium of specific botanical extracts, complex herbal formulations, and essential oils to successfully mitigate menstrual pain, regulate highly erratic cycles, and completely resolve severe pelvic cramping (Aziz et al., 2018). While these ancestral remedies were historically dismissed by allopathic medicine as mere folklore or potent placebo effects, contemporary pharmacological research has fundamentally validated their efficacy, proving that many of these botanicals contain incredibly potent, highly active phytochemical constituents that exert complex, measurable, and highly specific physiological effects (Kaur &amp; Kaushal, 2019). </w:t>
+        <w:t>While the massive overproduction of vasoactive prostaglandins (PGF2α and PGE2) has historically dominated the pathophysiological narrative of primary dysmenorrhea, contemporary molecular and biochemical research has unequivocally expanded this paradigm. It is now scientifically irrefutable that dysmenorrhea is not merely a localized prostaglandin disorder, but rather a complex, severe, and systemic inflammatory cascade driven massively by overwhelming oxidative stress and the aggressive proliferation of pro-inflammatory cytokines (Szydłowska et al., 2020). This modern understanding profoundly shifts the therapeutic target landscape, demanding pharmacological interventions that possess potent, multi-pathway antioxidant and immunomodulatory capabilities, far exceeding the narrow, single-target scope of traditional COX inhibitors.</w:t>
       </w:r>
     </w:p>
     <w:p>
@@ -618,7 +632,7 @@
           <w:color w:val="000000"/>
           <w:sz w:val="24"/>
         </w:rPr>
-        <w:t>Modern scientific investigations into these traditional botanical medicines have isolated an immense array of bioactive secondary metabolites—including complex flavonoids, highly volatile essential oils (terpenes and terpenoids), potent alkaloids, and specialized phenolic compounds—that exhibit profound anti-inflammatory, antispasmodic, tocolytic, and analgesic properties completely analogous to, and sometimes exceeding, those of synthetic pharmaceuticals (Guimarães et al., 2013). These complex plant-derived compounds frequently operate via multiple, synergistic pharmacological pathways. Rather than targeting a single, isolated enzyme like NSAIDs, these herbal extracts can simultaneously downregulate the expression of the COX-2 enzyme, actively inhibit the downstream lipoxygenase (LOX) inflammatory pathway, directly antagonize voltage-gated calcium channels within the myometrium, and significantly enhance local peripheral microcirculation to rapidly reverse ischemic tissue hypoxia (Ramezani &amp; Jalali, 2021).</w:t>
+        <w:t xml:space="preserve">Oxidative stress is fundamentally defined as a severe physiological imbalance wherein the pathological generation of highly reactive, unstable oxygen-containing molecules—specifically Reactive Oxygen Species (ROS) such as the superoxide anion, hydroxyl radical, and hydrogen peroxide—vastly overwhelms the body's endogenous antioxidant defense mechanisms (e.g., superoxide dismutase, catalase, and glutathione peroxidase). In the context of primary dysmenorrhea, this imbalance is not coincidental; it is a direct, catastrophic consequence of the ischemic hypercontractility characterizing the disorder (Song et al., 2025). When the prostaglandin-induced tetanic contractions physically crush the uterine spiral arterioles, the myometrium and endometrium are plunged into profound hypoxia. However, as the uterus intermittently relaxes, blood rushes back into the starved tissue in a violent process known as ischemia-reperfusion injury. This sudden influx of massive quantities of oxygen into severely metabolically stressed tissue triggers an explosive, uncontrollable burst of free radicals from the damaged mitochondria of the smooth muscle and endometrial cells. </w:t>
       </w:r>
     </w:p>
     <w:p>
@@ -632,92 +646,7 @@
           <w:color w:val="000000"/>
           <w:sz w:val="24"/>
         </w:rPr>
-        <w:t>A multitude of rigorous, double-blind, randomized controlled clinical trials have conclusively proven the exceptional efficacy of specific botanical interventions in resolving severe primary dysmenorrhea. For instance, Fennel (</w:t>
-      </w:r>
-      <w:r>
-        <w:rPr>
-          <w:rFonts w:ascii="Times New Roman" w:hAnsi="Times New Roman" w:eastAsia="Times New Roman"/>
-          <w:i/>
-          <w:color w:val="000000"/>
-          <w:sz w:val="24"/>
-        </w:rPr>
-        <w:t>Foeniculum vulgare</w:t>
-      </w:r>
-      <w:r>
-        <w:rPr>
-          <w:rFonts w:ascii="Times New Roman" w:hAnsi="Times New Roman" w:eastAsia="Times New Roman"/>
-          <w:color w:val="000000"/>
-          <w:sz w:val="24"/>
-        </w:rPr>
-        <w:t>), a botanical rich in the potent antispasmodic anethole, has repeatedly demonstrated an ability to significantly reduce both the severity and the duration of acute menstrual pain by acting as a powerful direct relaxant on the uterine smooth muscle, effectively neutralizing hypercontractility (Lee et al., 2020; Ostad et al., 2001). Ginger (</w:t>
-      </w:r>
-      <w:r>
-        <w:rPr>
-          <w:rFonts w:ascii="Times New Roman" w:hAnsi="Times New Roman" w:eastAsia="Times New Roman"/>
-          <w:i/>
-          <w:color w:val="000000"/>
-          <w:sz w:val="24"/>
-        </w:rPr>
-        <w:t>Zingiber officinale</w:t>
-      </w:r>
-      <w:r>
-        <w:rPr>
-          <w:rFonts w:ascii="Times New Roman" w:hAnsi="Times New Roman" w:eastAsia="Times New Roman"/>
-          <w:color w:val="000000"/>
-          <w:sz w:val="24"/>
-        </w:rPr>
-        <w:t>), densely packed with bioactive gingerols and shogaols, has been proven through massive meta-analyses to be statistically equally as effective as prescription mefenamic acid or ibuprofen in eliminating primary dysmenorrhea, functioning primarily through the profound, systemic inhibition of prostaglandin synthesis (Pattanittum et al., 2016). Similarly, Chamomile (</w:t>
-      </w:r>
-      <w:r>
-        <w:rPr>
-          <w:rFonts w:ascii="Times New Roman" w:hAnsi="Times New Roman" w:eastAsia="Times New Roman"/>
-          <w:i/>
-          <w:color w:val="000000"/>
-          <w:sz w:val="24"/>
-        </w:rPr>
-        <w:t>Matricaria chamomilla</w:t>
-      </w:r>
-      <w:r>
-        <w:rPr>
-          <w:rFonts w:ascii="Times New Roman" w:hAnsi="Times New Roman" w:eastAsia="Times New Roman"/>
-          <w:color w:val="000000"/>
-          <w:sz w:val="24"/>
-        </w:rPr>
-        <w:t>), Cinnamon (</w:t>
-      </w:r>
-      <w:r>
-        <w:rPr>
-          <w:rFonts w:ascii="Times New Roman" w:hAnsi="Times New Roman" w:eastAsia="Times New Roman"/>
-          <w:i/>
-          <w:color w:val="000000"/>
-          <w:sz w:val="24"/>
-        </w:rPr>
-        <w:t>Cinnamomum zeylanicum</w:t>
-      </w:r>
-      <w:r>
-        <w:rPr>
-          <w:rFonts w:ascii="Times New Roman" w:hAnsi="Times New Roman" w:eastAsia="Times New Roman"/>
-          <w:color w:val="000000"/>
-          <w:sz w:val="24"/>
-        </w:rPr>
-        <w:t xml:space="preserve">), and complex traditional formulations like </w:t>
-      </w:r>
-      <w:r>
-        <w:rPr>
-          <w:rFonts w:ascii="Times New Roman" w:hAnsi="Times New Roman" w:eastAsia="Times New Roman"/>
-          <w:i/>
-          <w:color w:val="000000"/>
-          <w:sz w:val="24"/>
-        </w:rPr>
-        <w:t>Dangguijagyag-san</w:t>
-      </w:r>
-      <w:r>
-        <w:rPr>
-          <w:rFonts w:ascii="Times New Roman" w:hAnsi="Times New Roman" w:eastAsia="Times New Roman"/>
-          <w:color w:val="000000"/>
-          <w:sz w:val="24"/>
-        </w:rPr>
-        <w:t xml:space="preserve"> have demonstrated profound, scientifically validated antispasmodic and analgesic actions, offering women massive relief without the severe gastrointestinal toxicity or thromboembolic risks intrinsically associated with continuous NSAID or oral contraceptive use (Lee et al., 2016; Rahnama &amp; Montazeri, 2021).</w:t>
+        <w:t>These highly destructive ROS immediately unleash absolute havoc upon the cellular architecture. They aggressively attack the lipid bilayers of the cell membranes in a destructive chain reaction known as lipid peroxidation. The primary byproduct of this lipid peroxidation is malondialdehyde (MDA), a highly stable and exceptionally toxic aldehyde. Clinical studies have consistently demonstrated that women suffering from severe primary dysmenorrhea exhibit massively elevated systemic and local levels of MDA during menstruation compared to healthy controls, providing incontrovertible biochemical proof of severe, active oxidative damage (Szydłowska et al., 2020). Furthermore, ROS directly damage critical cellular proteins and nuclear DNA, triggering massive cellular apoptosis. Crucially, this extreme oxidative stress acts as a potent, direct stimulus for the nuclear factor-kappa B (NF-κB) signaling pathway. The activation of NF-κB is the master trigger for the transcription of a massive array of inflammatory genes, thereby initiating the secondary, equally devastating arm of the dysmenorrheic pathology: the cytokine storm.</w:t>
       </w:r>
     </w:p>
     <w:p>
@@ -731,28 +660,25 @@
           <w:color w:val="000000"/>
           <w:sz w:val="24"/>
         </w:rPr>
-        <w:t xml:space="preserve">The profound scientific validation of these specific botanicals has established a critical, irrefutable precedent: the natural world harbors a massive, largely untapped reservoir of immensely potent, multi-targeted, and highly bioavailable tocolytic and analgesic agents. The successful integration of these herbal medicines into evidence-based clinical practice underscores an urgent, ongoing scientific imperative to systematically screen, rigorously evaluate, and fully characterize other prominent botanicals with strong traditional histories of use in treating inflammatory and spasmodic disorders (Sargin, 2021). Among the myriad of potential candidates, </w:t>
-      </w:r>
-      <w:r>
-        <w:rPr>
-          <w:rFonts w:ascii="Times New Roman" w:hAnsi="Times New Roman" w:eastAsia="Times New Roman"/>
-          <w:i/>
-          <w:color w:val="000000"/>
-          <w:sz w:val="24"/>
-        </w:rPr>
-        <w:t>Syzygium aromaticum</w:t>
-      </w:r>
-      <w:r>
-        <w:rPr>
-          <w:rFonts w:ascii="Times New Roman" w:hAnsi="Times New Roman" w:eastAsia="Times New Roman"/>
-          <w:color w:val="000000"/>
-          <w:sz w:val="24"/>
-        </w:rPr>
-        <w:t>, universally known as clove, has emerged as an exceptionally promising, highly potent botanical subject. Despite an incredibly rich, well-documented history of intense application in traditional medicine for severe pain relief and acute spasm suppression, its specific, isolated efficacy in neutralizing the complex pathophysiology of primary dysmenorrhea remains a critical, unresolved frontier demanding rigorous scientific investigation.</w:t>
+        <w:t>Cytokines are small, highly potent, secreted cell-signaling proteins that orchestrate the immune response. In primary dysmenorrhea, the activation of NF-κB, combined with the initial tissue necrosis from ischemia, triggers the massive recruitment and activation of endometrial macrophages and leukocytes (Song et al., 2025). These activated immune cells pour massive quantities of specific, highly aggressive pro-inflammatory cytokines directly into the local tissue microenvironment, most notably interleukin-6 (IL-6), interleukin-1 beta (IL-1β), and tumor necrosis factor-alpha (TNF-α). These specific cytokines exert profound, deleterious effects that drastically amplify the pain and cramping. First, IL-6 and TNF-α act as powerful, direct upregulators of the cyclooxygenase-2 (COX-2) enzyme. By massively increasing the total expression of COX-2 within the tissue, these cytokines supercharge the synthesis of even more prostaglandins, creating a vicious, self-sustaining loop of inflammation and ischemia (Wan &amp; Yao, 2021). Secondly, these cytokines are intrinsically hyperalgesic; they diffuse into the local tissue and directly bind to receptors on the pelvic visceral C-fibers, drastically lowering the pain threshold and exacerbating the peripheral sensitization already initiated by PGE2 (Li &amp; Wang, 2023). Finally, high systemic levels of these specific cytokines, particularly IL-6 and TNF-α, are directly responsible for the debilitating systemic symptoms so frequently reported by dysmenorrheic patients, including the intense fatigue, severe nausea, and febrile sensations that standard NSAIDs often fail to resolve.</w:t>
       </w:r>
     </w:p>
     <w:p>
       <w:pPr>
+        <w:spacing w:line="360" w:lineRule="auto" w:after="0"/>
+        <w:jc w:val="both"/>
+      </w:pPr>
+      <w:r>
+        <w:rPr>
+          <w:rFonts w:ascii="Times New Roman" w:hAnsi="Times New Roman" w:eastAsia="Times New Roman"/>
+          <w:color w:val="000000"/>
+          <w:sz w:val="24"/>
+        </w:rPr>
+        <w:t>The undeniable implication of this massive oxidative and cytokine-driven pathology is that targeting prostaglandins alone is insufficient for achieving complete resolution of the disorder. A truly optimal, comprehensive therapeutic agent must possess a tripartite pharmacological profile: it must be a potent tocolytic to halt the mechanical ischemia, a powerful, direct free radical scavenger to neutralize the massive ROS burst and prevent ischemia-reperfusion injury, and a robust immunomodulator capable of suppressing the pathological release of IL-6 and TNF-α (Szydłowska et al., 2020). It is specifically within this highly demanding context that the massive, complex phytochemical profiles of certain traditional botanicals—particularly those dense in highly active polyphenols, powerful flavonoids, and antioxidant essential oils—present an unprecedented therapeutic opportunity, offering a holistic pharmacological blockade that synthetic monotherapies simply cannot replicate.</w:t>
+      </w:r>
+    </w:p>
+    <w:p>
+      <w:pPr>
         <w:pStyle w:val="Heading2"/>
         <w:jc w:val="both"/>
       </w:pPr>
@@ -762,7 +688,7 @@
           <w:color w:val="000000"/>
           <w:sz w:val="24"/>
         </w:rPr>
-        <w:t>1.9 Taxonomic Classification and Overview of Syzygium aromaticum</w:t>
+        <w:t>1.9 Animal Models of Dysmenorrhea</w:t>
       </w:r>
     </w:p>
     <w:p>
@@ -773,70 +699,10 @@
       <w:r>
         <w:rPr>
           <w:rFonts w:ascii="Times New Roman" w:hAnsi="Times New Roman" w:eastAsia="Times New Roman"/>
-          <w:i/>
-          <w:color w:val="000000"/>
-          <w:sz w:val="24"/>
-        </w:rPr>
-        <w:t>Syzygium aromaticum</w:t>
-      </w:r>
-      <w:r>
-        <w:rPr>
-          <w:rFonts w:ascii="Times New Roman" w:hAnsi="Times New Roman" w:eastAsia="Times New Roman"/>
-          <w:color w:val="000000"/>
-          <w:sz w:val="24"/>
-        </w:rPr>
-        <w:t xml:space="preserve"> (L.) Merr. &amp; L.M. Perry, universally recognized by its common name "clove," is a profoundly important, highly valuable, and meticulously cultivated medicinal and culinary plant. Botanically, it is classified as a medium-sized, evergreen, tropical tree belonging to the extensive myrtle family, Myrtaceae (Batiha et al., 2020). The genus </w:t>
-      </w:r>
-      <w:r>
-        <w:rPr>
-          <w:rFonts w:ascii="Times New Roman" w:hAnsi="Times New Roman" w:eastAsia="Times New Roman"/>
-          <w:i/>
-          <w:color w:val="000000"/>
-          <w:sz w:val="24"/>
-        </w:rPr>
-        <w:t>Syzygium</w:t>
-      </w:r>
-      <w:r>
-        <w:rPr>
-          <w:rFonts w:ascii="Times New Roman" w:hAnsi="Times New Roman" w:eastAsia="Times New Roman"/>
-          <w:color w:val="000000"/>
-          <w:sz w:val="24"/>
-        </w:rPr>
-        <w:t xml:space="preserve"> is massive, comprising over 1,200 distinct species distributed widely across the tropical and subtropical regions of the Old World, yet </w:t>
-      </w:r>
-      <w:r>
-        <w:rPr>
-          <w:rFonts w:ascii="Times New Roman" w:hAnsi="Times New Roman" w:eastAsia="Times New Roman"/>
-          <w:i/>
-          <w:color w:val="000000"/>
-          <w:sz w:val="24"/>
-        </w:rPr>
-        <w:t>Syzygium aromaticum</w:t>
-      </w:r>
-      <w:r>
-        <w:rPr>
-          <w:rFonts w:ascii="Times New Roman" w:hAnsi="Times New Roman" w:eastAsia="Times New Roman"/>
-          <w:color w:val="000000"/>
-          <w:sz w:val="24"/>
-        </w:rPr>
-        <w:t xml:space="preserve"> remains the absolute most economically and pharmacologically significant member of the entire lineage (Devkota &amp; Devkota, 2022). Taxonomically, the plant is organized within the kingdom Plantae, the clade Angiosperms (flowering plants), the clade Eudicots, the clade Rosids, the massive order Myrtales, the family Myrtaceae, and the genus </w:t>
-      </w:r>
-      <w:r>
-        <w:rPr>
-          <w:rFonts w:ascii="Times New Roman" w:hAnsi="Times New Roman" w:eastAsia="Times New Roman"/>
-          <w:i/>
-          <w:color w:val="000000"/>
-          <w:sz w:val="24"/>
-        </w:rPr>
-        <w:t>Syzygium</w:t>
-      </w:r>
-      <w:r>
-        <w:rPr>
-          <w:rFonts w:ascii="Times New Roman" w:hAnsi="Times New Roman" w:eastAsia="Times New Roman"/>
-          <w:color w:val="000000"/>
-          <w:sz w:val="24"/>
-        </w:rPr>
-        <w:t>. The species is indigenous to the remote Maluku Islands (historically renowned as the "Spice Islands") of eastern Indonesia. However, owing to its immense global demand and exorbitant historical value in both the spice trade and traditional medicine, its intense commercial cultivation has expanded massively over centuries to encompass various tropical zones globally, including Madagascar, Tanzania (specifically the Zanzibar archipelago), Sri Lanka, India, and vast swathes of South America (Karabacak &amp; Sener, 2021).</w:t>
+          <w:color w:val="000000"/>
+          <w:sz w:val="24"/>
+        </w:rPr>
+        <w:t>The rigorous, systematic, and reproducible evaluation of novel tocolytic agents demands highly sophisticated experimental paradigms. While the isolated murine uterine organ bath provides unparalleled, artifact-free data regarding the direct biomechanical relaxation of smooth muscle, evaluating the complex, multi-systemic efficacy of a therapeutic agent against the true pathogenesis of primary dysmenorrhea necessitates the use of robust in vivo animal models (Hartmann &amp; Mohamed, 2021). Because laboratory rodents do not naturally experience menstruation or the spontaneous, cyclical pelvic hyperalgesia characteristic of human dysmenorrhea, pharmacologists must artificially induce a state of severe, acute uterine hypercontractility and profound visceral pain that perfectly mimics the human condition. Over decades of intensive pharmacological refinement, the "Estradiol Benzoate and Oxytocin Induction Model" in female mice has unequivocally emerged as the absolute, gold-standard, and most globally utilized experimental protocol for testing novel antidysmenorrhea compounds (Sari &amp; Sutrisno, 2022).</w:t>
       </w:r>
     </w:p>
     <w:p>
@@ -850,24 +716,7 @@
           <w:color w:val="000000"/>
           <w:sz w:val="24"/>
         </w:rPr>
-        <w:t xml:space="preserve">The clove tree typically reaches an impressive height of 8 to 12 meters, distinguished by a dense, highly aromatic canopy composed of large, opposite, ovate-lanceolate leaves that are highly coriaceous (leathery) and deeply studded with massive quantities of visible, translucent secretory glands heavily laden with potent essential oils. However, it is the deeply pigmented, unopened floral buds—the actual "cloves" of commerce—that possess the highest, most concentrated pharmacological value (Batiha et al., 2020). These massive floral buds are meticulously hand-harvested precisely when the fleshy lower receptacle (hypanthium) transitions from a pale green to an intense, vibrant crimson red, just prior to the unfurling of the delicate white petals. Following harvest, these buds are subjected to rigorous, controlled sun-drying until they rapidly desiccate, turning a deep, characteristic dark brown, simultaneously shrinking and hardening into their familiar nail-like morphology (the word "clove" is derived directly from the Latin </w:t>
-      </w:r>
-      <w:r>
-        <w:rPr>
-          <w:rFonts w:ascii="Times New Roman" w:hAnsi="Times New Roman" w:eastAsia="Times New Roman"/>
-          <w:i/>
-          <w:color w:val="000000"/>
-          <w:sz w:val="24"/>
-        </w:rPr>
-        <w:t>clavus</w:t>
-      </w:r>
-      <w:r>
-        <w:rPr>
-          <w:rFonts w:ascii="Times New Roman" w:hAnsi="Times New Roman" w:eastAsia="Times New Roman"/>
-          <w:color w:val="000000"/>
-          <w:sz w:val="24"/>
-        </w:rPr>
-        <w:t xml:space="preserve">, meaning nail). </w:t>
+        <w:t xml:space="preserve">The scientific rationale underpinning this specific induction model is deeply rooted in the fundamental neuroendocrinology and physiology of the myometrium. In human primary dysmenorrhea, the extreme tetanic contractions are generated by a highly sensitized, estrogen-primed uterus that is subsequently bombarded by massive surges of uterotonics (specifically prostaglandins, though oxytocin and vasopressin also play crucial synergistic roles). The murine model meticulously recreates this exact pathophysiological environment through a highly precise, two-step pharmacological sensitization and induction protocol (Ma &amp; Li, 2022). </w:t>
       </w:r>
     </w:p>
     <w:p>
@@ -881,28 +730,53 @@
           <w:color w:val="000000"/>
           <w:sz w:val="24"/>
         </w:rPr>
-        <w:t xml:space="preserve">Historically, these intensely aromatic, dried flower buds have commanded extraordinary value not merely as a potent culinary flavoring agent, but as a foundational, indispensable pillar of traditional medical systems worldwide (Karabacak &amp; Sener, 2021). In Traditional Chinese Medicine (TCM), Ayurveda, and Unani Tibb, clove has been revered for millennia as a supremely potent, multi-functional therapeutic agent (Devkota &amp; Devkota, 2022). It has been exhaustively utilized to rapidly resolve acute dental neuralgia, to forcefully expel intestinal parasites, to powerfully mitigate severe gastrointestinal spasms and dyspepsia, and to effectively treat severe, acute respiratory infections due to its profound bronchodilatory and intense antimicrobial actions. The immense, documented historical efficacy of </w:t>
-      </w:r>
-      <w:r>
-        <w:rPr>
-          <w:rFonts w:ascii="Times New Roman" w:hAnsi="Times New Roman" w:eastAsia="Times New Roman"/>
-          <w:i/>
-          <w:color w:val="000000"/>
-          <w:sz w:val="24"/>
-        </w:rPr>
-        <w:t>Syzygium aromaticum</w:t>
-      </w:r>
-      <w:r>
-        <w:rPr>
-          <w:rFonts w:ascii="Times New Roman" w:hAnsi="Times New Roman" w:eastAsia="Times New Roman"/>
-          <w:color w:val="000000"/>
-          <w:sz w:val="24"/>
-        </w:rPr>
-        <w:t xml:space="preserve"> across such diverse and severe medical applications unequivocally signals the presence of exceptionally potent, highly concentrated bioactive phytochemicals within its cellular matrix. This robust historical precedent establishes clove as a prime, incredibly promising botanical candidate for rigorous, contemporary pharmacological analysis, particularly in the targeted search for novel, highly efficacious anti-inflammatory, antispasmodic, and profound analgesic therapeutics capable of neutralizing the complex pathophysiology of dysmenorrhea.</w:t>
+        <w:t>The first crucial step is the massive, systemic sensitization of the murine uterus. To achieve this, non-pregnant, cycling female mice are administered a potent, long-acting synthetic estrogen, specifically estradiol benzoate. This administration is typically performed subcutaneously or intraperitoneally over a period of 24 to 48 hours prior to the actual pain induction. The massive influx of exogenous estradiol completely overrides the animal's natural estrous cycle, driving the entire reproductive tract into an artificially prolonged, extreme state of proestrus or early estrus (Sari &amp; Sutrisno, 2022). More importantly, this severe hyper-estrogenization triggers a massive, systemic genomic response within the myometrial smooth muscle cells. The estrogen acts directly on nuclear receptors to drastically upregulate the transcription and translation of oxytocin receptors (OXTRs) and gap junction proteins, specifically connexin-43 (Shi &amp; Jia, 2022). By forcing the massive proliferation of these critical receptors and electrical conduits, the estradiol benzoate dramatically lowers the resting membrane potential of the smooth muscle cells, creating an incredibly tense, highly interconnected syncytium that is exquisitely sensitized to any uterotonic stimulus. The uterus is essentially transformed into a primed, highly reactive mechanical explosive, structurally prepared to mount massive, coordinated, and sustained contractions (Ma &amp; Li, 2022).</w:t>
       </w:r>
     </w:p>
     <w:p>
       <w:pPr>
+        <w:spacing w:line="360" w:lineRule="auto" w:after="0"/>
+        <w:jc w:val="both"/>
+      </w:pPr>
+      <w:r>
+        <w:rPr>
+          <w:rFonts w:ascii="Times New Roman" w:hAnsi="Times New Roman" w:eastAsia="Times New Roman"/>
+          <w:color w:val="000000"/>
+          <w:sz w:val="24"/>
+        </w:rPr>
+        <w:t xml:space="preserve">The second step is the acute, violent induction of the actual dysmenorrheic pain episode. Once the uterus is fully sensitized by the estradiol, the mice are administered a massive, acute, high-dose injection of synthetic oxytocin (typically via the intraperitoneal route). The exogenous oxytocin immediately binds to the vastly upregulated population of OXTRs on the myometrial membrane, triggering a catastrophic intracellular cascade. The binding activates the Gq-protein coupled pathway, leading to a massive, explosive release of calcium from the sarcoplasmic reticulum and a rapid influx of extracellular calcium (Lestariningsih et al., 2024). This sudden, massive spike in intracellular calcium binds to calmodulin, activating myosin light chain kinase and resulting in immediate, severe, tetanic, and highly ischemic hypercontractions of the uterine horns. This artificially induced ischemic hypercontractility flawlessly mirrors the mechanical crushing of the uterine vasculature seen in human dysmenorrhea, generating the exact same anoxic tissue environment, lactic acid accumulation, and profound visceral pain signaling (Hartmann &amp; Mohamed, 2021). </w:t>
+      </w:r>
+    </w:p>
+    <w:p>
+      <w:pPr>
+        <w:spacing w:line="360" w:lineRule="auto" w:after="0"/>
+        <w:jc w:val="both"/>
+      </w:pPr>
+      <w:r>
+        <w:rPr>
+          <w:rFonts w:ascii="Times New Roman" w:hAnsi="Times New Roman" w:eastAsia="Times New Roman"/>
+          <w:color w:val="000000"/>
+          <w:sz w:val="24"/>
+        </w:rPr>
+        <w:t xml:space="preserve">The resulting extreme visceral agony manifests instantly and spectacularly in the mouse through highly characteristic, involuntary behavioral pain responses universally recognized as "writhing." A typical writhe is clinically defined as a severe, spastic contraction of the abdominal musculature, accompanied by an extreme, unnatural extension of the hind limbs and a severe arching or torsion of the entire torso, as the animal violently attempts to alleviate the acute pelvic pressure (Liu &amp; Chen, 2020). By isolating the animals in controlled observation chambers and meticulously counting the exact number of these specific writhing episodes over a precise timeframe (typically 30 minutes following the oxytocin injection), pharmacologists obtain a highly objective, quantifiable, and reproducible metric of the severity of the dysmenorrheic pain. </w:t>
+      </w:r>
+    </w:p>
+    <w:p>
+      <w:pPr>
+        <w:spacing w:line="360" w:lineRule="auto" w:after="0"/>
+        <w:jc w:val="both"/>
+      </w:pPr>
+      <w:r>
+        <w:rPr>
+          <w:rFonts w:ascii="Times New Roman" w:hAnsi="Times New Roman" w:eastAsia="Times New Roman"/>
+          <w:color w:val="000000"/>
+          <w:sz w:val="24"/>
+        </w:rPr>
+        <w:t>This model is exceptionally robust. If a novel test substance, such as a botanical extract or a synthetic pharmaceutical, is administered prophylactically prior to the oxytocin challenge, its precise in vivo efficacy can be directly measured (Sari &amp; Sutrisno, 2022). A highly effective tocolytic or analgesic agent will significantly, and in a dose-dependent manner, suppress the total number of observed writhes compared to an untreated control group. Furthermore, this specific model allows for the direct, head-to-head comparison of novel extracts against established, gold-standard clinical therapies, such as ibuprofen or diclofenac, providing incontrovertible, actionable in vivo validation of the extract's true pharmacological capacity to neutralize the complex, multi-systemic agony of primary dysmenorrhea (Ma &amp; Li, 2022).</w:t>
+      </w:r>
+    </w:p>
+    <w:p>
+      <w:pPr>
         <w:pStyle w:val="Heading2"/>
         <w:jc w:val="both"/>
       </w:pPr>
@@ -912,7 +786,7 @@
           <w:color w:val="000000"/>
           <w:sz w:val="24"/>
         </w:rPr>
-        <w:t>1.10 Acute Oral Toxicity</w:t>
+        <w:t>1.10 Drugs Implicated in the Management of Dysmenorrhea</w:t>
       </w:r>
     </w:p>
     <w:p>
@@ -926,7 +800,7 @@
           <w:color w:val="000000"/>
           <w:sz w:val="24"/>
         </w:rPr>
-        <w:t>While the global resurgence of interest in herbal medicine is driven by the profound pharmacological potential and the widespread public perception that "natural" inherently equates to "safe," rigorous scientific and toxicological evaluation is an absolute, non-negotiable prerequisite before any botanical extract can be considered a viable therapeutic candidate (Pal &amp; Dutta, 2022). The profound reality of pharmacognosy is that many potent medicinal plants harbor complex, biologically active secondary metabolites that, while highly therapeutic at optimized dosages, can become immensely toxic, mutagenic, or overtly lethal when administered incorrectly, at elevated concentrations, or as unregulated crude extracts. Therefore, definitively establishing the precise safety profile and the specific toxicological margins of a botanical extract is just as critical—if not more so—than proving its intended pharmacological efficacy. The fundamental baseline for this entire safety evaluation is the acute oral toxicity study (Graves, 2019).</w:t>
+        <w:t>Given that the definitive physiological origin of primary dysmenorrhea lies in the pathological overproduction of prostaglandins and the subsequent cascade of severe, ischemic uterine hypercontractility, contemporary pharmacological management is overwhelmingly directed toward breaking this specific pathogenic chain. The cornerstone of evidence-based medical intervention relies fundamentally on two primary classes of synthetic pharmaceuticals: Non-Steroidal Anti-Inflammatory Drugs (NSAIDs) and Combined Oral Contraceptives (COCs) (Marjoribanks et al., 2015; Wong et al., 2009). These two established modalities, utilized either as monotherapy or in a synergistic combination, currently constitute the undisputed, universally recommended first-line treatment protocols across all major global gynecological guidelines (Burnett &amp; Lemyre, 2017).</w:t>
       </w:r>
     </w:p>
     <w:p>
@@ -940,7 +814,7 @@
           <w:color w:val="000000"/>
           <w:sz w:val="24"/>
         </w:rPr>
-        <w:t>Acute oral toxicity testing is a highly standardized, rigorously controlled, early-stage in vivo pharmacological procedure designed specifically to determine the massive, immediate, and potentially lethal adverse effects that manifest within a short timeframe (typically 14 days) following the single, high-dose administration of a specific test substance (OECD, 2002). This critical evaluation provides the foundational, indispensable toxicological data required to classify the acute hazard potential of the extract, clearly delineate its precise safety margins, definitively establish the No-Observed-Adverse-Effect Level (NOAEL), and strictly guide the selection of safe, sub-lethal dosages for all subsequent, longer-term efficacy studies. Historically, this required massive animal sacrifice to determine the precise LD50 (the exact dose lethal to 50% of the test population). However, modern ethical mandates and stringent animal welfare regulations have completely revolutionized this approach (Sánchez &amp; García, 2022).</w:t>
+        <w:t>Non-Steroidal Anti-Inflammatory Drugs (NSAIDs), such as ibuprofen, naproxen, mefenamic acid, and diclofenac, represent the absolute vanguard of targeted, first-line therapy for primary dysmenorrhea (Marjoribanks et al., 2015). Their mechanism of action is incredibly precise and directly antagonistic to the core pathophysiology of the disorder: NSAIDs act as potent, competitive inhibitors of the cyclooxygenase (COX) enzyme system, the critical bottleneck catalyst responsible for the oxidative conversion of arachidonic acid into the massive surge of prostaglandins (PGF2α and PGE2) (Rouzer &amp; Marnett, 2009). By systematically blocking the catalytic activity of both the constitutive COX-1 and the highly inducible COX-2 isoforms, NSAIDs effectively shut down the entire downstream arachidonic acid cascade within the sloughing endometrium. This profound, targeted biochemical blockade drastically curtails the synthesis and accumulation of potent uterotonic prostaglandins, thereby preventing the initiation of severe myometrial hypercontractility, restoring normal uterine blood flow, eliminating tissue ischemia, and ultimately extinguishing the peripheral pain signal at its origin (Dawood, 1984). Extensive meta-analyses have repeatedly confirmed that NSAIDs are significantly superior to placebo in providing robust, rapid, and sustained relief from acute menstrual cramping (Marjoribanks et al., 2015).</w:t>
       </w:r>
     </w:p>
     <w:p>
@@ -954,7 +828,7 @@
           <w:color w:val="000000"/>
           <w:sz w:val="24"/>
         </w:rPr>
-        <w:t xml:space="preserve">Contemporary toxicological evaluations are strictly governed by highly optimized, globally recognized regulatory protocols, most notably the Organization for Economic Co-operation and Development (OECD) Guidelines for the Testing of Chemicals. Specifically, the OECD Test Guideline 423 (Acute Toxic Class Method) and Guideline 425 (Up-and-Down Procedure) represent the absolute gold standards in modern toxicological screening (Monica &amp; Kumar, 2021). These revolutionary protocols are meticulously designed to maximize the extraction of critical toxicological data while drastically minimizing the total number of live animals utilized. They achieve this through a highly precise, step-wise, sequential dosing strategy utilizing extremely small, tightly controlled cohorts of animals (typically three female mice per step) (OECD, 2002). The starting dose is explicitly selected from a set of fixed, standardized levels (e.g., 5, 50, 300, or 2000 mg/kg) based entirely on any pre-existing toxicological data. Following administration, the animals are subjected to intense, continuous clinical observation, rigorously monitoring for profound changes in the skin and fur, radical shifts in respiratory or cardiovascular function, severe neurological manifestations (such as tremors, severe convulsions, or profound lethargy), extreme behavioral alterations, and ultimately, mortality (Singh &amp; Singh, 2021). </w:t>
+        <w:t xml:space="preserve">Combined Oral Contraceptives (COCs) provide a highly effective, alternative, or adjunctive first-line therapeutic approach, functioning via a fundamentally different mechanism. Composed of synthetic estrogen and progestin, COCs operate by exerting profound, continuous negative feedback on the Hypothalamic-Pituitary-Ovarian (HPO) axis, thereby suppressing the mid-cycle luteinizing hormone (LH) surge and medically abolishing ovulation entirely (Wong et al., 2009). By preventing ovulation, COCs fundamentally disrupt the hormonal prerequisites necessary for the massive proliferation of the endometrial stratum functionalis. The continuous delivery of synthetic progestin creates a thin, highly atrophic, and relatively inactive endometrial lining. Consequently, when the withdrawal bleed (a hormonally induced pseudo-menstruation) occurs during the placebo week, there is an incredibly minimal volume of endometrial tissue available to break down. This massive reduction in tissue volume directly correlates to a vastly diminished capacity for the synthesis and release of arachidonic acid and prostaglandins (Wong et al., 2009). By preemptively downregulating the total substrate available for prostaglandin synthesis, COCs effectively lower the baseline intrauterine pressure and completely prevent the severe, spastic hypercontractility characteristic of dysmenorrhea. </w:t>
       </w:r>
     </w:p>
     <w:p>
@@ -968,24 +842,7 @@
           <w:color w:val="000000"/>
           <w:sz w:val="24"/>
         </w:rPr>
-        <w:t xml:space="preserve">If survival is confirmed at a specific dose, the protocol systematically dictates progression to the next highest dose level, meticulously continuing this sequence until profound toxicity is observed or the predefined, maximum limit dose (usually 2000 mg/kg or occasionally 5000 mg/kg) is successfully reached without any fatal outcomes (Pal &amp; Dutta, 2022). The survival of the animal cohort at these massive limit doses definitively categorizes the substance as "unclassified" or essentially non-toxic under acute oral exposure, effectively green-lighting the extract for widespread pharmacological application (Madhavi &amp; Rao, 2022). Therefore, conducting a rigorous, OECD-compliant acute oral toxicity study on the ethanolic extract of </w:t>
-      </w:r>
-      <w:r>
-        <w:rPr>
-          <w:rFonts w:ascii="Times New Roman" w:hAnsi="Times New Roman" w:eastAsia="Times New Roman"/>
-          <w:i/>
-          <w:color w:val="000000"/>
-          <w:sz w:val="24"/>
-        </w:rPr>
-        <w:t>Syzygium aromaticum</w:t>
-      </w:r>
-      <w:r>
-        <w:rPr>
-          <w:rFonts w:ascii="Times New Roman" w:hAnsi="Times New Roman" w:eastAsia="Times New Roman"/>
-          <w:color w:val="000000"/>
-          <w:sz w:val="24"/>
-        </w:rPr>
-        <w:t xml:space="preserve"> is an absolute, non-negotiable scientific mandate to unequivocally validate its safety profile prior to evaluating its complex, multi-pathway efficacy in reversing the severe pathophysiology of primary dysmenorrhea.</w:t>
+        <w:t>However, despite their proven efficacy, neither NSAIDs nor COCs provide a universal panacea, and their widespread clinical utility is severely limited by a formidable array of adverse drug reactions, absolute contraindications, and high rates of clinical failure (Oladosu et al., 2018). The indiscriminate inhibition of COX enzymes by non-selective NSAIDs profoundly suppresses the synthesis of cytoprotective prostaglandins within the gastric mucosa, exposing patients to severe gastrointestinal toxicities, ranging from chronic dyspepsia and nausea to life-threatening peptic ulceration and catastrophic gastrointestinal hemorrhage, particularly with long-term, high-dose administration (Navarro &amp; Sánchez, 2022). Furthermore, NSAID use carries well-documented risks of nephrotoxicity, hepatotoxicity, and exacerbation of reactive airway diseases like asthma. COCs also carry a significant burden of side effects, including severe mood lability, undesirable weight gain, debilitating migraines, extreme breast tenderness, and a profoundly elevated, life-threatening risk of developing venous thromboembolism (VTE), deep vein thrombosis (DVT), and pulmonary embolism, especially in individuals with a high BMI or a history of smoking (Smith et al., 2024). Even more concerning is the phenomenon of pharmacological resistance: an estimated 15% to 25% of women suffering from severe primary dysmenorrhea are completely refractory to maximum tolerated doses of both NSAIDs and COCs, deriving absolutely zero clinical relief and remaining trapped in severe, cyclical agony (Oladosu et al., 2018). This significant failure rate, combined with the severe, dose-limiting toxicity profile of existing synthetics, has catalyzed an urgent, global scientific mandate to aggressively discover, rigorously evaluate, and develop novel, highly efficacious, and significantly safer alternative tocolytic and analgesic therapeutics, with massive attention currently shifting toward the vast, untapped pharmacological potential of phytomedicine (Sargin, 2021).</w:t>
       </w:r>
     </w:p>
     <w:p>
@@ -999,7 +856,7 @@
           <w:color w:val="000000"/>
           <w:sz w:val="24"/>
         </w:rPr>
-        <w:t>1.11 Rationale of the Study</w:t>
+        <w:t>1.11 Herbal Medicines</w:t>
       </w:r>
     </w:p>
     <w:p>
@@ -1013,7 +870,7 @@
           <w:color w:val="000000"/>
           <w:sz w:val="24"/>
         </w:rPr>
-        <w:t>Primary dysmenorrhea represents a massive, debilitating global health crisis, afflicting up to 95% of reproductive-aged women and causing an immense, catastrophic burden of physical agony, systemic distress, and profound socioeconomic loss due to widespread school and occupational absenteeism (Ding et al., 2021). The foundational pathophysiology of this disorder is undeniably driven by the pathological overproduction of prostaglandins, triggering severe, ischemic, hypercontractile uterine spasms (Dawood, 2006). Current pharmacological reliance on Non-Steroidal Anti-Inflammatory Drugs (NSAIDs) and Combined Oral Contraceptives (COCs) is fundamentally flawed and grossly inadequate. These standard synthetic interventions are severely hampered by dangerous, life-threatening adverse effects—including catastrophic gastrointestinal ulceration, severe hepatotoxicity, and massive thromboembolic risks—and they exhibit an alarming, high clinical failure rate, leaving nearly a quarter of all patients completely refractory to treatment and trapped in a cycle of unremitting pain (Oladosu et al., 2018).</w:t>
+        <w:t xml:space="preserve">In direct response to the severe limitations, widespread therapeutic failures, and potentially devastating side effects associated with chronic NSAID and synthetic hormonal therapies, there has been a massive, global resurgence of scientific and clinical interest in exploring the vast pharmacological potential of herbal medicines and traditional phytotherapy for the management of primary dysmenorrhea (Sargin, 2021). For millennia, indigenous cultures and traditional medical systems across the world—ranging from Traditional Chinese Medicine (TCM) and Indian Ayurveda to African ethnomedicine and Western herbalism—have relied heavily on a vast compendium of specific botanical extracts, complex herbal formulations, and essential oils to successfully mitigate menstrual pain, regulate highly erratic cycles, and completely resolve severe pelvic cramping (Aziz et al., 2018). While these ancestral remedies were historically dismissed by allopathic medicine as mere folklore or potent placebo effects, contemporary pharmacological research has fundamentally validated their efficacy, proving that many of these botanicals contain incredibly potent, highly active phytochemical constituents that exert complex, measurable, and highly specific physiological effects (Kaur &amp; Kaushal, 2019). </w:t>
       </w:r>
     </w:p>
     <w:p>
@@ -1027,41 +884,7 @@
           <w:color w:val="000000"/>
           <w:sz w:val="24"/>
         </w:rPr>
-        <w:t xml:space="preserve">This profound clinical failure has catalyzed an urgent, absolute scientific mandate to aggressively discover novel, highly efficacious, and significantly safer alternative tocolytic therapies. The massive resurgence of interest in traditional botanical medicines is completely justified; however, these natural remedies require rigorous, uncompromising scientific validation. </w:t>
-      </w:r>
-      <w:r>
-        <w:rPr>
-          <w:rFonts w:ascii="Times New Roman" w:hAnsi="Times New Roman" w:eastAsia="Times New Roman"/>
-          <w:i/>
-          <w:color w:val="000000"/>
-          <w:sz w:val="24"/>
-        </w:rPr>
-        <w:t>Syzygium aromaticum</w:t>
-      </w:r>
-      <w:r>
-        <w:rPr>
-          <w:rFonts w:ascii="Times New Roman" w:hAnsi="Times New Roman" w:eastAsia="Times New Roman"/>
-          <w:color w:val="000000"/>
-          <w:sz w:val="24"/>
-        </w:rPr>
-        <w:t xml:space="preserve"> (clove) has emerged as an exceptionally potent candidate, boasting a massive historical precedent in traditional medicine for resolving severe pain and acute spasms (Batiha et al., 2020). Modern phytochemical screening confirms that clove is a highly concentrated reservoir of exceptionally potent bioactive compounds, specifically eugenol, which is known to possess powerful anti-inflammatory, anesthetic, and antispasmodic properties (Kamatou et al., 2012). Despite these immense capabilities, there is a massive, critical void in contemporary pharmacological literature regarding the specific, direct evaluation of the ethanolic extract of </w:t>
-      </w:r>
-      <w:r>
-        <w:rPr>
-          <w:rFonts w:ascii="Times New Roman" w:hAnsi="Times New Roman" w:eastAsia="Times New Roman"/>
-          <w:i/>
-          <w:color w:val="000000"/>
-          <w:sz w:val="24"/>
-        </w:rPr>
-        <w:t>S. aromaticum</w:t>
-      </w:r>
-      <w:r>
-        <w:rPr>
-          <w:rFonts w:ascii="Times New Roman" w:hAnsi="Times New Roman" w:eastAsia="Times New Roman"/>
-          <w:color w:val="000000"/>
-          <w:sz w:val="24"/>
-        </w:rPr>
-        <w:t xml:space="preserve"> flower buds in directly neutralizing the exact, complex pathophysiology of primary dysmenorrhea. </w:t>
+        <w:t>Modern scientific investigations into these traditional botanical medicines have isolated an immense array of bioactive secondary metabolites—including complex flavonoids, highly volatile essential oils (terpenes and terpenoids), potent alkaloids, and specialized phenolic compounds—that exhibit profound anti-inflammatory, antispasmodic, tocolytic, and analgesic properties completely analogous to, and sometimes exceeding, those of synthetic pharmaceuticals (Guimarães et al., 2013). These complex plant-derived compounds frequently operate via multiple, synergistic pharmacological pathways. Rather than targeting a single, isolated enzyme like NSAIDs, these herbal extracts can simultaneously downregulate the expression of the COX-2 enzyme, actively inhibit the downstream lipoxygenase (LOX) inflammatory pathway, directly antagonize voltage-gated calcium channels within the myometrium, and significantly enhance local peripheral microcirculation to rapidly reverse ischemic tissue hypoxia (Ramezani &amp; Jalali, 2021).</w:t>
       </w:r>
     </w:p>
     <w:p>
@@ -1075,7 +898,7 @@
           <w:color w:val="000000"/>
           <w:sz w:val="24"/>
         </w:rPr>
-        <w:t xml:space="preserve">Therefore, this study is absolutely critical. It aims to bridge this massive scientific gap by systematically and rigorously evaluating both the acute oral safety profile (via stringent OECD guidelines) and the specific, multi-pathway tocolytic efficacy of the ethanolic extract of </w:t>
+        <w:t>A multitude of rigorous, double-blind, randomized controlled clinical trials have conclusively proven the exceptional efficacy of specific botanical interventions in resolving severe primary dysmenorrhea. For instance, Fennel (</w:t>
       </w:r>
       <w:r>
         <w:rPr>
@@ -1084,19 +907,118 @@
           <w:color w:val="000000"/>
           <w:sz w:val="24"/>
         </w:rPr>
-        <w:t>S. aromaticum</w:t>
-      </w:r>
-      <w:r>
-        <w:rPr>
-          <w:rFonts w:ascii="Times New Roman" w:hAnsi="Times New Roman" w:eastAsia="Times New Roman"/>
-          <w:color w:val="000000"/>
-          <w:sz w:val="24"/>
-        </w:rPr>
-        <w:t xml:space="preserve"> flower buds using the gold-standard, isolated murine uterine model. This research is not merely exploratory; it is an essential, highly targeted scientific effort to definitively validate a potent, natural, and vastly safer alternative for millions of women suffering from the severe, unaddressed agony of primary dysmenorrhea.</w:t>
+        <w:t>Foeniculum vulgare</w:t>
+      </w:r>
+      <w:r>
+        <w:rPr>
+          <w:rFonts w:ascii="Times New Roman" w:hAnsi="Times New Roman" w:eastAsia="Times New Roman"/>
+          <w:color w:val="000000"/>
+          <w:sz w:val="24"/>
+        </w:rPr>
+        <w:t>), a botanical rich in the potent antispasmodic anethole, has repeatedly demonstrated an ability to significantly reduce both the severity and the duration of acute menstrual pain by acting as a powerful direct relaxant on the uterine smooth muscle, effectively neutralizing hypercontractility (Lee et al., 2020; Ostad et al., 2001). Ginger (</w:t>
+      </w:r>
+      <w:r>
+        <w:rPr>
+          <w:rFonts w:ascii="Times New Roman" w:hAnsi="Times New Roman" w:eastAsia="Times New Roman"/>
+          <w:i/>
+          <w:color w:val="000000"/>
+          <w:sz w:val="24"/>
+        </w:rPr>
+        <w:t>Zingiber officinale</w:t>
+      </w:r>
+      <w:r>
+        <w:rPr>
+          <w:rFonts w:ascii="Times New Roman" w:hAnsi="Times New Roman" w:eastAsia="Times New Roman"/>
+          <w:color w:val="000000"/>
+          <w:sz w:val="24"/>
+        </w:rPr>
+        <w:t>), densely packed with bioactive gingerols and shogaols, has been proven through massive meta-analyses to be statistically equally as effective as prescription mefenamic acid or ibuprofen in eliminating primary dysmenorrhea, functioning primarily through the profound, systemic inhibition of prostaglandin synthesis (Pattanittum et al., 2016). Similarly, Chamomile (</w:t>
+      </w:r>
+      <w:r>
+        <w:rPr>
+          <w:rFonts w:ascii="Times New Roman" w:hAnsi="Times New Roman" w:eastAsia="Times New Roman"/>
+          <w:i/>
+          <w:color w:val="000000"/>
+          <w:sz w:val="24"/>
+        </w:rPr>
+        <w:t>Matricaria chamomilla</w:t>
+      </w:r>
+      <w:r>
+        <w:rPr>
+          <w:rFonts w:ascii="Times New Roman" w:hAnsi="Times New Roman" w:eastAsia="Times New Roman"/>
+          <w:color w:val="000000"/>
+          <w:sz w:val="24"/>
+        </w:rPr>
+        <w:t>), Cinnamon (</w:t>
+      </w:r>
+      <w:r>
+        <w:rPr>
+          <w:rFonts w:ascii="Times New Roman" w:hAnsi="Times New Roman" w:eastAsia="Times New Roman"/>
+          <w:i/>
+          <w:color w:val="000000"/>
+          <w:sz w:val="24"/>
+        </w:rPr>
+        <w:t>Cinnamomum zeylanicum</w:t>
+      </w:r>
+      <w:r>
+        <w:rPr>
+          <w:rFonts w:ascii="Times New Roman" w:hAnsi="Times New Roman" w:eastAsia="Times New Roman"/>
+          <w:color w:val="000000"/>
+          <w:sz w:val="24"/>
+        </w:rPr>
+        <w:t xml:space="preserve">), and complex traditional formulations like </w:t>
+      </w:r>
+      <w:r>
+        <w:rPr>
+          <w:rFonts w:ascii="Times New Roman" w:hAnsi="Times New Roman" w:eastAsia="Times New Roman"/>
+          <w:i/>
+          <w:color w:val="000000"/>
+          <w:sz w:val="24"/>
+        </w:rPr>
+        <w:t>Dangguijagyag-san</w:t>
+      </w:r>
+      <w:r>
+        <w:rPr>
+          <w:rFonts w:ascii="Times New Roman" w:hAnsi="Times New Roman" w:eastAsia="Times New Roman"/>
+          <w:color w:val="000000"/>
+          <w:sz w:val="24"/>
+        </w:rPr>
+        <w:t xml:space="preserve"> have demonstrated profound, scientifically validated antispasmodic and analgesic actions, offering women massive relief without the severe gastrointestinal toxicity or thromboembolic risks intrinsically associated with continuous NSAID or oral contraceptive use (Lee et al., 2016; Rahnama &amp; Montazeri, 2021).</w:t>
       </w:r>
     </w:p>
     <w:p>
       <w:pPr>
+        <w:spacing w:line="360" w:lineRule="auto" w:after="0"/>
+        <w:jc w:val="both"/>
+      </w:pPr>
+      <w:r>
+        <w:rPr>
+          <w:rFonts w:ascii="Times New Roman" w:hAnsi="Times New Roman" w:eastAsia="Times New Roman"/>
+          <w:color w:val="000000"/>
+          <w:sz w:val="24"/>
+        </w:rPr>
+        <w:t xml:space="preserve">The profound scientific validation of these specific botanicals has established a critical, irrefutable precedent: the natural world harbors a massive, largely untapped reservoir of immensely potent, multi-targeted, and highly bioavailable tocolytic and analgesic agents. The successful integration of these herbal medicines into evidence-based clinical practice underscores an urgent, ongoing scientific imperative to systematically screen, rigorously evaluate, and fully characterize other prominent botanicals with strong traditional histories of use in treating inflammatory and spasmodic disorders (Sargin, 2021). Among the myriad of potential candidates, </w:t>
+      </w:r>
+      <w:r>
+        <w:rPr>
+          <w:rFonts w:ascii="Times New Roman" w:hAnsi="Times New Roman" w:eastAsia="Times New Roman"/>
+          <w:i/>
+          <w:color w:val="000000"/>
+          <w:sz w:val="24"/>
+        </w:rPr>
+        <w:t>Syzygium aromaticum</w:t>
+      </w:r>
+      <w:r>
+        <w:rPr>
+          <w:rFonts w:ascii="Times New Roman" w:hAnsi="Times New Roman" w:eastAsia="Times New Roman"/>
+          <w:color w:val="000000"/>
+          <w:sz w:val="24"/>
+        </w:rPr>
+        <w:t>, universally known as clove, has emerged as an exceptionally promising, highly potent botanical subject. Despite an incredibly rich, well-documented history of intense application in traditional medicine for severe pain relief and acute spasm suppression, its specific, isolated efficacy in neutralizing the complex pathophysiology of primary dysmenorrhea remains a critical, unresolved frontier demanding rigorous scientific investigation.</w:t>
+      </w:r>
+    </w:p>
+    <w:p>
+      <w:pPr>
         <w:pStyle w:val="Heading2"/>
         <w:jc w:val="both"/>
       </w:pPr>
@@ -1106,7 +1028,7 @@
           <w:color w:val="000000"/>
           <w:sz w:val="24"/>
         </w:rPr>
-        <w:t>1.12 Research Questions</w:t>
+        <w:t>1.12 Taxonomic Classification and Overview of Syzygium aromaticum</w:t>
       </w:r>
     </w:p>
     <w:p>
@@ -1117,14 +1039,6 @@
       <w:r>
         <w:rPr>
           <w:rFonts w:ascii="Times New Roman" w:hAnsi="Times New Roman" w:eastAsia="Times New Roman"/>
-          <w:color w:val="000000"/>
-          <w:sz w:val="24"/>
-        </w:rPr>
-        <w:t xml:space="preserve">To rigorously address the massive scientific gap surrounding the therapeutic potential and toxicological safety of </w:t>
-      </w:r>
-      <w:r>
-        <w:rPr>
-          <w:rFonts w:ascii="Times New Roman" w:hAnsi="Times New Roman" w:eastAsia="Times New Roman"/>
           <w:i/>
           <w:color w:val="000000"/>
           <w:sz w:val="24"/>
@@ -1137,7 +1051,58 @@
           <w:color w:val="000000"/>
           <w:sz w:val="24"/>
         </w:rPr>
-        <w:t>, this study is designed to systematically answer the following critical research questions:</w:t>
+        <w:t xml:space="preserve"> (L.) Merr. &amp; L.M. Perry, universally recognized by its common name "clove," is a profoundly important, highly valuable, and meticulously cultivated medicinal and culinary plant. Botanically, it is classified as a medium-sized, evergreen, tropical tree belonging to the extensive myrtle family, Myrtaceae (Batiha et al., 2020). The genus </w:t>
+      </w:r>
+      <w:r>
+        <w:rPr>
+          <w:rFonts w:ascii="Times New Roman" w:hAnsi="Times New Roman" w:eastAsia="Times New Roman"/>
+          <w:i/>
+          <w:color w:val="000000"/>
+          <w:sz w:val="24"/>
+        </w:rPr>
+        <w:t>Syzygium</w:t>
+      </w:r>
+      <w:r>
+        <w:rPr>
+          <w:rFonts w:ascii="Times New Roman" w:hAnsi="Times New Roman" w:eastAsia="Times New Roman"/>
+          <w:color w:val="000000"/>
+          <w:sz w:val="24"/>
+        </w:rPr>
+        <w:t xml:space="preserve"> is massive, comprising over 1,200 distinct species distributed widely across the tropical and subtropical regions of the Old World, yet </w:t>
+      </w:r>
+      <w:r>
+        <w:rPr>
+          <w:rFonts w:ascii="Times New Roman" w:hAnsi="Times New Roman" w:eastAsia="Times New Roman"/>
+          <w:i/>
+          <w:color w:val="000000"/>
+          <w:sz w:val="24"/>
+        </w:rPr>
+        <w:t>Syzygium aromaticum</w:t>
+      </w:r>
+      <w:r>
+        <w:rPr>
+          <w:rFonts w:ascii="Times New Roman" w:hAnsi="Times New Roman" w:eastAsia="Times New Roman"/>
+          <w:color w:val="000000"/>
+          <w:sz w:val="24"/>
+        </w:rPr>
+        <w:t xml:space="preserve"> remains the absolute most economically and pharmacologically significant member of the entire lineage (Devkota &amp; Devkota, 2022). Taxonomically, the plant is organized within the kingdom Plantae, the clade Angiosperms (flowering plants), the clade Eudicots, the clade Rosids, the massive order Myrtales, the family Myrtaceae, and the genus </w:t>
+      </w:r>
+      <w:r>
+        <w:rPr>
+          <w:rFonts w:ascii="Times New Roman" w:hAnsi="Times New Roman" w:eastAsia="Times New Roman"/>
+          <w:i/>
+          <w:color w:val="000000"/>
+          <w:sz w:val="24"/>
+        </w:rPr>
+        <w:t>Syzygium</w:t>
+      </w:r>
+      <w:r>
+        <w:rPr>
+          <w:rFonts w:ascii="Times New Roman" w:hAnsi="Times New Roman" w:eastAsia="Times New Roman"/>
+          <w:color w:val="000000"/>
+          <w:sz w:val="24"/>
+        </w:rPr>
+        <w:t>. The species is indigenous to the remote Maluku Islands (historically renowned as the "Spice Islands") of eastern Indonesia. However, owing to its immense global demand and exorbitant historical value in both the spice trade and traditional medicine, its intense commercial cultivation has expanded massively over centuries to encompass various tropical zones globally, including Madagascar, Tanzania (specifically the Zanzibar archipelago), Sri Lanka, India, and vast swathes of South America (Karabacak &amp; Sener, 2021).</w:t>
       </w:r>
     </w:p>
     <w:p>
@@ -1151,7 +1116,7 @@
           <w:color w:val="000000"/>
           <w:sz w:val="24"/>
         </w:rPr>
-        <w:t xml:space="preserve">1. What is the precise acute oral toxicity profile of the ethanolic extract of </w:t>
+        <w:t xml:space="preserve">The clove tree typically reaches an impressive height of 8 to 12 meters, distinguished by a dense, highly aromatic canopy composed of large, opposite, ovate-lanceolate leaves that are highly coriaceous (leathery) and deeply studded with massive quantities of visible, translucent secretory glands heavily laden with potent essential oils. However, it is the deeply pigmented, unopened floral buds—the actual "cloves" of commerce—that possess the highest, most concentrated pharmacological value (Batiha et al., 2020). These massive floral buds are meticulously hand-harvested precisely when the fleshy lower receptacle (hypanthium) transitions from a pale green to an intense, vibrant crimson red, just prior to the unfurling of the delicate white petals. Following harvest, these buds are subjected to rigorous, controlled sun-drying until they rapidly desiccate, turning a deep, characteristic dark brown, simultaneously shrinking and hardening into their familiar nail-like morphology (the word "clove" is derived directly from the Latin </w:t>
       </w:r>
       <w:r>
         <w:rPr>
@@ -1160,15 +1125,15 @@
           <w:color w:val="000000"/>
           <w:sz w:val="24"/>
         </w:rPr>
-        <w:t>Syzygium aromaticum</w:t>
-      </w:r>
-      <w:r>
-        <w:rPr>
-          <w:rFonts w:ascii="Times New Roman" w:hAnsi="Times New Roman" w:eastAsia="Times New Roman"/>
-          <w:color w:val="000000"/>
-          <w:sz w:val="24"/>
-        </w:rPr>
-        <w:t xml:space="preserve"> flower buds when evaluated systematically in female mice according to the rigorous, gold-standard OECD Test Guideline 423 protocols?</w:t>
+        <w:t>clavus</w:t>
+      </w:r>
+      <w:r>
+        <w:rPr>
+          <w:rFonts w:ascii="Times New Roman" w:hAnsi="Times New Roman" w:eastAsia="Times New Roman"/>
+          <w:color w:val="000000"/>
+          <w:sz w:val="24"/>
+        </w:rPr>
+        <w:t xml:space="preserve">, meaning nail). </w:t>
       </w:r>
     </w:p>
     <w:p>
@@ -1182,7 +1147,7 @@
           <w:color w:val="000000"/>
           <w:sz w:val="24"/>
         </w:rPr>
-        <w:t xml:space="preserve">2. Does the direct application of the ethanolic extract of </w:t>
+        <w:t xml:space="preserve">Historically, these intensely aromatic, dried flower buds have commanded extraordinary value not merely as a potent culinary flavoring agent, but as a foundational, indispensable pillar of traditional medical systems worldwide (Karabacak &amp; Sener, 2021). In Traditional Chinese Medicine (TCM), Ayurveda, and Unani Tibb, clove has been revered for millennia as a supremely potent, multi-functional therapeutic agent (Devkota &amp; Devkota, 2022). It has been exhaustively utilized to rapidly resolve acute dental neuralgia, to forcefully expel intestinal parasites, to powerfully mitigate severe gastrointestinal spasms and dyspepsia, and to effectively treat severe, acute respiratory infections due to its profound bronchodilatory and intense antimicrobial actions. The immense, documented historical efficacy of </w:t>
       </w:r>
       <w:r>
         <w:rPr>
@@ -1199,11 +1164,25 @@
           <w:color w:val="000000"/>
           <w:sz w:val="24"/>
         </w:rPr>
-        <w:t xml:space="preserve"> flower buds exhibit a massive, statistically significant, and reproducible tocolytic (antispasmodic) effect on the baseline, spontaneous contractile activity of isolated non-pregnant murine uterine tissue?</w:t>
+        <w:t xml:space="preserve"> across such diverse and severe medical applications unequivocally signals the presence of exceptionally potent, highly concentrated bioactive phytochemicals within its cellular matrix. This robust historical precedent establishes clove as a prime, incredibly promising botanical candidate for rigorous, contemporary pharmacological analysis, particularly in the targeted search for novel, highly efficacious anti-inflammatory, antispasmodic, and profound analgesic therapeutics capable of neutralizing the complex pathophysiology of dysmenorrhea.</w:t>
       </w:r>
     </w:p>
     <w:p>
       <w:pPr>
+        <w:pStyle w:val="Heading2"/>
+        <w:jc w:val="both"/>
+      </w:pPr>
+      <w:r>
+        <w:rPr>
+          <w:rFonts w:ascii="Times New Roman" w:hAnsi="Times New Roman" w:eastAsia="Times New Roman"/>
+          <w:color w:val="000000"/>
+          <w:sz w:val="24"/>
+        </w:rPr>
+        <w:t>1.13 Acute Oral Toxicity</w:t>
+      </w:r>
+    </w:p>
+    <w:p>
+      <w:pPr>
         <w:spacing w:line="360" w:lineRule="auto" w:after="0"/>
         <w:jc w:val="both"/>
       </w:pPr>
@@ -1213,28 +1192,70 @@
           <w:color w:val="000000"/>
           <w:sz w:val="24"/>
         </w:rPr>
-        <w:t xml:space="preserve">3. Can the ethanolic extract of </w:t>
-      </w:r>
-      <w:r>
-        <w:rPr>
-          <w:rFonts w:ascii="Times New Roman" w:hAnsi="Times New Roman" w:eastAsia="Times New Roman"/>
-          <w:i/>
-          <w:color w:val="000000"/>
-          <w:sz w:val="24"/>
-        </w:rPr>
-        <w:t>Syzygium aromaticum</w:t>
-      </w:r>
-      <w:r>
-        <w:rPr>
-          <w:rFonts w:ascii="Times New Roman" w:hAnsi="Times New Roman" w:eastAsia="Times New Roman"/>
-          <w:color w:val="000000"/>
-          <w:sz w:val="24"/>
-        </w:rPr>
-        <w:t xml:space="preserve"> effectively, rapidly, and predictably reverse the severe, hypercontractile spasms induced by exogenous oxytocin in the isolated murine uterus, thereby demonstrating its profound capacity to neutralize acute dysmenorrheic pathology?</w:t>
+        <w:t>While the global resurgence of interest in herbal medicine is driven by the profound pharmacological potential and the widespread public perception that "natural" inherently equates to "safe," rigorous scientific and toxicological evaluation is an absolute, non-negotiable prerequisite before any botanical extract can be considered a viable therapeutic candidate (Pal &amp; Dutta, 2022). The profound reality of pharmacognosy is that many potent medicinal plants harbor complex, biologically active secondary metabolites that, while highly therapeutic at optimized dosages, can become immensely toxic, mutagenic, or overtly lethal when administered incorrectly, at elevated concentrations, or as unregulated crude extracts. Therefore, definitively establishing the precise safety profile and the specific toxicological margins of a botanical extract is just as critical—if not more so—than proving its intended pharmacological efficacy. The fundamental baseline for this entire safety evaluation is the acute oral toxicity study (Graves, 2019).</w:t>
       </w:r>
     </w:p>
     <w:p>
       <w:pPr>
+        <w:spacing w:line="360" w:lineRule="auto" w:after="0"/>
+        <w:jc w:val="both"/>
+      </w:pPr>
+      <w:r>
+        <w:rPr>
+          <w:rFonts w:ascii="Times New Roman" w:hAnsi="Times New Roman" w:eastAsia="Times New Roman"/>
+          <w:color w:val="000000"/>
+          <w:sz w:val="24"/>
+        </w:rPr>
+        <w:t>Acute oral toxicity testing is a highly standardized, rigorously controlled, early-stage in vivo pharmacological procedure designed specifically to determine the massive, immediate, and potentially lethal adverse effects that manifest within a short timeframe (typically 14 days) following the single, high-dose administration of a specific test substance (OECD, 2002). This critical evaluation provides the foundational, indispensable toxicological data required to classify the acute hazard potential of the extract, clearly delineate its precise safety margins, definitively establish the No-Observed-Adverse-Effect Level (NOAEL), and strictly guide the selection of safe, sub-lethal dosages for all subsequent, longer-term efficacy studies. Historically, this required massive animal sacrifice to determine the precise LD50 (the exact dose lethal to 50% of the test population). However, modern ethical mandates and stringent animal welfare regulations have completely revolutionized this approach (Sánchez &amp; García, 2022).</w:t>
+      </w:r>
+    </w:p>
+    <w:p>
+      <w:pPr>
+        <w:spacing w:line="360" w:lineRule="auto" w:after="0"/>
+        <w:jc w:val="both"/>
+      </w:pPr>
+      <w:r>
+        <w:rPr>
+          <w:rFonts w:ascii="Times New Roman" w:hAnsi="Times New Roman" w:eastAsia="Times New Roman"/>
+          <w:color w:val="000000"/>
+          <w:sz w:val="24"/>
+        </w:rPr>
+        <w:t xml:space="preserve">Contemporary toxicological evaluations are strictly governed by highly optimized, globally recognized regulatory protocols, most notably the Organization for Economic Co-operation and Development (OECD) Guidelines for the Testing of Chemicals. Specifically, the OECD Test Guideline 423 (Acute Toxic Class Method) and Guideline 425 (Up-and-Down Procedure) represent the absolute gold standards in modern toxicological screening (Monica &amp; Kumar, 2021). These revolutionary protocols are meticulously designed to maximize the extraction of critical toxicological data while drastically minimizing the total number of live animals utilized. They achieve this through a highly precise, step-wise, sequential dosing strategy utilizing extremely small, tightly controlled cohorts of animals (typically three female mice per step) (OECD, 2002). The starting dose is explicitly selected from a set of fixed, standardized levels (e.g., 5, 50, 300, or 2000 mg/kg) based entirely on any pre-existing toxicological data. Following administration, the animals are subjected to intense, continuous clinical observation, rigorously monitoring for profound changes in the skin and fur, radical shifts in respiratory or cardiovascular function, severe neurological manifestations (such as tremors, severe convulsions, or profound lethargy), extreme behavioral alterations, and ultimately, mortality (Singh &amp; Singh, 2021). </w:t>
+      </w:r>
+    </w:p>
+    <w:p>
+      <w:pPr>
+        <w:spacing w:line="360" w:lineRule="auto" w:after="0"/>
+        <w:jc w:val="both"/>
+      </w:pPr>
+      <w:r>
+        <w:rPr>
+          <w:rFonts w:ascii="Times New Roman" w:hAnsi="Times New Roman" w:eastAsia="Times New Roman"/>
+          <w:color w:val="000000"/>
+          <w:sz w:val="24"/>
+        </w:rPr>
+        <w:t xml:space="preserve">If survival is confirmed at a specific dose, the protocol systematically dictates progression to the next highest dose level, meticulously continuing this sequence until profound toxicity is observed or the predefined, maximum limit dose (usually 2000 mg/kg or occasionally 5000 mg/kg) is successfully reached without any fatal outcomes (Pal &amp; Dutta, 2022). The survival of the animal cohort at these massive limit doses definitively categorizes the substance as "unclassified" or essentially non-toxic under acute oral exposure, effectively green-lighting the extract for widespread pharmacological application (Madhavi &amp; Rao, 2022). Therefore, conducting a rigorous, OECD-compliant acute oral toxicity study on the ethanolic extract of </w:t>
+      </w:r>
+      <w:r>
+        <w:rPr>
+          <w:rFonts w:ascii="Times New Roman" w:hAnsi="Times New Roman" w:eastAsia="Times New Roman"/>
+          <w:i/>
+          <w:color w:val="000000"/>
+          <w:sz w:val="24"/>
+        </w:rPr>
+        <w:t>Syzygium aromaticum</w:t>
+      </w:r>
+      <w:r>
+        <w:rPr>
+          <w:rFonts w:ascii="Times New Roman" w:hAnsi="Times New Roman" w:eastAsia="Times New Roman"/>
+          <w:color w:val="000000"/>
+          <w:sz w:val="24"/>
+        </w:rPr>
+        <w:t xml:space="preserve"> is an absolute, non-negotiable scientific mandate to unequivocally validate its safety profile prior to evaluating its complex, multi-pathway efficacy in reversing the severe pathophysiology of primary dysmenorrhea.</w:t>
+      </w:r>
+    </w:p>
+    <w:p>
+      <w:pPr>
         <w:pStyle w:val="Heading2"/>
         <w:jc w:val="both"/>
       </w:pPr>
@@ -1244,7 +1265,675 @@
           <w:color w:val="000000"/>
           <w:sz w:val="24"/>
         </w:rPr>
-        <w:t>1.13 Study Hypothesis</w:t>
+        <w:t>1.14 Detailed Phytochemistry of Clove (Syzygium aromaticum)</w:t>
+      </w:r>
+    </w:p>
+    <w:p>
+      <w:pPr>
+        <w:spacing w:line="360" w:lineRule="auto" w:after="0"/>
+        <w:jc w:val="both"/>
+      </w:pPr>
+      <w:r>
+        <w:rPr>
+          <w:rFonts w:ascii="Times New Roman" w:hAnsi="Times New Roman" w:eastAsia="Times New Roman"/>
+          <w:color w:val="000000"/>
+          <w:sz w:val="24"/>
+        </w:rPr>
+        <w:t xml:space="preserve">The immense, historically documented pharmacological potency of </w:t>
+      </w:r>
+      <w:r>
+        <w:rPr>
+          <w:rFonts w:ascii="Times New Roman" w:hAnsi="Times New Roman" w:eastAsia="Times New Roman"/>
+          <w:i/>
+          <w:color w:val="000000"/>
+          <w:sz w:val="24"/>
+        </w:rPr>
+        <w:t>Syzygium aromaticum</w:t>
+      </w:r>
+      <w:r>
+        <w:rPr>
+          <w:rFonts w:ascii="Times New Roman" w:hAnsi="Times New Roman" w:eastAsia="Times New Roman"/>
+          <w:color w:val="000000"/>
+          <w:sz w:val="24"/>
+        </w:rPr>
+        <w:t xml:space="preserve"> (clove) is not a product of myth, but rather a direct consequence of its astonishingly complex, incredibly dense, and highly synergistic phytochemical architecture. Modern analytical techniques, specifically high-performance liquid chromatography (HPLC) and gas chromatography-mass spectrometry (GC-MS), have definitively characterized the clove bud as a massive biological reservoir of exceptionally potent secondary metabolites. While many botanicals possess trace amounts of active compounds, the clove bud is uniquely remarkable for the sheer volume and extraordinary concentration of its bioactive constituents, which can collectively account for over 20% of the total dry weight of the harvested flower bud (Batiha et al., 2020). This massive phytochemical payload is systematically categorized into two distinct, highly active fractions: the volatile essential oil fraction and the non-volatile, highly complex polyphenolic fraction. </w:t>
+      </w:r>
+    </w:p>
+    <w:p>
+      <w:pPr>
+        <w:spacing w:line="360" w:lineRule="auto" w:after="0"/>
+        <w:jc w:val="both"/>
+      </w:pPr>
+      <w:r>
+        <w:rPr>
+          <w:rFonts w:ascii="Times New Roman" w:hAnsi="Times New Roman" w:eastAsia="Times New Roman"/>
+          <w:color w:val="000000"/>
+          <w:sz w:val="24"/>
+        </w:rPr>
+        <w:t xml:space="preserve">The volatile essential oil fraction is the absolute pharmacological centerpiece of the clove bud, typically comprising an astounding 15% to 20% of its total dry mass—one of the highest essential oil yields of any botanical species known to science (Salehi &amp; Sharifi-Rad, 2021). This fraction is aggressively extracted via steam or hydro-distillation and is the primary subject of intense industrial and medical focus. GC-MS analysis reveals that this essential oil is overwhelmingly dominated by phenylpropanoids and terpenes. The absolute, undisputed primary constituent is </w:t>
+      </w:r>
+      <w:r>
+        <w:rPr>
+          <w:rFonts w:ascii="Times New Roman" w:hAnsi="Times New Roman" w:eastAsia="Times New Roman"/>
+          <w:b/>
+          <w:color w:val="000000"/>
+          <w:sz w:val="24"/>
+        </w:rPr>
+        <w:t>eugenol</w:t>
+      </w:r>
+      <w:r>
+        <w:rPr>
+          <w:rFonts w:ascii="Times New Roman" w:hAnsi="Times New Roman" w:eastAsia="Times New Roman"/>
+          <w:color w:val="000000"/>
+          <w:sz w:val="24"/>
+        </w:rPr>
+        <w:t xml:space="preserve"> (4-allyl-2-methoxyphenol), a remarkably potent, highly volatile phenolic compound that typically constitutes an astonishing 70% to 90% of the entire essential oil profile, depending heavily on the geographical origin, the precise maturity of the bud at harvest, and the specific extraction methodology employed (Uysal &amp; Ustun, 2022). Eugenol is the undisputed chemical heart of clove, single-handedly responsible for its intense, characteristic, spicy aroma and the vast majority of its powerful, documented anti-inflammatory, anesthetic, and antispasmodic pharmacological actions (Kamatou et al., 2012).</w:t>
+      </w:r>
+    </w:p>
+    <w:p>
+      <w:pPr>
+        <w:spacing w:line="360" w:lineRule="auto" w:after="0"/>
+        <w:jc w:val="both"/>
+      </w:pPr>
+      <w:r>
+        <w:rPr>
+          <w:rFonts w:ascii="Times New Roman" w:hAnsi="Times New Roman" w:eastAsia="Times New Roman"/>
+          <w:color w:val="000000"/>
+          <w:sz w:val="24"/>
+        </w:rPr>
+        <w:t xml:space="preserve">However, the efficacy of clove is not solely dependent on eugenol. The essential oil fraction also contains highly significant concentrations of </w:t>
+      </w:r>
+      <w:r>
+        <w:rPr>
+          <w:rFonts w:ascii="Times New Roman" w:hAnsi="Times New Roman" w:eastAsia="Times New Roman"/>
+          <w:b/>
+          <w:color w:val="000000"/>
+          <w:sz w:val="24"/>
+        </w:rPr>
+        <w:t>eugenyl acetate</w:t>
+      </w:r>
+      <w:r>
+        <w:rPr>
+          <w:rFonts w:ascii="Times New Roman" w:hAnsi="Times New Roman" w:eastAsia="Times New Roman"/>
+          <w:color w:val="000000"/>
+          <w:sz w:val="24"/>
+        </w:rPr>
+        <w:t xml:space="preserve"> (typically 5% to 15%), an acetylated derivative of eugenol that strongly synergizes with the parent compound, enhancing its overall bioavailability and significantly extending its powerful antioxidant and antispasmodic duration within target tissues (Vardhan &amp; Shukla, 2022). Furthermore, the oil contains a critical sesquiterpene, </w:t>
+      </w:r>
+      <w:r>
+        <w:rPr>
+          <w:rFonts w:ascii="Times New Roman" w:hAnsi="Times New Roman" w:eastAsia="Times New Roman"/>
+          <w:b/>
+          <w:color w:val="000000"/>
+          <w:sz w:val="24"/>
+        </w:rPr>
+        <w:t>β-caryophyllene</w:t>
+      </w:r>
+      <w:r>
+        <w:rPr>
+          <w:rFonts w:ascii="Times New Roman" w:hAnsi="Times New Roman" w:eastAsia="Times New Roman"/>
+          <w:color w:val="000000"/>
+          <w:sz w:val="24"/>
+        </w:rPr>
+        <w:t xml:space="preserve"> (typically 2% to 10%), a massive, highly lipophilic molecule known for its distinct, profound anti-inflammatory properties and its unique, scientifically validated capacity to act as a selective dietary cannabinoid, specifically binding to and agonizing the peripheral CB2 receptors to modulate severe pain and acute immune responses (Haro-González et al., 2021). Traces of other potent volatile compounds, including α-humulene, chavicol, methyl salicylate, and various complex pinene derivatives, further contribute to the oil's intense, multi-targeted pharmacological synergy. </w:t>
+      </w:r>
+    </w:p>
+    <w:p>
+      <w:pPr>
+        <w:spacing w:line="360" w:lineRule="auto" w:after="0"/>
+        <w:jc w:val="both"/>
+      </w:pPr>
+      <w:r>
+        <w:rPr>
+          <w:rFonts w:ascii="Times New Roman" w:hAnsi="Times New Roman" w:eastAsia="Times New Roman"/>
+          <w:color w:val="000000"/>
+          <w:sz w:val="24"/>
+        </w:rPr>
+        <w:t xml:space="preserve">Beyond the volatile fraction, the non-volatile residue of the clove bud—often extracted via highly polar solvents like ethanol or methanol—reveals a second, immensely powerful, and frequently overlooked pharmacological arsenal: the complex polyphenolic fraction (Xue et al., 2022). This fraction is astonishingly dense in powerful, highly structured flavonoids, phenolic acids, and hydrolyzable tannins. Prominent among these are exceptionally high concentrations of specific, potent flavonoids such as </w:t>
+      </w:r>
+      <w:r>
+        <w:rPr>
+          <w:rFonts w:ascii="Times New Roman" w:hAnsi="Times New Roman" w:eastAsia="Times New Roman"/>
+          <w:b/>
+          <w:color w:val="000000"/>
+          <w:sz w:val="24"/>
+        </w:rPr>
+        <w:t>quercetin</w:t>
+      </w:r>
+      <w:r>
+        <w:rPr>
+          <w:rFonts w:ascii="Times New Roman" w:hAnsi="Times New Roman" w:eastAsia="Times New Roman"/>
+          <w:color w:val="000000"/>
+          <w:sz w:val="24"/>
+        </w:rPr>
+        <w:t xml:space="preserve">, </w:t>
+      </w:r>
+      <w:r>
+        <w:rPr>
+          <w:rFonts w:ascii="Times New Roman" w:hAnsi="Times New Roman" w:eastAsia="Times New Roman"/>
+          <w:b/>
+          <w:color w:val="000000"/>
+          <w:sz w:val="24"/>
+        </w:rPr>
+        <w:t>kaempferol</w:t>
+      </w:r>
+      <w:r>
+        <w:rPr>
+          <w:rFonts w:ascii="Times New Roman" w:hAnsi="Times New Roman" w:eastAsia="Times New Roman"/>
+          <w:color w:val="000000"/>
+          <w:sz w:val="24"/>
+        </w:rPr>
+        <w:t xml:space="preserve">, and </w:t>
+      </w:r>
+      <w:r>
+        <w:rPr>
+          <w:rFonts w:ascii="Times New Roman" w:hAnsi="Times New Roman" w:eastAsia="Times New Roman"/>
+          <w:b/>
+          <w:color w:val="000000"/>
+          <w:sz w:val="24"/>
+        </w:rPr>
+        <w:t>rhamnetin</w:t>
+      </w:r>
+      <w:r>
+        <w:rPr>
+          <w:rFonts w:ascii="Times New Roman" w:hAnsi="Times New Roman" w:eastAsia="Times New Roman"/>
+          <w:color w:val="000000"/>
+          <w:sz w:val="24"/>
+        </w:rPr>
+        <w:t xml:space="preserve">, alongside their massive, complex glycosidic derivatives (Ryu et al., 2016). These specific flavonoids are universally recognized in the scientific literature as some of the most powerful, direct, naturally occurring scavengers of reactive oxygen species (ROS) and free radicals known to pharmacognosy. They provide an immense, overwhelming systemic antioxidant defense capable of rapidly neutralizing the massive oxidative stress and severe lipid peroxidation that fundamentally characterizes the ischemia-reperfusion injury seen in primary dysmenorrhea (Szydłowska et al., 2020). </w:t>
+      </w:r>
+    </w:p>
+    <w:p>
+      <w:pPr>
+        <w:spacing w:line="360" w:lineRule="auto" w:after="0"/>
+        <w:jc w:val="both"/>
+      </w:pPr>
+      <w:r>
+        <w:rPr>
+          <w:rFonts w:ascii="Times New Roman" w:hAnsi="Times New Roman" w:eastAsia="Times New Roman"/>
+          <w:color w:val="000000"/>
+          <w:sz w:val="24"/>
+        </w:rPr>
+        <w:t xml:space="preserve">Furthermore, the non-volatile extract is exceptionally rich in massive phenolic acids, most notably </w:t>
+      </w:r>
+      <w:r>
+        <w:rPr>
+          <w:rFonts w:ascii="Times New Roman" w:hAnsi="Times New Roman" w:eastAsia="Times New Roman"/>
+          <w:b/>
+          <w:color w:val="000000"/>
+          <w:sz w:val="24"/>
+        </w:rPr>
+        <w:t>gallic acid</w:t>
+      </w:r>
+      <w:r>
+        <w:rPr>
+          <w:rFonts w:ascii="Times New Roman" w:hAnsi="Times New Roman" w:eastAsia="Times New Roman"/>
+          <w:color w:val="000000"/>
+          <w:sz w:val="24"/>
+        </w:rPr>
+        <w:t xml:space="preserve">, </w:t>
+      </w:r>
+      <w:r>
+        <w:rPr>
+          <w:rFonts w:ascii="Times New Roman" w:hAnsi="Times New Roman" w:eastAsia="Times New Roman"/>
+          <w:b/>
+          <w:color w:val="000000"/>
+          <w:sz w:val="24"/>
+        </w:rPr>
+        <w:t>caffeic acid</w:t>
+      </w:r>
+      <w:r>
+        <w:rPr>
+          <w:rFonts w:ascii="Times New Roman" w:hAnsi="Times New Roman" w:eastAsia="Times New Roman"/>
+          <w:color w:val="000000"/>
+          <w:sz w:val="24"/>
+        </w:rPr>
+        <w:t xml:space="preserve">, </w:t>
+      </w:r>
+      <w:r>
+        <w:rPr>
+          <w:rFonts w:ascii="Times New Roman" w:hAnsi="Times New Roman" w:eastAsia="Times New Roman"/>
+          <w:b/>
+          <w:color w:val="000000"/>
+          <w:sz w:val="24"/>
+        </w:rPr>
+        <w:t>ferulic acid</w:t>
+      </w:r>
+      <w:r>
+        <w:rPr>
+          <w:rFonts w:ascii="Times New Roman" w:hAnsi="Times New Roman" w:eastAsia="Times New Roman"/>
+          <w:color w:val="000000"/>
+          <w:sz w:val="24"/>
+        </w:rPr>
+        <w:t xml:space="preserve">, and </w:t>
+      </w:r>
+      <w:r>
+        <w:rPr>
+          <w:rFonts w:ascii="Times New Roman" w:hAnsi="Times New Roman" w:eastAsia="Times New Roman"/>
+          <w:b/>
+          <w:color w:val="000000"/>
+          <w:sz w:val="24"/>
+        </w:rPr>
+        <w:t>ellagic acid</w:t>
+      </w:r>
+      <w:r>
+        <w:rPr>
+          <w:rFonts w:ascii="Times New Roman" w:hAnsi="Times New Roman" w:eastAsia="Times New Roman"/>
+          <w:color w:val="000000"/>
+          <w:sz w:val="24"/>
+        </w:rPr>
+        <w:t xml:space="preserve"> (Batiha et al., 2020). These specific phenolic compounds do not merely act as passive antioxidants; they operate as powerful, highly active immunomodulators. Extensive in vitro studies demonstrate that these acids actively suppress the catastrophic nuclear factor-kappa B (NF-κB) inflammatory signaling pathway, thereby massively downregulating the pathological secretion of the hyperalgesic cytokines interleukin-6 (IL-6) and tumor necrosis factor-alpha (TNF-α) from activated macrophages (Xue et al., 2022). Additionally, clove buds are uniquely rich in a specific, highly complex macrocyclic ellagitannin known as </w:t>
+      </w:r>
+      <w:r>
+        <w:rPr>
+          <w:rFonts w:ascii="Times New Roman" w:hAnsi="Times New Roman" w:eastAsia="Times New Roman"/>
+          <w:b/>
+          <w:color w:val="000000"/>
+          <w:sz w:val="24"/>
+        </w:rPr>
+        <w:t>eugeniin</w:t>
+      </w:r>
+      <w:r>
+        <w:rPr>
+          <w:rFonts w:ascii="Times New Roman" w:hAnsi="Times New Roman" w:eastAsia="Times New Roman"/>
+          <w:color w:val="000000"/>
+          <w:sz w:val="24"/>
+        </w:rPr>
+        <w:t xml:space="preserve">, which has demonstrated profound, highly specific antiviral and massive anti-inflammatory potential in early clinical screening. </w:t>
+      </w:r>
+    </w:p>
+    <w:p>
+      <w:pPr>
+        <w:spacing w:line="360" w:lineRule="auto" w:after="0"/>
+        <w:jc w:val="both"/>
+      </w:pPr>
+      <w:r>
+        <w:rPr>
+          <w:rFonts w:ascii="Times New Roman" w:hAnsi="Times New Roman" w:eastAsia="Times New Roman"/>
+          <w:color w:val="000000"/>
+          <w:sz w:val="24"/>
+        </w:rPr>
+        <w:t xml:space="preserve">The profound, multi-pathway pharmacological synergy resulting from the combination of the highly volatile, severely antispasmodic eugenol and the massive, non-volatile, highly antioxidant polyphenolic fraction dictates that an ethanolic extract of </w:t>
+      </w:r>
+      <w:r>
+        <w:rPr>
+          <w:rFonts w:ascii="Times New Roman" w:hAnsi="Times New Roman" w:eastAsia="Times New Roman"/>
+          <w:i/>
+          <w:color w:val="000000"/>
+          <w:sz w:val="24"/>
+        </w:rPr>
+        <w:t>Syzygium aromaticum</w:t>
+      </w:r>
+      <w:r>
+        <w:rPr>
+          <w:rFonts w:ascii="Times New Roman" w:hAnsi="Times New Roman" w:eastAsia="Times New Roman"/>
+          <w:color w:val="000000"/>
+          <w:sz w:val="24"/>
+        </w:rPr>
+        <w:t xml:space="preserve"> is theoretically perfectly engineered to neutralize the exact, complex pathophysiology of primary dysmenorrhea. The ethanol effectively acts as a universal solvent, meticulously extracting both the highly lipophilic volatile terpenes and the profoundly polar polyphenolic flavonoids (Ibrahim et al., 2022), thereby producing a comprehensive, hyper-potent botanical formulation capable of simultaneously halting severe mechanical ischemia, silencing intense neuropathic pain, neutralizing catastrophic oxidative stress, and suppressing the massive cytokine storm.</w:t>
+      </w:r>
+    </w:p>
+    <w:p>
+      <w:pPr>
+        <w:pStyle w:val="Heading2"/>
+        <w:jc w:val="both"/>
+      </w:pPr>
+      <w:r>
+        <w:rPr>
+          <w:rFonts w:ascii="Times New Roman" w:hAnsi="Times New Roman" w:eastAsia="Times New Roman"/>
+          <w:color w:val="000000"/>
+          <w:sz w:val="24"/>
+        </w:rPr>
+        <w:t>1.15 Deep Dive into Eugenol Pharmacology</w:t>
+      </w:r>
+    </w:p>
+    <w:p>
+      <w:pPr>
+        <w:spacing w:line="360" w:lineRule="auto" w:after="0"/>
+        <w:jc w:val="both"/>
+      </w:pPr>
+      <w:r>
+        <w:rPr>
+          <w:rFonts w:ascii="Times New Roman" w:hAnsi="Times New Roman" w:eastAsia="Times New Roman"/>
+          <w:color w:val="000000"/>
+          <w:sz w:val="24"/>
+        </w:rPr>
+        <w:t xml:space="preserve">The overwhelming pharmacological potency of the </w:t>
+      </w:r>
+      <w:r>
+        <w:rPr>
+          <w:rFonts w:ascii="Times New Roman" w:hAnsi="Times New Roman" w:eastAsia="Times New Roman"/>
+          <w:i/>
+          <w:color w:val="000000"/>
+          <w:sz w:val="24"/>
+        </w:rPr>
+        <w:t>Syzygium aromaticum</w:t>
+      </w:r>
+      <w:r>
+        <w:rPr>
+          <w:rFonts w:ascii="Times New Roman" w:hAnsi="Times New Roman" w:eastAsia="Times New Roman"/>
+          <w:color w:val="000000"/>
+          <w:sz w:val="24"/>
+        </w:rPr>
+        <w:t xml:space="preserve"> extract is undeniably anchored by its primary active constituent, </w:t>
+      </w:r>
+      <w:r>
+        <w:rPr>
+          <w:rFonts w:ascii="Times New Roman" w:hAnsi="Times New Roman" w:eastAsia="Times New Roman"/>
+          <w:b/>
+          <w:color w:val="000000"/>
+          <w:sz w:val="24"/>
+        </w:rPr>
+        <w:t>eugenol</w:t>
+      </w:r>
+      <w:r>
+        <w:rPr>
+          <w:rFonts w:ascii="Times New Roman" w:hAnsi="Times New Roman" w:eastAsia="Times New Roman"/>
+          <w:color w:val="000000"/>
+          <w:sz w:val="24"/>
+        </w:rPr>
+        <w:t xml:space="preserve"> (4-allyl-2-methoxyphenol). Eugenol is a massive, highly lipophilic, and extraordinarily versatile phenylpropanoid that has been the subject of thousands of rigorous, peer-reviewed scientific investigations over the past several decades (Kamatou et al., 2012). While historically celebrated in dentistry as a profound, fast-acting topical analgesic and potent local anesthetic (often formulated with zinc oxide for endodontic root canal therapies), modern, high-resolution pharmacological research has definitively unraveled its complex, systemic mechanisms of action. This research unequivocally proves that eugenol is a powerful, multi-targeted biochemical modulator, capable of simultaneously and aggressively intervening in the specific inflammatory and smooth muscle excitation pathways that fundamentally drive the debilitating pathology of primary dysmenorrhea (Ortiz &amp; Castañeda-Hernández, 2022).</w:t>
+      </w:r>
+    </w:p>
+    <w:p>
+      <w:pPr>
+        <w:spacing w:line="360" w:lineRule="auto" w:after="0"/>
+        <w:jc w:val="both"/>
+      </w:pPr>
+      <w:r>
+        <w:rPr>
+          <w:rFonts w:ascii="Times New Roman" w:hAnsi="Times New Roman" w:eastAsia="Times New Roman"/>
+          <w:color w:val="000000"/>
+          <w:sz w:val="24"/>
+        </w:rPr>
+        <w:t xml:space="preserve">The primary, and arguably most critical, pharmacological mechanism of eugenol is its profound, targeted capacity to completely halt the arachidonic acid inflammatory cascade. Unlike standard synthetic Non-Steroidal Anti-Inflammatory Drugs (NSAIDs), which typically operate as narrow, highly selective inhibitors of the cyclooxygenase (COX) enzyme pathway alone, eugenol functions as a massive, dual-action inflammatory antagonist (Sarkar &amp; Das, 2023). Extensive biochemical assays have conclusively demonstrated that eugenol exerts intense, direct, and dose-dependent competitive inhibition on both the COX-1 and the highly inducible, pathological COX-2 enzyme isoforms, thereby drastically curtailing the massive synthesis and accumulation of the potent uterotonic prostaglandins, PGF2α and PGE2, within ischemic tissue (Kim et al., 2003). However, eugenol's efficacy extends significantly further. It simultaneously, and powerfully, inhibits the 5-lipoxygenase (5-LOX) enzyme pathway (Raghavenra et al., 2006). The 5-LOX pathway is responsible for the conversion of arachidonic acid into leukotrienes—another massive class of incredibly potent, highly active inflammatory and smooth-muscle-constricting mediators that standard NSAIDs completely fail to address. By actively silencing both the COX and the LOX inflammatory pathways simultaneously, eugenol provides a comprehensive, overwhelming biochemical blockade against the entire spectrum of vasoactive and hyperalgesic eicosanoids that trigger uterine tetany, presenting a massive therapeutic advantage over conventional, single-target synthetic interventions (Reddy &amp; Reddy, 2021). </w:t>
+      </w:r>
+    </w:p>
+    <w:p>
+      <w:pPr>
+        <w:spacing w:line="360" w:lineRule="auto" w:after="0"/>
+        <w:jc w:val="both"/>
+      </w:pPr>
+      <w:r>
+        <w:rPr>
+          <w:rFonts w:ascii="Times New Roman" w:hAnsi="Times New Roman" w:eastAsia="Times New Roman"/>
+          <w:color w:val="000000"/>
+          <w:sz w:val="24"/>
+        </w:rPr>
+        <w:t xml:space="preserve">Beyond its intense anti-inflammatory capacity, eugenol operates as a profound, highly direct, and rapidly acting antispasmodic and tocolytic agent on visceral smooth muscle (Rajan &amp; Kumar, 2022). The tetanic, hypercontractile spasms of the dysmenorrheic uterus are absolutely dependent on the massive, rapid influx of extracellular calcium into the myometrial smooth muscle cells. Eugenol has been unequivocally proven through highly sensitive, isolated patch-clamp electrophysiology to function as a highly potent, direct antagonist of voltage-dependent calcium channels (VDCCs), specifically the L-type and T-type calcium channels heavily expressed on the myometrial membrane (Peixoto-Neves et al., 2014; Seo et al., 2013). By physically binding to and blocking these critical ion channels, eugenol forcefully prevents the massive calcium influx required to activate myosin light chain kinase, thereby instantly halting the excitation-contraction coupling process, enforcing severe, dose-dependent smooth muscle relaxation, and rapidly restoring critical, oxygen-rich blood flow to the severely ischemic, hypoxic uterine tissue (Shen &amp; Li, 2021). </w:t>
+      </w:r>
+    </w:p>
+    <w:p>
+      <w:pPr>
+        <w:spacing w:line="360" w:lineRule="auto" w:after="0"/>
+        <w:jc w:val="both"/>
+      </w:pPr>
+      <w:r>
+        <w:rPr>
+          <w:rFonts w:ascii="Times New Roman" w:hAnsi="Times New Roman" w:eastAsia="Times New Roman"/>
+          <w:color w:val="000000"/>
+          <w:sz w:val="24"/>
+        </w:rPr>
+        <w:t>Furthermore, eugenol addresses the neurobiological dimension of the pain directly at the peripheral nerve terminal. The severe, agonizing cramps of dysmenorrhea are transmitted by visceral C-fibers that are heavily populated with transient receptor potential vanilloid 1 (TRPV1) channels, which are hyper-sensitized by the local inflammatory soup. Eugenol possesses a highly specific, unique molecular structure that allows it to interact directly with these sensory nerve endings. Pharmacological research demonstrates that while eugenol can act as a partial, weak agonist of TRPV1 channels—initially causing a brief, localized warming sensation—it rapidly and forcefully induces profound, long-lasting receptor desensitization (Pina &amp; Silva, 2021). By forcing the TRPV1 channels into a prolonged, inactive refractory state, eugenol physically prevents the hyper-excitable C-fibers from transmitting the massive barrage of agonizing pain signals to the dorsal horn of the spinal cord (Ko et al., 2021). This intense, local anesthetic action, combined synergistically with its dual COX/LOX inflammatory blockade and its potent, direct calcium-channel blocking tocolytic effects, solidifies eugenol as an extraordinarily promising, multi-pathway therapeutic agent for the rapid, comprehensive neutralization of primary dysmenorrhea (Ortiz &amp; Castañeda-Hernández, 2022).</w:t>
+      </w:r>
+    </w:p>
+    <w:p>
+      <w:pPr>
+        <w:pStyle w:val="Heading2"/>
+        <w:jc w:val="both"/>
+      </w:pPr>
+      <w:r>
+        <w:rPr>
+          <w:rFonts w:ascii="Times New Roman" w:hAnsi="Times New Roman" w:eastAsia="Times New Roman"/>
+          <w:color w:val="000000"/>
+          <w:sz w:val="24"/>
+        </w:rPr>
+        <w:t>1.16 Rationale of the Study</w:t>
+      </w:r>
+    </w:p>
+    <w:p>
+      <w:pPr>
+        <w:spacing w:line="360" w:lineRule="auto" w:after="0"/>
+        <w:jc w:val="both"/>
+      </w:pPr>
+      <w:r>
+        <w:rPr>
+          <w:rFonts w:ascii="Times New Roman" w:hAnsi="Times New Roman" w:eastAsia="Times New Roman"/>
+          <w:color w:val="000000"/>
+          <w:sz w:val="24"/>
+        </w:rPr>
+        <w:t>Primary dysmenorrhea represents a massive, debilitating global health crisis, afflicting up to 95% of reproductive-aged women and causing an immense, catastrophic burden of physical agony, systemic distress, and profound socioeconomic loss due to widespread school and occupational absenteeism (Ding et al., 2021). The foundational pathophysiology of this disorder is undeniably driven by the pathological overproduction of prostaglandins, triggering severe, ischemic, hypercontractile uterine spasms (Dawood, 2006). Current pharmacological reliance on Non-Steroidal Anti-Inflammatory Drugs (NSAIDs) and Combined Oral Contraceptives (COCs) is fundamentally flawed and grossly inadequate. These standard synthetic interventions are severely hampered by dangerous, life-threatening adverse effects—including catastrophic gastrointestinal ulceration, severe hepatotoxicity, and massive thromboembolic risks—and they exhibit an alarming, high clinical failure rate, leaving nearly a quarter of all patients completely refractory to treatment and trapped in a cycle of unremitting pain (Oladosu et al., 2018).</w:t>
+      </w:r>
+    </w:p>
+    <w:p>
+      <w:pPr>
+        <w:spacing w:line="360" w:lineRule="auto" w:after="0"/>
+        <w:jc w:val="both"/>
+      </w:pPr>
+      <w:r>
+        <w:rPr>
+          <w:rFonts w:ascii="Times New Roman" w:hAnsi="Times New Roman" w:eastAsia="Times New Roman"/>
+          <w:color w:val="000000"/>
+          <w:sz w:val="24"/>
+        </w:rPr>
+        <w:t xml:space="preserve">This profound clinical failure has catalyzed an urgent, absolute scientific mandate to aggressively discover novel, highly efficacious, and significantly safer alternative tocolytic therapies. The massive resurgence of interest in traditional botanical medicines is completely justified; however, these natural remedies require rigorous, uncompromising scientific validation. </w:t>
+      </w:r>
+      <w:r>
+        <w:rPr>
+          <w:rFonts w:ascii="Times New Roman" w:hAnsi="Times New Roman" w:eastAsia="Times New Roman"/>
+          <w:i/>
+          <w:color w:val="000000"/>
+          <w:sz w:val="24"/>
+        </w:rPr>
+        <w:t>Syzygium aromaticum</w:t>
+      </w:r>
+      <w:r>
+        <w:rPr>
+          <w:rFonts w:ascii="Times New Roman" w:hAnsi="Times New Roman" w:eastAsia="Times New Roman"/>
+          <w:color w:val="000000"/>
+          <w:sz w:val="24"/>
+        </w:rPr>
+        <w:t xml:space="preserve"> (clove) has emerged as an exceptionally potent candidate, boasting a massive historical precedent in traditional medicine for resolving severe pain and acute spasms (Batiha et al., 2020). Modern phytochemical screening confirms that clove is a highly concentrated reservoir of exceptionally potent bioactive compounds, specifically eugenol, which is known to possess powerful anti-inflammatory, anesthetic, and antispasmodic properties (Kamatou et al., 2012). Despite these immense capabilities, there is a massive, critical void in contemporary pharmacological literature regarding the specific, direct evaluation of the ethanolic extract of </w:t>
+      </w:r>
+      <w:r>
+        <w:rPr>
+          <w:rFonts w:ascii="Times New Roman" w:hAnsi="Times New Roman" w:eastAsia="Times New Roman"/>
+          <w:i/>
+          <w:color w:val="000000"/>
+          <w:sz w:val="24"/>
+        </w:rPr>
+        <w:t>S. aromaticum</w:t>
+      </w:r>
+      <w:r>
+        <w:rPr>
+          <w:rFonts w:ascii="Times New Roman" w:hAnsi="Times New Roman" w:eastAsia="Times New Roman"/>
+          <w:color w:val="000000"/>
+          <w:sz w:val="24"/>
+        </w:rPr>
+        <w:t xml:space="preserve"> flower buds in directly neutralizing the exact, complex pathophysiology of primary dysmenorrhea. </w:t>
+      </w:r>
+    </w:p>
+    <w:p>
+      <w:pPr>
+        <w:spacing w:line="360" w:lineRule="auto" w:after="0"/>
+        <w:jc w:val="both"/>
+      </w:pPr>
+      <w:r>
+        <w:rPr>
+          <w:rFonts w:ascii="Times New Roman" w:hAnsi="Times New Roman" w:eastAsia="Times New Roman"/>
+          <w:color w:val="000000"/>
+          <w:sz w:val="24"/>
+        </w:rPr>
+        <w:t xml:space="preserve">Therefore, this study is absolutely critical. It aims to bridge this massive scientific gap by systematically and rigorously evaluating both the acute oral safety profile (via stringent OECD guidelines) and the specific, multi-pathway tocolytic efficacy of the ethanolic extract of </w:t>
+      </w:r>
+      <w:r>
+        <w:rPr>
+          <w:rFonts w:ascii="Times New Roman" w:hAnsi="Times New Roman" w:eastAsia="Times New Roman"/>
+          <w:i/>
+          <w:color w:val="000000"/>
+          <w:sz w:val="24"/>
+        </w:rPr>
+        <w:t>S. aromaticum</w:t>
+      </w:r>
+      <w:r>
+        <w:rPr>
+          <w:rFonts w:ascii="Times New Roman" w:hAnsi="Times New Roman" w:eastAsia="Times New Roman"/>
+          <w:color w:val="000000"/>
+          <w:sz w:val="24"/>
+        </w:rPr>
+        <w:t xml:space="preserve"> flower buds using the gold-standard, isolated murine uterine model. This research is not merely exploratory; it is an essential, highly targeted scientific effort to definitively validate a potent, natural, and vastly safer alternative for millions of women suffering from the severe, unaddressed agony of primary dysmenorrhea.</w:t>
+      </w:r>
+    </w:p>
+    <w:p>
+      <w:pPr>
+        <w:pStyle w:val="Heading2"/>
+        <w:jc w:val="both"/>
+      </w:pPr>
+      <w:r>
+        <w:rPr>
+          <w:rFonts w:ascii="Times New Roman" w:hAnsi="Times New Roman" w:eastAsia="Times New Roman"/>
+          <w:color w:val="000000"/>
+          <w:sz w:val="24"/>
+        </w:rPr>
+        <w:t>1.17 Research Questions</w:t>
+      </w:r>
+    </w:p>
+    <w:p>
+      <w:pPr>
+        <w:spacing w:line="360" w:lineRule="auto" w:after="0"/>
+        <w:jc w:val="both"/>
+      </w:pPr>
+      <w:r>
+        <w:rPr>
+          <w:rFonts w:ascii="Times New Roman" w:hAnsi="Times New Roman" w:eastAsia="Times New Roman"/>
+          <w:color w:val="000000"/>
+          <w:sz w:val="24"/>
+        </w:rPr>
+        <w:t xml:space="preserve">To rigorously address the massive scientific gap surrounding the therapeutic potential and toxicological safety of </w:t>
+      </w:r>
+      <w:r>
+        <w:rPr>
+          <w:rFonts w:ascii="Times New Roman" w:hAnsi="Times New Roman" w:eastAsia="Times New Roman"/>
+          <w:i/>
+          <w:color w:val="000000"/>
+          <w:sz w:val="24"/>
+        </w:rPr>
+        <w:t>Syzygium aromaticum</w:t>
+      </w:r>
+      <w:r>
+        <w:rPr>
+          <w:rFonts w:ascii="Times New Roman" w:hAnsi="Times New Roman" w:eastAsia="Times New Roman"/>
+          <w:color w:val="000000"/>
+          <w:sz w:val="24"/>
+        </w:rPr>
+        <w:t>, this study is designed to systematically answer the following critical research questions:</w:t>
+      </w:r>
+    </w:p>
+    <w:p>
+      <w:pPr>
+        <w:spacing w:line="360" w:lineRule="auto" w:after="0"/>
+        <w:jc w:val="both"/>
+      </w:pPr>
+      <w:r>
+        <w:rPr>
+          <w:rFonts w:ascii="Times New Roman" w:hAnsi="Times New Roman" w:eastAsia="Times New Roman"/>
+          <w:color w:val="000000"/>
+          <w:sz w:val="24"/>
+        </w:rPr>
+        <w:t xml:space="preserve">1. What is the precise acute oral toxicity profile of the ethanolic extract of </w:t>
+      </w:r>
+      <w:r>
+        <w:rPr>
+          <w:rFonts w:ascii="Times New Roman" w:hAnsi="Times New Roman" w:eastAsia="Times New Roman"/>
+          <w:i/>
+          <w:color w:val="000000"/>
+          <w:sz w:val="24"/>
+        </w:rPr>
+        <w:t>Syzygium aromaticum</w:t>
+      </w:r>
+      <w:r>
+        <w:rPr>
+          <w:rFonts w:ascii="Times New Roman" w:hAnsi="Times New Roman" w:eastAsia="Times New Roman"/>
+          <w:color w:val="000000"/>
+          <w:sz w:val="24"/>
+        </w:rPr>
+        <w:t xml:space="preserve"> flower buds when evaluated systematically in female mice according to the rigorous, gold-standard OECD Test Guideline 423 protocols?</w:t>
+      </w:r>
+    </w:p>
+    <w:p>
+      <w:pPr>
+        <w:spacing w:line="360" w:lineRule="auto" w:after="0"/>
+        <w:jc w:val="both"/>
+      </w:pPr>
+      <w:r>
+        <w:rPr>
+          <w:rFonts w:ascii="Times New Roman" w:hAnsi="Times New Roman" w:eastAsia="Times New Roman"/>
+          <w:color w:val="000000"/>
+          <w:sz w:val="24"/>
+        </w:rPr>
+        <w:t xml:space="preserve">2. Does the direct application of the ethanolic extract of </w:t>
+      </w:r>
+      <w:r>
+        <w:rPr>
+          <w:rFonts w:ascii="Times New Roman" w:hAnsi="Times New Roman" w:eastAsia="Times New Roman"/>
+          <w:i/>
+          <w:color w:val="000000"/>
+          <w:sz w:val="24"/>
+        </w:rPr>
+        <w:t>Syzygium aromaticum</w:t>
+      </w:r>
+      <w:r>
+        <w:rPr>
+          <w:rFonts w:ascii="Times New Roman" w:hAnsi="Times New Roman" w:eastAsia="Times New Roman"/>
+          <w:color w:val="000000"/>
+          <w:sz w:val="24"/>
+        </w:rPr>
+        <w:t xml:space="preserve"> flower buds exhibit a massive, statistically significant, and reproducible tocolytic (antispasmodic) effect on the baseline, spontaneous contractile activity of isolated non-pregnant murine uterine tissue?</w:t>
+      </w:r>
+    </w:p>
+    <w:p>
+      <w:pPr>
+        <w:spacing w:line="360" w:lineRule="auto" w:after="0"/>
+        <w:jc w:val="both"/>
+      </w:pPr>
+      <w:r>
+        <w:rPr>
+          <w:rFonts w:ascii="Times New Roman" w:hAnsi="Times New Roman" w:eastAsia="Times New Roman"/>
+          <w:color w:val="000000"/>
+          <w:sz w:val="24"/>
+        </w:rPr>
+        <w:t xml:space="preserve">3. Can the ethanolic extract of </w:t>
+      </w:r>
+      <w:r>
+        <w:rPr>
+          <w:rFonts w:ascii="Times New Roman" w:hAnsi="Times New Roman" w:eastAsia="Times New Roman"/>
+          <w:i/>
+          <w:color w:val="000000"/>
+          <w:sz w:val="24"/>
+        </w:rPr>
+        <w:t>Syzygium aromaticum</w:t>
+      </w:r>
+      <w:r>
+        <w:rPr>
+          <w:rFonts w:ascii="Times New Roman" w:hAnsi="Times New Roman" w:eastAsia="Times New Roman"/>
+          <w:color w:val="000000"/>
+          <w:sz w:val="24"/>
+        </w:rPr>
+        <w:t xml:space="preserve"> effectively, rapidly, and predictably reverse the severe, hypercontractile spasms induced by exogenous oxytocin in the isolated murine uterus, thereby demonstrating its profound capacity to neutralize acute dysmenorrheic pathology?</w:t>
+      </w:r>
+    </w:p>
+    <w:p>
+      <w:pPr>
+        <w:pStyle w:val="Heading2"/>
+        <w:jc w:val="both"/>
+      </w:pPr>
+      <w:r>
+        <w:rPr>
+          <w:rFonts w:ascii="Times New Roman" w:hAnsi="Times New Roman" w:eastAsia="Times New Roman"/>
+          <w:color w:val="000000"/>
+          <w:sz w:val="24"/>
+        </w:rPr>
+        <w:t>1.18 Study Hypothesis</w:t>
       </w:r>
     </w:p>
     <w:p>
@@ -1354,7 +2043,7 @@
           <w:color w:val="000000"/>
           <w:sz w:val="24"/>
         </w:rPr>
-        <w:t>1.14 Aim and Objectives of the Study</w:t>
+        <w:t>1.19 Aim and Objectives of the Study</w:t>
       </w:r>
     </w:p>
     <w:p>

</xml_diff>

<commit_message>
fix: manual academic sanitization of text to remove hyperbole, fluff, and em-dashes
</commit_message>
<xml_diff>
--- a/output/draft/iyare-draft.docx
+++ b/output/draft/iyare-draft.docx
@@ -464,7 +464,7 @@
           <w:color w:val="000000"/>
           <w:sz w:val="24"/>
         </w:rPr>
-        <w:t>Dysmenorrhea, colloquially known as painful menstruation, represents one of the most widespread and debilitating gynecological disorders affecting women of reproductive age globally (Iacovides et al., 2015). It is clinically stratified into two distinct classifications: primary dysmenorrhea and secondary dysmenorrhea. Primary dysmenorrhea is strictly defined as severe, spasmodic lower abdominal or pelvic pain occurring directly prior to or coincident with the onset of menses, in the absolute absence of any identifiable macroscopic pelvic pathology (Dawood, 2006). In stark contrast, secondary dysmenorrhea is directly attributable to a specific underlying structural or pathological anomaly within the reproductive tract, such as endometriosis, uterine fibroids (leiomyomas), adenomyosis, pelvic inflammatory disease, or the presence of an intrauterine device (Smith et al., 2024). While secondary dysmenorrhea predominantly affects older women and necessitates the targeted medical or surgical resolution of the causative pathology, primary dysmenorrhea typically emerges shortly after menarche, once regular ovulatory cycles have been established, and constitutes the primary focus of vast pharmacological research and tocolytic intervention.</w:t>
+        <w:t>Dysmenorrhea, known as painful menstruation, represents a widespread gynecological disorder affecting women of reproductive age globally (Iacovides et al., 2015). It is clinically stratified into two distinct classifications: primary dysmenorrhea and secondary dysmenorrhea. Primary dysmenorrhea is defined as spasmodic lower abdominal or pelvic pain occurring prior to or coincident with the onset of menses, in the absence of any identifiable macroscopic pelvic pathology (Dawood, 2006). In contrast, secondary dysmenorrhea is attributable to a specific underlying structural or pathological anomaly within the reproductive tract, such as endometriosis, uterine fibroids (leiomyomas), adenomyosis, pelvic inflammatory disease, or the presence of an intrauterine device (Smith et al., 2024). While secondary dysmenorrhea predominantly affects older women and necessitates the targeted medical or surgical resolution of the causative pathology, primary dysmenorrhea typically emerges shortly after menarche, once regular ovulatory cycles have been established, and constitutes a primary focus of pharmacological research and tocolytic intervention.</w:t>
       </w:r>
     </w:p>
     <w:p>
@@ -478,7 +478,7 @@
           <w:color w:val="000000"/>
           <w:sz w:val="24"/>
         </w:rPr>
-        <w:t>The global epidemiological burden of primary dysmenorrhea is massive, though precisely quantifying its exact prevalence is notoriously challenging due to significant cultural disparities in pain reporting, inconsistent clinical definitions, and the widespread normalization of menstrual pain, which often deters women from seeking formal medical intervention (Ju et al., 2014). Nevertheless, comprehensive systematic reviews and large-scale cross-sectional meta-analyses consistently report that primary dysmenorrhea affects between 45% to 95% of menstruating women worldwide, with the highest prevalence rates uniformly observed during late adolescence and early adulthood (Ding et al., 2021). The clinical manifestation is not isolated to pelvic pain; it is frequently accompanied by a constellation of severe systemic symptoms, including debilitating nausea, emesis, profound fatigue, recurrent headaches, lower back pain radiating down the thighs, and unremitting diarrhea. The compounded physical and psychological toll of this symptomatology exerts a profound, measurable negative impact on academic performance, occupational productivity, and overall quality of life, accounting for millions of lost school and work hours annually (Ameade et al., 2018).</w:t>
+        <w:t>The epidemiological burden of primary dysmenorrhea is substantial, though quantifying its exact prevalence is challenging due to cultural disparities in pain reporting, inconsistent clinical definitions, and the normalization of menstrual pain, which often deters women from seeking formal medical intervention (Ju et al., 2014). Systematic reviews and large-scale cross-sectional meta-analyses report that primary dysmenorrhea affects between 45% to 95% of menstruating women worldwide, with the highest prevalence rates observed during late adolescence and early adulthood (Ding et al., 2021). The clinical manifestation is not isolated to pelvic pain; it is frequently accompanied by a constellation of systemic symptoms, including nausea, emesis, fatigue, recurrent headaches, lower back pain radiating down the thighs, and diarrhea. The compounded physical and psychological toll of this symptomatology exerts a negative impact on academic performance, occupational productivity, and overall quality of life, accounting for lost school and work hours annually (Ameade et al., 2018).</w:t>
       </w:r>
     </w:p>
     <w:p>
@@ -492,7 +492,7 @@
           <w:color w:val="000000"/>
           <w:sz w:val="24"/>
         </w:rPr>
-        <w:t>The fundamental pathophysiology of primary dysmenorrhea is unequivocally rooted in the gross hypercontractility of the uterine myometrium, driven almost entirely by the pathological overproduction of endogenous prostaglandins within the sloughing endometrium (Tang &amp; Wang, 2023). Following the physiological demise of the corpus luteum and the subsequent precipitous drop in circulating progesterone and estrogen at the end of the luteal phase, lysosomal membranes within the endometrial cells destabilize. This destabilization liberates the enzyme phospholipase A2, which cleaves arachidonic acid from the lipid bilayer of the cell membranes. Arachidonic acid is rapidly oxygenated by cyclooxygenase (COX) enzymes, specifically the highly inducible COX-2 isoform, triggering the massive, localized synthesis of cyclic endoperoxides (Wan &amp; Yao, 2021). These intermediates are swiftly converted into potent terminal prostaglandins, predominantly prostaglandin F2-alpha (PGF2α) and prostaglandin E2 (PGE2). Women suffering from primary dysmenorrhea synthesize and release exponentially higher concentrations of these specific prostaglandins into their menstrual fluid compared to asymptomatic, eumenorrheic women (Dawood, 1987).</w:t>
+        <w:t>The fundamental pathophysiology of primary dysmenorrhea is rooted in the hypercontractility of the uterine myometrium, driven almost entirely by the pathological overproduction of endogenous prostaglandins within the sloughing endometrium (Tang &amp; Wang, 2023). Following the physiological demise of the corpus luteum and the subsequent precipitous drop in circulating progesterone and estrogen at the end of the luteal phase, lysosomal membranes within the endometrial cells destabilize. This destabilization liberates the enzyme phospholipase A2, which cleaves arachidonic acid from the lipid bilayer of the cell membranes. Arachidonic acid is oxygenated by cyclooxygenase (COX) enzymes, specifically the highly inducible COX-2 isoform, triggering the localized synthesis of cyclic endoperoxides (Wan &amp; Yao, 2021). These intermediates are swiftly converted into terminal prostaglandins, predominantly prostaglandin F2-alpha (PGF2α) and prostaglandin E2 (PGE2). Women suffering from primary dysmenorrhea synthesize and release exponentially higher concentrations of these specific prostaglandins into their menstrual fluid compared to asymptomatic, eumenorrheic women (Dawood, 1987).</w:t>
       </w:r>
     </w:p>
     <w:p>
@@ -506,7 +506,7 @@
           <w:color w:val="000000"/>
           <w:sz w:val="24"/>
         </w:rPr>
-        <w:t>These excess prostaglandins, particularly PGF2α, act as incredibly potent, direct uterotonics (Tang &amp; Wang, 2023). They diffuse deeply into the underlying myometrium and bind to specific G-protein coupled receptors, triggering massive intracellular calcium release. This calcium cascade initiates severe, dysrhythmic, and sustained tetanic contractions of the massive myometrial muscle bed. These pathological hypercontractions dramatically elevate baseline intrauterine resting tone, often exceeding 40 mmHg, and generate immense active contractile pressures that can surpass 150 mmHg (Akerlund, 1979). Crucially, these extreme intrauterine pressures physically exceed the mean arterial perfusion pressure of the uterine vasculature. This creates a state of profound, transient mechanical ischemia, as the contracting muscle mass physically crushes the embedded arcuate and radial arteries, severely restricting oxygen delivery to the tissue (Altunyurt et al., 2005). The resulting severe hypoxia forces the myometrium into anaerobic metabolism, leading to the rapid accumulation of lactic acid and other noxious metabolites. These metabolic byproducts directly stimulate the type C pain fibers traversing the pelvic visceral afferent nerves, culminating in the intense, agonizing cramping characteristic of primary dysmenorrhea (Iacovides et al., 2015). Furthermore, researchers have demonstrated that elevated levels of other vasoactive mediators, such as vasopressin and oxytocin, act synergistically with prostaglandins to exacerbate uterine dysrhythmia and vascular ischemia, further compounding the pain profile (Liedman et al., 2008). Therefore, the suppression of this aberrant uterine contractility—either by inhibiting the upstream synthesis of prostaglandins or by directly blocking the downstream calcium channels required for smooth muscle execution—remains the fundamental, indisputable strategy for all pharmacological treatments targeting primary dysmenorrhea (Smith et al., 2024).</w:t>
+        <w:t>These excess prostaglandins, particularly PGF2α, act as direct uterotonics (Tang &amp; Wang, 2023). They diffuse into the underlying myometrium and bind to specific G-protein coupled receptors, triggering intracellular calcium release. This calcium cascade initiates severe, dysrhythmic, and sustained tetanic contractions of the myometrial muscle bed. These pathological hypercontractions elevate baseline intrauterine resting tone, often exceeding 40 mmHg, and generate active contractile pressures that can surpass 150 mmHg (Akerlund, 1979). Crucially, these intrauterine pressures physically exceed the mean arterial perfusion pressure of the uterine vasculature. This creates a state of transient mechanical ischemia, as the contracting muscle mass physically compresses the embedded arcuate and radial arteries, restricting oxygen delivery to the tissue (Altunyurt et al., 2005). The resulting hypoxia forces the myometrium into anaerobic metabolism, leading to the rapid accumulation of lactic acid and other noxious metabolites. These metabolic byproducts directly stimulate the type C pain fibers traversing the pelvic visceral afferent nerves, culminating in the cramping characteristic of primary dysmenorrhea (Iacovides et al., 2015). Furthermore, researchers have demonstrated that elevated levels of other vasoactive mediators, such as vasopressin and oxytocin, act synergistically with prostaglandins to exacerbate uterine dysrhythmia and vascular ischemia, further compounding the pain profile (Liedman et al., 2008). Therefore, the suppression of this aberrant uterine contractility (either by inhibiting the upstream synthesis of prostaglandins or by directly blocking the downstream calcium channels required for smooth muscle execution) remains the fundamental strategy for pharmacological treatments targeting primary dysmenorrhea (Smith et al., 2024).</w:t>
       </w:r>
     </w:p>
     <w:p>
@@ -534,7 +534,7 @@
           <w:color w:val="000000"/>
           <w:sz w:val="24"/>
         </w:rPr>
-        <w:t>While the mechanical ischemia induced by hypercontractility is the physiological trigger for primary dysmenorrhea, the actual perception of this severe cramping—the translation of tissue hypoxia into the conscious experience of agonizing pain—requires a profound understanding of the neurobiology of pelvic nociception. The uterus is a deeply innervated visceral organ, receiving its primary sensory nerve supply from the autonomic nervous system via the pelvic splanchnic nerves and the inferior hypogastric plexus. The visceral afferent nerve fibers that innervate the myometrium and endometrium are predominantly unmyelinated, slow-conducting C-fibers, which are classically responsible for the transmission of dull, aching, poorly localized, and protracted pain (Iacovides et al., 2015). Unlike somatic pain fibers, which respond to distinct, sharp mechanical stimuli, these visceral C-fibers are polymodal nociceptors. This means they are profoundly sensitive to a complex soup of chemical mediators, specifically the massive efflux of inflammatory metabolites that accumulate during menstruation.</w:t>
+        <w:t>While the mechanical ischemia induced by hypercontractility is the physiological trigger for primary dysmenorrhea, the actual perception of this cramping (the translation of tissue hypoxia into the conscious experience of pain) requires an understanding of the neurobiology of pelvic nociception. The uterus is a deeply innervated visceral organ, receiving its primary sensory nerve supply from the autonomic nervous system via the pelvic splanchnic nerves and the inferior hypogastric plexus. The visceral afferent nerve fibers that innervate the myometrium and endometrium are predominantly unmyelinated, slow-conducting C-fibers, which are classically responsible for the transmission of dull, aching, poorly localized, and protracted pain (Iacovides et al., 2015). Unlike somatic pain fibers, which respond to distinct, sharp mechanical stimuli, these visceral C-fibers are polymodal nociceptors. This means they are sensitive to a complex array of chemical mediators, specifically the efflux of inflammatory metabolites that accumulate during menstruation.</w:t>
       </w:r>
     </w:p>
     <w:p>
@@ -548,7 +548,7 @@
           <w:color w:val="000000"/>
           <w:sz w:val="24"/>
         </w:rPr>
-        <w:t>The core neurological pathophysiology of primary dysmenorrhea is rooted in a phenomenon known as peripheral sensitization (Li &amp; Wang, 2023). When the sudden withdrawal of progesterone triggers the massive localized synthesis of prostaglandins (PGF2α and PGE2), these lipids do not solely act on smooth muscle receptors to induce tetanic contractions. PGE2, in particular, acts as a profound neuromodulator. It binds directly to specific E-prostanoid (EP) receptors situated on the terminal endings of the visceral C-fibers. This binding initiates a massive intracellular signaling cascade, typically involving the cyclic AMP (cAMP) and protein kinase A (PKA) pathways. The activation of PKA directly phosphorylates and drastically lowers the activation threshold of crucial voltage-gated sodium channels (Nav1.8 and Nav1.9) and transient receptor potential vanilloid 1 (TRPV1) channels located on the nerve membrane (Pina &amp; Silva, 2021). Consequently, the nerve fiber becomes hyper-excitable. Stimuli that would normally be sub-threshold—such as the standard mechanical distension of the uterus or the normal rhythmic contractions of menstruation—are suddenly amplified into massive, sustained bursts of action potentials. This effectively hyper-sensitizes the entire pelvic nerve network, converting normal physiological processes into agonizing nociceptive signals.</w:t>
+        <w:t>The core neurological pathophysiology of primary dysmenorrhea is rooted in a phenomenon known as peripheral sensitization (Li &amp; Wang, 2023). When the sudden withdrawal of progesterone triggers the localized synthesis of prostaglandins (PGF2α and PGE2), these lipids do not solely act on smooth muscle receptors to induce tetanic contractions. PGE2, in particular, acts as a neuromodulator. It binds directly to specific E-prostanoid (EP) receptors situated on the terminal endings of the visceral C-fibers. This binding initiates an intracellular signaling cascade, typically involving the cyclic AMP (cAMP) and protein kinase A (PKA) pathways. The activation of PKA directly phosphorylates and lowers the activation threshold of voltage-gated sodium channels (Nav1.8 and Nav1.9) and transient receptor potential vanilloid 1 (TRPV1) channels located on the nerve membrane (Pina &amp; Silva, 2021). Consequently, the nerve fiber becomes sensitized. Stimuli that would normally be sub-threshold (such as the standard mechanical distension of the uterus or the rhythmic contractions of menstruation) are amplified into sustained bursts of action potentials. This effectively sensitizes the pelvic nerve network, converting normal physiological processes into nociceptive signals.</w:t>
       </w:r>
     </w:p>
     <w:p>
@@ -562,7 +562,7 @@
           <w:color w:val="000000"/>
           <w:sz w:val="24"/>
         </w:rPr>
-        <w:t>Furthermore, the mechanical ischemia generated by the prostaglandin-induced hypercontractility forces the massive myometrial muscle bed into a state of severe, protracted anaerobic glycolysis. This metabolic shift results in the rapid, localized accumulation of noxious metabolic byproducts, most notably lactic acid, reactive oxygen species (ROS), and bradykinin. The resulting severe tissue acidosis (low pH) directly and powerfully activates acid-sensing ion channels (ASICs) and further stimulates the already hyper-sensitized TRPV1 channels on the C-fibers (Iacovides et al., 2015). Bradykinin, a highly potent endogenous algesic nonapeptide, binds to specific B2 receptors on the nerve terminals, operating synergistically with PGE2 to amplify the peripheral sensitization. This synergistic interaction between mechanical ischemia, metabolic acidosis, and prostaglandin-mediated receptor phosphorylation creates a catastrophic positive feedback loop of unremitting pain transmission.</w:t>
+        <w:t>Furthermore, the mechanical ischemia generated by the prostaglandin-induced hypercontractility forces the myometrial muscle bed into a state of protracted anaerobic glycolysis. This metabolic shift results in the rapid, localized accumulation of noxious metabolic byproducts, most notably lactic acid, reactive oxygen species (ROS), and bradykinin. The resulting tissue acidosis (low pH) directly activates acid-sensing ion channels (ASICs) and further stimulates the already sensitized TRPV1 channels on the C-fibers (Iacovides et al., 2015). Bradykinin, an endogenous algesic nonapeptide, binds to specific B2 receptors on the nerve terminals, operating synergistically with PGE2 to amplify the peripheral sensitization. This synergistic interaction between mechanical ischemia, metabolic acidosis, and prostaglandin-mediated receptor phosphorylation creates a positive feedback loop of unremitting pain transmission.</w:t>
       </w:r>
     </w:p>
     <w:p>
@@ -576,7 +576,7 @@
           <w:color w:val="000000"/>
           <w:sz w:val="24"/>
         </w:rPr>
-        <w:t xml:space="preserve">However, the neurobiological complexity of dysmenorrhea does not terminate at the peripheral nerve ending. Chronic, severe primary dysmenorrhea is increasingly recognized as a profound driver of central sensitization—a pathological state wherein the central nervous system itself becomes hyper-responsive to pain (Li &amp; Wang, 2023). The continuous, massive bombardment of the dorsal horn of the spinal cord by hyper-active C-fibers during menstruation leads to the massive release of excitatory neurotransmitters, specifically glutamate and substance P. Over repeated menstrual cycles, this chronic excitatory input induces long-term potentiation (LTP) at the spinal synapses. The post-synaptic neurons in the spinal cord physically upregulate their N-methyl-D-aspartate (NMDA) receptors, drastically amplifying the pain signal before it is relayed to the brain (Song et al., 2025). This central amplification explains why women with severe, untreated primary dysmenorrhea often experience hyperalgesia (an exaggerated response to a painful stimulus) and allodynia (pain generated by a normally non-painful stimulus) not just in the pelvis, but in adjacent somatic dermatomes, leading to the characteristic radiating pain down the thighs and lower back. </w:t>
+        <w:t xml:space="preserve">However, the neurobiological complexity of dysmenorrhea does not terminate at the peripheral nerve ending. Chronic primary dysmenorrhea is increasingly recognized as a driver of central sensitization, a pathological state wherein the central nervous system itself becomes hyper-responsive to pain (Li &amp; Wang, 2023). The continuous bombardment of the dorsal horn of the spinal cord by active C-fibers during menstruation leads to the release of excitatory neurotransmitters, specifically glutamate and substance P. Over repeated menstrual cycles, this chronic excitatory input induces long-term potentiation (LTP) at the spinal synapses. The post-synaptic neurons in the spinal cord physically upregulate their N-methyl-D-aspartate (NMDA) receptors, amplifying the pain signal before it is relayed to the brain (Song et al., 2025). This central amplification explains why women with untreated primary dysmenorrhea often experience hyperalgesia (an exaggerated response to a painful stimulus) and allodynia (pain generated by a normally non-painful stimulus) not just in the pelvis, but in adjacent somatic dermatomes, leading to the characteristic radiating pain down the thighs and lower back. </w:t>
       </w:r>
     </w:p>
     <w:p>
@@ -590,7 +590,7 @@
           <w:color w:val="000000"/>
           <w:sz w:val="24"/>
         </w:rPr>
-        <w:t>Understanding this dual mechanism of peripheral and central sensitization underscores the absolute necessity of profound, early pharmacological intervention. Tocolytic agents that merely relax the uterine muscle without addressing the underlying inflammatory and neuropathic sensitization are often clinically inadequate. Optimal therapeutics must possess the dual capacity to mechanically halt the ischemic hypercontractility while simultaneously suppressing the synthesis of the exact neuro-sensitizing agents (PGE2) and directly antagonizing the hyper-excitable ion channels (such as TRPV1) on the sensory nerve terminals (Pina &amp; Silva, 2021). It is within this specific, highly demanding pharmacological niche that multi-targeted phytomedicines, particularly those rich in neuro-modulatory anesthetics like eugenol, represent an immensely promising therapeutic frontier.</w:t>
+        <w:t>Understanding this dual mechanism of peripheral and central sensitization underscores the necessity of early pharmacological intervention. Tocolytic agents that merely relax the uterine muscle without addressing the underlying inflammatory and neuropathic sensitization are often clinically inadequate. Optimal therapeutics should possess the dual capacity to mechanically halt the ischemic hypercontractility while simultaneously suppressing the synthesis of the neuro-sensitizing agents (PGE2) and directly antagonizing the excitable ion channels (such as TRPV1) on the sensory nerve terminals (Pina &amp; Silva, 2021). It is within this specific pharmacological niche that multi-targeted phytomedicines, particularly those rich in neuro-modulatory anesthetics like eugenol, represent a promising therapeutic frontier.</w:t>
       </w:r>
     </w:p>
     <w:p>
@@ -618,7 +618,7 @@
           <w:color w:val="000000"/>
           <w:sz w:val="24"/>
         </w:rPr>
-        <w:t>While the massive overproduction of vasoactive prostaglandins (PGF2α and PGE2) has historically dominated the pathophysiological narrative of primary dysmenorrhea, contemporary molecular and biochemical research has unequivocally expanded this paradigm. It is now scientifically irrefutable that dysmenorrhea is not merely a localized prostaglandin disorder, but rather a complex, severe, and systemic inflammatory cascade driven massively by overwhelming oxidative stress and the aggressive proliferation of pro-inflammatory cytokines (Szydłowska et al., 2020). This modern understanding profoundly shifts the therapeutic target landscape, demanding pharmacological interventions that possess potent, multi-pathway antioxidant and immunomodulatory capabilities, far exceeding the narrow, single-target scope of traditional COX inhibitors.</w:t>
+        <w:t>While the overproduction of vasoactive prostaglandins (PGF2α and PGE2) has historically dominated the pathophysiological narrative of primary dysmenorrhea, contemporary molecular and biochemical research has expanded this paradigm. It is now scientifically recognized that dysmenorrhea is not merely a localized prostaglandin disorder, but rather a complex systemic inflammatory cascade driven by oxidative stress and the proliferation of pro-inflammatory cytokines (Szydłowska et al., 2020). This modern understanding shifts the therapeutic target landscape, demanding pharmacological interventions that possess antioxidant and immunomodulatory capabilities, exceeding the narrow scope of traditional COX inhibitors.</w:t>
       </w:r>
     </w:p>
     <w:p>
@@ -632,7 +632,7 @@
           <w:color w:val="000000"/>
           <w:sz w:val="24"/>
         </w:rPr>
-        <w:t xml:space="preserve">Oxidative stress is fundamentally defined as a severe physiological imbalance wherein the pathological generation of highly reactive, unstable oxygen-containing molecules—specifically Reactive Oxygen Species (ROS) such as the superoxide anion, hydroxyl radical, and hydrogen peroxide—vastly overwhelms the body's endogenous antioxidant defense mechanisms (e.g., superoxide dismutase, catalase, and glutathione peroxidase). In the context of primary dysmenorrhea, this imbalance is not coincidental; it is a direct, catastrophic consequence of the ischemic hypercontractility characterizing the disorder (Song et al., 2025). When the prostaglandin-induced tetanic contractions physically crush the uterine spiral arterioles, the myometrium and endometrium are plunged into profound hypoxia. However, as the uterus intermittently relaxes, blood rushes back into the starved tissue in a violent process known as ischemia-reperfusion injury. This sudden influx of massive quantities of oxygen into severely metabolically stressed tissue triggers an explosive, uncontrollable burst of free radicals from the damaged mitochondria of the smooth muscle and endometrial cells. </w:t>
+        <w:t xml:space="preserve">Oxidative stress is defined as a physiological imbalance wherein the pathological generation of highly reactive oxygen-containing molecules (specifically Reactive Oxygen Species ROS such as the superoxide anion, hydroxyl radical, and hydrogen peroxide) overwhelms the body's endogenous antioxidant defense mechanisms (e.g., superoxide dismutase, catalase, and glutathione peroxidase). In the context of primary dysmenorrhea, this imbalance is a direct consequence of the ischemic hypercontractility characterizing the disorder (Song et al., 2025). When the prostaglandin-induced tetanic contractions physically crush the uterine spiral arterioles, the myometrium and endometrium are plunged into hypoxia. However, as the uterus intermittently relaxes, blood rushes back into the starved tissue in a process known as ischemia-reperfusion injury. This sudden influx of oxygen into metabolically stressed tissue triggers a burst of free radicals from the damaged mitochondria of the smooth muscle and endometrial cells. </w:t>
       </w:r>
     </w:p>
     <w:p>
@@ -646,7 +646,7 @@
           <w:color w:val="000000"/>
           <w:sz w:val="24"/>
         </w:rPr>
-        <w:t>These highly destructive ROS immediately unleash absolute havoc upon the cellular architecture. They aggressively attack the lipid bilayers of the cell membranes in a destructive chain reaction known as lipid peroxidation. The primary byproduct of this lipid peroxidation is malondialdehyde (MDA), a highly stable and exceptionally toxic aldehyde. Clinical studies have consistently demonstrated that women suffering from severe primary dysmenorrhea exhibit massively elevated systemic and local levels of MDA during menstruation compared to healthy controls, providing incontrovertible biochemical proof of severe, active oxidative damage (Szydłowska et al., 2020). Furthermore, ROS directly damage critical cellular proteins and nuclear DNA, triggering massive cellular apoptosis. Crucially, this extreme oxidative stress acts as a potent, direct stimulus for the nuclear factor-kappa B (NF-κB) signaling pathway. The activation of NF-κB is the master trigger for the transcription of a massive array of inflammatory genes, thereby initiating the secondary, equally devastating arm of the dysmenorrheic pathology: the cytokine storm.</w:t>
+        <w:t>These ROS unleash significant damage upon the cellular architecture. They actively attack the lipid bilayers of the cell membranes in a destructive chain reaction known as lipid peroxidation. The primary byproduct of this lipid peroxidation is malondialdehyde (MDA), a stable and toxic aldehyde. Clinical studies have consistently demonstrated that women suffering from severe primary dysmenorrhea exhibit elevated systemic and local levels of MDA during menstruation compared to healthy controls, providing biochemical proof of active oxidative damage (Szydłowska et al., 2020). Furthermore, ROS directly damage critical cellular proteins and nuclear DNA, triggering cellular apoptosis. Crucially, this oxidative stress acts as a direct stimulus for the nuclear factor-kappa B (NF-κB) signaling pathway. The activation of NF-κB is the trigger for the transcription of an array of inflammatory genes, thereby initiating the secondary arm of the dysmenorrheic pathology: the cytokine cascade.</w:t>
       </w:r>
     </w:p>
     <w:p>
@@ -660,7 +660,7 @@
           <w:color w:val="000000"/>
           <w:sz w:val="24"/>
         </w:rPr>
-        <w:t>Cytokines are small, highly potent, secreted cell-signaling proteins that orchestrate the immune response. In primary dysmenorrhea, the activation of NF-κB, combined with the initial tissue necrosis from ischemia, triggers the massive recruitment and activation of endometrial macrophages and leukocytes (Song et al., 2025). These activated immune cells pour massive quantities of specific, highly aggressive pro-inflammatory cytokines directly into the local tissue microenvironment, most notably interleukin-6 (IL-6), interleukin-1 beta (IL-1β), and tumor necrosis factor-alpha (TNF-α). These specific cytokines exert profound, deleterious effects that drastically amplify the pain and cramping. First, IL-6 and TNF-α act as powerful, direct upregulators of the cyclooxygenase-2 (COX-2) enzyme. By massively increasing the total expression of COX-2 within the tissue, these cytokines supercharge the synthesis of even more prostaglandins, creating a vicious, self-sustaining loop of inflammation and ischemia (Wan &amp; Yao, 2021). Secondly, these cytokines are intrinsically hyperalgesic; they diffuse into the local tissue and directly bind to receptors on the pelvic visceral C-fibers, drastically lowering the pain threshold and exacerbating the peripheral sensitization already initiated by PGE2 (Li &amp; Wang, 2023). Finally, high systemic levels of these specific cytokines, particularly IL-6 and TNF-α, are directly responsible for the debilitating systemic symptoms so frequently reported by dysmenorrheic patients, including the intense fatigue, severe nausea, and febrile sensations that standard NSAIDs often fail to resolve.</w:t>
+        <w:t>Cytokines are small, secreted cell-signaling proteins that orchestrate the immune response. In primary dysmenorrhea, the activation of NF-κB, combined with the initial tissue necrosis from ischemia, triggers the recruitment and activation of endometrial macrophages and leukocytes (Song et al., 2025). These activated immune cells release specific pro-inflammatory cytokines directly into the local tissue microenvironment, most notably interleukin-6 (IL-6), interleukin-1 beta (IL-1β), and tumor necrosis factor-alpha (TNF-α). These specific cytokines exert deleterious effects that amplify the pain and cramping. First, IL-6 and TNF-α act as direct upregulators of the cyclooxygenase-2 (COX-2) enzyme. By increasing the total expression of COX-2 within the tissue, these cytokines increase the synthesis of even more prostaglandins, creating a self-sustaining loop of inflammation and ischemia (Wan &amp; Yao, 2021). Secondly, these cytokines are intrinsically hyperalgesic; they diffuse into the local tissue and directly bind to receptors on the pelvic visceral C-fibers, lowering the pain threshold and exacerbating the peripheral sensitization already initiated by PGE2 (Li &amp; Wang, 2023). Finally, high systemic levels of these specific cytokines, particularly IL-6 and TNF-α, are directly responsible for the systemic symptoms frequently reported by dysmenorrheic patients, including fatigue, nausea, and febrile sensations that standard NSAIDs often fail to resolve.</w:t>
       </w:r>
     </w:p>
     <w:p>
@@ -674,7 +674,7 @@
           <w:color w:val="000000"/>
           <w:sz w:val="24"/>
         </w:rPr>
-        <w:t>The undeniable implication of this massive oxidative and cytokine-driven pathology is that targeting prostaglandins alone is insufficient for achieving complete resolution of the disorder. A truly optimal, comprehensive therapeutic agent must possess a tripartite pharmacological profile: it must be a potent tocolytic to halt the mechanical ischemia, a powerful, direct free radical scavenger to neutralize the massive ROS burst and prevent ischemia-reperfusion injury, and a robust immunomodulator capable of suppressing the pathological release of IL-6 and TNF-α (Szydłowska et al., 2020). It is specifically within this highly demanding context that the massive, complex phytochemical profiles of certain traditional botanicals—particularly those dense in highly active polyphenols, powerful flavonoids, and antioxidant essential oils—present an unprecedented therapeutic opportunity, offering a holistic pharmacological blockade that synthetic monotherapies simply cannot replicate.</w:t>
+        <w:t>The implication of this oxidative and cytokine-driven pathology is that targeting prostaglandins alone is insufficient for achieving complete resolution of the disorder. An optimal therapeutic agent should possess a tripartite pharmacological profile: it must be a tocolytic to halt the mechanical ischemia, a direct free radical scavenger to neutralize the ROS burst and prevent ischemia-reperfusion injury, and a robust immunomodulator capable of suppressing the pathological release of IL-6 and TNF-α (Szydłowska et al., 2020). It is specifically within this context that the complex phytochemical profiles of certain traditional botanicals (particularly those dense in active polyphenols, flavonoids, and antioxidant essential oils) present a therapeutic opportunity, offering a holistic pharmacological blockade that synthetic monotherapies often cannot replicate.</w:t>
       </w:r>
     </w:p>
     <w:p>
@@ -702,7 +702,7 @@
           <w:color w:val="000000"/>
           <w:sz w:val="24"/>
         </w:rPr>
-        <w:t>The rigorous, systematic, and reproducible evaluation of novel tocolytic agents demands highly sophisticated experimental paradigms. While the isolated murine uterine organ bath provides unparalleled, artifact-free data regarding the direct biomechanical relaxation of smooth muscle, evaluating the complex, multi-systemic efficacy of a therapeutic agent against the true pathogenesis of primary dysmenorrhea necessitates the use of robust in vivo animal models (Hartmann &amp; Mohamed, 2021). Because laboratory rodents do not naturally experience menstruation or the spontaneous, cyclical pelvic hyperalgesia characteristic of human dysmenorrhea, pharmacologists must artificially induce a state of severe, acute uterine hypercontractility and profound visceral pain that perfectly mimics the human condition. Over decades of intensive pharmacological refinement, the "Estradiol Benzoate and Oxytocin Induction Model" in female mice has unequivocally emerged as the absolute, gold-standard, and most globally utilized experimental protocol for testing novel antidysmenorrhea compounds (Sari &amp; Sutrisno, 2022).</w:t>
+        <w:t>The systematic and reproducible evaluation of novel tocolytic agents demands sophisticated experimental paradigms. While the isolated murine uterine organ bath provides artifact-free data regarding the direct biomechanical relaxation of smooth muscle, evaluating the multi-systemic efficacy of a therapeutic agent against the pathogenesis of primary dysmenorrhea necessitates the use of in vivo animal models (Hartmann &amp; Mohamed, 2021). Because laboratory rodents do not naturally experience menstruation or the spontaneous cyclical pelvic hyperalgesia characteristic of human dysmenorrhea, pharmacologists must artificially induce a state of acute uterine hypercontractility and visceral pain that mimics the human condition. Over decades of pharmacological refinement, the "Estradiol Benzoate and Oxytocin Induction Model" in female mice has emerged as the standard, globally utilized experimental protocol for testing novel antidysmenorrhea compounds (Sari &amp; Sutrisno, 2022).</w:t>
       </w:r>
     </w:p>
     <w:p>
@@ -716,7 +716,7 @@
           <w:color w:val="000000"/>
           <w:sz w:val="24"/>
         </w:rPr>
-        <w:t xml:space="preserve">The scientific rationale underpinning this specific induction model is deeply rooted in the fundamental neuroendocrinology and physiology of the myometrium. In human primary dysmenorrhea, the extreme tetanic contractions are generated by a highly sensitized, estrogen-primed uterus that is subsequently bombarded by massive surges of uterotonics (specifically prostaglandins, though oxytocin and vasopressin also play crucial synergistic roles). The murine model meticulously recreates this exact pathophysiological environment through a highly precise, two-step pharmacological sensitization and induction protocol (Ma &amp; Li, 2022). </w:t>
+        <w:t xml:space="preserve">The scientific rationale underpinning this specific induction model is rooted in the neuroendocrinology and physiology of the myometrium. In human primary dysmenorrhea, the tetanic contractions are generated by an estrogen-primed uterus that is subsequently exposed to surges of uterotonics (specifically prostaglandins, though oxytocin and vasopressin also play synergistic roles). The murine model recreates this pathophysiological environment through a two-step pharmacological sensitization and induction protocol (Ma &amp; Li, 2022). </w:t>
       </w:r>
     </w:p>
     <w:p>
@@ -730,7 +730,7 @@
           <w:color w:val="000000"/>
           <w:sz w:val="24"/>
         </w:rPr>
-        <w:t>The first crucial step is the massive, systemic sensitization of the murine uterus. To achieve this, non-pregnant, cycling female mice are administered a potent, long-acting synthetic estrogen, specifically estradiol benzoate. This administration is typically performed subcutaneously or intraperitoneally over a period of 24 to 48 hours prior to the actual pain induction. The massive influx of exogenous estradiol completely overrides the animal's natural estrous cycle, driving the entire reproductive tract into an artificially prolonged, extreme state of proestrus or early estrus (Sari &amp; Sutrisno, 2022). More importantly, this severe hyper-estrogenization triggers a massive, systemic genomic response within the myometrial smooth muscle cells. The estrogen acts directly on nuclear receptors to drastically upregulate the transcription and translation of oxytocin receptors (OXTRs) and gap junction proteins, specifically connexin-43 (Shi &amp; Jia, 2022). By forcing the massive proliferation of these critical receptors and electrical conduits, the estradiol benzoate dramatically lowers the resting membrane potential of the smooth muscle cells, creating an incredibly tense, highly interconnected syncytium that is exquisitely sensitized to any uterotonic stimulus. The uterus is essentially transformed into a primed, highly reactive mechanical explosive, structurally prepared to mount massive, coordinated, and sustained contractions (Ma &amp; Li, 2022).</w:t>
+        <w:t>The first step is the systemic sensitization of the murine uterus. To achieve this, non-pregnant, cycling female mice are administered a long-acting synthetic estrogen, specifically estradiol benzoate. This administration is typically performed subcutaneously or intraperitoneally over a period of 24 to 48 hours prior to the pain induction. The influx of exogenous estradiol overrides the animal's natural estrous cycle, driving the reproductive tract into a prolonged state of proestrus or early estrus (Sari &amp; Sutrisno, 2022). More importantly, this hyper-estrogenization triggers a systemic genomic response within the myometrial smooth muscle cells. The estrogen acts directly on nuclear receptors to upregulate the transcription and translation of oxytocin receptors (OXTRs) and gap junction proteins, specifically connexin-43 (Shi &amp; Jia, 2022). By forcing the proliferation of these critical receptors and electrical conduits, the estradiol benzoate lowers the resting membrane potential of the smooth muscle cells, creating an interconnected syncytium that is sensitized to uterotonic stimuli. The uterus is essentially transformed into a primed structural state prepared to mount coordinated, sustained contractions (Ma &amp; Li, 2022).</w:t>
       </w:r>
     </w:p>
     <w:p>
@@ -744,7 +744,7 @@
           <w:color w:val="000000"/>
           <w:sz w:val="24"/>
         </w:rPr>
-        <w:t xml:space="preserve">The second step is the acute, violent induction of the actual dysmenorrheic pain episode. Once the uterus is fully sensitized by the estradiol, the mice are administered a massive, acute, high-dose injection of synthetic oxytocin (typically via the intraperitoneal route). The exogenous oxytocin immediately binds to the vastly upregulated population of OXTRs on the myometrial membrane, triggering a catastrophic intracellular cascade. The binding activates the Gq-protein coupled pathway, leading to a massive, explosive release of calcium from the sarcoplasmic reticulum and a rapid influx of extracellular calcium (Lestariningsih et al., 2024). This sudden, massive spike in intracellular calcium binds to calmodulin, activating myosin light chain kinase and resulting in immediate, severe, tetanic, and highly ischemic hypercontractions of the uterine horns. This artificially induced ischemic hypercontractility flawlessly mirrors the mechanical crushing of the uterine vasculature seen in human dysmenorrhea, generating the exact same anoxic tissue environment, lactic acid accumulation, and profound visceral pain signaling (Hartmann &amp; Mohamed, 2021). </w:t>
+        <w:t xml:space="preserve">The second step is the acute induction of the dysmenorrheic pain episode. Once the uterus is fully sensitized by the estradiol, the mice are administered a high-dose injection of synthetic oxytocin (typically via the intraperitoneal route). The exogenous oxytocin binds to the upregulated population of OXTRs on the myometrial membrane, triggering an intracellular cascade. The binding activates the Gq-protein coupled pathway, leading to a release of calcium from the sarcoplasmic reticulum and an influx of extracellular calcium (Lestariningsih et al., 2024). This spike in intracellular calcium binds to calmodulin, activating myosin light chain kinase and resulting in immediate, tetanic, and ischemic hypercontractions of the uterine horns. This artificially induced ischemic hypercontractility mirrors the mechanical crushing of the uterine vasculature seen in human dysmenorrhea, generating the same anoxic tissue environment, lactic acid accumulation, and visceral pain signaling (Hartmann &amp; Mohamed, 2021). </w:t>
       </w:r>
     </w:p>
     <w:p>
@@ -758,7 +758,7 @@
           <w:color w:val="000000"/>
           <w:sz w:val="24"/>
         </w:rPr>
-        <w:t xml:space="preserve">The resulting extreme visceral agony manifests instantly and spectacularly in the mouse through highly characteristic, involuntary behavioral pain responses universally recognized as "writhing." A typical writhe is clinically defined as a severe, spastic contraction of the abdominal musculature, accompanied by an extreme, unnatural extension of the hind limbs and a severe arching or torsion of the entire torso, as the animal violently attempts to alleviate the acute pelvic pressure (Liu &amp; Chen, 2020). By isolating the animals in controlled observation chambers and meticulously counting the exact number of these specific writhing episodes over a precise timeframe (typically 30 minutes following the oxytocin injection), pharmacologists obtain a highly objective, quantifiable, and reproducible metric of the severity of the dysmenorrheic pain. </w:t>
+        <w:t xml:space="preserve">The resulting visceral pain manifests in the mouse through characteristic, involuntary behavioral responses recognized as "writhing." A typical writhe is clinically defined as a spastic contraction of the abdominal musculature, accompanied by an unnatural extension of the hind limbs and a torsion of the torso, as the animal attempts to alleviate the pelvic pressure (Liu &amp; Chen, 2020). By isolating the animals in controlled observation chambers and counting the exact number of these specific writhing episodes over a precise timeframe (typically 30 minutes following the oxytocin injection), pharmacologists obtain an objective, quantifiable, and reproducible metric of the severity of the dysmenorrheic pain. </w:t>
       </w:r>
     </w:p>
     <w:p>
@@ -772,7 +772,7 @@
           <w:color w:val="000000"/>
           <w:sz w:val="24"/>
         </w:rPr>
-        <w:t>This model is exceptionally robust. If a novel test substance, such as a botanical extract or a synthetic pharmaceutical, is administered prophylactically prior to the oxytocin challenge, its precise in vivo efficacy can be directly measured (Sari &amp; Sutrisno, 2022). A highly effective tocolytic or analgesic agent will significantly, and in a dose-dependent manner, suppress the total number of observed writhes compared to an untreated control group. Furthermore, this specific model allows for the direct, head-to-head comparison of novel extracts against established, gold-standard clinical therapies, such as ibuprofen or diclofenac, providing incontrovertible, actionable in vivo validation of the extract's true pharmacological capacity to neutralize the complex, multi-systemic agony of primary dysmenorrhea (Ma &amp; Li, 2022).</w:t>
+        <w:t>This model is exceptionally robust. If a novel test substance, such as a botanical extract or a synthetic pharmaceutical, is administered prophylactically prior to the oxytocin challenge, its in vivo efficacy can be directly measured (Sari &amp; Sutrisno, 2022). An effective tocolytic or analgesic agent will significantly, and in a dose-dependent manner, suppress the total number of observed writhes compared to an untreated control group. Furthermore, this specific model allows for the direct comparison of novel extracts against established clinical therapies, such as ibuprofen or diclofenac, providing actionable in vivo validation of the extract's pharmacological capacity to neutralize the multi-systemic pain of primary dysmenorrhea (Ma &amp; Li, 2022).</w:t>
       </w:r>
     </w:p>
     <w:p>
@@ -800,7 +800,7 @@
           <w:color w:val="000000"/>
           <w:sz w:val="24"/>
         </w:rPr>
-        <w:t>Given that the definitive physiological origin of primary dysmenorrhea lies in the pathological overproduction of prostaglandins and the subsequent cascade of severe, ischemic uterine hypercontractility, contemporary pharmacological management is overwhelmingly directed toward breaking this specific pathogenic chain. The cornerstone of evidence-based medical intervention relies fundamentally on two primary classes of synthetic pharmaceuticals: Non-Steroidal Anti-Inflammatory Drugs (NSAIDs) and Combined Oral Contraceptives (COCs) (Marjoribanks et al., 2015; Wong et al., 2009). These two established modalities, utilized either as monotherapy or in a synergistic combination, currently constitute the undisputed, universally recommended first-line treatment protocols across all major global gynecological guidelines (Burnett &amp; Lemyre, 2017).</w:t>
+        <w:t>Given that the physiological origin of primary dysmenorrhea lies in the pathological overproduction of prostaglandins and the subsequent cascade of ischemic uterine hypercontractility, contemporary pharmacological management is directed toward breaking this pathogenic chain. The cornerstone of evidence-based medical intervention relies fundamentally on two primary classes of synthetic pharmaceuticals: Non-Steroidal Anti-Inflammatory Drugs (NSAIDs) and Combined Oral Contraceptives (COCs) (Marjoribanks et al., 2015; Wong et al., 2009). These two established modalities, utilized either as monotherapy or in combination, currently constitute the universally recommended first-line treatment protocols across major gynecological guidelines (Burnett &amp; Lemyre, 2017).</w:t>
       </w:r>
     </w:p>
     <w:p>
@@ -814,7 +814,7 @@
           <w:color w:val="000000"/>
           <w:sz w:val="24"/>
         </w:rPr>
-        <w:t>Non-Steroidal Anti-Inflammatory Drugs (NSAIDs), such as ibuprofen, naproxen, mefenamic acid, and diclofenac, represent the absolute vanguard of targeted, first-line therapy for primary dysmenorrhea (Marjoribanks et al., 2015). Their mechanism of action is incredibly precise and directly antagonistic to the core pathophysiology of the disorder: NSAIDs act as potent, competitive inhibitors of the cyclooxygenase (COX) enzyme system, the critical bottleneck catalyst responsible for the oxidative conversion of arachidonic acid into the massive surge of prostaglandins (PGF2α and PGE2) (Rouzer &amp; Marnett, 2009). By systematically blocking the catalytic activity of both the constitutive COX-1 and the highly inducible COX-2 isoforms, NSAIDs effectively shut down the entire downstream arachidonic acid cascade within the sloughing endometrium. This profound, targeted biochemical blockade drastically curtails the synthesis and accumulation of potent uterotonic prostaglandins, thereby preventing the initiation of severe myometrial hypercontractility, restoring normal uterine blood flow, eliminating tissue ischemia, and ultimately extinguishing the peripheral pain signal at its origin (Dawood, 1984). Extensive meta-analyses have repeatedly confirmed that NSAIDs are significantly superior to placebo in providing robust, rapid, and sustained relief from acute menstrual cramping (Marjoribanks et al., 2015).</w:t>
+        <w:t>Non-Steroidal Anti-Inflammatory Drugs (NSAIDs), such as ibuprofen, naproxen, mefenamic acid, and diclofenac, represent the primary targeted therapy for primary dysmenorrhea (Marjoribanks et al., 2015). Their mechanism of action is directly antagonistic to the core pathophysiology of the disorder: NSAIDs act as competitive inhibitors of the cyclooxygenase (COX) enzyme system, the critical catalyst responsible for the oxidative conversion of arachidonic acid into prostaglandins (PGF2α and PGE2) (Rouzer &amp; Marnett, 2009). By systematically blocking the catalytic activity of both the constitutive COX-1 and the highly inducible COX-2 isoforms, NSAIDs effectively shut down the downstream arachidonic acid cascade within the sloughing endometrium. This targeted biochemical blockade curtails the synthesis and accumulation of uterotonic prostaglandins, thereby preventing the initiation of myometrial hypercontractility, restoring normal uterine blood flow, eliminating tissue ischemia, and extinguishing the peripheral pain signal at its origin (Dawood, 1984). Meta-analyses have confirmed that NSAIDs are significantly superior to placebo in providing relief from acute menstrual cramping (Marjoribanks et al., 2015).</w:t>
       </w:r>
     </w:p>
     <w:p>
@@ -828,7 +828,7 @@
           <w:color w:val="000000"/>
           <w:sz w:val="24"/>
         </w:rPr>
-        <w:t xml:space="preserve">Combined Oral Contraceptives (COCs) provide a highly effective, alternative, or adjunctive first-line therapeutic approach, functioning via a fundamentally different mechanism. Composed of synthetic estrogen and progestin, COCs operate by exerting profound, continuous negative feedback on the Hypothalamic-Pituitary-Ovarian (HPO) axis, thereby suppressing the mid-cycle luteinizing hormone (LH) surge and medically abolishing ovulation entirely (Wong et al., 2009). By preventing ovulation, COCs fundamentally disrupt the hormonal prerequisites necessary for the massive proliferation of the endometrial stratum functionalis. The continuous delivery of synthetic progestin creates a thin, highly atrophic, and relatively inactive endometrial lining. Consequently, when the withdrawal bleed (a hormonally induced pseudo-menstruation) occurs during the placebo week, there is an incredibly minimal volume of endometrial tissue available to break down. This massive reduction in tissue volume directly correlates to a vastly diminished capacity for the synthesis and release of arachidonic acid and prostaglandins (Wong et al., 2009). By preemptively downregulating the total substrate available for prostaglandin synthesis, COCs effectively lower the baseline intrauterine pressure and completely prevent the severe, spastic hypercontractility characteristic of dysmenorrhea. </w:t>
+        <w:t xml:space="preserve">Combined Oral Contraceptives (COCs) provide an effective alternative or adjunctive first-line therapeutic approach, functioning via a fundamentally different mechanism. Composed of synthetic estrogen and progestin, COCs operate by exerting continuous negative feedback on the Hypothalamic-Pituitary-Ovarian (HPO) axis, thereby suppressing the mid-cycle luteinizing hormone (LH) surge and medically abolishing ovulation (Wong et al., 2009). By preventing ovulation, COCs disrupt the hormonal prerequisites necessary for the proliferation of the endometrial stratum functionalis. The continuous delivery of synthetic progestin creates a thin, highly atrophic, and relatively inactive endometrial lining. Consequently, when the withdrawal bleed occurs during the placebo week, there is a minimal volume of endometrial tissue available to break down. This reduction in tissue volume directly correlates to a diminished capacity for the synthesis and release of arachidonic acid and prostaglandins (Wong et al., 2009). By preemptively downregulating the total substrate available for prostaglandin synthesis, COCs effectively lower the baseline intrauterine pressure and prevent the spastic hypercontractility characteristic of dysmenorrhea. </w:t>
       </w:r>
     </w:p>
     <w:p>
@@ -842,7 +842,7 @@
           <w:color w:val="000000"/>
           <w:sz w:val="24"/>
         </w:rPr>
-        <w:t>However, despite their proven efficacy, neither NSAIDs nor COCs provide a universal panacea, and their widespread clinical utility is severely limited by a formidable array of adverse drug reactions, absolute contraindications, and high rates of clinical failure (Oladosu et al., 2018). The indiscriminate inhibition of COX enzymes by non-selective NSAIDs profoundly suppresses the synthesis of cytoprotective prostaglandins within the gastric mucosa, exposing patients to severe gastrointestinal toxicities, ranging from chronic dyspepsia and nausea to life-threatening peptic ulceration and catastrophic gastrointestinal hemorrhage, particularly with long-term, high-dose administration (Navarro &amp; Sánchez, 2022). Furthermore, NSAID use carries well-documented risks of nephrotoxicity, hepatotoxicity, and exacerbation of reactive airway diseases like asthma. COCs also carry a significant burden of side effects, including severe mood lability, undesirable weight gain, debilitating migraines, extreme breast tenderness, and a profoundly elevated, life-threatening risk of developing venous thromboembolism (VTE), deep vein thrombosis (DVT), and pulmonary embolism, especially in individuals with a high BMI or a history of smoking (Smith et al., 2024). Even more concerning is the phenomenon of pharmacological resistance: an estimated 15% to 25% of women suffering from severe primary dysmenorrhea are completely refractory to maximum tolerated doses of both NSAIDs and COCs, deriving absolutely zero clinical relief and remaining trapped in severe, cyclical agony (Oladosu et al., 2018). This significant failure rate, combined with the severe, dose-limiting toxicity profile of existing synthetics, has catalyzed an urgent, global scientific mandate to aggressively discover, rigorously evaluate, and develop novel, highly efficacious, and significantly safer alternative tocolytic and analgesic therapeutics, with massive attention currently shifting toward the vast, untapped pharmacological potential of phytomedicine (Sargin, 2021).</w:t>
+        <w:t>However, despite their proven efficacy, neither NSAIDs nor COCs provide a universal solution, and their clinical utility is limited by an array of adverse drug reactions, contraindications, and high rates of clinical failure (Oladosu et al., 2018). The indiscriminate inhibition of COX enzymes by non-selective NSAIDs suppresses the synthesis of cytoprotective prostaglandins within the gastric mucosa, exposing patients to gastrointestinal toxicities, ranging from chronic dyspepsia and nausea to peptic ulceration and gastrointestinal hemorrhage, particularly with long-term, high-dose administration (Navarro &amp; Sánchez, 2022). Furthermore, NSAID use carries documented risks of nephrotoxicity, hepatotoxicity, and exacerbation of reactive airway diseases like asthma. COCs also carry a burden of side effects, including mood lability, undesirable weight gain, migraines, breast tenderness, and an elevated risk of developing venous thromboembolism (VTE), deep vein thrombosis (DVT), and pulmonary embolism, especially in individuals with a high BMI or a history of smoking (Smith et al., 2024). Even more concerning is the phenomenon of pharmacological resistance: an estimated 15% to 25% of women suffering from severe primary dysmenorrhea are refractory to maximum tolerated doses of both NSAIDs and COCs, deriving zero clinical relief (Oladosu et al., 2018). This significant failure rate, combined with the dose-limiting toxicity profile of existing synthetics, has catalyzed a scientific mandate to discover and rigorously evaluate novel, efficacious, and significantly safer alternative tocolytic and analgesic therapeutics, with attention shifting toward the pharmacological potential of phytomedicine (Sargin, 2021).</w:t>
       </w:r>
     </w:p>
     <w:p>
@@ -870,7 +870,7 @@
           <w:color w:val="000000"/>
           <w:sz w:val="24"/>
         </w:rPr>
-        <w:t xml:space="preserve">In direct response to the severe limitations, widespread therapeutic failures, and potentially devastating side effects associated with chronic NSAID and synthetic hormonal therapies, there has been a massive, global resurgence of scientific and clinical interest in exploring the vast pharmacological potential of herbal medicines and traditional phytotherapy for the management of primary dysmenorrhea (Sargin, 2021). For millennia, indigenous cultures and traditional medical systems across the world—ranging from Traditional Chinese Medicine (TCM) and Indian Ayurveda to African ethnomedicine and Western herbalism—have relied heavily on a vast compendium of specific botanical extracts, complex herbal formulations, and essential oils to successfully mitigate menstrual pain, regulate highly erratic cycles, and completely resolve severe pelvic cramping (Aziz et al., 2018). While these ancestral remedies were historically dismissed by allopathic medicine as mere folklore or potent placebo effects, contemporary pharmacological research has fundamentally validated their efficacy, proving that many of these botanicals contain incredibly potent, highly active phytochemical constituents that exert complex, measurable, and highly specific physiological effects (Kaur &amp; Kaushal, 2019). </w:t>
+        <w:t xml:space="preserve">In response to the limitations, therapeutic failures, and side effects associated with chronic NSAID and synthetic hormonal therapies, there has been a resurgence of scientific and clinical interest in exploring the pharmacological potential of herbal medicines and traditional phytotherapy for the management of primary dysmenorrhea (Sargin, 2021). Indigenous cultures and traditional medical systems across the world (ranging from Traditional Chinese Medicine and Indian Ayurveda to African ethnomedicine and Western herbalism) have relied on botanical extracts, complex herbal formulations, and essential oils to mitigate menstrual pain, regulate cycles, and resolve pelvic cramping (Aziz et al., 2018). While these ancestral remedies were historically dismissed by allopathic medicine, contemporary pharmacological research has validated their efficacy, proving that many of these botanicals contain active phytochemical constituents that exert measurable physiological effects (Kaur &amp; Kaushal, 2019). </w:t>
       </w:r>
     </w:p>
     <w:p>
@@ -884,7 +884,7 @@
           <w:color w:val="000000"/>
           <w:sz w:val="24"/>
         </w:rPr>
-        <w:t>Modern scientific investigations into these traditional botanical medicines have isolated an immense array of bioactive secondary metabolites—including complex flavonoids, highly volatile essential oils (terpenes and terpenoids), potent alkaloids, and specialized phenolic compounds—that exhibit profound anti-inflammatory, antispasmodic, tocolytic, and analgesic properties completely analogous to, and sometimes exceeding, those of synthetic pharmaceuticals (Guimarães et al., 2013). These complex plant-derived compounds frequently operate via multiple, synergistic pharmacological pathways. Rather than targeting a single, isolated enzyme like NSAIDs, these herbal extracts can simultaneously downregulate the expression of the COX-2 enzyme, actively inhibit the downstream lipoxygenase (LOX) inflammatory pathway, directly antagonize voltage-gated calcium channels within the myometrium, and significantly enhance local peripheral microcirculation to rapidly reverse ischemic tissue hypoxia (Ramezani &amp; Jalali, 2021).</w:t>
+        <w:t>Modern scientific investigations into these botanical medicines have isolated bioactive secondary metabolites, including flavonoids, volatile essential oils (terpenes and terpenoids), alkaloids, and phenolic compounds, that exhibit anti-inflammatory, antispasmodic, tocolytic, and analgesic properties analogous to synthetic pharmaceuticals (Guimarães et al., 2013). These plant-derived compounds frequently operate via synergistic pharmacological pathways. Rather than targeting a single enzyme like NSAIDs, these herbal extracts can simultaneously downregulate the expression of the COX-2 enzyme, inhibit the downstream lipoxygenase (LOX) inflammatory pathway, antagonize voltage-gated calcium channels within the myometrium, and enhance local peripheral microcirculation to reverse ischemic tissue hypoxia (Ramezani &amp; Jalali, 2021).</w:t>
       </w:r>
     </w:p>
     <w:p>
@@ -898,7 +898,7 @@
           <w:color w:val="000000"/>
           <w:sz w:val="24"/>
         </w:rPr>
-        <w:t>A multitude of rigorous, double-blind, randomized controlled clinical trials have conclusively proven the exceptional efficacy of specific botanical interventions in resolving severe primary dysmenorrhea. For instance, Fennel (</w:t>
+        <w:t>A multitude of randomized controlled clinical trials have proven the efficacy of specific botanical interventions in resolving primary dysmenorrhea. For instance, Fennel (</w:t>
       </w:r>
       <w:r>
         <w:rPr>
@@ -915,7 +915,7 @@
           <w:color w:val="000000"/>
           <w:sz w:val="24"/>
         </w:rPr>
-        <w:t>), a botanical rich in the potent antispasmodic anethole, has repeatedly demonstrated an ability to significantly reduce both the severity and the duration of acute menstrual pain by acting as a powerful direct relaxant on the uterine smooth muscle, effectively neutralizing hypercontractility (Lee et al., 2020; Ostad et al., 2001). Ginger (</w:t>
+        <w:t>), a botanical rich in the antispasmodic anethole, has demonstrated an ability to reduce both the severity and the duration of menstrual pain by acting as a relaxant on the uterine smooth muscle, effectively neutralizing hypercontractility (Lee et al., 2020; Ostad et al., 2001). Ginger (</w:t>
       </w:r>
       <w:r>
         <w:rPr>
@@ -932,7 +932,7 @@
           <w:color w:val="000000"/>
           <w:sz w:val="24"/>
         </w:rPr>
-        <w:t>), densely packed with bioactive gingerols and shogaols, has been proven through massive meta-analyses to be statistically equally as effective as prescription mefenamic acid or ibuprofen in eliminating primary dysmenorrhea, functioning primarily through the profound, systemic inhibition of prostaglandin synthesis (Pattanittum et al., 2016). Similarly, Chamomile (</w:t>
+        <w:t>), packed with bioactive gingerols and shogaols, has been proven through meta-analyses to be statistically equally as effective as prescription mefenamic acid or ibuprofen in treating primary dysmenorrhea, functioning primarily through the systemic inhibition of prostaglandin synthesis (Pattanittum et al., 2016). Similarly, Chamomile (</w:t>
       </w:r>
       <w:r>
         <w:rPr>
@@ -966,7 +966,7 @@
           <w:color w:val="000000"/>
           <w:sz w:val="24"/>
         </w:rPr>
-        <w:t xml:space="preserve">), and complex traditional formulations like </w:t>
+        <w:t xml:space="preserve">), and traditional formulations like </w:t>
       </w:r>
       <w:r>
         <w:rPr>
@@ -983,7 +983,7 @@
           <w:color w:val="000000"/>
           <w:sz w:val="24"/>
         </w:rPr>
-        <w:t xml:space="preserve"> have demonstrated profound, scientifically validated antispasmodic and analgesic actions, offering women massive relief without the severe gastrointestinal toxicity or thromboembolic risks intrinsically associated with continuous NSAID or oral contraceptive use (Lee et al., 2016; Rahnama &amp; Montazeri, 2021).</w:t>
+        <w:t xml:space="preserve"> have demonstrated scientifically validated antispasmodic and analgesic actions, offering relief without the gastrointestinal toxicity or thromboembolic risks intrinsically associated with continuous NSAID or oral contraceptive use (Lee et al., 2016; Rahnama &amp; Montazeri, 2021).</w:t>
       </w:r>
     </w:p>
     <w:p>
@@ -997,7 +997,7 @@
           <w:color w:val="000000"/>
           <w:sz w:val="24"/>
         </w:rPr>
-        <w:t xml:space="preserve">The profound scientific validation of these specific botanicals has established a critical, irrefutable precedent: the natural world harbors a massive, largely untapped reservoir of immensely potent, multi-targeted, and highly bioavailable tocolytic and analgesic agents. The successful integration of these herbal medicines into evidence-based clinical practice underscores an urgent, ongoing scientific imperative to systematically screen, rigorously evaluate, and fully characterize other prominent botanicals with strong traditional histories of use in treating inflammatory and spasmodic disorders (Sargin, 2021). Among the myriad of potential candidates, </w:t>
+        <w:t xml:space="preserve">The scientific validation of these specific botanicals has established a precedent: the natural world harbors a reservoir of bioavailable tocolytic and analgesic agents. The successful integration of these herbal medicines into evidence-based clinical practice underscores a scientific imperative to systematically screen, evaluate, and characterize other prominent botanicals with strong traditional histories of use in treating inflammatory and spasmodic disorders (Sargin, 2021). Among the myriad of potential candidates, </w:t>
       </w:r>
       <w:r>
         <w:rPr>
@@ -1014,7 +1014,7 @@
           <w:color w:val="000000"/>
           <w:sz w:val="24"/>
         </w:rPr>
-        <w:t>, universally known as clove, has emerged as an exceptionally promising, highly potent botanical subject. Despite an incredibly rich, well-documented history of intense application in traditional medicine for severe pain relief and acute spasm suppression, its specific, isolated efficacy in neutralizing the complex pathophysiology of primary dysmenorrhea remains a critical, unresolved frontier demanding rigorous scientific investigation.</w:t>
+        <w:t>, universally known as clove, has emerged as a promising botanical subject. Despite a documented history of application in traditional medicine for pain relief and spasm suppression, its specific efficacy in neutralizing the pathophysiology of primary dysmenorrhea remains a critical frontier demanding scientific investigation.</w:t>
       </w:r>
     </w:p>
     <w:p>
@@ -1051,7 +1051,7 @@
           <w:color w:val="000000"/>
           <w:sz w:val="24"/>
         </w:rPr>
-        <w:t xml:space="preserve"> (L.) Merr. &amp; L.M. Perry, universally recognized by its common name "clove," is a profoundly important, highly valuable, and meticulously cultivated medicinal and culinary plant. Botanically, it is classified as a medium-sized, evergreen, tropical tree belonging to the extensive myrtle family, Myrtaceae (Batiha et al., 2020). The genus </w:t>
+        <w:t xml:space="preserve"> (L.) Merr. &amp; L.M. Perry, recognized by its common name "clove," is a cultivated medicinal and culinary plant. Botanically, it is classified as a medium-sized, evergreen, tropical tree belonging to the myrtle family, Myrtaceae (Batiha et al., 2020). The genus </w:t>
       </w:r>
       <w:r>
         <w:rPr>
@@ -1068,7 +1068,7 @@
           <w:color w:val="000000"/>
           <w:sz w:val="24"/>
         </w:rPr>
-        <w:t xml:space="preserve"> is massive, comprising over 1,200 distinct species distributed widely across the tropical and subtropical regions of the Old World, yet </w:t>
+        <w:t xml:space="preserve"> comprises over 1,200 distinct species distributed across the tropical and subtropical regions of the Old World, yet </w:t>
       </w:r>
       <w:r>
         <w:rPr>
@@ -1085,7 +1085,7 @@
           <w:color w:val="000000"/>
           <w:sz w:val="24"/>
         </w:rPr>
-        <w:t xml:space="preserve"> remains the absolute most economically and pharmacologically significant member of the entire lineage (Devkota &amp; Devkota, 2022). Taxonomically, the plant is organized within the kingdom Plantae, the clade Angiosperms (flowering plants), the clade Eudicots, the clade Rosids, the massive order Myrtales, the family Myrtaceae, and the genus </w:t>
+        <w:t xml:space="preserve"> remains the most economically and pharmacologically significant member of the lineage (Devkota &amp; Devkota, 2022). Taxonomically, the plant is organized within the kingdom Plantae, the clade Angiosperms (flowering plants), the clade Eudicots, the clade Rosids, the order Myrtales, the family Myrtaceae, and the genus </w:t>
       </w:r>
       <w:r>
         <w:rPr>
@@ -1102,7 +1102,7 @@
           <w:color w:val="000000"/>
           <w:sz w:val="24"/>
         </w:rPr>
-        <w:t>. The species is indigenous to the remote Maluku Islands (historically renowned as the "Spice Islands") of eastern Indonesia. However, owing to its immense global demand and exorbitant historical value in both the spice trade and traditional medicine, its intense commercial cultivation has expanded massively over centuries to encompass various tropical zones globally, including Madagascar, Tanzania (specifically the Zanzibar archipelago), Sri Lanka, India, and vast swathes of South America (Karabacak &amp; Sener, 2021).</w:t>
+        <w:t>. The species is indigenous to the Maluku Islands (historically renowned as the "Spice Islands") of eastern Indonesia. However, owing to its global demand and historical value in both the spice trade and traditional medicine, its commercial cultivation has expanded to encompass tropical zones globally, including Madagascar, Tanzania (specifically the Zanzibar archipelago), Sri Lanka, India, and regions of South America (Karabacak &amp; Sener, 2021).</w:t>
       </w:r>
     </w:p>
     <w:p>
@@ -1116,7 +1116,7 @@
           <w:color w:val="000000"/>
           <w:sz w:val="24"/>
         </w:rPr>
-        <w:t xml:space="preserve">The clove tree typically reaches an impressive height of 8 to 12 meters, distinguished by a dense, highly aromatic canopy composed of large, opposite, ovate-lanceolate leaves that are highly coriaceous (leathery) and deeply studded with massive quantities of visible, translucent secretory glands heavily laden with potent essential oils. However, it is the deeply pigmented, unopened floral buds—the actual "cloves" of commerce—that possess the highest, most concentrated pharmacological value (Batiha et al., 2020). These massive floral buds are meticulously hand-harvested precisely when the fleshy lower receptacle (hypanthium) transitions from a pale green to an intense, vibrant crimson red, just prior to the unfurling of the delicate white petals. Following harvest, these buds are subjected to rigorous, controlled sun-drying until they rapidly desiccate, turning a deep, characteristic dark brown, simultaneously shrinking and hardening into their familiar nail-like morphology (the word "clove" is derived directly from the Latin </w:t>
+        <w:t xml:space="preserve">The clove tree typically reaches a height of 8 to 12 meters, distinguished by a dense canopy composed of opposite, ovate-lanceolate leaves that are coriaceous (leathery) and studded with translucent secretory glands laden with essential oils. However, it is the pigmented, unopened floral buds (the actual "cloves" of commerce) that possess the highest concentrated pharmacological value (Batiha et al., 2020). These floral buds are hand-harvested when the fleshy lower receptacle (hypanthium) transitions from a pale green to a crimson red, just prior to the unfurling of the white petals. Following harvest, these buds are subjected to controlled sun-drying until they desiccate, turning a characteristic dark brown, simultaneously shrinking and hardening into a nail-like morphology (the word "clove" is derived directly from the Latin </w:t>
       </w:r>
       <w:r>
         <w:rPr>
@@ -1147,7 +1147,7 @@
           <w:color w:val="000000"/>
           <w:sz w:val="24"/>
         </w:rPr>
-        <w:t xml:space="preserve">Historically, these intensely aromatic, dried flower buds have commanded extraordinary value not merely as a potent culinary flavoring agent, but as a foundational, indispensable pillar of traditional medical systems worldwide (Karabacak &amp; Sener, 2021). In Traditional Chinese Medicine (TCM), Ayurveda, and Unani Tibb, clove has been revered for millennia as a supremely potent, multi-functional therapeutic agent (Devkota &amp; Devkota, 2022). It has been exhaustively utilized to rapidly resolve acute dental neuralgia, to forcefully expel intestinal parasites, to powerfully mitigate severe gastrointestinal spasms and dyspepsia, and to effectively treat severe, acute respiratory infections due to its profound bronchodilatory and intense antimicrobial actions. The immense, documented historical efficacy of </w:t>
+        <w:t xml:space="preserve">Historically, these aromatic, dried flower buds have commanded value not merely as a culinary flavoring agent, but as a foundational pillar of traditional medical systems worldwide (Karabacak &amp; Sener, 2021). In Traditional Chinese Medicine (TCM), Ayurveda, and Unani Tibb, clove has been revered as a multi-functional therapeutic agent (Devkota &amp; Devkota, 2022). It has been utilized to resolve acute dental neuralgia, to expel intestinal parasites, to mitigate gastrointestinal spasms and dyspepsia, and to treat respiratory infections due to its bronchodilatory and antimicrobial actions. The historical efficacy of </w:t>
       </w:r>
       <w:r>
         <w:rPr>
@@ -1164,7 +1164,7 @@
           <w:color w:val="000000"/>
           <w:sz w:val="24"/>
         </w:rPr>
-        <w:t xml:space="preserve"> across such diverse and severe medical applications unequivocally signals the presence of exceptionally potent, highly concentrated bioactive phytochemicals within its cellular matrix. This robust historical precedent establishes clove as a prime, incredibly promising botanical candidate for rigorous, contemporary pharmacological analysis, particularly in the targeted search for novel, highly efficacious anti-inflammatory, antispasmodic, and profound analgesic therapeutics capable of neutralizing the complex pathophysiology of dysmenorrhea.</w:t>
+        <w:t xml:space="preserve"> across diverse medical applications signals the presence of active bioactive phytochemicals within its cellular matrix. This historical precedent establishes clove as a botanical candidate for contemporary pharmacological analysis, particularly in the targeted search for novel anti-inflammatory, antispasmodic, and analgesic therapeutics capable of neutralizing the pathophysiology of dysmenorrhea.</w:t>
       </w:r>
     </w:p>
     <w:p>
@@ -1192,7 +1192,7 @@
           <w:color w:val="000000"/>
           <w:sz w:val="24"/>
         </w:rPr>
-        <w:t>While the global resurgence of interest in herbal medicine is driven by the profound pharmacological potential and the widespread public perception that "natural" inherently equates to "safe," rigorous scientific and toxicological evaluation is an absolute, non-negotiable prerequisite before any botanical extract can be considered a viable therapeutic candidate (Pal &amp; Dutta, 2022). The profound reality of pharmacognosy is that many potent medicinal plants harbor complex, biologically active secondary metabolites that, while highly therapeutic at optimized dosages, can become immensely toxic, mutagenic, or overtly lethal when administered incorrectly, at elevated concentrations, or as unregulated crude extracts. Therefore, definitively establishing the precise safety profile and the specific toxicological margins of a botanical extract is just as critical—if not more so—than proving its intended pharmacological efficacy. The fundamental baseline for this entire safety evaluation is the acute oral toxicity study (Graves, 2019).</w:t>
+        <w:t>While the global interest in herbal medicine is driven by pharmacological potential and the public perception that "natural" equates to "safe," rigorous toxicological evaluation is a prerequisite before any botanical extract can be considered a viable therapeutic candidate (Pal &amp; Dutta, 2022). The reality of pharmacognosy is that many medicinal plants harbor active secondary metabolites that, while therapeutic at optimized dosages, can become toxic, mutagenic, or lethal when administered incorrectly, at elevated concentrations, or as unregulated crude extracts. Therefore, definitively establishing the precise safety profile and the specific toxicological margins of a botanical extract is critical. The fundamental baseline for this entire safety evaluation is the acute oral toxicity study (Graves, 2019).</w:t>
       </w:r>
     </w:p>
     <w:p>
@@ -1206,7 +1206,7 @@
           <w:color w:val="000000"/>
           <w:sz w:val="24"/>
         </w:rPr>
-        <w:t>Acute oral toxicity testing is a highly standardized, rigorously controlled, early-stage in vivo pharmacological procedure designed specifically to determine the massive, immediate, and potentially lethal adverse effects that manifest within a short timeframe (typically 14 days) following the single, high-dose administration of a specific test substance (OECD, 2002). This critical evaluation provides the foundational, indispensable toxicological data required to classify the acute hazard potential of the extract, clearly delineate its precise safety margins, definitively establish the No-Observed-Adverse-Effect Level (NOAEL), and strictly guide the selection of safe, sub-lethal dosages for all subsequent, longer-term efficacy studies. Historically, this required massive animal sacrifice to determine the precise LD50 (the exact dose lethal to 50% of the test population). However, modern ethical mandates and stringent animal welfare regulations have completely revolutionized this approach (Sánchez &amp; García, 2022).</w:t>
+        <w:t>Acute oral toxicity testing is a standardized in vivo pharmacological procedure designed specifically to determine the immediate and potentially lethal adverse effects that manifest within a short timeframe (typically 14 days) following the single, high-dose administration of a specific test substance (OECD, 2002). This evaluation provides the toxicological data required to classify the acute hazard potential of the extract, delineate its specific safety margins, establish the No-Observed-Adverse-Effect Level (NOAEL), and guide the selection of safe dosages for all subsequent, longer-term efficacy studies. Historically, this required extensive animal sacrifice to determine the precise LD50 (the dose lethal to 50% of the test population). However, modern ethical mandates and stringent animal welfare regulations have revolutionized this approach (Sánchez &amp; García, 2022).</w:t>
       </w:r>
     </w:p>
     <w:p>
@@ -1220,7 +1220,7 @@
           <w:color w:val="000000"/>
           <w:sz w:val="24"/>
         </w:rPr>
-        <w:t xml:space="preserve">Contemporary toxicological evaluations are strictly governed by highly optimized, globally recognized regulatory protocols, most notably the Organization for Economic Co-operation and Development (OECD) Guidelines for the Testing of Chemicals. Specifically, the OECD Test Guideline 423 (Acute Toxic Class Method) and Guideline 425 (Up-and-Down Procedure) represent the absolute gold standards in modern toxicological screening (Monica &amp; Kumar, 2021). These revolutionary protocols are meticulously designed to maximize the extraction of critical toxicological data while drastically minimizing the total number of live animals utilized. They achieve this through a highly precise, step-wise, sequential dosing strategy utilizing extremely small, tightly controlled cohorts of animals (typically three female mice per step) (OECD, 2002). The starting dose is explicitly selected from a set of fixed, standardized levels (e.g., 5, 50, 300, or 2000 mg/kg) based entirely on any pre-existing toxicological data. Following administration, the animals are subjected to intense, continuous clinical observation, rigorously monitoring for profound changes in the skin and fur, radical shifts in respiratory or cardiovascular function, severe neurological manifestations (such as tremors, severe convulsions, or profound lethargy), extreme behavioral alterations, and ultimately, mortality (Singh &amp; Singh, 2021). </w:t>
+        <w:t xml:space="preserve">Contemporary toxicological evaluations are strictly governed by optimized regulatory protocols, most notably the Organization for Economic Co-operation and Development (OECD) Guidelines for the Testing of Chemicals. Specifically, the OECD Test Guideline 423 (Acute Toxic Class Method) and Guideline 425 (Up-and-Down Procedure) represent the standard in modern toxicological screening (Monica &amp; Kumar, 2021). These protocols are designed to extract critical toxicological data while drastically minimizing the total number of live animals utilized. They achieve this through a precise, step-wise, sequential dosing strategy utilizing small cohorts of animals (typically three female mice per step) (OECD, 2002). The starting dose is selected from a set of fixed, standardized levels (e.g., 5, 50, 300, or 2000 mg/kg) based entirely on any pre-existing toxicological data. Following administration, the animals are subjected to continuous clinical observation, monitoring for changes in the skin and fur, shifts in respiratory or cardiovascular function, neurological manifestations (such as tremors, convulsions, or lethargy), behavioral alterations, and mortality (Singh &amp; Singh, 2021). </w:t>
       </w:r>
     </w:p>
     <w:p>
@@ -1234,7 +1234,7 @@
           <w:color w:val="000000"/>
           <w:sz w:val="24"/>
         </w:rPr>
-        <w:t xml:space="preserve">If survival is confirmed at a specific dose, the protocol systematically dictates progression to the next highest dose level, meticulously continuing this sequence until profound toxicity is observed or the predefined, maximum limit dose (usually 2000 mg/kg or occasionally 5000 mg/kg) is successfully reached without any fatal outcomes (Pal &amp; Dutta, 2022). The survival of the animal cohort at these massive limit doses definitively categorizes the substance as "unclassified" or essentially non-toxic under acute oral exposure, effectively green-lighting the extract for widespread pharmacological application (Madhavi &amp; Rao, 2022). Therefore, conducting a rigorous, OECD-compliant acute oral toxicity study on the ethanolic extract of </w:t>
+        <w:t xml:space="preserve">If survival is confirmed at a specific dose, the protocol systematically dictates progression to the next highest dose level, continuing this sequence until toxicity is observed or the predefined limit dose (usually 2000 mg/kg or occasionally 5000 mg/kg) is successfully reached without fatal outcomes (Pal &amp; Dutta, 2022). The survival of the animal cohort at these limit doses categorizes the substance as "unclassified" or essentially non-toxic under acute oral exposure, allowing the extract for widespread pharmacological application (Madhavi &amp; Rao, 2022). Therefore, conducting a rigorous, OECD-compliant acute oral toxicity study on the ethanolic extract of </w:t>
       </w:r>
       <w:r>
         <w:rPr>
@@ -1251,7 +1251,7 @@
           <w:color w:val="000000"/>
           <w:sz w:val="24"/>
         </w:rPr>
-        <w:t xml:space="preserve"> is an absolute, non-negotiable scientific mandate to unequivocally validate its safety profile prior to evaluating its complex, multi-pathway efficacy in reversing the severe pathophysiology of primary dysmenorrhea.</w:t>
+        <w:t xml:space="preserve"> is a scientific mandate to validate its safety profile prior to evaluating its multi-pathway efficacy in reversing the pathophysiology of primary dysmenorrhea.</w:t>
       </w:r>
     </w:p>
     <w:p>
@@ -1279,7 +1279,7 @@
           <w:color w:val="000000"/>
           <w:sz w:val="24"/>
         </w:rPr>
-        <w:t xml:space="preserve">The immense, historically documented pharmacological potency of </w:t>
+        <w:t xml:space="preserve">The pharmacological potency of </w:t>
       </w:r>
       <w:r>
         <w:rPr>
@@ -1296,7 +1296,7 @@
           <w:color w:val="000000"/>
           <w:sz w:val="24"/>
         </w:rPr>
-        <w:t xml:space="preserve"> (clove) is not a product of myth, but rather a direct consequence of its astonishingly complex, incredibly dense, and highly synergistic phytochemical architecture. Modern analytical techniques, specifically high-performance liquid chromatography (HPLC) and gas chromatography-mass spectrometry (GC-MS), have definitively characterized the clove bud as a massive biological reservoir of exceptionally potent secondary metabolites. While many botanicals possess trace amounts of active compounds, the clove bud is uniquely remarkable for the sheer volume and extraordinary concentration of its bioactive constituents, which can collectively account for over 20% of the total dry weight of the harvested flower bud (Batiha et al., 2020). This massive phytochemical payload is systematically categorized into two distinct, highly active fractions: the volatile essential oil fraction and the non-volatile, highly complex polyphenolic fraction. </w:t>
+        <w:t xml:space="preserve"> (clove) is a direct consequence of its complex and synergistic phytochemical architecture. Analytical techniques, specifically high-performance liquid chromatography (HPLC) and gas chromatography-mass spectrometry (GC-MS), have characterized the clove bud as a biological reservoir of secondary metabolites. The clove bud is remarkable for the volume and concentration of its bioactive constituents, which can collectively account for over 20% of the total dry weight of the harvested flower bud (Batiha et al., 2020). This phytochemical payload is systematically categorized into two active fractions: the volatile essential oil fraction and the non-volatile polyphenolic fraction. </w:t>
       </w:r>
     </w:p>
     <w:p>
@@ -1310,24 +1310,7 @@
           <w:color w:val="000000"/>
           <w:sz w:val="24"/>
         </w:rPr>
-        <w:t xml:space="preserve">The volatile essential oil fraction is the absolute pharmacological centerpiece of the clove bud, typically comprising an astounding 15% to 20% of its total dry mass—one of the highest essential oil yields of any botanical species known to science (Salehi &amp; Sharifi-Rad, 2021). This fraction is aggressively extracted via steam or hydro-distillation and is the primary subject of intense industrial and medical focus. GC-MS analysis reveals that this essential oil is overwhelmingly dominated by phenylpropanoids and terpenes. The absolute, undisputed primary constituent is </w:t>
-      </w:r>
-      <w:r>
-        <w:rPr>
-          <w:rFonts w:ascii="Times New Roman" w:hAnsi="Times New Roman" w:eastAsia="Times New Roman"/>
-          <w:b/>
-          <w:color w:val="000000"/>
-          <w:sz w:val="24"/>
-        </w:rPr>
-        <w:t>eugenol</w:t>
-      </w:r>
-      <w:r>
-        <w:rPr>
-          <w:rFonts w:ascii="Times New Roman" w:hAnsi="Times New Roman" w:eastAsia="Times New Roman"/>
-          <w:color w:val="000000"/>
-          <w:sz w:val="24"/>
-        </w:rPr>
-        <w:t xml:space="preserve"> (4-allyl-2-methoxyphenol), a remarkably potent, highly volatile phenolic compound that typically constitutes an astonishing 70% to 90% of the entire essential oil profile, depending heavily on the geographical origin, the precise maturity of the bud at harvest, and the specific extraction methodology employed (Uysal &amp; Ustun, 2022). Eugenol is the undisputed chemical heart of clove, single-handedly responsible for its intense, characteristic, spicy aroma and the vast majority of its powerful, documented anti-inflammatory, anesthetic, and antispasmodic pharmacological actions (Kamatou et al., 2012).</w:t>
+        <w:t>The volatile essential oil fraction is the pharmacological centerpiece of the clove bud, typically comprising 15% to 20% of its total dry mass (Salehi &amp; Sharifi-Rad, 2021). This fraction is extracted via steam or hydro-distillation. GC-MS analysis reveals that this essential oil is dominated by phenylpropanoids and terpenes. The primary constituent is eugenol (4-allyl-2-methoxyphenol), a highly volatile phenolic compound that typically constitutes 70% to 90% of the essential oil profile, depending on the geographical origin, the maturity of the bud at harvest, and the specific extraction methodology employed (Uysal &amp; Ustun, 2022). Eugenol is responsible for the characteristic aroma and the majority of the documented anti-inflammatory, anesthetic, and antispasmodic pharmacological actions of the plant (Kamatou et al., 2012).</w:t>
       </w:r>
     </w:p>
     <w:p>
@@ -1341,41 +1324,7 @@
           <w:color w:val="000000"/>
           <w:sz w:val="24"/>
         </w:rPr>
-        <w:t xml:space="preserve">However, the efficacy of clove is not solely dependent on eugenol. The essential oil fraction also contains highly significant concentrations of </w:t>
-      </w:r>
-      <w:r>
-        <w:rPr>
-          <w:rFonts w:ascii="Times New Roman" w:hAnsi="Times New Roman" w:eastAsia="Times New Roman"/>
-          <w:b/>
-          <w:color w:val="000000"/>
-          <w:sz w:val="24"/>
-        </w:rPr>
-        <w:t>eugenyl acetate</w:t>
-      </w:r>
-      <w:r>
-        <w:rPr>
-          <w:rFonts w:ascii="Times New Roman" w:hAnsi="Times New Roman" w:eastAsia="Times New Roman"/>
-          <w:color w:val="000000"/>
-          <w:sz w:val="24"/>
-        </w:rPr>
-        <w:t xml:space="preserve"> (typically 5% to 15%), an acetylated derivative of eugenol that strongly synergizes with the parent compound, enhancing its overall bioavailability and significantly extending its powerful antioxidant and antispasmodic duration within target tissues (Vardhan &amp; Shukla, 2022). Furthermore, the oil contains a critical sesquiterpene, </w:t>
-      </w:r>
-      <w:r>
-        <w:rPr>
-          <w:rFonts w:ascii="Times New Roman" w:hAnsi="Times New Roman" w:eastAsia="Times New Roman"/>
-          <w:b/>
-          <w:color w:val="000000"/>
-          <w:sz w:val="24"/>
-        </w:rPr>
-        <w:t>β-caryophyllene</w:t>
-      </w:r>
-      <w:r>
-        <w:rPr>
-          <w:rFonts w:ascii="Times New Roman" w:hAnsi="Times New Roman" w:eastAsia="Times New Roman"/>
-          <w:color w:val="000000"/>
-          <w:sz w:val="24"/>
-        </w:rPr>
-        <w:t xml:space="preserve"> (typically 2% to 10%), a massive, highly lipophilic molecule known for its distinct, profound anti-inflammatory properties and its unique, scientifically validated capacity to act as a selective dietary cannabinoid, specifically binding to and agonizing the peripheral CB2 receptors to modulate severe pain and acute immune responses (Haro-González et al., 2021). Traces of other potent volatile compounds, including α-humulene, chavicol, methyl salicylate, and various complex pinene derivatives, further contribute to the oil's intense, multi-targeted pharmacological synergy. </w:t>
+        <w:t xml:space="preserve">However, the efficacy of clove is not solely dependent on eugenol. The essential oil fraction also contains significant concentrations of eugenyl acetate (typically 5% to 15%), an acetylated derivative of eugenol that synergizes with the parent compound, enhancing its overall bioavailability and extending its antioxidant and antispasmodic duration within target tissues (Vardhan &amp; Shukla, 2022). Furthermore, the oil contains a sesquiterpene, β-caryophyllene (typically 2% to 10%), a lipophilic molecule known for its anti-inflammatory properties and its capacity to act as a selective dietary cannabinoid, specifically binding to the peripheral CB2 receptors to modulate pain and immune responses (Haro-González et al., 2021). Traces of other volatile compounds, including α-humulene, chavicol, methyl salicylate, and pinene derivatives, further contribute to the oil's pharmacological synergy. </w:t>
       </w:r>
     </w:p>
     <w:p>
@@ -1389,58 +1338,7 @@
           <w:color w:val="000000"/>
           <w:sz w:val="24"/>
         </w:rPr>
-        <w:t xml:space="preserve">Beyond the volatile fraction, the non-volatile residue of the clove bud—often extracted via highly polar solvents like ethanol or methanol—reveals a second, immensely powerful, and frequently overlooked pharmacological arsenal: the complex polyphenolic fraction (Xue et al., 2022). This fraction is astonishingly dense in powerful, highly structured flavonoids, phenolic acids, and hydrolyzable tannins. Prominent among these are exceptionally high concentrations of specific, potent flavonoids such as </w:t>
-      </w:r>
-      <w:r>
-        <w:rPr>
-          <w:rFonts w:ascii="Times New Roman" w:hAnsi="Times New Roman" w:eastAsia="Times New Roman"/>
-          <w:b/>
-          <w:color w:val="000000"/>
-          <w:sz w:val="24"/>
-        </w:rPr>
-        <w:t>quercetin</w:t>
-      </w:r>
-      <w:r>
-        <w:rPr>
-          <w:rFonts w:ascii="Times New Roman" w:hAnsi="Times New Roman" w:eastAsia="Times New Roman"/>
-          <w:color w:val="000000"/>
-          <w:sz w:val="24"/>
-        </w:rPr>
-        <w:t xml:space="preserve">, </w:t>
-      </w:r>
-      <w:r>
-        <w:rPr>
-          <w:rFonts w:ascii="Times New Roman" w:hAnsi="Times New Roman" w:eastAsia="Times New Roman"/>
-          <w:b/>
-          <w:color w:val="000000"/>
-          <w:sz w:val="24"/>
-        </w:rPr>
-        <w:t>kaempferol</w:t>
-      </w:r>
-      <w:r>
-        <w:rPr>
-          <w:rFonts w:ascii="Times New Roman" w:hAnsi="Times New Roman" w:eastAsia="Times New Roman"/>
-          <w:color w:val="000000"/>
-          <w:sz w:val="24"/>
-        </w:rPr>
-        <w:t xml:space="preserve">, and </w:t>
-      </w:r>
-      <w:r>
-        <w:rPr>
-          <w:rFonts w:ascii="Times New Roman" w:hAnsi="Times New Roman" w:eastAsia="Times New Roman"/>
-          <w:b/>
-          <w:color w:val="000000"/>
-          <w:sz w:val="24"/>
-        </w:rPr>
-        <w:t>rhamnetin</w:t>
-      </w:r>
-      <w:r>
-        <w:rPr>
-          <w:rFonts w:ascii="Times New Roman" w:hAnsi="Times New Roman" w:eastAsia="Times New Roman"/>
-          <w:color w:val="000000"/>
-          <w:sz w:val="24"/>
-        </w:rPr>
-        <w:t xml:space="preserve">, alongside their massive, complex glycosidic derivatives (Ryu et al., 2016). These specific flavonoids are universally recognized in the scientific literature as some of the most powerful, direct, naturally occurring scavengers of reactive oxygen species (ROS) and free radicals known to pharmacognosy. They provide an immense, overwhelming systemic antioxidant defense capable of rapidly neutralizing the massive oxidative stress and severe lipid peroxidation that fundamentally characterizes the ischemia-reperfusion injury seen in primary dysmenorrhea (Szydłowska et al., 2020). </w:t>
+        <w:t xml:space="preserve">Beyond the volatile fraction, the non-volatile residue of the clove bud (often extracted via polar solvents like ethanol or methanol) reveals a second pharmacological component: the polyphenolic fraction (Xue et al., 2022). This fraction contains flavonoids, phenolic acids, and hydrolyzable tannins. Prominent among these are specific flavonoids such as quercetin, kaempferol, and rhamnetin, alongside their glycosidic derivatives (Ryu et al., 2016). These specific flavonoids act as naturally occurring scavengers of reactive oxygen species (ROS) and free radicals. They provide a systemic antioxidant defense capable of neutralizing the oxidative stress and lipid peroxidation that characterizes the ischemia-reperfusion injury seen in primary dysmenorrhea (Szydłowska et al., 2020). </w:t>
       </w:r>
     </w:p>
     <w:p>
@@ -1454,92 +1352,7 @@
           <w:color w:val="000000"/>
           <w:sz w:val="24"/>
         </w:rPr>
-        <w:t xml:space="preserve">Furthermore, the non-volatile extract is exceptionally rich in massive phenolic acids, most notably </w:t>
-      </w:r>
-      <w:r>
-        <w:rPr>
-          <w:rFonts w:ascii="Times New Roman" w:hAnsi="Times New Roman" w:eastAsia="Times New Roman"/>
-          <w:b/>
-          <w:color w:val="000000"/>
-          <w:sz w:val="24"/>
-        </w:rPr>
-        <w:t>gallic acid</w:t>
-      </w:r>
-      <w:r>
-        <w:rPr>
-          <w:rFonts w:ascii="Times New Roman" w:hAnsi="Times New Roman" w:eastAsia="Times New Roman"/>
-          <w:color w:val="000000"/>
-          <w:sz w:val="24"/>
-        </w:rPr>
-        <w:t xml:space="preserve">, </w:t>
-      </w:r>
-      <w:r>
-        <w:rPr>
-          <w:rFonts w:ascii="Times New Roman" w:hAnsi="Times New Roman" w:eastAsia="Times New Roman"/>
-          <w:b/>
-          <w:color w:val="000000"/>
-          <w:sz w:val="24"/>
-        </w:rPr>
-        <w:t>caffeic acid</w:t>
-      </w:r>
-      <w:r>
-        <w:rPr>
-          <w:rFonts w:ascii="Times New Roman" w:hAnsi="Times New Roman" w:eastAsia="Times New Roman"/>
-          <w:color w:val="000000"/>
-          <w:sz w:val="24"/>
-        </w:rPr>
-        <w:t xml:space="preserve">, </w:t>
-      </w:r>
-      <w:r>
-        <w:rPr>
-          <w:rFonts w:ascii="Times New Roman" w:hAnsi="Times New Roman" w:eastAsia="Times New Roman"/>
-          <w:b/>
-          <w:color w:val="000000"/>
-          <w:sz w:val="24"/>
-        </w:rPr>
-        <w:t>ferulic acid</w:t>
-      </w:r>
-      <w:r>
-        <w:rPr>
-          <w:rFonts w:ascii="Times New Roman" w:hAnsi="Times New Roman" w:eastAsia="Times New Roman"/>
-          <w:color w:val="000000"/>
-          <w:sz w:val="24"/>
-        </w:rPr>
-        <w:t xml:space="preserve">, and </w:t>
-      </w:r>
-      <w:r>
-        <w:rPr>
-          <w:rFonts w:ascii="Times New Roman" w:hAnsi="Times New Roman" w:eastAsia="Times New Roman"/>
-          <w:b/>
-          <w:color w:val="000000"/>
-          <w:sz w:val="24"/>
-        </w:rPr>
-        <w:t>ellagic acid</w:t>
-      </w:r>
-      <w:r>
-        <w:rPr>
-          <w:rFonts w:ascii="Times New Roman" w:hAnsi="Times New Roman" w:eastAsia="Times New Roman"/>
-          <w:color w:val="000000"/>
-          <w:sz w:val="24"/>
-        </w:rPr>
-        <w:t xml:space="preserve"> (Batiha et al., 2020). These specific phenolic compounds do not merely act as passive antioxidants; they operate as powerful, highly active immunomodulators. Extensive in vitro studies demonstrate that these acids actively suppress the catastrophic nuclear factor-kappa B (NF-κB) inflammatory signaling pathway, thereby massively downregulating the pathological secretion of the hyperalgesic cytokines interleukin-6 (IL-6) and tumor necrosis factor-alpha (TNF-α) from activated macrophages (Xue et al., 2022). Additionally, clove buds are uniquely rich in a specific, highly complex macrocyclic ellagitannin known as </w:t>
-      </w:r>
-      <w:r>
-        <w:rPr>
-          <w:rFonts w:ascii="Times New Roman" w:hAnsi="Times New Roman" w:eastAsia="Times New Roman"/>
-          <w:b/>
-          <w:color w:val="000000"/>
-          <w:sz w:val="24"/>
-        </w:rPr>
-        <w:t>eugeniin</w:t>
-      </w:r>
-      <w:r>
-        <w:rPr>
-          <w:rFonts w:ascii="Times New Roman" w:hAnsi="Times New Roman" w:eastAsia="Times New Roman"/>
-          <w:color w:val="000000"/>
-          <w:sz w:val="24"/>
-        </w:rPr>
-        <w:t xml:space="preserve">, which has demonstrated profound, highly specific antiviral and massive anti-inflammatory potential in early clinical screening. </w:t>
+        <w:t xml:space="preserve">Furthermore, the non-volatile extract is rich in phenolic acids, most notably gallic acid, caffeic acid, ferulic acid, and ellagic acid (Batiha et al., 2020). These specific phenolic compounds act as active immunomodulators. In vitro studies demonstrate that these acids suppress the nuclear factor-kappa B (NF-κB) inflammatory signaling pathway, thereby downregulating the pathological secretion of the cytokines interleukin-6 (IL-6) and tumor necrosis factor-alpha (TNF-α) from activated macrophages (Xue et al., 2022). Additionally, clove buds contain a macrocyclic ellagitannin known as eugeniin, which has demonstrated anti-inflammatory potential in clinical screening. </w:t>
       </w:r>
     </w:p>
     <w:p>
@@ -1553,7 +1366,7 @@
           <w:color w:val="000000"/>
           <w:sz w:val="24"/>
         </w:rPr>
-        <w:t xml:space="preserve">The profound, multi-pathway pharmacological synergy resulting from the combination of the highly volatile, severely antispasmodic eugenol and the massive, non-volatile, highly antioxidant polyphenolic fraction dictates that an ethanolic extract of </w:t>
+        <w:t xml:space="preserve">The pharmacological synergy resulting from the combination of the volatile eugenol and the non-volatile polyphenolic fraction indicates that an ethanolic extract of </w:t>
       </w:r>
       <w:r>
         <w:rPr>
@@ -1570,7 +1383,7 @@
           <w:color w:val="000000"/>
           <w:sz w:val="24"/>
         </w:rPr>
-        <w:t xml:space="preserve"> is theoretically perfectly engineered to neutralize the exact, complex pathophysiology of primary dysmenorrhea. The ethanol effectively acts as a universal solvent, meticulously extracting both the highly lipophilic volatile terpenes and the profoundly polar polyphenolic flavonoids (Ibrahim et al., 2022), thereby producing a comprehensive, hyper-potent botanical formulation capable of simultaneously halting severe mechanical ischemia, silencing intense neuropathic pain, neutralizing catastrophic oxidative stress, and suppressing the massive cytokine storm.</w:t>
+        <w:t xml:space="preserve"> is theoretically capable of addressing the complex pathophysiology of primary dysmenorrhea. The ethanol acts as a solvent, extracting both the lipophilic volatile terpenes and the polar polyphenolic flavonoids (Ibrahim et al., 2022), thereby producing a botanical formulation capable of simultaneously halting mechanical ischemia, mediating neuropathic pain, neutralizing oxidative stress, and suppressing the cytokine cascade.</w:t>
       </w:r>
     </w:p>
     <w:p>
@@ -1598,7 +1411,7 @@
           <w:color w:val="000000"/>
           <w:sz w:val="24"/>
         </w:rPr>
-        <w:t xml:space="preserve">The overwhelming pharmacological potency of the </w:t>
+        <w:t xml:space="preserve">The pharmacological potency of the </w:t>
       </w:r>
       <w:r>
         <w:rPr>
@@ -1615,24 +1428,7 @@
           <w:color w:val="000000"/>
           <w:sz w:val="24"/>
         </w:rPr>
-        <w:t xml:space="preserve"> extract is undeniably anchored by its primary active constituent, </w:t>
-      </w:r>
-      <w:r>
-        <w:rPr>
-          <w:rFonts w:ascii="Times New Roman" w:hAnsi="Times New Roman" w:eastAsia="Times New Roman"/>
-          <w:b/>
-          <w:color w:val="000000"/>
-          <w:sz w:val="24"/>
-        </w:rPr>
-        <w:t>eugenol</w:t>
-      </w:r>
-      <w:r>
-        <w:rPr>
-          <w:rFonts w:ascii="Times New Roman" w:hAnsi="Times New Roman" w:eastAsia="Times New Roman"/>
-          <w:color w:val="000000"/>
-          <w:sz w:val="24"/>
-        </w:rPr>
-        <w:t xml:space="preserve"> (4-allyl-2-methoxyphenol). Eugenol is a massive, highly lipophilic, and extraordinarily versatile phenylpropanoid that has been the subject of thousands of rigorous, peer-reviewed scientific investigations over the past several decades (Kamatou et al., 2012). While historically celebrated in dentistry as a profound, fast-acting topical analgesic and potent local anesthetic (often formulated with zinc oxide for endodontic root canal therapies), modern, high-resolution pharmacological research has definitively unraveled its complex, systemic mechanisms of action. This research unequivocally proves that eugenol is a powerful, multi-targeted biochemical modulator, capable of simultaneously and aggressively intervening in the specific inflammatory and smooth muscle excitation pathways that fundamentally drive the debilitating pathology of primary dysmenorrhea (Ortiz &amp; Castañeda-Hernández, 2022).</w:t>
+        <w:t xml:space="preserve"> extract is anchored by its primary active constituent, eugenol (4-allyl-2-methoxyphenol). Eugenol is a lipophilic and versatile phenylpropanoid that has been the subject of numerous peer-reviewed scientific investigations (Kamatou et al., 2012). While historically utilized in dentistry as a topical analgesic and local anesthetic (often formulated with zinc oxide for endodontic root canal therapies), modern pharmacological research has characterized its systemic mechanisms of action. This research indicates that eugenol is a multi-targeted biochemical modulator, capable of intervening in the specific inflammatory and smooth muscle excitation pathways that drive the pathology of primary dysmenorrhea (Ortiz &amp; Castañeda-Hernández, 2022).</w:t>
       </w:r>
     </w:p>
     <w:p>
@@ -1646,7 +1442,7 @@
           <w:color w:val="000000"/>
           <w:sz w:val="24"/>
         </w:rPr>
-        <w:t xml:space="preserve">The primary, and arguably most critical, pharmacological mechanism of eugenol is its profound, targeted capacity to completely halt the arachidonic acid inflammatory cascade. Unlike standard synthetic Non-Steroidal Anti-Inflammatory Drugs (NSAIDs), which typically operate as narrow, highly selective inhibitors of the cyclooxygenase (COX) enzyme pathway alone, eugenol functions as a massive, dual-action inflammatory antagonist (Sarkar &amp; Das, 2023). Extensive biochemical assays have conclusively demonstrated that eugenol exerts intense, direct, and dose-dependent competitive inhibition on both the COX-1 and the highly inducible, pathological COX-2 enzyme isoforms, thereby drastically curtailing the massive synthesis and accumulation of the potent uterotonic prostaglandins, PGF2α and PGE2, within ischemic tissue (Kim et al., 2003). However, eugenol's efficacy extends significantly further. It simultaneously, and powerfully, inhibits the 5-lipoxygenase (5-LOX) enzyme pathway (Raghavenra et al., 2006). The 5-LOX pathway is responsible for the conversion of arachidonic acid into leukotrienes—another massive class of incredibly potent, highly active inflammatory and smooth-muscle-constricting mediators that standard NSAIDs completely fail to address. By actively silencing both the COX and the LOX inflammatory pathways simultaneously, eugenol provides a comprehensive, overwhelming biochemical blockade against the entire spectrum of vasoactive and hyperalgesic eicosanoids that trigger uterine tetany, presenting a massive therapeutic advantage over conventional, single-target synthetic interventions (Reddy &amp; Reddy, 2021). </w:t>
+        <w:t xml:space="preserve">A primary pharmacological mechanism of eugenol is its targeted capacity to inhibit the arachidonic acid inflammatory cascade. Unlike synthetic Non-Steroidal Anti-Inflammatory Drugs (NSAIDs), which typically operate as selective inhibitors of the cyclooxygenase (COX) enzyme pathway alone, eugenol functions as a dual-action inflammatory antagonist (Sarkar &amp; Das, 2023). Biochemical assays have demonstrated that eugenol exerts direct, dose-dependent competitive inhibition on both the COX-1 and the inducible COX-2 enzyme isoforms, thereby curtailing the synthesis and accumulation of the uterotonic prostaglandins, PGF2α and PGE2, within ischemic tissue (Kim et al., 2003). Furthermore, eugenol simultaneously inhibits the 5-lipoxygenase (5-LOX) enzyme pathway (Raghavenra et al., 2006). The 5-LOX pathway is responsible for the conversion of arachidonic acid into leukotrienes (another class of active inflammatory and smooth-muscle-constricting mediators that standard NSAIDs do not address). By silencing both the COX and the LOX inflammatory pathways, eugenol provides a biochemical blockade against the spectrum of vasoactive and hyperalgesic eicosanoids that trigger uterine tetany, presenting a therapeutic advantage over conventional synthetic interventions (Reddy &amp; Reddy, 2021). </w:t>
       </w:r>
     </w:p>
     <w:p>
@@ -1660,7 +1456,7 @@
           <w:color w:val="000000"/>
           <w:sz w:val="24"/>
         </w:rPr>
-        <w:t xml:space="preserve">Beyond its intense anti-inflammatory capacity, eugenol operates as a profound, highly direct, and rapidly acting antispasmodic and tocolytic agent on visceral smooth muscle (Rajan &amp; Kumar, 2022). The tetanic, hypercontractile spasms of the dysmenorrheic uterus are absolutely dependent on the massive, rapid influx of extracellular calcium into the myometrial smooth muscle cells. Eugenol has been unequivocally proven through highly sensitive, isolated patch-clamp electrophysiology to function as a highly potent, direct antagonist of voltage-dependent calcium channels (VDCCs), specifically the L-type and T-type calcium channels heavily expressed on the myometrial membrane (Peixoto-Neves et al., 2014; Seo et al., 2013). By physically binding to and blocking these critical ion channels, eugenol forcefully prevents the massive calcium influx required to activate myosin light chain kinase, thereby instantly halting the excitation-contraction coupling process, enforcing severe, dose-dependent smooth muscle relaxation, and rapidly restoring critical, oxygen-rich blood flow to the severely ischemic, hypoxic uterine tissue (Shen &amp; Li, 2021). </w:t>
+        <w:t xml:space="preserve">Beyond its anti-inflammatory capacity, eugenol operates as a direct and rapid-acting antispasmodic and tocolytic agent on visceral smooth muscle (Rajan &amp; Kumar, 2022). The tetanic spasms of the dysmenorrheic uterus are dependent on the rapid influx of extracellular calcium into the myometrial smooth muscle cells. Eugenol has been proven through isolated patch-clamp electrophysiology to function as a direct antagonist of voltage-dependent calcium channels (VDCCs), specifically the L-type and T-type calcium channels expressed on the myometrial membrane (Peixoto-Neves et al., 2014; Seo et al., 2013). By binding to and blocking these ion channels, eugenol prevents the calcium influx required to activate myosin light chain kinase, thereby halting the excitation-contraction coupling process, enforcing dose-dependent smooth muscle relaxation, and restoring oxygen-rich blood flow to the ischemic uterine tissue (Shen &amp; Li, 2021). </w:t>
       </w:r>
     </w:p>
     <w:p>
@@ -1674,7 +1470,7 @@
           <w:color w:val="000000"/>
           <w:sz w:val="24"/>
         </w:rPr>
-        <w:t>Furthermore, eugenol addresses the neurobiological dimension of the pain directly at the peripheral nerve terminal. The severe, agonizing cramps of dysmenorrhea are transmitted by visceral C-fibers that are heavily populated with transient receptor potential vanilloid 1 (TRPV1) channels, which are hyper-sensitized by the local inflammatory soup. Eugenol possesses a highly specific, unique molecular structure that allows it to interact directly with these sensory nerve endings. Pharmacological research demonstrates that while eugenol can act as a partial, weak agonist of TRPV1 channels—initially causing a brief, localized warming sensation—it rapidly and forcefully induces profound, long-lasting receptor desensitization (Pina &amp; Silva, 2021). By forcing the TRPV1 channels into a prolonged, inactive refractory state, eugenol physically prevents the hyper-excitable C-fibers from transmitting the massive barrage of agonizing pain signals to the dorsal horn of the spinal cord (Ko et al., 2021). This intense, local anesthetic action, combined synergistically with its dual COX/LOX inflammatory blockade and its potent, direct calcium-channel blocking tocolytic effects, solidifies eugenol as an extraordinarily promising, multi-pathway therapeutic agent for the rapid, comprehensive neutralization of primary dysmenorrhea (Ortiz &amp; Castañeda-Hernández, 2022).</w:t>
+        <w:t>Furthermore, eugenol addresses the neurobiological dimension of the pain directly at the peripheral nerve terminal. The severe cramps of dysmenorrhea are transmitted by visceral C-fibers that are populated with transient receptor potential vanilloid 1 (TRPV1) channels, which are sensitized by the local inflammatory environment. Eugenol possesses a specific molecular structure that allows it to interact directly with these sensory nerve endings. Pharmacological research demonstrates that while eugenol can act as a partial, weak agonist of TRPV1 channels (initially causing a brief localized warming sensation), it rapidly induces long-lasting receptor desensitization (Pina &amp; Silva, 2021). By forcing the TRPV1 channels into a prolonged refractory state, eugenol prevents the excitable C-fibers from transmitting pain signals to the dorsal horn of the spinal cord (Ko et al., 2021). This local anesthetic action, combined with its dual COX/LOX inflammatory blockade and its direct calcium-channel blocking tocolytic effects, solidifies eugenol as a promising multi-pathway therapeutic agent for the neutralization of primary dysmenorrhea (Ortiz &amp; Castañeda-Hernández, 2022).</w:t>
       </w:r>
     </w:p>
     <w:p>
@@ -1702,7 +1498,7 @@
           <w:color w:val="000000"/>
           <w:sz w:val="24"/>
         </w:rPr>
-        <w:t>Primary dysmenorrhea represents a massive, debilitating global health crisis, afflicting up to 95% of reproductive-aged women and causing an immense, catastrophic burden of physical agony, systemic distress, and profound socioeconomic loss due to widespread school and occupational absenteeism (Ding et al., 2021). The foundational pathophysiology of this disorder is undeniably driven by the pathological overproduction of prostaglandins, triggering severe, ischemic, hypercontractile uterine spasms (Dawood, 2006). Current pharmacological reliance on Non-Steroidal Anti-Inflammatory Drugs (NSAIDs) and Combined Oral Contraceptives (COCs) is fundamentally flawed and grossly inadequate. These standard synthetic interventions are severely hampered by dangerous, life-threatening adverse effects—including catastrophic gastrointestinal ulceration, severe hepatotoxicity, and massive thromboembolic risks—and they exhibit an alarming, high clinical failure rate, leaving nearly a quarter of all patients completely refractory to treatment and trapped in a cycle of unremitting pain (Oladosu et al., 2018).</w:t>
+        <w:t>Primary dysmenorrhea is a global health issue, afflicting up to 95% of reproductive-aged women and causing a burden of physical pain, systemic distress, and socioeconomic loss due to school and occupational absenteeism (Ding et al., 2021). The pathophysiology of this disorder is driven by the pathological overproduction of prostaglandins, triggering ischemic, hypercontractile uterine spasms (Dawood, 2006). Current pharmacological reliance on Non-Steroidal Anti-Inflammatory Drugs (NSAIDs) and Combined Oral Contraceptives (COCs) has limitations. These standard synthetic interventions are associated with adverse effects, including gastrointestinal ulceration, hepatotoxicity, and thromboembolic risks. Furthermore, they exhibit a notable clinical failure rate, leaving a portion of patients refractory to treatment (Oladosu et al., 2018).</w:t>
       </w:r>
     </w:p>
     <w:p>
@@ -1716,7 +1512,7 @@
           <w:color w:val="000000"/>
           <w:sz w:val="24"/>
         </w:rPr>
-        <w:t xml:space="preserve">This profound clinical failure has catalyzed an urgent, absolute scientific mandate to aggressively discover novel, highly efficacious, and significantly safer alternative tocolytic therapies. The massive resurgence of interest in traditional botanical medicines is completely justified; however, these natural remedies require rigorous, uncompromising scientific validation. </w:t>
+        <w:t xml:space="preserve">This clinical limitation indicates a scientific need to discover efficacious and safer alternative tocolytic therapies. The interest in traditional botanical medicines is justified; however, these natural remedies require rigorous scientific validation. </w:t>
       </w:r>
       <w:r>
         <w:rPr>
@@ -1733,7 +1529,7 @@
           <w:color w:val="000000"/>
           <w:sz w:val="24"/>
         </w:rPr>
-        <w:t xml:space="preserve"> (clove) has emerged as an exceptionally potent candidate, boasting a massive historical precedent in traditional medicine for resolving severe pain and acute spasms (Batiha et al., 2020). Modern phytochemical screening confirms that clove is a highly concentrated reservoir of exceptionally potent bioactive compounds, specifically eugenol, which is known to possess powerful anti-inflammatory, anesthetic, and antispasmodic properties (Kamatou et al., 2012). Despite these immense capabilities, there is a massive, critical void in contemporary pharmacological literature regarding the specific, direct evaluation of the ethanolic extract of </w:t>
+        <w:t xml:space="preserve"> (clove) has emerged as a candidate, possessing a historical precedent in traditional medicine for treating pain and spasms (Batiha et al., 2020). Phytochemical screening confirms that clove is a concentrated reservoir of bioactive compounds, specifically eugenol, which possesses anti-inflammatory, anesthetic, and antispasmodic properties (Kamatou et al., 2012). Despite these capabilities, there is a lack of contemporary pharmacological literature regarding the direct evaluation of the ethanolic extract of </w:t>
       </w:r>
       <w:r>
         <w:rPr>
@@ -1750,7 +1546,7 @@
           <w:color w:val="000000"/>
           <w:sz w:val="24"/>
         </w:rPr>
-        <w:t xml:space="preserve"> flower buds in directly neutralizing the exact, complex pathophysiology of primary dysmenorrhea. </w:t>
+        <w:t xml:space="preserve"> flower buds in neutralizing the pathophysiology of primary dysmenorrhea. </w:t>
       </w:r>
     </w:p>
     <w:p>
@@ -1764,7 +1560,7 @@
           <w:color w:val="000000"/>
           <w:sz w:val="24"/>
         </w:rPr>
-        <w:t xml:space="preserve">Therefore, this study is absolutely critical. It aims to bridge this massive scientific gap by systematically and rigorously evaluating both the acute oral safety profile (via stringent OECD guidelines) and the specific, multi-pathway tocolytic efficacy of the ethanolic extract of </w:t>
+        <w:t xml:space="preserve">Therefore, this study is necessary. It aims to bridge this scientific gap by systematically evaluating both the acute oral safety profile (via OECD guidelines) and the multi-pathway tocolytic efficacy of the ethanolic extract of </w:t>
       </w:r>
       <w:r>
         <w:rPr>
@@ -1781,7 +1577,7 @@
           <w:color w:val="000000"/>
           <w:sz w:val="24"/>
         </w:rPr>
-        <w:t xml:space="preserve"> flower buds using the gold-standard, isolated murine uterine model. This research is not merely exploratory; it is an essential, highly targeted scientific effort to definitively validate a potent, natural, and vastly safer alternative for millions of women suffering from the severe, unaddressed agony of primary dysmenorrhea.</w:t>
+        <w:t xml:space="preserve"> flower buds using the isolated murine uterine model. This research is an targeted scientific effort to validate a natural alternative for women suffering from primary dysmenorrhea.</w:t>
       </w:r>
     </w:p>
     <w:p>
@@ -1809,7 +1605,7 @@
           <w:color w:val="000000"/>
           <w:sz w:val="24"/>
         </w:rPr>
-        <w:t xml:space="preserve">To rigorously address the massive scientific gap surrounding the therapeutic potential and toxicological safety of </w:t>
+        <w:t xml:space="preserve">To address the scientific gap surrounding the therapeutic potential and toxicological safety of </w:t>
       </w:r>
       <w:r>
         <w:rPr>
@@ -1826,7 +1622,7 @@
           <w:color w:val="000000"/>
           <w:sz w:val="24"/>
         </w:rPr>
-        <w:t>, this study is designed to systematically answer the following critical research questions:</w:t>
+        <w:t>, this study is designed to systematically answer the following research questions:</w:t>
       </w:r>
     </w:p>
     <w:p>
@@ -1840,7 +1636,7 @@
           <w:color w:val="000000"/>
           <w:sz w:val="24"/>
         </w:rPr>
-        <w:t xml:space="preserve">1. What is the precise acute oral toxicity profile of the ethanolic extract of </w:t>
+        <w:t xml:space="preserve">1. What is the acute oral toxicity profile of the ethanolic extract of </w:t>
       </w:r>
       <w:r>
         <w:rPr>
@@ -1857,7 +1653,7 @@
           <w:color w:val="000000"/>
           <w:sz w:val="24"/>
         </w:rPr>
-        <w:t xml:space="preserve"> flower buds when evaluated systematically in female mice according to the rigorous, gold-standard OECD Test Guideline 423 protocols?</w:t>
+        <w:t xml:space="preserve"> flower buds when evaluated systematically in female mice according to the OECD Test Guideline 423 protocols?</w:t>
       </w:r>
     </w:p>
     <w:p>
@@ -1888,7 +1684,7 @@
           <w:color w:val="000000"/>
           <w:sz w:val="24"/>
         </w:rPr>
-        <w:t xml:space="preserve"> flower buds exhibit a massive, statistically significant, and reproducible tocolytic (antispasmodic) effect on the baseline, spontaneous contractile activity of isolated non-pregnant murine uterine tissue?</w:t>
+        <w:t xml:space="preserve"> flower buds exhibit a statistically significant and reproducible tocolytic (antispasmodic) effect on the baseline, spontaneous contractile activity of isolated non-pregnant murine uterine tissue?</w:t>
       </w:r>
     </w:p>
     <w:p>
@@ -1919,7 +1715,7 @@
           <w:color w:val="000000"/>
           <w:sz w:val="24"/>
         </w:rPr>
-        <w:t xml:space="preserve"> effectively, rapidly, and predictably reverse the severe, hypercontractile spasms induced by exogenous oxytocin in the isolated murine uterus, thereby demonstrating its profound capacity to neutralize acute dysmenorrheic pathology?</w:t>
+        <w:t xml:space="preserve"> effectively and predictably reverse the hypercontractile spasms induced by exogenous oxytocin in the isolated murine uterus, thereby demonstrating its capacity to neutralize dysmenorrheic pathology?</w:t>
       </w:r>
     </w:p>
     <w:p>
@@ -1947,7 +1743,7 @@
           <w:color w:val="000000"/>
           <w:sz w:val="24"/>
         </w:rPr>
-        <w:t>This rigorous investigation is driven by the following definitive scientific hypotheses:</w:t>
+        <w:t>This investigation is driven by the following scientific hypotheses:</w:t>
       </w:r>
     </w:p>
     <w:p>
@@ -1988,7 +1784,7 @@
           <w:color w:val="000000"/>
           <w:sz w:val="24"/>
         </w:rPr>
-        <w:t xml:space="preserve"> flower buds exhibits profound acute oral toxicity in vivo and produces absolutely no statistically significant tocolytic or antispasmodic effect on either the spontaneous or oxytocin-induced hypercontractile activity of the isolated murine uterus.</w:t>
+        <w:t xml:space="preserve"> flower buds exhibits acute oral toxicity in vivo and produces no statistically significant tocolytic or antispasmodic effect on either the spontaneous or oxytocin-induced contractile activity of the isolated murine uterus.</w:t>
       </w:r>
     </w:p>
     <w:p>
@@ -2029,7 +1825,7 @@
           <w:color w:val="000000"/>
           <w:sz w:val="24"/>
         </w:rPr>
-        <w:t xml:space="preserve"> flower buds is highly safe, exhibiting zero acute oral toxicity up to the massive limit dose of 2000 mg/kg, and it exerts a profound, statistically significant, dose-dependent tocolytic effect, massively suppressing both spontaneous uterine contractions and effectively reversing oxytocin-induced hypercontractility in the murine model, thereby validating its potent antidysmenorrhea efficacy.</w:t>
+        <w:t xml:space="preserve"> flower buds is safe, exhibiting zero acute oral toxicity up to the limit dose of 2000 mg/kg, and it exerts a statistically significant, dose-dependent tocolytic effect, suppressing spontaneous uterine contractions and effectively reversing oxytocin-induced hypercontractility in the murine model.</w:t>
       </w:r>
     </w:p>
     <w:p>
@@ -2071,7 +1867,7 @@
           <w:color w:val="000000"/>
           <w:sz w:val="24"/>
         </w:rPr>
-        <w:t xml:space="preserve">The fundamental, overarching aim of this highly rigorous study is to definitively establish the acute in vivo toxicological safety profile and to systematically, quantitatively evaluate the potent in vitro antidysmenorrhea (tocolytic) efficacy of the ethanolic extract of </w:t>
+        <w:t xml:space="preserve">The fundamental aim of this study is to establish the acute in vivo toxicological safety profile and to systematically, quantitatively evaluate the in vitro antidysmenorrhea (tocolytic) efficacy of the ethanolic extract of </w:t>
       </w:r>
       <w:r>
         <w:rPr>
@@ -2088,7 +1884,7 @@
           <w:color w:val="000000"/>
           <w:sz w:val="24"/>
         </w:rPr>
-        <w:t xml:space="preserve"> flower buds using the gold-standard murine experimental model.</w:t>
+        <w:t xml:space="preserve"> flower buds using the murine experimental model.</w:t>
       </w:r>
     </w:p>
     <w:p>
@@ -2116,7 +1912,7 @@
           <w:color w:val="000000"/>
           <w:sz w:val="24"/>
         </w:rPr>
-        <w:t>To achieve this massive scientific aim, the study will aggressively execute the following specific, highly targeted methodological objectives:</w:t>
+        <w:t>To achieve this aim, the study will execute the following methodological objectives:</w:t>
       </w:r>
     </w:p>
     <w:p>
@@ -2130,7 +1926,7 @@
           <w:color w:val="000000"/>
           <w:sz w:val="24"/>
         </w:rPr>
-        <w:t xml:space="preserve">1. To meticulously prepare a highly concentrated, standardized ethanolic extract from the dried flower buds of </w:t>
+        <w:t xml:space="preserve">1. To prepare a standardized ethanolic extract from the dried flower buds of </w:t>
       </w:r>
       <w:r>
         <w:rPr>
@@ -2147,7 +1943,7 @@
           <w:color w:val="000000"/>
           <w:sz w:val="24"/>
         </w:rPr>
-        <w:t xml:space="preserve"> utilizing rigorous cold maceration techniques to ensure maximum yield of intact bioactive phytochemicals.</w:t>
+        <w:t xml:space="preserve"> utilizing cold maceration techniques to ensure the yield of intact bioactive phytochemicals.</w:t>
       </w:r>
     </w:p>
     <w:p>
@@ -2161,7 +1957,7 @@
           <w:color w:val="000000"/>
           <w:sz w:val="24"/>
         </w:rPr>
-        <w:t>2. To definitively determine the precise acute oral toxicity and establish the absolute safety margin (NOAEL) of the ethanolic extract in live female mice by strictly adhering to the highly controlled, sequential dosing protocols mandated by the OECD Test Guideline 423.</w:t>
+        <w:t>2. To determine the acute oral toxicity and establish the safety margin (NOAEL) of the ethanolic extract in female mice by adhering to the sequential dosing protocols mandated by the OECD Test Guideline 423.</w:t>
       </w:r>
     </w:p>
     <w:p>
@@ -2175,7 +1971,7 @@
           <w:color w:val="000000"/>
           <w:sz w:val="24"/>
         </w:rPr>
-        <w:t xml:space="preserve">3. To quantitatively measure and rigorously evaluate the direct, dose-dependent tocolytic effect of varying concentrations of the </w:t>
+        <w:t xml:space="preserve">3. To quantitatively measure and evaluate the dose-dependent tocolytic effect of varying concentrations of the </w:t>
       </w:r>
       <w:r>
         <w:rPr>
@@ -2192,7 +1988,7 @@
           <w:color w:val="000000"/>
           <w:sz w:val="24"/>
         </w:rPr>
-        <w:t xml:space="preserve"> extract on the spontaneous, baseline rhythmic contractions of isolated, non-pregnant murine uterine horns suspended in a controlled, physiological tissue bath environment.</w:t>
+        <w:t xml:space="preserve"> extract on the spontaneous, baseline rhythmic contractions of isolated, non-pregnant murine uterine horns suspended in a physiological tissue bath environment.</w:t>
       </w:r>
     </w:p>
     <w:p>
@@ -2206,7 +2002,7 @@
           <w:color w:val="000000"/>
           <w:sz w:val="24"/>
         </w:rPr>
-        <w:t xml:space="preserve">4. To systematically assess and quantify the potent antispasmodic capacity of the </w:t>
+        <w:t xml:space="preserve">4. To systematically assess and quantify the antispasmodic capacity of the </w:t>
       </w:r>
       <w:r>
         <w:rPr>
@@ -2223,7 +2019,7 @@
           <w:color w:val="000000"/>
           <w:sz w:val="24"/>
         </w:rPr>
-        <w:t xml:space="preserve"> extract to rapidly neutralize and completely reverse the severe, tetanic uterine hypercontractility specifically induced by the administration of exogenous oxytocin in the isolated murine uterine model.</w:t>
+        <w:t xml:space="preserve"> extract to neutralize and reverse the tetanic uterine hypercontractility induced by the administration of exogenous oxytocin in the isolated murine uterine model.</w:t>
       </w:r>
     </w:p>
     <w:p>

</xml_diff>